<commit_message>
docs(report): noi ro moi policy/dieu khoan YEU CAU gi + sua 2 trich dan PCI sai
- Them Bang 7 'Tra cuu — moi dieu khoan tieu chuan yeu cau gi' (21 dong: CIS Docker, PCI, GDPR,
  ND13, Luat ATTTM, OCI/SLSA, NIST, TCVN) o muc 3.2.
- Bang luat F04 (Bang 8): cot giua neu RO luat yeu cau gi (phai co USER non-root, khong EXPOSE cong
  quan tri, phai co nhan OCI, khong secret trong ENV/ARG).
- Sua trich dan PCI cho dung v3.2.1: 8.3 -> 8.2.1 (credential khong luu dang doc duoc; 8.3 la MFA),
  2.2.6 -> 2.2 (v3.2.1 chi co 2.2.1-2.2.5). Dong bo ca policy .rego lan Phu luc A/B. conftest 17/17.
- Rebuild PDF (26 trang) + DOCX.
</commit_message>
<xml_diff>
--- a/report/BaoCao_DevSecOps_JuiceShop_gon.docx
+++ b/report/BaoCao_DevSecOps_JuiceShop_gon.docx
@@ -2331,7 +2331,7 @@
         <w:t>PCI-DSS v3.2.1</w:t>
       </w:r>
       <w:r>
-        <w:t xml:space="preserve">: chuẩn an toàn dữ liệu thẻ thanh toán; Yêu cầu 3.4 (không lưu/không lộ số thẻ đầy đủ), 8.3 (không nhúng bí mật), 2.2.x (không chạy root). </w:t>
+        <w:t xml:space="preserve">: chuẩn an toàn dữ liệu thẻ thanh toán; Yêu cầu 3.4 (không lưu/không lộ số thẻ đầy đủ), 8.2.1 (không lưu credential ở dạng đọc được), 2.2 (cấu hình an toàn, đặc quyền tối thiểu). </w:t>
       </w:r>
       <w:r>
         <w:rPr>
@@ -2537,6 +2537,627 @@
         <w:t>, làm cơ sở kỹ thuật cho cấu hình triển khai tối thiểu (F03/F04).</w:t>
       </w:r>
     </w:p>
+    <w:p>
+      <w:pPr>
+        <w:jc w:val="both"/>
+      </w:pPr>
+      <w:r>
+        <w:t xml:space="preserve">Để các trích dẫn trong báo cáo không chỉ là mã số, bảng sau nêu rõ </w:t>
+      </w:r>
+      <w:r>
+        <w:rPr>
+          <w:b/>
+        </w:rPr>
+        <w:t>mỗi điều khoản yêu cầu gì</w:t>
+      </w:r>
+      <w:r>
+        <w:t>:</w:t>
+      </w:r>
+    </w:p>
+    <w:p>
+      <w:pPr>
+        <w:jc w:val="center"/>
+      </w:pPr>
+      <w:r>
+        <w:rPr>
+          <w:i/>
+          <w:sz w:val="22"/>
+        </w:rPr>
+        <w:t>Bảng 7. Tra cứu — mỗi điều khoản tiêu chuẩn yêu cầu gì</w:t>
+      </w:r>
+    </w:p>
+    <w:tbl>
+      <w:tblPr>
+        <w:tblStyle w:val="TableGrid"/>
+        <w:tblW w:type="auto" w:w="0"/>
+        <w:jc w:val="center"/>
+        <w:tblLook w:firstColumn="1" w:firstRow="1" w:lastColumn="0" w:lastRow="0" w:noHBand="0" w:noVBand="1" w:val="04A0"/>
+      </w:tblPr>
+      <w:tblGrid>
+        <w:gridCol w:w="4819"/>
+        <w:gridCol w:w="4819"/>
+      </w:tblGrid>
+      <w:tr>
+        <w:tc>
+          <w:tcPr>
+            <w:tcW w:type="dxa" w:w="4819"/>
+            <w:shd w:val="clear" w:color="auto" w:fill="0B2A4A"/>
+          </w:tcPr>
+          <w:p>
+            <w:r>
+              <w:rPr>
+                <w:b/>
+                <w:color w:val="FFFFFF"/>
+              </w:rPr>
+              <w:t>Điều khoản</w:t>
+            </w:r>
+          </w:p>
+        </w:tc>
+        <w:tc>
+          <w:tcPr>
+            <w:tcW w:type="dxa" w:w="4819"/>
+            <w:shd w:val="clear" w:color="auto" w:fill="0B2A4A"/>
+          </w:tcPr>
+          <w:p>
+            <w:r>
+              <w:rPr>
+                <w:b/>
+                <w:color w:val="FFFFFF"/>
+              </w:rPr>
+              <w:t>Yêu cầu cụ thể</w:t>
+            </w:r>
+          </w:p>
+        </w:tc>
+      </w:tr>
+      <w:tr>
+        <w:tc>
+          <w:tcPr>
+            <w:tcW w:type="dxa" w:w="4819"/>
+          </w:tcPr>
+          <w:p>
+            <w:r>
+              <w:t>CIS Docker 4.1</w:t>
+            </w:r>
+          </w:p>
+        </w:tc>
+        <w:tc>
+          <w:tcPr>
+            <w:tcW w:type="dxa" w:w="4819"/>
+          </w:tcPr>
+          <w:p>
+            <w:r>
+              <w:t xml:space="preserve">Chạy container bằng user riêng, </w:t>
+            </w:r>
+            <w:r>
+              <w:rPr>
+                <w:b/>
+              </w:rPr>
+              <w:t>không phải root</w:t>
+            </w:r>
+          </w:p>
+        </w:tc>
+      </w:tr>
+      <w:tr>
+        <w:tc>
+          <w:tcPr>
+            <w:tcW w:type="dxa" w:w="4819"/>
+          </w:tcPr>
+          <w:p>
+            <w:r>
+              <w:t>CIS Docker 4.5</w:t>
+            </w:r>
+          </w:p>
+        </w:tc>
+        <w:tc>
+          <w:tcPr>
+            <w:tcW w:type="dxa" w:w="4819"/>
+          </w:tcPr>
+          <w:p>
+            <w:r>
+              <w:t xml:space="preserve">Dùng ảnh nền tin cậy, ghim phiên bản/digest (tránh tag động </w:t>
+            </w:r>
+            <w:r>
+              <w:rPr>
+                <w:rFonts w:ascii="Consolas" w:hAnsi="Consolas"/>
+                <w:sz w:val="20"/>
+              </w:rPr>
+              <w:t>:latest</w:t>
+            </w:r>
+            <w:r>
+              <w:t>)</w:t>
+            </w:r>
+          </w:p>
+        </w:tc>
+      </w:tr>
+      <w:tr>
+        <w:tc>
+          <w:tcPr>
+            <w:tcW w:type="dxa" w:w="4819"/>
+          </w:tcPr>
+          <w:p>
+            <w:r>
+              <w:t>CIS Docker 4.9</w:t>
+            </w:r>
+          </w:p>
+        </w:tc>
+        <w:tc>
+          <w:tcPr>
+            <w:tcW w:type="dxa" w:w="4819"/>
+          </w:tcPr>
+          <w:p>
+            <w:r>
+              <w:t xml:space="preserve">Dùng </w:t>
+            </w:r>
+            <w:r>
+              <w:rPr>
+                <w:rFonts w:ascii="Consolas" w:hAnsi="Consolas"/>
+                <w:sz w:val="20"/>
+              </w:rPr>
+              <w:t>COPY</w:t>
+            </w:r>
+            <w:r>
+              <w:t xml:space="preserve"> thay cho </w:t>
+            </w:r>
+            <w:r>
+              <w:rPr>
+                <w:rFonts w:ascii="Consolas" w:hAnsi="Consolas"/>
+                <w:sz w:val="20"/>
+              </w:rPr>
+              <w:t>ADD</w:t>
+            </w:r>
+            <w:r>
+              <w:t xml:space="preserve"> (tránh kéo nội dung từ xa ngoài kiểm soát)</w:t>
+            </w:r>
+          </w:p>
+        </w:tc>
+      </w:tr>
+      <w:tr>
+        <w:tc>
+          <w:tcPr>
+            <w:tcW w:type="dxa" w:w="4819"/>
+          </w:tcPr>
+          <w:p>
+            <w:r>
+              <w:t>CIS Docker 4.10</w:t>
+            </w:r>
+          </w:p>
+        </w:tc>
+        <w:tc>
+          <w:tcPr>
+            <w:tcW w:type="dxa" w:w="4819"/>
+          </w:tcPr>
+          <w:p>
+            <w:r>
+              <w:t>Không lưu bí mật trong Dockerfile</w:t>
+            </w:r>
+          </w:p>
+        </w:tc>
+      </w:tr>
+      <w:tr>
+        <w:tc>
+          <w:tcPr>
+            <w:tcW w:type="dxa" w:w="4819"/>
+          </w:tcPr>
+          <w:p>
+            <w:r>
+              <w:t>CIS Docker 5.3</w:t>
+            </w:r>
+          </w:p>
+        </w:tc>
+        <w:tc>
+          <w:tcPr>
+            <w:tcW w:type="dxa" w:w="4819"/>
+          </w:tcPr>
+          <w:p>
+            <w:r>
+              <w:t>Loại bỏ Linux capabilities không cần (</w:t>
+            </w:r>
+            <w:r>
+              <w:rPr>
+                <w:rFonts w:ascii="Consolas" w:hAnsi="Consolas"/>
+                <w:sz w:val="20"/>
+              </w:rPr>
+              <w:t>cap_drop: ALL</w:t>
+            </w:r>
+            <w:r>
+              <w:t>)</w:t>
+            </w:r>
+          </w:p>
+        </w:tc>
+      </w:tr>
+      <w:tr>
+        <w:tc>
+          <w:tcPr>
+            <w:tcW w:type="dxa" w:w="4819"/>
+          </w:tcPr>
+          <w:p>
+            <w:r>
+              <w:t>CIS Docker 5.4</w:t>
+            </w:r>
+          </w:p>
+        </w:tc>
+        <w:tc>
+          <w:tcPr>
+            <w:tcW w:type="dxa" w:w="4819"/>
+          </w:tcPr>
+          <w:p>
+            <w:r>
+              <w:t xml:space="preserve">Không chạy container ở chế độ </w:t>
+            </w:r>
+            <w:r>
+              <w:rPr>
+                <w:rFonts w:ascii="Consolas" w:hAnsi="Consolas"/>
+                <w:sz w:val="20"/>
+              </w:rPr>
+              <w:t>privileged</w:t>
+            </w:r>
+          </w:p>
+        </w:tc>
+      </w:tr>
+      <w:tr>
+        <w:tc>
+          <w:tcPr>
+            <w:tcW w:type="dxa" w:w="4819"/>
+          </w:tcPr>
+          <w:p>
+            <w:r>
+              <w:t>CIS Docker 5.8</w:t>
+            </w:r>
+          </w:p>
+        </w:tc>
+        <w:tc>
+          <w:tcPr>
+            <w:tcW w:type="dxa" w:w="4819"/>
+          </w:tcPr>
+          <w:p>
+            <w:r>
+              <w:t>Chỉ mở đúng cổng cần thiết (không mở cổng quản trị/CSDL)</w:t>
+            </w:r>
+          </w:p>
+        </w:tc>
+      </w:tr>
+      <w:tr>
+        <w:tc>
+          <w:tcPr>
+            <w:tcW w:type="dxa" w:w="4819"/>
+          </w:tcPr>
+          <w:p>
+            <w:r>
+              <w:t>CIS Docker 5.12</w:t>
+            </w:r>
+          </w:p>
+        </w:tc>
+        <w:tc>
+          <w:tcPr>
+            <w:tcW w:type="dxa" w:w="4819"/>
+          </w:tcPr>
+          <w:p>
+            <w:r>
+              <w:t>Gắn hệ thống tệp gốc ở chế độ chỉ đọc (</w:t>
+            </w:r>
+            <w:r>
+              <w:rPr>
+                <w:rFonts w:ascii="Consolas" w:hAnsi="Consolas"/>
+                <w:sz w:val="20"/>
+              </w:rPr>
+              <w:t>read_only</w:t>
+            </w:r>
+            <w:r>
+              <w:t>)</w:t>
+            </w:r>
+          </w:p>
+        </w:tc>
+      </w:tr>
+      <w:tr>
+        <w:tc>
+          <w:tcPr>
+            <w:tcW w:type="dxa" w:w="4819"/>
+          </w:tcPr>
+          <w:p>
+            <w:r>
+              <w:t>CIS Docker 5.31</w:t>
+            </w:r>
+          </w:p>
+        </w:tc>
+        <w:tc>
+          <w:tcPr>
+            <w:tcW w:type="dxa" w:w="4819"/>
+          </w:tcPr>
+          <w:p>
+            <w:r>
+              <w:t>Không mount Docker socket vào container</w:t>
+            </w:r>
+          </w:p>
+        </w:tc>
+      </w:tr>
+      <w:tr>
+        <w:tc>
+          <w:tcPr>
+            <w:tcW w:type="dxa" w:w="4819"/>
+          </w:tcPr>
+          <w:p>
+            <w:r>
+              <w:t>PCI-DSS 2.2</w:t>
+            </w:r>
+          </w:p>
+        </w:tc>
+        <w:tc>
+          <w:tcPr>
+            <w:tcW w:type="dxa" w:w="4819"/>
+          </w:tcPr>
+          <w:p>
+            <w:r>
+              <w:t>Cấu hình tham số an toàn hệ thống, chạy với đặc quyền tối thiểu</w:t>
+            </w:r>
+          </w:p>
+        </w:tc>
+      </w:tr>
+      <w:tr>
+        <w:tc>
+          <w:tcPr>
+            <w:tcW w:type="dxa" w:w="4819"/>
+          </w:tcPr>
+          <w:p>
+            <w:r>
+              <w:t>PCI-DSS 3.4</w:t>
+            </w:r>
+          </w:p>
+        </w:tc>
+        <w:tc>
+          <w:tcPr>
+            <w:tcW w:type="dxa" w:w="4819"/>
+          </w:tcPr>
+          <w:p>
+            <w:r>
+              <w:t>Làm số thẻ (PAN) không đọc được ở mọi nơi lưu trữ</w:t>
+            </w:r>
+          </w:p>
+        </w:tc>
+      </w:tr>
+      <w:tr>
+        <w:tc>
+          <w:tcPr>
+            <w:tcW w:type="dxa" w:w="4819"/>
+          </w:tcPr>
+          <w:p>
+            <w:r>
+              <w:t>PCI-DSS 8.2.1</w:t>
+            </w:r>
+          </w:p>
+        </w:tc>
+        <w:tc>
+          <w:tcPr>
+            <w:tcW w:type="dxa" w:w="4819"/>
+          </w:tcPr>
+          <w:p>
+            <w:r>
+              <w:t>Không lưu thông tin xác thực (credential) ở dạng đọc được</w:t>
+            </w:r>
+          </w:p>
+        </w:tc>
+      </w:tr>
+      <w:tr>
+        <w:tc>
+          <w:tcPr>
+            <w:tcW w:type="dxa" w:w="4819"/>
+          </w:tcPr>
+          <w:p>
+            <w:r>
+              <w:t>GDPR Điều 5(1)(f)</w:t>
+            </w:r>
+          </w:p>
+        </w:tc>
+        <w:tc>
+          <w:tcPr>
+            <w:tcW w:type="dxa" w:w="4819"/>
+          </w:tcPr>
+          <w:p>
+            <w:r>
+              <w:t>Nguyên tắc toàn vẹn &amp; bảo mật khi xử lý dữ liệu</w:t>
+            </w:r>
+          </w:p>
+        </w:tc>
+      </w:tr>
+      <w:tr>
+        <w:tc>
+          <w:tcPr>
+            <w:tcW w:type="dxa" w:w="4819"/>
+          </w:tcPr>
+          <w:p>
+            <w:r>
+              <w:t>GDPR Điều 25</w:t>
+            </w:r>
+          </w:p>
+        </w:tc>
+        <w:tc>
+          <w:tcPr>
+            <w:tcW w:type="dxa" w:w="4819"/>
+          </w:tcPr>
+          <w:p>
+            <w:r>
+              <w:t>Bảo vệ dữ liệu ngay từ thiết kế và theo mặc định</w:t>
+            </w:r>
+          </w:p>
+        </w:tc>
+      </w:tr>
+      <w:tr>
+        <w:tc>
+          <w:tcPr>
+            <w:tcW w:type="dxa" w:w="4819"/>
+          </w:tcPr>
+          <w:p>
+            <w:r>
+              <w:t>GDPR Điều 32</w:t>
+            </w:r>
+          </w:p>
+        </w:tc>
+        <w:tc>
+          <w:tcPr>
+            <w:tcW w:type="dxa" w:w="4819"/>
+          </w:tcPr>
+          <w:p>
+            <w:r>
+              <w:t>Biện pháp kỹ thuật &amp; tổ chức bảo đảm an toàn khi xử lý</w:t>
+            </w:r>
+          </w:p>
+        </w:tc>
+      </w:tr>
+      <w:tr>
+        <w:tc>
+          <w:tcPr>
+            <w:tcW w:type="dxa" w:w="4819"/>
+          </w:tcPr>
+          <w:p>
+            <w:r>
+              <w:t>NĐ 13/2023 Điều 3</w:t>
+            </w:r>
+          </w:p>
+        </w:tc>
+        <w:tc>
+          <w:tcPr>
+            <w:tcW w:type="dxa" w:w="4819"/>
+          </w:tcPr>
+          <w:p>
+            <w:r>
+              <w:t>Nguyên tắc bảo vệ dữ liệu cá nhân (gồm nguyên tắc bảo mật, an toàn)</w:t>
+            </w:r>
+          </w:p>
+        </w:tc>
+      </w:tr>
+      <w:tr>
+        <w:tc>
+          <w:tcPr>
+            <w:tcW w:type="dxa" w:w="4819"/>
+          </w:tcPr>
+          <w:p>
+            <w:r>
+              <w:t>NĐ 13/2023 Điều 26</w:t>
+            </w:r>
+          </w:p>
+        </w:tc>
+        <w:tc>
+          <w:tcPr>
+            <w:tcW w:type="dxa" w:w="4819"/>
+          </w:tcPr>
+          <w:p>
+            <w:r>
+              <w:t>Biện pháp quản lý &amp; kỹ thuật bảo vệ dữ liệu cá nhân, từ đầu và suốt quá trình xử lý</w:t>
+            </w:r>
+          </w:p>
+        </w:tc>
+      </w:tr>
+      <w:tr>
+        <w:tc>
+          <w:tcPr>
+            <w:tcW w:type="dxa" w:w="4819"/>
+          </w:tcPr>
+          <w:p>
+            <w:r>
+              <w:t>Luật ATTTM 2015 Điều 17</w:t>
+            </w:r>
+          </w:p>
+        </w:tc>
+        <w:tc>
+          <w:tcPr>
+            <w:tcW w:type="dxa" w:w="4819"/>
+          </w:tcPr>
+          <w:p>
+            <w:r>
+              <w:t>Không chia sẻ thông tin cá nhân cho bên thứ ba khi chưa được đồng ý</w:t>
+            </w:r>
+          </w:p>
+        </w:tc>
+      </w:tr>
+      <w:tr>
+        <w:tc>
+          <w:tcPr>
+            <w:tcW w:type="dxa" w:w="4819"/>
+          </w:tcPr>
+          <w:p>
+            <w:r>
+              <w:t>Luật ATTTM 2015 Điều 19</w:t>
+            </w:r>
+          </w:p>
+        </w:tc>
+        <w:tc>
+          <w:tcPr>
+            <w:tcW w:type="dxa" w:w="4819"/>
+          </w:tcPr>
+          <w:p>
+            <w:r>
+              <w:t>Biện pháp quản lý &amp; kỹ thuật bảo đảm an toàn thông tin cá nhân; tuân thủ tiêu chuẩn kỹ thuật</w:t>
+            </w:r>
+          </w:p>
+        </w:tc>
+      </w:tr>
+      <w:tr>
+        <w:tc>
+          <w:tcPr>
+            <w:tcW w:type="dxa" w:w="4819"/>
+          </w:tcPr>
+          <w:p>
+            <w:r>
+              <w:t>OCI image-spec / SLSA</w:t>
+            </w:r>
+          </w:p>
+        </w:tc>
+        <w:tc>
+          <w:tcPr>
+            <w:tcW w:type="dxa" w:w="4819"/>
+          </w:tcPr>
+          <w:p>
+            <w:r>
+              <w:t>Khai báo nguồn gốc (provenance) &amp; bảo đảm toàn vẹn chuỗi cung ứng ảnh</w:t>
+            </w:r>
+          </w:p>
+        </w:tc>
+      </w:tr>
+      <w:tr>
+        <w:tc>
+          <w:tcPr>
+            <w:tcW w:type="dxa" w:w="4819"/>
+          </w:tcPr>
+          <w:p>
+            <w:r>
+              <w:t>NIST SP 800-190</w:t>
+            </w:r>
+          </w:p>
+        </w:tc>
+        <w:tc>
+          <w:tcPr>
+            <w:tcW w:type="dxa" w:w="4819"/>
+          </w:tcPr>
+          <w:p>
+            <w:r>
+              <w:t>Hướng dẫn an toàn cho container</w:t>
+            </w:r>
+          </w:p>
+        </w:tc>
+      </w:tr>
+      <w:tr>
+        <w:tc>
+          <w:tcPr>
+            <w:tcW w:type="dxa" w:w="4819"/>
+          </w:tcPr>
+          <w:p>
+            <w:r>
+              <w:t>TCVN 11930:2017</w:t>
+            </w:r>
+          </w:p>
+        </w:tc>
+        <w:tc>
+          <w:tcPr>
+            <w:tcW w:type="dxa" w:w="4819"/>
+          </w:tcPr>
+          <w:p>
+            <w:r>
+              <w:t>Yêu cầu cơ bản về an toàn hệ thống thông tin theo cấp độ</w:t>
+            </w:r>
+          </w:p>
+        </w:tc>
+      </w:tr>
+    </w:tbl>
+    <w:p/>
     <w:p>
       <w:pPr>
         <w:pStyle w:val="Heading1"/>
@@ -4394,7 +5015,7 @@
           <w:i/>
           <w:sz w:val="22"/>
         </w:rPr>
-        <w:t>Bảng 7. Luật kiểm tra cấu hình container và tiêu chuẩn đối chiếu</w:t>
+        <w:t>Bảng 8. Luật kiểm tra cấu hình container — luật yêu cầu gì và dựa trên chuẩn nào</w:t>
       </w:r>
     </w:p>
     <w:tbl>
@@ -4436,7 +5057,7 @@
                 <w:b/>
                 <w:color w:val="FFFFFF"/>
               </w:rPr>
-              <w:t>Vi phạm bị chặn</w:t>
+              <w:t>Luật yêu cầu gì (chặn khi vi phạm)</w:t>
             </w:r>
           </w:p>
         </w:tc>
@@ -4451,7 +5072,7 @@
                 <w:b/>
                 <w:color w:val="FFFFFF"/>
               </w:rPr>
-              <w:t>Tiêu chuẩn (quốc tế + Việt Nam)</w:t>
+              <w:t>Tiêu chuẩn (ý nghĩa xem Bảng tra ở mục 3.2)</w:t>
             </w:r>
           </w:p>
         </w:tc>
@@ -4473,7 +5094,26 @@
           </w:tcPr>
           <w:p>
             <w:r>
-              <w:t>stage cuối chạy root</w:t>
+              <w:t xml:space="preserve">Stage cuối </w:t>
+            </w:r>
+            <w:r>
+              <w:rPr>
+                <w:b/>
+              </w:rPr>
+              <w:t>phải</w:t>
+            </w:r>
+            <w:r>
+              <w:t xml:space="preserve"> khai báo </w:t>
+            </w:r>
+            <w:r>
+              <w:rPr>
+                <w:rFonts w:ascii="Consolas" w:hAnsi="Consolas"/>
+                <w:sz w:val="20"/>
+              </w:rPr>
+              <w:t>USER</w:t>
+            </w:r>
+            <w:r>
+              <w:t xml:space="preserve"> là UID số, không phải root</w:t>
             </w:r>
           </w:p>
         </w:tc>
@@ -4483,13 +5123,7 @@
           </w:tcPr>
           <w:p>
             <w:r>
-              <w:t xml:space="preserve">CIS Docker 4.1; PCI-DSS 2.2.6; </w:t>
-            </w:r>
-            <w:r>
-              <w:rPr>
-                <w:b/>
-              </w:rPr>
-              <w:t>NĐ 13/2023 Đ.26; Luật ATTTM Đ.19</w:t>
+              <w:t>CIS Docker 4.1; PCI-DSS 2.2; NĐ 13/2023 Đ.26; Luật ATTTM Đ.19</w:t>
             </w:r>
           </w:p>
         </w:tc>
@@ -4511,7 +5145,23 @@
           </w:tcPr>
           <w:p>
             <w:r>
-              <w:t>EXPOSE cổng 22/23/3306/5432</w:t>
+              <w:rPr>
+                <w:b/>
+              </w:rPr>
+              <w:t>Không</w:t>
+            </w:r>
+            <w:r>
+              <w:t xml:space="preserve"> được </w:t>
+            </w:r>
+            <w:r>
+              <w:rPr>
+                <w:rFonts w:ascii="Consolas" w:hAnsi="Consolas"/>
+                <w:sz w:val="20"/>
+              </w:rPr>
+              <w:t>EXPOSE</w:t>
+            </w:r>
+            <w:r>
+              <w:t xml:space="preserve"> cổng quản trị/CSDL (22/23/3306/5432)</w:t>
             </w:r>
           </w:p>
         </w:tc>
@@ -4521,13 +5171,7 @@
           </w:tcPr>
           <w:p>
             <w:r>
-              <w:t xml:space="preserve">CIS Docker 5.8; NIST SP 800-190; </w:t>
-            </w:r>
-            <w:r>
-              <w:rPr>
-                <w:b/>
-              </w:rPr>
-              <w:t>Luật ATTTM Đ.19</w:t>
+              <w:t>CIS Docker 5.8; NIST SP 800-190; Luật ATTTM Đ.19</w:t>
             </w:r>
           </w:p>
         </w:tc>
@@ -4549,7 +5193,42 @@
           </w:tcPr>
           <w:p>
             <w:r>
-              <w:t>thiếu nhãn nguồn gốc OCI (provenance khai báo); dùng :latest/ADD; chưa ghim digest</w:t>
+              <w:rPr>
+                <w:b/>
+              </w:rPr>
+              <w:t>Phải</w:t>
+            </w:r>
+            <w:r>
+              <w:t xml:space="preserve"> có nhãn nguồn gốc OCI; </w:t>
+            </w:r>
+            <w:r>
+              <w:rPr>
+                <w:b/>
+              </w:rPr>
+              <w:t>không</w:t>
+            </w:r>
+            <w:r>
+              <w:t xml:space="preserve"> dùng </w:t>
+            </w:r>
+            <w:r>
+              <w:rPr>
+                <w:rFonts w:ascii="Consolas" w:hAnsi="Consolas"/>
+                <w:sz w:val="20"/>
+              </w:rPr>
+              <w:t>:latest</w:t>
+            </w:r>
+            <w:r>
+              <w:t>/</w:t>
+            </w:r>
+            <w:r>
+              <w:rPr>
+                <w:rFonts w:ascii="Consolas" w:hAnsi="Consolas"/>
+                <w:sz w:val="20"/>
+              </w:rPr>
+              <w:t>ADD</w:t>
+            </w:r>
+            <w:r>
+              <w:t>; nên ghim digest</w:t>
             </w:r>
           </w:p>
         </w:tc>
@@ -4587,7 +5266,30 @@
           </w:tcPr>
           <w:p>
             <w:r>
-              <w:t>nhúng bí mật trong ENV/ARG</w:t>
+              <w:rPr>
+                <w:b/>
+              </w:rPr>
+              <w:t>Không</w:t>
+            </w:r>
+            <w:r>
+              <w:t xml:space="preserve"> đặt bí mật/credential trong </w:t>
+            </w:r>
+            <w:r>
+              <w:rPr>
+                <w:rFonts w:ascii="Consolas" w:hAnsi="Consolas"/>
+                <w:sz w:val="20"/>
+              </w:rPr>
+              <w:t>ENV</w:t>
+            </w:r>
+            <w:r>
+              <w:t>/</w:t>
+            </w:r>
+            <w:r>
+              <w:rPr>
+                <w:rFonts w:ascii="Consolas" w:hAnsi="Consolas"/>
+                <w:sz w:val="20"/>
+              </w:rPr>
+              <w:t>ARG</w:t>
             </w:r>
           </w:p>
         </w:tc>
@@ -4597,13 +5299,7 @@
           </w:tcPr>
           <w:p>
             <w:r>
-              <w:t xml:space="preserve">CIS Docker 4.10; PCI-DSS 8.3; GDPR Đ.32; </w:t>
-            </w:r>
-            <w:r>
-              <w:rPr>
-                <w:b/>
-              </w:rPr>
-              <w:t>NĐ 13/2023 Đ.26</w:t>
+              <w:t>CIS Docker 4.10; PCI-DSS 8.2.1; GDPR Đ.32; NĐ 13/2023 Đ.26</w:t>
             </w:r>
           </w:p>
         </w:tc>
@@ -4674,7 +5370,7 @@
         <w:rPr>
           <w:i/>
         </w:rPr>
-        <w:t>"…container runs as root. (CIS Docker 4.1; PCI-DSS 2.2.6; NĐ 13/2023 Đ.26; Luật ATTTM 2015 Đ.19)"</w:t>
+        <w:t>"…container runs as root. (CIS Docker 4.1; PCI-DSS 2.2; NĐ 13/2023 Đ.26; Luật ATTTM 2015 Đ.19)"</w:t>
       </w:r>
       <w:r>
         <w:t xml:space="preserve">. Nhờ vậy khi cổng chặn phát hành, người đọc thấy ngay </w:t>
@@ -5206,7 +5902,7 @@
           <w:i/>
           <w:sz w:val="22"/>
         </w:rPr>
-        <w:t>Bảng 8. Các cổng kiểm soát và lệnh chạy</w:t>
+        <w:t>Bảng 9. Các cổng kiểm soát và lệnh chạy</w:t>
       </w:r>
     </w:p>
     <w:tbl>
@@ -5577,7 +6273,7 @@
           <w:i/>
           <w:sz w:val="22"/>
         </w:rPr>
-        <w:t>Bảng 9. Liên hệ đoạn mã demo với tài liệu môn học</w:t>
+        <w:t>Bảng 10. Liên hệ đoạn mã demo với tài liệu môn học</w:t>
       </w:r>
     </w:p>
     <w:tbl>
@@ -6143,7 +6839,7 @@
           <w:i/>
           <w:sz w:val="22"/>
         </w:rPr>
-        <w:t>Bảng 10. Ánh xạ lỗi với chính sách (quốc tế và Việt Nam)</w:t>
+        <w:t>Bảng 11. Ánh xạ lỗi với chính sách (quốc tế và Việt Nam)</w:t>
       </w:r>
     </w:p>
     <w:tbl>
@@ -6471,7 +7167,7 @@
         <w:pStyle w:val="ListBullet"/>
       </w:pPr>
       <w:r>
-        <w:t>CIS Docker Benchmark; PCI-DSS v3.2.1 (Yêu cầu 3.4, 8.3, 2.2.x); OWASP Top 10 2021; SLSA.</w:t>
+        <w:t>CIS Docker Benchmark; PCI-DSS v3.2.1 (Yêu cầu 3.4, 8.2.1, 2.2); OWASP Top 10 2021; SLSA.</w:t>
       </w:r>
     </w:p>
     <w:p>
@@ -6904,7 +7600,7 @@
                 <w:sz w:val="17"/>
               </w:rPr>
               <w:tab/>
-              <w:t>msg := "LEAST-PRIVILEGE: final stage has no USER instruction; container runs as root. (CIS Docker 4.1; PCI-DSS 2.2.6; NIST SP 800-190; NĐ 13/2023 Đ.26; Luật ATTTM 2015 Đ.19)"</w:t>
+              <w:t>msg := "LEAST-PRIVILEGE: final stage has no USER instruction; container runs as root. (CIS Docker 4.1; PCI-DSS 2.2; NIST SP 800-190; NĐ 13/2023 Đ.26; Luật ATTTM 2015 Đ.19)"</w:t>
             </w:r>
             <w:r>
               <w:br/>
@@ -6955,7 +7651,7 @@
                 <w:sz w:val="17"/>
               </w:rPr>
               <w:tab/>
-              <w:t>msg := sprintf("LEAST-PRIVILEGE: final USER '%s' is root. (CIS Docker 4.1; PCI-DSS 2.2.6; NĐ 13/2023 Đ.26)", [last_user])</w:t>
+              <w:t>msg := sprintf("LEAST-PRIVILEGE: final USER '%s' is root. (CIS Docker 4.1; PCI-DSS 2.2; NĐ 13/2023 Đ.26)", [last_user])</w:t>
             </w:r>
             <w:r>
               <w:br/>
@@ -7637,7 +8333,7 @@
                 <w:sz w:val="17"/>
               </w:rPr>
               <w:tab/>
-              <w:t>msg := sprintf("SECRET-IN-IMAGE: ENV '%s' hardcodes a credential into the image (exposed via docker history); use build secrets/runtime env. (CIS Docker 4.10; GDPR Art.32; PCI-DSS 8.3; NĐ 13/2023 Đ.26)", [key])</w:t>
+              <w:t>msg := sprintf("SECRET-IN-IMAGE: ENV '%s' hardcodes a credential into the image (exposed via docker history); use build secrets/runtime env. (CIS Docker 4.10; GDPR Art.32; PCI-DSS 8.2.1; NĐ 13/2023 Đ.26)", [key])</w:t>
             </w:r>
             <w:r>
               <w:br/>
@@ -7743,7 +8439,7 @@
                 <w:sz w:val="17"/>
               </w:rPr>
               <w:tab/>
-              <w:t>msg := sprintf("SECRET-IN-IMAGE: ARG '%s' bakes a credential default into the image. (CIS Docker 4.10; GDPR Art.32; PCI-DSS 8.3; NĐ 13/2023 Đ.26)", [split(tok, "=")[0]])</w:t>
+              <w:t>msg := sprintf("SECRET-IN-IMAGE: ARG '%s' bakes a credential default into the image. (CIS Docker 4.10; GDPR Art.32; PCI-DSS 8.2.1; NĐ 13/2023 Đ.26)", [split(tok, "=")[0]])</w:t>
             </w:r>
             <w:r>
               <w:br/>
@@ -8557,7 +9253,7 @@
                 <w:sz w:val="17"/>
               </w:rPr>
               <w:tab/>
-              <w:t>msg := sprintf("[PCI-DSS 8.3 / GDPR Art.32 / NĐ 13/2023 Đ.26] service '%s' has an inline secret in environment: %s", [name, split(e, "=")[0]])</w:t>
+              <w:t>msg := sprintf("[PCI-DSS 8.2.1 / GDPR Art.32 / NĐ 13/2023 Đ.26] service '%s' has an inline secret in environment: %s", [name, split(e, "=")[0]])</w:t>
             </w:r>
             <w:r>
               <w:br/>

</xml_diff>

<commit_message>
docs(report): bang tra phu TOAN BO tieu chuan tham chieu (them GDPR sub-dieu, OWASP, CWE)
- Bang 7 mo rong tu 21 -> 28 dong, phu 100%% trich dan trong than bao cao: them
  GDPR 5(1)(f)/25/32 (ro sub-dieu 32(1)(b)/(d)), OWASP A01/A02/A03 ghep CWE-639/-327/-89,
  NĐ13 Đ.27, Luat ATTTM Đ.16, SLSA L1. Moi tieu chuan deu co tom gon 'yeu cau gi'.
- Them con tro tới Bang tra o §2 (bang du lieu) va §6 (anh xa phap ly).
- Rebuild PDF (27 trang) + DOCX.
</commit_message>
<xml_diff>
--- a/report/BaoCao_DevSecOps_JuiceShop_gon.docx
+++ b/report/BaoCao_DevSecOps_JuiceShop_gon.docx
@@ -1458,6 +1458,23 @@
       </w:tr>
     </w:tbl>
     <w:p/>
+    <w:p>
+      <w:pPr>
+        <w:jc w:val="both"/>
+      </w:pPr>
+      <w:r>
+        <w:t xml:space="preserve">Ý nghĩa cụ thể của từng điều khoản (GDPR, PCI-DSS… và các chuẩn khác) được tóm gọn trong </w:t>
+      </w:r>
+      <w:r>
+        <w:rPr>
+          <w:b/>
+        </w:rPr>
+        <w:t>Bảng tra ở mục 3.2</w:t>
+      </w:r>
+      <w:r>
+        <w:t>.</w:t>
+      </w:r>
+    </w:p>
     <w:p>
       <w:pPr>
         <w:pStyle w:val="Heading2"/>
@@ -2542,7 +2559,16 @@
         <w:jc w:val="both"/>
       </w:pPr>
       <w:r>
-        <w:t xml:space="preserve">Để các trích dẫn trong báo cáo không chỉ là mã số, bảng sau nêu rõ </w:t>
+        <w:t xml:space="preserve">Để </w:t>
+      </w:r>
+      <w:r>
+        <w:rPr>
+          <w:b/>
+        </w:rPr>
+        <w:t>mọi</w:t>
+      </w:r>
+      <w:r>
+        <w:t xml:space="preserve"> trích dẫn trong báo cáo không chỉ là tên + mã số, bảng sau tóm gọn </w:t>
       </w:r>
       <w:r>
         <w:rPr>
@@ -2551,7 +2577,7 @@
         <w:t>mỗi điều khoản yêu cầu gì</w:t>
       </w:r>
       <w:r>
-        <w:t>:</w:t>
+        <w:t>. Bảng này phủ toàn bộ tiêu chuẩn được dùng; các bảng và mục khác chỉ ghi mã, tra ý nghĩa tại đây.</w:t>
       </w:r>
     </w:p>
     <w:p>
@@ -2563,7 +2589,7 @@
           <w:i/>
           <w:sz w:val="22"/>
         </w:rPr>
-        <w:t>Bảng 7. Tra cứu — mỗi điều khoản tiêu chuẩn yêu cầu gì</w:t>
+        <w:t>Bảng 7. Tra cứu — mỗi tiêu chuẩn/điều khoản tham chiếu yêu cầu gì</w:t>
       </w:r>
     </w:p>
     <w:tbl>
@@ -2604,7 +2630,7 @@
                 <w:b/>
                 <w:color w:val="FFFFFF"/>
               </w:rPr>
-              <w:t>Yêu cầu cụ thể</w:t>
+              <w:t>Yêu cầu / ý nghĩa tóm gọn</w:t>
             </w:r>
           </w:p>
         </w:tc>
@@ -2616,7 +2642,7 @@
           </w:tcPr>
           <w:p>
             <w:r>
-              <w:t>CIS Docker 4.1</w:t>
+              <w:t>GDPR Điều 5(1)(f)</w:t>
             </w:r>
           </w:p>
         </w:tc>
@@ -2626,13 +2652,16 @@
           </w:tcPr>
           <w:p>
             <w:r>
-              <w:t xml:space="preserve">Chạy container bằng user riêng, </w:t>
+              <w:t xml:space="preserve">Nguyên tắc </w:t>
             </w:r>
             <w:r>
               <w:rPr>
-                <w:b/>
+                <w:i/>
               </w:rPr>
-              <w:t>không phải root</w:t>
+              <w:t>toàn vẹn &amp; bảo mật</w:t>
+            </w:r>
+            <w:r>
+              <w:t>: xử lý dữ liệu một cách an toàn</w:t>
             </w:r>
           </w:p>
         </w:tc>
@@ -2644,7 +2673,7 @@
           </w:tcPr>
           <w:p>
             <w:r>
-              <w:t>CIS Docker 4.5</w:t>
+              <w:t>GDPR Điều 25</w:t>
             </w:r>
           </w:p>
         </w:tc>
@@ -2654,17 +2683,25 @@
           </w:tcPr>
           <w:p>
             <w:r>
-              <w:t xml:space="preserve">Dùng ảnh nền tin cậy, ghim phiên bản/digest (tránh tag động </w:t>
+              <w:t xml:space="preserve">Bảo vệ dữ liệu </w:t>
             </w:r>
             <w:r>
               <w:rPr>
-                <w:rFonts w:ascii="Consolas" w:hAnsi="Consolas"/>
-                <w:sz w:val="20"/>
+                <w:i/>
               </w:rPr>
-              <w:t>:latest</w:t>
-            </w:r>
-            <w:r>
-              <w:t>)</w:t>
+              <w:t>từ thiết kế</w:t>
+            </w:r>
+            <w:r>
+              <w:t xml:space="preserve"> (khoản 1) và </w:t>
+            </w:r>
+            <w:r>
+              <w:rPr>
+                <w:i/>
+              </w:rPr>
+              <w:t>theo mặc định</w:t>
+            </w:r>
+            <w:r>
+              <w:t xml:space="preserve"> (khoản 2)</w:t>
             </w:r>
           </w:p>
         </w:tc>
@@ -2676,7 +2713,7 @@
           </w:tcPr>
           <w:p>
             <w:r>
-              <w:t>CIS Docker 4.9</w:t>
+              <w:t>GDPR Điều 32</w:t>
             </w:r>
           </w:p>
         </w:tc>
@@ -2686,27 +2723,7 @@
           </w:tcPr>
           <w:p>
             <w:r>
-              <w:t xml:space="preserve">Dùng </w:t>
-            </w:r>
-            <w:r>
-              <w:rPr>
-                <w:rFonts w:ascii="Consolas" w:hAnsi="Consolas"/>
-                <w:sz w:val="20"/>
-              </w:rPr>
-              <w:t>COPY</w:t>
-            </w:r>
-            <w:r>
-              <w:t xml:space="preserve"> thay cho </w:t>
-            </w:r>
-            <w:r>
-              <w:rPr>
-                <w:rFonts w:ascii="Consolas" w:hAnsi="Consolas"/>
-                <w:sz w:val="20"/>
-              </w:rPr>
-              <w:t>ADD</w:t>
-            </w:r>
-            <w:r>
-              <w:t xml:space="preserve"> (tránh kéo nội dung từ xa ngoài kiểm soát)</w:t>
+              <w:t>Biện pháp kỹ thuật &amp; tổ chức bảo đảm an toàn khi xử lý — (1)(b) bí mật/toàn vẹn, (1)(d) kiểm thử &amp; đánh giá định kỳ</w:t>
             </w:r>
           </w:p>
         </w:tc>
@@ -2718,7 +2735,7 @@
           </w:tcPr>
           <w:p>
             <w:r>
-              <w:t>CIS Docker 4.10</w:t>
+              <w:t>OWASP A01:2021 / CWE-639</w:t>
             </w:r>
           </w:p>
         </w:tc>
@@ -2728,7 +2745,13 @@
           </w:tcPr>
           <w:p>
             <w:r>
-              <w:t>Không lưu bí mật trong Dockerfile</w:t>
+              <w:rPr>
+                <w:i/>
+              </w:rPr>
+              <w:t>Broken Access Control</w:t>
+            </w:r>
+            <w:r>
+              <w:t xml:space="preserve"> — kiểm soát truy cập bị phá vỡ (IDOR)</w:t>
             </w:r>
           </w:p>
         </w:tc>
@@ -2740,7 +2763,7 @@
           </w:tcPr>
           <w:p>
             <w:r>
-              <w:t>CIS Docker 5.3</w:t>
+              <w:t>OWASP A02:2021 / CWE-327</w:t>
             </w:r>
           </w:p>
         </w:tc>
@@ -2750,17 +2773,13 @@
           </w:tcPr>
           <w:p>
             <w:r>
-              <w:t>Loại bỏ Linux capabilities không cần (</w:t>
-            </w:r>
-            <w:r>
               <w:rPr>
-                <w:rFonts w:ascii="Consolas" w:hAnsi="Consolas"/>
-                <w:sz w:val="20"/>
+                <w:i/>
               </w:rPr>
-              <w:t>cap_drop: ALL</w:t>
-            </w:r>
-            <w:r>
-              <w:t>)</w:t>
+              <w:t>Cryptographic Failures</w:t>
+            </w:r>
+            <w:r>
+              <w:t xml:space="preserve"> — lỗi mật mã (vd băm mật khẩu bằng thuật toán yếu)</w:t>
             </w:r>
           </w:p>
         </w:tc>
@@ -2772,7 +2791,7 @@
           </w:tcPr>
           <w:p>
             <w:r>
-              <w:t>CIS Docker 5.4</w:t>
+              <w:t>OWASP A03:2021 / CWE-89</w:t>
             </w:r>
           </w:p>
         </w:tc>
@@ -2782,14 +2801,13 @@
           </w:tcPr>
           <w:p>
             <w:r>
-              <w:t xml:space="preserve">Không chạy container ở chế độ </w:t>
-            </w:r>
-            <w:r>
               <w:rPr>
-                <w:rFonts w:ascii="Consolas" w:hAnsi="Consolas"/>
-                <w:sz w:val="20"/>
+                <w:i/>
               </w:rPr>
-              <w:t>privileged</w:t>
+              <w:t>Injection</w:t>
+            </w:r>
+            <w:r>
+              <w:t xml:space="preserve"> — tiêm nhiễm dữ liệu vào câu lệnh (SQL injection)</w:t>
             </w:r>
           </w:p>
         </w:tc>
@@ -2801,7 +2819,7 @@
           </w:tcPr>
           <w:p>
             <w:r>
-              <w:t>CIS Docker 5.8</w:t>
+              <w:t>PCI-DSS 2.2</w:t>
             </w:r>
           </w:p>
         </w:tc>
@@ -2811,7 +2829,7 @@
           </w:tcPr>
           <w:p>
             <w:r>
-              <w:t>Chỉ mở đúng cổng cần thiết (không mở cổng quản trị/CSDL)</w:t>
+              <w:t>Cấu hình tham số an toàn hệ thống, chạy với đặc quyền tối thiểu</w:t>
             </w:r>
           </w:p>
         </w:tc>
@@ -2823,7 +2841,7 @@
           </w:tcPr>
           <w:p>
             <w:r>
-              <w:t>CIS Docker 5.12</w:t>
+              <w:t>PCI-DSS 3.4</w:t>
             </w:r>
           </w:p>
         </w:tc>
@@ -2833,17 +2851,7 @@
           </w:tcPr>
           <w:p>
             <w:r>
-              <w:t>Gắn hệ thống tệp gốc ở chế độ chỉ đọc (</w:t>
-            </w:r>
-            <w:r>
-              <w:rPr>
-                <w:rFonts w:ascii="Consolas" w:hAnsi="Consolas"/>
-                <w:sz w:val="20"/>
-              </w:rPr>
-              <w:t>read_only</w:t>
-            </w:r>
-            <w:r>
-              <w:t>)</w:t>
+              <w:t>Làm số thẻ (PAN) không đọc được ở mọi nơi lưu trữ</w:t>
             </w:r>
           </w:p>
         </w:tc>
@@ -2855,7 +2863,7 @@
           </w:tcPr>
           <w:p>
             <w:r>
-              <w:t>CIS Docker 5.31</w:t>
+              <w:t>PCI-DSS 8.2.1</w:t>
             </w:r>
           </w:p>
         </w:tc>
@@ -2865,7 +2873,7 @@
           </w:tcPr>
           <w:p>
             <w:r>
-              <w:t>Không mount Docker socket vào container</w:t>
+              <w:t>Không lưu thông tin xác thực (credential) ở dạng đọc được</w:t>
             </w:r>
           </w:p>
         </w:tc>
@@ -2877,7 +2885,7 @@
           </w:tcPr>
           <w:p>
             <w:r>
-              <w:t>PCI-DSS 2.2</w:t>
+              <w:t>CIS Docker 4.1</w:t>
             </w:r>
           </w:p>
         </w:tc>
@@ -2887,7 +2895,13 @@
           </w:tcPr>
           <w:p>
             <w:r>
-              <w:t>Cấu hình tham số an toàn hệ thống, chạy với đặc quyền tối thiểu</w:t>
+              <w:t xml:space="preserve">Chạy container bằng user riêng, </w:t>
+            </w:r>
+            <w:r>
+              <w:rPr>
+                <w:b/>
+              </w:rPr>
+              <w:t>không phải root</w:t>
             </w:r>
           </w:p>
         </w:tc>
@@ -2899,7 +2913,7 @@
           </w:tcPr>
           <w:p>
             <w:r>
-              <w:t>PCI-DSS 3.4</w:t>
+              <w:t>CIS Docker 4.5</w:t>
             </w:r>
           </w:p>
         </w:tc>
@@ -2909,7 +2923,17 @@
           </w:tcPr>
           <w:p>
             <w:r>
-              <w:t>Làm số thẻ (PAN) không đọc được ở mọi nơi lưu trữ</w:t>
+              <w:t xml:space="preserve">Dùng ảnh nền tin cậy, ghim phiên bản/digest (tránh tag động </w:t>
+            </w:r>
+            <w:r>
+              <w:rPr>
+                <w:rFonts w:ascii="Consolas" w:hAnsi="Consolas"/>
+                <w:sz w:val="20"/>
+              </w:rPr>
+              <w:t>:latest</w:t>
+            </w:r>
+            <w:r>
+              <w:t>)</w:t>
             </w:r>
           </w:p>
         </w:tc>
@@ -2921,7 +2945,7 @@
           </w:tcPr>
           <w:p>
             <w:r>
-              <w:t>PCI-DSS 8.2.1</w:t>
+              <w:t>CIS Docker 4.9</w:t>
             </w:r>
           </w:p>
         </w:tc>
@@ -2931,7 +2955,27 @@
           </w:tcPr>
           <w:p>
             <w:r>
-              <w:t>Không lưu thông tin xác thực (credential) ở dạng đọc được</w:t>
+              <w:t xml:space="preserve">Dùng </w:t>
+            </w:r>
+            <w:r>
+              <w:rPr>
+                <w:rFonts w:ascii="Consolas" w:hAnsi="Consolas"/>
+                <w:sz w:val="20"/>
+              </w:rPr>
+              <w:t>COPY</w:t>
+            </w:r>
+            <w:r>
+              <w:t xml:space="preserve"> thay cho </w:t>
+            </w:r>
+            <w:r>
+              <w:rPr>
+                <w:rFonts w:ascii="Consolas" w:hAnsi="Consolas"/>
+                <w:sz w:val="20"/>
+              </w:rPr>
+              <w:t>ADD</w:t>
+            </w:r>
+            <w:r>
+              <w:t xml:space="preserve"> (tránh kéo nội dung từ xa ngoài kiểm soát)</w:t>
             </w:r>
           </w:p>
         </w:tc>
@@ -2943,7 +2987,7 @@
           </w:tcPr>
           <w:p>
             <w:r>
-              <w:t>GDPR Điều 5(1)(f)</w:t>
+              <w:t>CIS Docker 4.10</w:t>
             </w:r>
           </w:p>
         </w:tc>
@@ -2953,7 +2997,7 @@
           </w:tcPr>
           <w:p>
             <w:r>
-              <w:t>Nguyên tắc toàn vẹn &amp; bảo mật khi xử lý dữ liệu</w:t>
+              <w:t>Không lưu bí mật trong Dockerfile</w:t>
             </w:r>
           </w:p>
         </w:tc>
@@ -2965,7 +3009,7 @@
           </w:tcPr>
           <w:p>
             <w:r>
-              <w:t>GDPR Điều 25</w:t>
+              <w:t>CIS Docker 5.3</w:t>
             </w:r>
           </w:p>
         </w:tc>
@@ -2975,7 +3019,17 @@
           </w:tcPr>
           <w:p>
             <w:r>
-              <w:t>Bảo vệ dữ liệu ngay từ thiết kế và theo mặc định</w:t>
+              <w:t>Loại bỏ Linux capabilities không cần (</w:t>
+            </w:r>
+            <w:r>
+              <w:rPr>
+                <w:rFonts w:ascii="Consolas" w:hAnsi="Consolas"/>
+                <w:sz w:val="20"/>
+              </w:rPr>
+              <w:t>cap_drop: ALL</w:t>
+            </w:r>
+            <w:r>
+              <w:t>)</w:t>
             </w:r>
           </w:p>
         </w:tc>
@@ -2987,7 +3041,7 @@
           </w:tcPr>
           <w:p>
             <w:r>
-              <w:t>GDPR Điều 32</w:t>
+              <w:t>CIS Docker 5.4</w:t>
             </w:r>
           </w:p>
         </w:tc>
@@ -2997,7 +3051,14 @@
           </w:tcPr>
           <w:p>
             <w:r>
-              <w:t>Biện pháp kỹ thuật &amp; tổ chức bảo đảm an toàn khi xử lý</w:t>
+              <w:t xml:space="preserve">Không chạy container ở chế độ </w:t>
+            </w:r>
+            <w:r>
+              <w:rPr>
+                <w:rFonts w:ascii="Consolas" w:hAnsi="Consolas"/>
+                <w:sz w:val="20"/>
+              </w:rPr>
+              <w:t>privileged</w:t>
             </w:r>
           </w:p>
         </w:tc>
@@ -3009,7 +3070,7 @@
           </w:tcPr>
           <w:p>
             <w:r>
-              <w:t>NĐ 13/2023 Điều 3</w:t>
+              <w:t>CIS Docker 5.8</w:t>
             </w:r>
           </w:p>
         </w:tc>
@@ -3019,7 +3080,7 @@
           </w:tcPr>
           <w:p>
             <w:r>
-              <w:t>Nguyên tắc bảo vệ dữ liệu cá nhân (gồm nguyên tắc bảo mật, an toàn)</w:t>
+              <w:t>Chỉ mở đúng cổng cần thiết (không mở cổng quản trị/CSDL)</w:t>
             </w:r>
           </w:p>
         </w:tc>
@@ -3031,7 +3092,7 @@
           </w:tcPr>
           <w:p>
             <w:r>
-              <w:t>NĐ 13/2023 Điều 26</w:t>
+              <w:t>CIS Docker 5.12</w:t>
             </w:r>
           </w:p>
         </w:tc>
@@ -3041,7 +3102,17 @@
           </w:tcPr>
           <w:p>
             <w:r>
-              <w:t>Biện pháp quản lý &amp; kỹ thuật bảo vệ dữ liệu cá nhân, từ đầu và suốt quá trình xử lý</w:t>
+              <w:t>Gắn hệ thống tệp gốc ở chế độ chỉ đọc (</w:t>
+            </w:r>
+            <w:r>
+              <w:rPr>
+                <w:rFonts w:ascii="Consolas" w:hAnsi="Consolas"/>
+                <w:sz w:val="20"/>
+              </w:rPr>
+              <w:t>read_only</w:t>
+            </w:r>
+            <w:r>
+              <w:t>)</w:t>
             </w:r>
           </w:p>
         </w:tc>
@@ -3053,7 +3124,7 @@
           </w:tcPr>
           <w:p>
             <w:r>
-              <w:t>Luật ATTTM 2015 Điều 17</w:t>
+              <w:t>CIS Docker 5.31</w:t>
             </w:r>
           </w:p>
         </w:tc>
@@ -3063,7 +3134,7 @@
           </w:tcPr>
           <w:p>
             <w:r>
-              <w:t>Không chia sẻ thông tin cá nhân cho bên thứ ba khi chưa được đồng ý</w:t>
+              <w:t>Không mount Docker socket vào container</w:t>
             </w:r>
           </w:p>
         </w:tc>
@@ -3075,7 +3146,7 @@
           </w:tcPr>
           <w:p>
             <w:r>
-              <w:t>Luật ATTTM 2015 Điều 19</w:t>
+              <w:t>OCI image-spec</w:t>
             </w:r>
           </w:p>
         </w:tc>
@@ -3085,7 +3156,7 @@
           </w:tcPr>
           <w:p>
             <w:r>
-              <w:t>Biện pháp quản lý &amp; kỹ thuật bảo đảm an toàn thông tin cá nhân; tuân thủ tiêu chuẩn kỹ thuật</w:t>
+              <w:t>Chuẩn định dạng ảnh container + nhãn metadata nguồn gốc</w:t>
             </w:r>
           </w:p>
         </w:tc>
@@ -3097,7 +3168,7 @@
           </w:tcPr>
           <w:p>
             <w:r>
-              <w:t>OCI image-spec / SLSA</w:t>
+              <w:t>SLSA (L1)</w:t>
             </w:r>
           </w:p>
         </w:tc>
@@ -3107,7 +3178,13 @@
           </w:tcPr>
           <w:p>
             <w:r>
-              <w:t>Khai báo nguồn gốc (provenance) &amp; bảo đảm toàn vẹn chuỗi cung ứng ảnh</w:t>
+              <w:t xml:space="preserve">Khung toàn vẹn chuỗi cung ứng; mức L1 = </w:t>
+            </w:r>
+            <w:r>
+              <w:rPr>
+                <w:i/>
+              </w:rPr>
+              <w:t>có khai báo nguồn gốc (provenance)</w:t>
             </w:r>
           </w:p>
         </w:tc>
@@ -3130,6 +3207,138 @@
           <w:p>
             <w:r>
               <w:t>Hướng dẫn an toàn cho container</w:t>
+            </w:r>
+          </w:p>
+        </w:tc>
+      </w:tr>
+      <w:tr>
+        <w:tc>
+          <w:tcPr>
+            <w:tcW w:type="dxa" w:w="4819"/>
+          </w:tcPr>
+          <w:p>
+            <w:r>
+              <w:t>NĐ 13/2023 Điều 3</w:t>
+            </w:r>
+          </w:p>
+        </w:tc>
+        <w:tc>
+          <w:tcPr>
+            <w:tcW w:type="dxa" w:w="4819"/>
+          </w:tcPr>
+          <w:p>
+            <w:r>
+              <w:t>Nguyên tắc bảo vệ dữ liệu cá nhân (gồm nguyên tắc bảo mật, an toàn)</w:t>
+            </w:r>
+          </w:p>
+        </w:tc>
+      </w:tr>
+      <w:tr>
+        <w:tc>
+          <w:tcPr>
+            <w:tcW w:type="dxa" w:w="4819"/>
+          </w:tcPr>
+          <w:p>
+            <w:r>
+              <w:t>NĐ 13/2023 Điều 26</w:t>
+            </w:r>
+          </w:p>
+        </w:tc>
+        <w:tc>
+          <w:tcPr>
+            <w:tcW w:type="dxa" w:w="4819"/>
+          </w:tcPr>
+          <w:p>
+            <w:r>
+              <w:t>Biện pháp quản lý &amp; kỹ thuật bảo vệ dữ liệu cá nhân, từ đầu và suốt quá trình xử lý</w:t>
+            </w:r>
+          </w:p>
+        </w:tc>
+      </w:tr>
+      <w:tr>
+        <w:tc>
+          <w:tcPr>
+            <w:tcW w:type="dxa" w:w="4819"/>
+          </w:tcPr>
+          <w:p>
+            <w:r>
+              <w:t>NĐ 13/2023 Điều 27</w:t>
+            </w:r>
+          </w:p>
+        </w:tc>
+        <w:tc>
+          <w:tcPr>
+            <w:tcW w:type="dxa" w:w="4819"/>
+          </w:tcPr>
+          <w:p>
+            <w:r>
+              <w:t>Biện pháp bảo vệ dữ liệu cá nhân cơ bản</w:t>
+            </w:r>
+          </w:p>
+        </w:tc>
+      </w:tr>
+      <w:tr>
+        <w:tc>
+          <w:tcPr>
+            <w:tcW w:type="dxa" w:w="4819"/>
+          </w:tcPr>
+          <w:p>
+            <w:r>
+              <w:t>Luật ATTTM 2015 Điều 16</w:t>
+            </w:r>
+          </w:p>
+        </w:tc>
+        <w:tc>
+          <w:tcPr>
+            <w:tcW w:type="dxa" w:w="4819"/>
+          </w:tcPr>
+          <w:p>
+            <w:r>
+              <w:t>Nguyên tắc bảo vệ thông tin cá nhân</w:t>
+            </w:r>
+          </w:p>
+        </w:tc>
+      </w:tr>
+      <w:tr>
+        <w:tc>
+          <w:tcPr>
+            <w:tcW w:type="dxa" w:w="4819"/>
+          </w:tcPr>
+          <w:p>
+            <w:r>
+              <w:t>Luật ATTTM 2015 Điều 17</w:t>
+            </w:r>
+          </w:p>
+        </w:tc>
+        <w:tc>
+          <w:tcPr>
+            <w:tcW w:type="dxa" w:w="4819"/>
+          </w:tcPr>
+          <w:p>
+            <w:r>
+              <w:t>Không chia sẻ thông tin cá nhân cho bên thứ ba khi chưa được đồng ý</w:t>
+            </w:r>
+          </w:p>
+        </w:tc>
+      </w:tr>
+      <w:tr>
+        <w:tc>
+          <w:tcPr>
+            <w:tcW w:type="dxa" w:w="4819"/>
+          </w:tcPr>
+          <w:p>
+            <w:r>
+              <w:t>Luật ATTTM 2015 Điều 19</w:t>
+            </w:r>
+          </w:p>
+        </w:tc>
+        <w:tc>
+          <w:tcPr>
+            <w:tcW w:type="dxa" w:w="4819"/>
+          </w:tcPr>
+          <w:p>
+            <w:r>
+              <w:t>Biện pháp quản lý &amp; kỹ thuật bảo đảm an toàn thông tin cá nhân; tuân thủ tiêu chuẩn kỹ thuật</w:t>
             </w:r>
           </w:p>
         </w:tc>
@@ -6827,7 +7036,16 @@
         <w:t>pháp luật Việt Nam</w:t>
       </w:r>
       <w:r>
-        <w:t xml:space="preserve"> — Nghị định 13/2023/NĐ-CP (bảo vệ dữ liệu cá nhân) và Luật An toàn thông tin mạng 2015.</w:t>
+        <w:t xml:space="preserve"> — Nghị định 13/2023/NĐ-CP (bảo vệ dữ liệu cá nhân) và Luật An toàn thông tin mạng 2015. Ý nghĩa cụ thể của từng điều khoản xem </w:t>
+      </w:r>
+      <w:r>
+        <w:rPr>
+          <w:b/>
+        </w:rPr>
+        <w:t>Bảng tra ở mục 3.2</w:t>
+      </w:r>
+      <w:r>
+        <w:t>.</w:t>
       </w:r>
     </w:p>
     <w:p>

</xml_diff>

<commit_message>
docs(report): dua Quy trinh DevSecOps len §4 (truoc 4 loi) + anh chay that + phu 7 pha lab guide
- Thiet ke lai: §4 = Quy trinh DevSecOps (diagram + cong kiem soat) dat TRUOC §5 Bon loi
  (truoc day so do nam o cuoi, sau 4 loi). Danh so lai muc/cross-ref, @fig tu phan giai.
- Them 3 ANH CHAY THAT (output thuc te, report/figures/capture_runs.py tu chup):
  env.png (2 moi truong up), gitleaks.png (24 commit/no leaks), conftest-verify.png (17/17).
- Them Bang 9 phu TOAN BO 7 pha cua Hands-on Lab Guide, ghi ro thay cong cu tuong duong
  (Semgrep thay SonarQube, Conftest+docker inspect thay InSpec) + minh chung tung pha.
- Rebuild PDF (27 trang) + DOCX.
</commit_message>
<xml_diff>
--- a/report/BaoCao_DevSecOps_JuiceShop_gon.docx
+++ b/report/BaoCao_DevSecOps_JuiceShop_gon.docx
@@ -3372,7 +3372,1563 @@
         <w:pStyle w:val="Heading1"/>
       </w:pPr>
       <w:r>
-        <w:t>4. Bốn lỗi an toàn: phát hiện và xử lý</w:t>
+        <w:t>4. Quy trình DevSecOps và các cổng kiểm soát</w:t>
+      </w:r>
+    </w:p>
+    <w:p>
+      <w:pPr>
+        <w:jc w:val="both"/>
+      </w:pPr>
+      <w:r>
+        <w:t>Toàn bộ việc phát hiện và chống tái diễn bốn lỗi được viết thành mã và chạy tự động như một chuỗi kiểm soát (pipeline cục bộ), đúng tinh thần DevSecOps. Hình dưới ánh xạ từng lỗi và cổng kiểm soát vào các pha của vòng đời DevSecOps (xanh dương = Security as Code cho F01/F02; xanh lá = Policy as Code cho F03/F04):</w:t>
+      </w:r>
+    </w:p>
+    <w:p>
+      <w:pPr>
+        <w:jc w:val="center"/>
+      </w:pPr>
+      <w:r>
+        <w:drawing>
+          <wp:inline xmlns:a="http://schemas.openxmlformats.org/drawingml/2006/main" xmlns:pic="http://schemas.openxmlformats.org/drawingml/2006/picture">
+            <wp:extent cx="5760000" cy="2618182"/>
+            <wp:docPr id="2" name="Picture 2"/>
+            <wp:cNvGraphicFramePr>
+              <a:graphicFrameLocks noChangeAspect="1"/>
+            </wp:cNvGraphicFramePr>
+            <a:graphic>
+              <a:graphicData uri="http://schemas.openxmlformats.org/drawingml/2006/picture">
+                <pic:pic>
+                  <pic:nvPicPr>
+                    <pic:cNvPr id="0" name="devsecops-pipeline.png"/>
+                    <pic:cNvPicPr/>
+                  </pic:nvPicPr>
+                  <pic:blipFill>
+                    <a:blip r:embed="rId11"/>
+                    <a:stretch>
+                      <a:fillRect/>
+                    </a:stretch>
+                  </pic:blipFill>
+                  <pic:spPr>
+                    <a:xfrm>
+                      <a:off x="0" y="0"/>
+                      <a:ext cx="5760000" cy="2618182"/>
+                    </a:xfrm>
+                    <a:prstGeom prst="rect"/>
+                  </pic:spPr>
+                </pic:pic>
+              </a:graphicData>
+            </a:graphic>
+          </wp:inline>
+        </w:drawing>
+      </w:r>
+    </w:p>
+    <w:p>
+      <w:pPr>
+        <w:jc w:val="center"/>
+      </w:pPr>
+      <w:r>
+        <w:rPr>
+          <w:i/>
+          <w:sz w:val="22"/>
+        </w:rPr>
+        <w:t xml:space="preserve">Hình 2. </w:t>
+      </w:r>
+      <w:r>
+        <w:rPr>
+          <w:i/>
+          <w:sz w:val="22"/>
+        </w:rPr>
+        <w:t>Quy trình DevSecOps: ánh xạ bốn lỗi F01–F04 và các cổng kiểm soát theo từng pha; Security as Code cho F01/F02, Policy as Code cho F03/F04</w:t>
+      </w:r>
+    </w:p>
+    <w:p>
+      <w:pPr>
+        <w:jc w:val="both"/>
+      </w:pPr>
+      <w:r>
+        <w:t>Hai nhóm kiểm soát trong hình:</w:t>
+      </w:r>
+    </w:p>
+    <w:p>
+      <w:pPr>
+        <w:pStyle w:val="ListBullet"/>
+      </w:pPr>
+      <w:r>
+        <w:rPr>
+          <w:b/>
+        </w:rPr>
+        <w:t>Security as Code:</w:t>
+      </w:r>
+      <w:r>
+        <w:t xml:space="preserve"> quét secret (Gitleaks), SAST (Semgrep) cho F01/F02, và kiểm thử bảo mật </w:t>
+      </w:r>
+      <w:r>
+        <w:rPr>
+          <w:rFonts w:ascii="Consolas" w:hAnsi="Consolas"/>
+          <w:sz w:val="20"/>
+        </w:rPr>
+        <w:t>f01-f02.test.ts</w:t>
+      </w:r>
+      <w:r>
+        <w:t xml:space="preserve"> (đỏ trước vá, xanh sau vá).</w:t>
+      </w:r>
+    </w:p>
+    <w:p>
+      <w:pPr>
+        <w:pStyle w:val="ListBullet"/>
+      </w:pPr>
+      <w:r>
+        <w:rPr>
+          <w:b/>
+        </w:rPr>
+        <w:t>Policy as Code (build-time):</w:t>
+      </w:r>
+      <w:r>
+        <w:t xml:space="preserve"> luật Rego cho Dockerfile (F04) và cho </w:t>
+      </w:r>
+      <w:r>
+        <w:rPr>
+          <w:rFonts w:ascii="Consolas" w:hAnsi="Consolas"/>
+          <w:sz w:val="20"/>
+        </w:rPr>
+        <w:t>docker-compose</w:t>
+      </w:r>
+      <w:r>
+        <w:t xml:space="preserve"> (F03) — chặn cấu hình mở cổng backend hay chạy root </w:t>
+      </w:r>
+      <w:r>
+        <w:rPr>
+          <w:b/>
+        </w:rPr>
+        <w:t>trước khi triển khai</w:t>
+      </w:r>
+      <w:r>
+        <w:t>.</w:t>
+      </w:r>
+    </w:p>
+    <w:p>
+      <w:pPr>
+        <w:pStyle w:val="ListBullet"/>
+      </w:pPr>
+      <w:r>
+        <w:rPr>
+          <w:b/>
+        </w:rPr>
+        <w:t>Compliance as Code (runtime):</w:t>
+      </w:r>
+      <w:r>
+        <w:t xml:space="preserve"> kiểm tra </w:t>
+      </w:r>
+      <w:r>
+        <w:rPr>
+          <w:b/>
+        </w:rPr>
+        <w:t>container đang chạy</w:t>
+      </w:r>
+      <w:r>
+        <w:t xml:space="preserve"> bằng </w:t>
+      </w:r>
+      <w:r>
+        <w:rPr>
+          <w:rFonts w:ascii="Consolas" w:hAnsi="Consolas"/>
+          <w:sz w:val="20"/>
+        </w:rPr>
+        <w:t>docker inspect</w:t>
+      </w:r>
+      <w:r>
+        <w:t xml:space="preserve"> + luật Rego runtime (</w:t>
+      </w:r>
+      <w:r>
+        <w:rPr>
+          <w:rFonts w:ascii="Consolas" w:hAnsi="Consolas"/>
+          <w:sz w:val="20"/>
+        </w:rPr>
+        <w:t>report/policy/runtime.rego</w:t>
+      </w:r>
+      <w:r>
+        <w:t xml:space="preserve">, </w:t>
+      </w:r>
+      <w:r>
+        <w:rPr>
+          <w:rFonts w:ascii="Consolas" w:hAnsi="Consolas"/>
+          <w:sz w:val="20"/>
+        </w:rPr>
+        <w:t>checks/hardening.py</w:t>
+      </w:r>
+      <w:r>
+        <w:t xml:space="preserve">) — xác nhận non-root, drop capability, chỉ proxy mở cổng loopback. So sánh container đối chứng (trước vá) với bản triển khai (sau vá) chính là cặp ca </w:t>
+      </w:r>
+      <w:r>
+        <w:rPr>
+          <w:i/>
+        </w:rPr>
+        <w:t>lỗi cố ý / đạt</w:t>
+      </w:r>
+      <w:r>
+        <w:t xml:space="preserve"> của kiểm tra tuân thủ.</w:t>
+      </w:r>
+    </w:p>
+    <w:p>
+      <w:pPr>
+        <w:jc w:val="both"/>
+      </w:pPr>
+      <w:r>
+        <w:t xml:space="preserve">Nhóm kiểm chứng trên </w:t>
+      </w:r>
+      <w:r>
+        <w:rPr>
+          <w:b/>
+        </w:rPr>
+        <w:t>hai môi trường chạy song song</w:t>
+      </w:r>
+      <w:r>
+        <w:t xml:space="preserve">: container đối chứng </w:t>
+      </w:r>
+      <w:r>
+        <w:rPr>
+          <w:i/>
+        </w:rPr>
+        <w:t>trước vá</w:t>
+      </w:r>
+      <w:r>
+        <w:t xml:space="preserve"> (image gốc, </w:t>
+      </w:r>
+      <w:r>
+        <w:rPr>
+          <w:rFonts w:ascii="Consolas" w:hAnsi="Consolas"/>
+          <w:sz w:val="20"/>
+        </w:rPr>
+        <w:t>127.0.0.1:3100</w:t>
+      </w:r>
+      <w:r>
+        <w:t xml:space="preserve">) và bản triển khai </w:t>
+      </w:r>
+      <w:r>
+        <w:rPr>
+          <w:i/>
+        </w:rPr>
+        <w:t>sau vá</w:t>
+      </w:r>
+      <w:r>
+        <w:t xml:space="preserve"> (reverse proxy + backend ở mạng internal, </w:t>
+      </w:r>
+      <w:r>
+        <w:rPr>
+          <w:rFonts w:ascii="Consolas" w:hAnsi="Consolas"/>
+          <w:sz w:val="20"/>
+        </w:rPr>
+        <w:t>127.0.0.1:3102</w:t>
+      </w:r>
+      <w:r>
+        <w:t>). Cả hai đang chạy:</w:t>
+      </w:r>
+    </w:p>
+    <w:p>
+      <w:pPr>
+        <w:jc w:val="center"/>
+      </w:pPr>
+      <w:r>
+        <w:drawing>
+          <wp:inline xmlns:a="http://schemas.openxmlformats.org/drawingml/2006/main" xmlns:pic="http://schemas.openxmlformats.org/drawingml/2006/picture">
+            <wp:extent cx="5760000" cy="875676"/>
+            <wp:docPr id="3" name="Picture 3"/>
+            <wp:cNvGraphicFramePr>
+              <a:graphicFrameLocks noChangeAspect="1"/>
+            </wp:cNvGraphicFramePr>
+            <a:graphic>
+              <a:graphicData uri="http://schemas.openxmlformats.org/drawingml/2006/picture">
+                <pic:pic>
+                  <pic:nvPicPr>
+                    <pic:cNvPr id="0" name="env.png"/>
+                    <pic:cNvPicPr/>
+                  </pic:nvPicPr>
+                  <pic:blipFill>
+                    <a:blip r:embed="rId12"/>
+                    <a:stretch>
+                      <a:fillRect/>
+                    </a:stretch>
+                  </pic:blipFill>
+                  <pic:spPr>
+                    <a:xfrm>
+                      <a:off x="0" y="0"/>
+                      <a:ext cx="5760000" cy="875676"/>
+                    </a:xfrm>
+                    <a:prstGeom prst="rect"/>
+                  </pic:spPr>
+                </pic:pic>
+              </a:graphicData>
+            </a:graphic>
+          </wp:inline>
+        </w:drawing>
+      </w:r>
+    </w:p>
+    <w:p>
+      <w:pPr>
+        <w:jc w:val="center"/>
+      </w:pPr>
+      <w:r>
+        <w:rPr>
+          <w:i/>
+          <w:sz w:val="22"/>
+        </w:rPr>
+        <w:t xml:space="preserve">Hình 3. </w:t>
+      </w:r>
+      <w:r>
+        <w:rPr>
+          <w:i/>
+          <w:sz w:val="22"/>
+        </w:rPr>
+        <w:t>Hai môi trường: đối chứng trước vá (3100) và triển khai sau vá qua proxy (3102); backend chạy ở mạng internal, không mở cổng host</w:t>
+      </w:r>
+    </w:p>
+    <w:p>
+      <w:pPr>
+        <w:jc w:val="both"/>
+      </w:pPr>
+      <w:r>
+        <w:t xml:space="preserve">Các kiểm soát này được viết thành mã, chạy lặp lại được — hiện chạy cục bộ (xem </w:t>
+      </w:r>
+      <w:r>
+        <w:rPr>
+          <w:rFonts w:ascii="Consolas" w:hAnsi="Consolas"/>
+          <w:sz w:val="20"/>
+        </w:rPr>
+        <w:t>DEMO.md</w:t>
+      </w:r>
+      <w:r>
+        <w:t xml:space="preserve">), và có thể ghép thành một chuỗi cổng (gate) trong CI. Mỗi cổng trả PASS/WARN/FAIL; chỉ mức </w:t>
+      </w:r>
+      <w:r>
+        <w:rPr>
+          <w:b/>
+        </w:rPr>
+        <w:t>FAIL (luật `deny`)</w:t>
+      </w:r>
+      <w:r>
+        <w:t xml:space="preserve"> mới chặn phát hành, còn mức </w:t>
+      </w:r>
+      <w:r>
+        <w:rPr>
+          <w:b/>
+        </w:rPr>
+        <w:t>WARN (luật `warn`)</w:t>
+      </w:r>
+      <w:r>
+        <w:t xml:space="preserve"> chỉ cảnh báo, không chặn. Trong </w:t>
+      </w:r>
+      <w:r>
+        <w:rPr>
+          <w:rFonts w:ascii="Consolas" w:hAnsi="Consolas"/>
+          <w:sz w:val="20"/>
+        </w:rPr>
+        <w:t>compose.rego</w:t>
+      </w:r>
+      <w:r>
+        <w:t xml:space="preserve">, các luật </w:t>
+      </w:r>
+      <w:r>
+        <w:rPr>
+          <w:rFonts w:ascii="Consolas" w:hAnsi="Consolas"/>
+          <w:sz w:val="20"/>
+        </w:rPr>
+        <w:t>cap_drop</w:t>
+      </w:r>
+      <w:r>
+        <w:t>/</w:t>
+      </w:r>
+      <w:r>
+        <w:rPr>
+          <w:rFonts w:ascii="Consolas" w:hAnsi="Consolas"/>
+          <w:sz w:val="20"/>
+        </w:rPr>
+        <w:t>read_only</w:t>
+      </w:r>
+      <w:r>
+        <w:t xml:space="preserve"> là mức WARN (khuyến cáo), còn các luật mở cổng backend, bind ngoài loopback, privileged, mount docker.sock, secret nội tuyến là mức FAIL (chặn).</w:t>
+      </w:r>
+    </w:p>
+    <w:p>
+      <w:pPr>
+        <w:jc w:val="center"/>
+      </w:pPr>
+      <w:r>
+        <w:rPr>
+          <w:i/>
+          <w:sz w:val="22"/>
+        </w:rPr>
+        <w:t>Bảng 8. Các cổng kiểm soát và lệnh chạy</w:t>
+      </w:r>
+    </w:p>
+    <w:tbl>
+      <w:tblPr>
+        <w:tblStyle w:val="TableGrid"/>
+        <w:tblW w:type="auto" w:w="0"/>
+        <w:jc w:val="center"/>
+        <w:tblLook w:firstColumn="1" w:firstRow="1" w:lastColumn="0" w:lastRow="0" w:noHBand="0" w:noVBand="1" w:val="04A0"/>
+      </w:tblPr>
+      <w:tblGrid>
+        <w:gridCol w:w="2409"/>
+        <w:gridCol w:w="2409"/>
+        <w:gridCol w:w="2409"/>
+        <w:gridCol w:w="2409"/>
+      </w:tblGrid>
+      <w:tr>
+        <w:tc>
+          <w:tcPr>
+            <w:tcW w:type="dxa" w:w="2409"/>
+            <w:shd w:val="clear" w:color="auto" w:fill="0B2A4A"/>
+          </w:tcPr>
+          <w:p>
+            <w:r>
+              <w:rPr>
+                <w:b/>
+                <w:color w:val="FFFFFF"/>
+              </w:rPr>
+              <w:t>Cổng kiểm soát</w:t>
+            </w:r>
+          </w:p>
+        </w:tc>
+        <w:tc>
+          <w:tcPr>
+            <w:tcW w:type="dxa" w:w="2409"/>
+            <w:shd w:val="clear" w:color="auto" w:fill="0B2A4A"/>
+          </w:tcPr>
+          <w:p>
+            <w:r>
+              <w:rPr>
+                <w:b/>
+                <w:color w:val="FFFFFF"/>
+              </w:rPr>
+              <w:t>Công cụ</w:t>
+            </w:r>
+          </w:p>
+        </w:tc>
+        <w:tc>
+          <w:tcPr>
+            <w:tcW w:type="dxa" w:w="2409"/>
+            <w:shd w:val="clear" w:color="auto" w:fill="0B2A4A"/>
+          </w:tcPr>
+          <w:p>
+            <w:r>
+              <w:rPr>
+                <w:b/>
+                <w:color w:val="FFFFFF"/>
+              </w:rPr>
+              <w:t>Lỗi được kiểm soát</w:t>
+            </w:r>
+          </w:p>
+        </w:tc>
+        <w:tc>
+          <w:tcPr>
+            <w:tcW w:type="dxa" w:w="2409"/>
+            <w:shd w:val="clear" w:color="auto" w:fill="0B2A4A"/>
+          </w:tcPr>
+          <w:p>
+            <w:r>
+              <w:rPr>
+                <w:b/>
+                <w:color w:val="FFFFFF"/>
+              </w:rPr>
+              <w:t>Chặn phát hành</w:t>
+            </w:r>
+          </w:p>
+        </w:tc>
+      </w:tr>
+      <w:tr>
+        <w:tc>
+          <w:tcPr>
+            <w:tcW w:type="dxa" w:w="2409"/>
+          </w:tcPr>
+          <w:p>
+            <w:r>
+              <w:t>Quét secret</w:t>
+            </w:r>
+          </w:p>
+        </w:tc>
+        <w:tc>
+          <w:tcPr>
+            <w:tcW w:type="dxa" w:w="2409"/>
+          </w:tcPr>
+          <w:p>
+            <w:r>
+              <w:t>Gitleaks</w:t>
+            </w:r>
+          </w:p>
+        </w:tc>
+        <w:tc>
+          <w:tcPr>
+            <w:tcW w:type="dxa" w:w="2409"/>
+          </w:tcPr>
+          <w:p>
+            <w:r>
+              <w:t>khóa/bí mật lộ trong mã</w:t>
+            </w:r>
+          </w:p>
+        </w:tc>
+        <w:tc>
+          <w:tcPr>
+            <w:tcW w:type="dxa" w:w="2409"/>
+          </w:tcPr>
+          <w:p>
+            <w:r>
+              <w:t>có</w:t>
+            </w:r>
+          </w:p>
+        </w:tc>
+      </w:tr>
+      <w:tr>
+        <w:tc>
+          <w:tcPr>
+            <w:tcW w:type="dxa" w:w="2409"/>
+          </w:tcPr>
+          <w:p>
+            <w:r>
+              <w:t>SAST</w:t>
+            </w:r>
+          </w:p>
+        </w:tc>
+        <w:tc>
+          <w:tcPr>
+            <w:tcW w:type="dxa" w:w="2409"/>
+          </w:tcPr>
+          <w:p>
+            <w:r>
+              <w:t>Semgrep</w:t>
+            </w:r>
+          </w:p>
+        </w:tc>
+        <w:tc>
+          <w:tcPr>
+            <w:tcW w:type="dxa" w:w="2409"/>
+          </w:tcPr>
+          <w:p>
+            <w:r>
+              <w:t>F01, F02</w:t>
+            </w:r>
+          </w:p>
+        </w:tc>
+        <w:tc>
+          <w:tcPr>
+            <w:tcW w:type="dxa" w:w="2409"/>
+          </w:tcPr>
+          <w:p>
+            <w:r>
+              <w:t>có</w:t>
+            </w:r>
+          </w:p>
+        </w:tc>
+      </w:tr>
+      <w:tr>
+        <w:tc>
+          <w:tcPr>
+            <w:tcW w:type="dxa" w:w="2409"/>
+          </w:tcPr>
+          <w:p>
+            <w:r>
+              <w:t>Kiểm thử bảo mật</w:t>
+            </w:r>
+          </w:p>
+        </w:tc>
+        <w:tc>
+          <w:tcPr>
+            <w:tcW w:type="dxa" w:w="2409"/>
+          </w:tcPr>
+          <w:p>
+            <w:r>
+              <w:t>node:test (Supertest)</w:t>
+            </w:r>
+          </w:p>
+        </w:tc>
+        <w:tc>
+          <w:tcPr>
+            <w:tcW w:type="dxa" w:w="2409"/>
+          </w:tcPr>
+          <w:p>
+            <w:r>
+              <w:t>F01, F02 (đỏ→xanh)</w:t>
+            </w:r>
+          </w:p>
+        </w:tc>
+        <w:tc>
+          <w:tcPr>
+            <w:tcW w:type="dxa" w:w="2409"/>
+          </w:tcPr>
+          <w:p>
+            <w:r>
+              <w:t>có</w:t>
+            </w:r>
+          </w:p>
+        </w:tc>
+      </w:tr>
+      <w:tr>
+        <w:tc>
+          <w:tcPr>
+            <w:tcW w:type="dxa" w:w="2409"/>
+          </w:tcPr>
+          <w:p>
+            <w:r>
+              <w:t>Policy as Code — build</w:t>
+            </w:r>
+          </w:p>
+        </w:tc>
+        <w:tc>
+          <w:tcPr>
+            <w:tcW w:type="dxa" w:w="2409"/>
+          </w:tcPr>
+          <w:p>
+            <w:r>
+              <w:t>Conftest/OPA (Rego)</w:t>
+            </w:r>
+          </w:p>
+        </w:tc>
+        <w:tc>
+          <w:tcPr>
+            <w:tcW w:type="dxa" w:w="2409"/>
+          </w:tcPr>
+          <w:p>
+            <w:r>
+              <w:t>F03, F04 (Dockerfile, compose)</w:t>
+            </w:r>
+          </w:p>
+        </w:tc>
+        <w:tc>
+          <w:tcPr>
+            <w:tcW w:type="dxa" w:w="2409"/>
+          </w:tcPr>
+          <w:p>
+            <w:r>
+              <w:t xml:space="preserve">có — luật </w:t>
+            </w:r>
+            <w:r>
+              <w:rPr>
+                <w:rFonts w:ascii="Consolas" w:hAnsi="Consolas"/>
+                <w:sz w:val="20"/>
+              </w:rPr>
+              <w:t>deny</w:t>
+            </w:r>
+            <w:r>
+              <w:t xml:space="preserve">; luật </w:t>
+            </w:r>
+            <w:r>
+              <w:rPr>
+                <w:rFonts w:ascii="Consolas" w:hAnsi="Consolas"/>
+                <w:sz w:val="20"/>
+              </w:rPr>
+              <w:t>warn</w:t>
+            </w:r>
+            <w:r>
+              <w:t xml:space="preserve"> chỉ cảnh báo</w:t>
+            </w:r>
+          </w:p>
+        </w:tc>
+      </w:tr>
+      <w:tr>
+        <w:tc>
+          <w:tcPr>
+            <w:tcW w:type="dxa" w:w="2409"/>
+          </w:tcPr>
+          <w:p>
+            <w:r>
+              <w:t>Compliance as Code — runtime</w:t>
+            </w:r>
+          </w:p>
+        </w:tc>
+        <w:tc>
+          <w:tcPr>
+            <w:tcW w:type="dxa" w:w="2409"/>
+          </w:tcPr>
+          <w:p>
+            <w:r>
+              <w:t xml:space="preserve">Conftest + </w:t>
+            </w:r>
+            <w:r>
+              <w:rPr>
+                <w:rFonts w:ascii="Consolas" w:hAnsi="Consolas"/>
+                <w:sz w:val="20"/>
+              </w:rPr>
+              <w:t>docker inspect</w:t>
+            </w:r>
+          </w:p>
+        </w:tc>
+        <w:tc>
+          <w:tcPr>
+            <w:tcW w:type="dxa" w:w="2409"/>
+          </w:tcPr>
+          <w:p>
+            <w:r>
+              <w:t>F03, F04 (container đang chạy)</w:t>
+            </w:r>
+          </w:p>
+        </w:tc>
+        <w:tc>
+          <w:tcPr>
+            <w:tcW w:type="dxa" w:w="2409"/>
+          </w:tcPr>
+          <w:p>
+            <w:r>
+              <w:t>cảnh báo</w:t>
+            </w:r>
+          </w:p>
+        </w:tc>
+      </w:tr>
+    </w:tbl>
+    <w:p/>
+    <w:p>
+      <w:pPr>
+        <w:jc w:val="both"/>
+      </w:pPr>
+      <w:r>
+        <w:t xml:space="preserve">Lệnh chạy cụ thể cho từng cổng và từng demo được ghi trong </w:t>
+      </w:r>
+      <w:r>
+        <w:rPr>
+          <w:rFonts w:ascii="Consolas" w:hAnsi="Consolas"/>
+          <w:sz w:val="20"/>
+        </w:rPr>
+        <w:t>DEMO.md</w:t>
+      </w:r>
+      <w:r>
+        <w:t xml:space="preserve"> (thư mục gốc) và </w:t>
+      </w:r>
+      <w:r>
+        <w:rPr>
+          <w:rFonts w:ascii="Consolas" w:hAnsi="Consolas"/>
+          <w:sz w:val="20"/>
+        </w:rPr>
+        <w:t>report/HUONG_DAN_DEMO.md</w:t>
+      </w:r>
+      <w:r>
+        <w:t>.</w:t>
+      </w:r>
+    </w:p>
+    <w:p>
+      <w:pPr>
+        <w:jc w:val="both"/>
+      </w:pPr>
+      <w:r>
+        <w:t xml:space="preserve">Báo cáo bám theo </w:t>
+      </w:r>
+      <w:r>
+        <w:rPr>
+          <w:b/>
+        </w:rPr>
+        <w:t>bảy pha của tài liệu lab</w:t>
+      </w:r>
+      <w:r>
+        <w:t xml:space="preserve"> (</w:t>
+      </w:r>
+      <w:r>
+        <w:rPr>
+          <w:i/>
+        </w:rPr>
+        <w:t>Hands-On Lab Guide: Security as Code with OWASP Juice Shop &amp; Docker</w:t>
+      </w:r>
+      <w:r>
+        <w:t>), có thay một số công cụ bằng công cụ tương đương:</w:t>
+      </w:r>
+    </w:p>
+    <w:p>
+      <w:pPr>
+        <w:jc w:val="center"/>
+      </w:pPr>
+      <w:r>
+        <w:rPr>
+          <w:i/>
+          <w:sz w:val="22"/>
+        </w:rPr>
+        <w:t>Bảng 9. Bảy pha DevSecOps của tài liệu lab và cách báo cáo phủ</w:t>
+      </w:r>
+    </w:p>
+    <w:tbl>
+      <w:tblPr>
+        <w:tblStyle w:val="TableGrid"/>
+        <w:tblW w:type="auto" w:w="0"/>
+        <w:jc w:val="center"/>
+        <w:tblLook w:firstColumn="1" w:firstRow="1" w:lastColumn="0" w:lastRow="0" w:noHBand="0" w:noVBand="1" w:val="04A0"/>
+      </w:tblPr>
+      <w:tblGrid>
+        <w:gridCol w:w="2409"/>
+        <w:gridCol w:w="2409"/>
+        <w:gridCol w:w="2409"/>
+        <w:gridCol w:w="2409"/>
+      </w:tblGrid>
+      <w:tr>
+        <w:tc>
+          <w:tcPr>
+            <w:tcW w:type="dxa" w:w="2409"/>
+            <w:shd w:val="clear" w:color="auto" w:fill="0B2A4A"/>
+          </w:tcPr>
+          <w:p>
+            <w:r>
+              <w:rPr>
+                <w:b/>
+                <w:color w:val="FFFFFF"/>
+              </w:rPr>
+              <w:t>Pha (tài liệu lab)</w:t>
+            </w:r>
+          </w:p>
+        </w:tc>
+        <w:tc>
+          <w:tcPr>
+            <w:tcW w:type="dxa" w:w="2409"/>
+            <w:shd w:val="clear" w:color="auto" w:fill="0B2A4A"/>
+          </w:tcPr>
+          <w:p>
+            <w:r>
+              <w:rPr>
+                <w:b/>
+                <w:color w:val="FFFFFF"/>
+              </w:rPr>
+              <w:t>Hoạt động</w:t>
+            </w:r>
+          </w:p>
+        </w:tc>
+        <w:tc>
+          <w:tcPr>
+            <w:tcW w:type="dxa" w:w="2409"/>
+            <w:shd w:val="clear" w:color="auto" w:fill="0B2A4A"/>
+          </w:tcPr>
+          <w:p>
+            <w:r>
+              <w:rPr>
+                <w:b/>
+                <w:color w:val="FFFFFF"/>
+              </w:rPr>
+              <w:t>Công cụ nhóm dùng</w:t>
+            </w:r>
+          </w:p>
+        </w:tc>
+        <w:tc>
+          <w:tcPr>
+            <w:tcW w:type="dxa" w:w="2409"/>
+            <w:shd w:val="clear" w:color="auto" w:fill="0B2A4A"/>
+          </w:tcPr>
+          <w:p>
+            <w:r>
+              <w:rPr>
+                <w:b/>
+                <w:color w:val="FFFFFF"/>
+              </w:rPr>
+              <w:t>Minh chứng</w:t>
+            </w:r>
+          </w:p>
+        </w:tc>
+      </w:tr>
+      <w:tr>
+        <w:tc>
+          <w:tcPr>
+            <w:tcW w:type="dxa" w:w="2409"/>
+          </w:tcPr>
+          <w:p>
+            <w:r>
+              <w:t>1. Thiết lập môi trường</w:t>
+            </w:r>
+          </w:p>
+        </w:tc>
+        <w:tc>
+          <w:tcPr>
+            <w:tcW w:type="dxa" w:w="2409"/>
+          </w:tcPr>
+          <w:p>
+            <w:r>
+              <w:t>Dựng 2 môi trường trước/sau vá bằng Docker</w:t>
+            </w:r>
+          </w:p>
+        </w:tc>
+        <w:tc>
+          <w:tcPr>
+            <w:tcW w:type="dxa" w:w="2409"/>
+          </w:tcPr>
+          <w:p>
+            <w:r>
+              <w:t>Docker Compose, Node</w:t>
+            </w:r>
+          </w:p>
+        </w:tc>
+        <w:tc>
+          <w:tcPr>
+            <w:tcW w:type="dxa" w:w="2409"/>
+          </w:tcPr>
+          <w:p>
+            <w:r>
+              <w:t>Hình 3</w:t>
+            </w:r>
+          </w:p>
+        </w:tc>
+      </w:tr>
+      <w:tr>
+        <w:tc>
+          <w:tcPr>
+            <w:tcW w:type="dxa" w:w="2409"/>
+          </w:tcPr>
+          <w:p>
+            <w:r>
+              <w:t>2. Policy as Code</w:t>
+            </w:r>
+          </w:p>
+        </w:tc>
+        <w:tc>
+          <w:tcPr>
+            <w:tcW w:type="dxa" w:w="2409"/>
+          </w:tcPr>
+          <w:p>
+            <w:r>
+              <w:t>Kiểm chính sách Dockerfile &amp; compose trước khi triển khai</w:t>
+            </w:r>
+          </w:p>
+        </w:tc>
+        <w:tc>
+          <w:tcPr>
+            <w:tcW w:type="dxa" w:w="2409"/>
+          </w:tcPr>
+          <w:p>
+            <w:r>
+              <w:t>Conftest/OPA (Rego)</w:t>
+            </w:r>
+          </w:p>
+        </w:tc>
+        <w:tc>
+          <w:tcPr>
+            <w:tcW w:type="dxa" w:w="2409"/>
+          </w:tcPr>
+          <w:p>
+            <w:r>
+              <w:t>Hình 5; mục 5.3, 5.4</w:t>
+            </w:r>
+          </w:p>
+        </w:tc>
+      </w:tr>
+      <w:tr>
+        <w:tc>
+          <w:tcPr>
+            <w:tcW w:type="dxa" w:w="2409"/>
+          </w:tcPr>
+          <w:p>
+            <w:r>
+              <w:t>3. SAST &amp; ánh xạ pháp lý</w:t>
+            </w:r>
+          </w:p>
+        </w:tc>
+        <w:tc>
+          <w:tcPr>
+            <w:tcW w:type="dxa" w:w="2409"/>
+          </w:tcPr>
+          <w:p>
+            <w:r>
+              <w:t>Quét tĩnh tìm lỗi mã; ánh xạ GDPR/PCI</w:t>
+            </w:r>
+          </w:p>
+        </w:tc>
+        <w:tc>
+          <w:tcPr>
+            <w:tcW w:type="dxa" w:w="2409"/>
+          </w:tcPr>
+          <w:p>
+            <w:r>
+              <w:t xml:space="preserve">Semgrep </w:t>
+            </w:r>
+            <w:r>
+              <w:rPr>
+                <w:i/>
+              </w:rPr>
+              <w:t>(thay SonarQube)</w:t>
+            </w:r>
+          </w:p>
+        </w:tc>
+        <w:tc>
+          <w:tcPr>
+            <w:tcW w:type="dxa" w:w="2409"/>
+          </w:tcPr>
+          <w:p>
+            <w:r>
+              <w:t>Hình 6; mục 5.1, 5.2, 6</w:t>
+            </w:r>
+          </w:p>
+        </w:tc>
+      </w:tr>
+      <w:tr>
+        <w:tc>
+          <w:tcPr>
+            <w:tcW w:type="dxa" w:w="2409"/>
+          </w:tcPr>
+          <w:p>
+            <w:r>
+              <w:t>4. Test-Driven Security</w:t>
+            </w:r>
+          </w:p>
+        </w:tc>
+        <w:tc>
+          <w:tcPr>
+            <w:tcW w:type="dxa" w:w="2409"/>
+          </w:tcPr>
+          <w:p>
+            <w:r>
+              <w:t>Viết test đỏ trước vá → xanh sau vá</w:t>
+            </w:r>
+          </w:p>
+        </w:tc>
+        <w:tc>
+          <w:tcPr>
+            <w:tcW w:type="dxa" w:w="2409"/>
+          </w:tcPr>
+          <w:p>
+            <w:r>
+              <w:t>node:test (Supertest)</w:t>
+            </w:r>
+          </w:p>
+        </w:tc>
+        <w:tc>
+          <w:tcPr>
+            <w:tcW w:type="dxa" w:w="2409"/>
+          </w:tcPr>
+          <w:p>
+            <w:r>
+              <w:t>Hình 7, Hình 10</w:t>
+            </w:r>
+          </w:p>
+        </w:tc>
+      </w:tr>
+      <w:tr>
+        <w:tc>
+          <w:tcPr>
+            <w:tcW w:type="dxa" w:w="2409"/>
+          </w:tcPr>
+          <w:p>
+            <w:r>
+              <w:t>5. Vá ứng dụng</w:t>
+            </w:r>
+          </w:p>
+        </w:tc>
+        <w:tc>
+          <w:tcPr>
+            <w:tcW w:type="dxa" w:w="2409"/>
+          </w:tcPr>
+          <w:p>
+            <w:r>
+              <w:t>Sửa mã theo kết quả kiểm thử</w:t>
+            </w:r>
+          </w:p>
+        </w:tc>
+        <w:tc>
+          <w:tcPr>
+            <w:tcW w:type="dxa" w:w="2409"/>
+          </w:tcPr>
+          <w:p>
+            <w:r>
+              <w:t>TypeScript / Express</w:t>
+            </w:r>
+          </w:p>
+        </w:tc>
+        <w:tc>
+          <w:tcPr>
+            <w:tcW w:type="dxa" w:w="2409"/>
+          </w:tcPr>
+          <w:p>
+            <w:r>
+              <w:t>mục 5.1, 5.2</w:t>
+            </w:r>
+          </w:p>
+        </w:tc>
+      </w:tr>
+      <w:tr>
+        <w:tc>
+          <w:tcPr>
+            <w:tcW w:type="dxa" w:w="2409"/>
+          </w:tcPr>
+          <w:p>
+            <w:r>
+              <w:t>6. Compliance as Code</w:t>
+            </w:r>
+          </w:p>
+        </w:tc>
+        <w:tc>
+          <w:tcPr>
+            <w:tcW w:type="dxa" w:w="2409"/>
+          </w:tcPr>
+          <w:p>
+            <w:r>
+              <w:t>Soi container đang chạy (runtime)</w:t>
+            </w:r>
+          </w:p>
+        </w:tc>
+        <w:tc>
+          <w:tcPr>
+            <w:tcW w:type="dxa" w:w="2409"/>
+          </w:tcPr>
+          <w:p>
+            <w:r>
+              <w:t xml:space="preserve">Conftest + </w:t>
+            </w:r>
+            <w:r>
+              <w:rPr>
+                <w:rFonts w:ascii="Consolas" w:hAnsi="Consolas"/>
+                <w:sz w:val="20"/>
+              </w:rPr>
+              <w:t>docker inspect</w:t>
+            </w:r>
+            <w:r>
+              <w:t xml:space="preserve"> </w:t>
+            </w:r>
+            <w:r>
+              <w:rPr>
+                <w:i/>
+              </w:rPr>
+              <w:t>(thay InSpec)</w:t>
+            </w:r>
+          </w:p>
+        </w:tc>
+        <w:tc>
+          <w:tcPr>
+            <w:tcW w:type="dxa" w:w="2409"/>
+          </w:tcPr>
+          <w:p>
+            <w:r>
+              <w:t>Hình 1</w:t>
+            </w:r>
+          </w:p>
+        </w:tc>
+      </w:tr>
+      <w:tr>
+        <w:tc>
+          <w:tcPr>
+            <w:tcW w:type="dxa" w:w="2409"/>
+          </w:tcPr>
+          <w:p>
+            <w:r>
+              <w:t>7. Kiểm chứng &amp; nộp</w:t>
+            </w:r>
+          </w:p>
+        </w:tc>
+        <w:tc>
+          <w:tcPr>
+            <w:tcW w:type="dxa" w:w="2409"/>
+          </w:tcPr>
+          <w:p>
+            <w:r>
+              <w:t>Chạy lại toàn bộ cổng; quét secret</w:t>
+            </w:r>
+          </w:p>
+        </w:tc>
+        <w:tc>
+          <w:tcPr>
+            <w:tcW w:type="dxa" w:w="2409"/>
+          </w:tcPr>
+          <w:p>
+            <w:r>
+              <w:t>Conftest verify, Gitleaks</w:t>
+            </w:r>
+          </w:p>
+        </w:tc>
+        <w:tc>
+          <w:tcPr>
+            <w:tcW w:type="dxa" w:w="2409"/>
+          </w:tcPr>
+          <w:p>
+            <w:r>
+              <w:t>Hình 5, Hình 4</w:t>
+            </w:r>
+          </w:p>
+        </w:tc>
+      </w:tr>
+    </w:tbl>
+    <w:p/>
+    <w:p>
+      <w:pPr>
+        <w:jc w:val="both"/>
+      </w:pPr>
+      <w:r>
+        <w:t>Hai cổng tự động chạy thật (ảnh chụp output thực tế):</w:t>
+      </w:r>
+    </w:p>
+    <w:p>
+      <w:pPr>
+        <w:jc w:val="center"/>
+      </w:pPr>
+      <w:r>
+        <w:drawing>
+          <wp:inline xmlns:a="http://schemas.openxmlformats.org/drawingml/2006/main" xmlns:pic="http://schemas.openxmlformats.org/drawingml/2006/picture">
+            <wp:extent cx="5760000" cy="786162"/>
+            <wp:docPr id="4" name="Picture 4"/>
+            <wp:cNvGraphicFramePr>
+              <a:graphicFrameLocks noChangeAspect="1"/>
+            </wp:cNvGraphicFramePr>
+            <a:graphic>
+              <a:graphicData uri="http://schemas.openxmlformats.org/drawingml/2006/picture">
+                <pic:pic>
+                  <pic:nvPicPr>
+                    <pic:cNvPr id="0" name="gitleaks.png"/>
+                    <pic:cNvPicPr/>
+                  </pic:nvPicPr>
+                  <pic:blipFill>
+                    <a:blip r:embed="rId13"/>
+                    <a:stretch>
+                      <a:fillRect/>
+                    </a:stretch>
+                  </pic:blipFill>
+                  <pic:spPr>
+                    <a:xfrm>
+                      <a:off x="0" y="0"/>
+                      <a:ext cx="5760000" cy="786162"/>
+                    </a:xfrm>
+                    <a:prstGeom prst="rect"/>
+                  </pic:spPr>
+                </pic:pic>
+              </a:graphicData>
+            </a:graphic>
+          </wp:inline>
+        </w:drawing>
+      </w:r>
+    </w:p>
+    <w:p>
+      <w:pPr>
+        <w:jc w:val="center"/>
+      </w:pPr>
+      <w:r>
+        <w:rPr>
+          <w:i/>
+          <w:sz w:val="22"/>
+        </w:rPr>
+        <w:t xml:space="preserve">Hình 4. </w:t>
+      </w:r>
+      <w:r>
+        <w:rPr>
+          <w:i/>
+          <w:sz w:val="22"/>
+        </w:rPr>
+        <w:t>Gitleaks quét toàn bộ commit vá: 24 commit, không có secret/khóa bí mật nào lộ</w:t>
+      </w:r>
+    </w:p>
+    <w:p>
+      <w:pPr>
+        <w:jc w:val="center"/>
+      </w:pPr>
+      <w:r>
+        <w:drawing>
+          <wp:inline xmlns:a="http://schemas.openxmlformats.org/drawingml/2006/main" xmlns:pic="http://schemas.openxmlformats.org/drawingml/2006/picture">
+            <wp:extent cx="5760000" cy="607135"/>
+            <wp:docPr id="5" name="Picture 5"/>
+            <wp:cNvGraphicFramePr>
+              <a:graphicFrameLocks noChangeAspect="1"/>
+            </wp:cNvGraphicFramePr>
+            <a:graphic>
+              <a:graphicData uri="http://schemas.openxmlformats.org/drawingml/2006/picture">
+                <pic:pic>
+                  <pic:nvPicPr>
+                    <pic:cNvPr id="0" name="conftest-verify.png"/>
+                    <pic:cNvPicPr/>
+                  </pic:nvPicPr>
+                  <pic:blipFill>
+                    <a:blip r:embed="rId14"/>
+                    <a:stretch>
+                      <a:fillRect/>
+                    </a:stretch>
+                  </pic:blipFill>
+                  <pic:spPr>
+                    <a:xfrm>
+                      <a:off x="0" y="0"/>
+                      <a:ext cx="5760000" cy="607135"/>
+                    </a:xfrm>
+                    <a:prstGeom prst="rect"/>
+                  </pic:spPr>
+                </pic:pic>
+              </a:graphicData>
+            </a:graphic>
+          </wp:inline>
+        </w:drawing>
+      </w:r>
+    </w:p>
+    <w:p>
+      <w:pPr>
+        <w:jc w:val="center"/>
+      </w:pPr>
+      <w:r>
+        <w:rPr>
+          <w:i/>
+          <w:sz w:val="22"/>
+        </w:rPr>
+        <w:t xml:space="preserve">Hình 5. </w:t>
+      </w:r>
+      <w:r>
+        <w:rPr>
+          <w:i/>
+          <w:sz w:val="22"/>
+        </w:rPr>
+        <w:t>Conftest verify: toàn bộ 17 unit test của bộ luật Rego (Dockerfile + compose) đều đạt</w:t>
+      </w:r>
+    </w:p>
+    <w:p>
+      <w:pPr>
+        <w:jc w:val="both"/>
+      </w:pPr>
+      <w:r>
+        <w:t xml:space="preserve">Đoạn mã demo của mỗi thành viên không tách rời tài liệu môn học mà </w:t>
+      </w:r>
+      <w:r>
+        <w:rPr>
+          <w:b/>
+        </w:rPr>
+        <w:t>áp dụng trực tiếp</w:t>
+      </w:r>
+      <w:r>
+        <w:t xml:space="preserve"> kỹ thuật được dạy trong đó:</w:t>
+      </w:r>
+    </w:p>
+    <w:p>
+      <w:pPr>
+        <w:jc w:val="center"/>
+      </w:pPr>
+      <w:r>
+        <w:rPr>
+          <w:i/>
+          <w:sz w:val="22"/>
+        </w:rPr>
+        <w:t>Bảng 10. Liên hệ đoạn mã demo với tài liệu môn học</w:t>
+      </w:r>
+    </w:p>
+    <w:tbl>
+      <w:tblPr>
+        <w:tblStyle w:val="TableGrid"/>
+        <w:tblW w:type="auto" w:w="0"/>
+        <w:jc w:val="center"/>
+        <w:tblLook w:firstColumn="1" w:firstRow="1" w:lastColumn="0" w:lastRow="0" w:noHBand="0" w:noVBand="1" w:val="04A0"/>
+      </w:tblPr>
+      <w:tblGrid>
+        <w:gridCol w:w="3213"/>
+        <w:gridCol w:w="3213"/>
+        <w:gridCol w:w="3213"/>
+      </w:tblGrid>
+      <w:tr>
+        <w:tc>
+          <w:tcPr>
+            <w:tcW w:type="dxa" w:w="3213"/>
+            <w:shd w:val="clear" w:color="auto" w:fill="0B2A4A"/>
+          </w:tcPr>
+          <w:p>
+            <w:r>
+              <w:rPr>
+                <w:b/>
+                <w:color w:val="FFFFFF"/>
+              </w:rPr>
+              <w:t>Thành viên</w:t>
+            </w:r>
+          </w:p>
+        </w:tc>
+        <w:tc>
+          <w:tcPr>
+            <w:tcW w:type="dxa" w:w="3213"/>
+            <w:shd w:val="clear" w:color="auto" w:fill="0B2A4A"/>
+          </w:tcPr>
+          <w:p>
+            <w:r>
+              <w:rPr>
+                <w:b/>
+                <w:color w:val="FFFFFF"/>
+              </w:rPr>
+              <w:t>Đoạn mã demo</w:t>
+            </w:r>
+          </w:p>
+        </w:tc>
+        <w:tc>
+          <w:tcPr>
+            <w:tcW w:type="dxa" w:w="3213"/>
+            <w:shd w:val="clear" w:color="auto" w:fill="0B2A4A"/>
+          </w:tcPr>
+          <w:p>
+            <w:r>
+              <w:rPr>
+                <w:b/>
+                <w:color w:val="FFFFFF"/>
+              </w:rPr>
+              <w:t>Kỹ thuật &amp; tài liệu môn học áp dụng</w:t>
+            </w:r>
+          </w:p>
+        </w:tc>
+      </w:tr>
+      <w:tr>
+        <w:tc>
+          <w:tcPr>
+            <w:tcW w:type="dxa" w:w="3213"/>
+          </w:tcPr>
+          <w:p>
+            <w:r>
+              <w:t>Nguyễn Toàn Thắng (F01)</w:t>
+            </w:r>
+          </w:p>
+        </w:tc>
+        <w:tc>
+          <w:tcPr>
+            <w:tcW w:type="dxa" w:w="3213"/>
+          </w:tcPr>
+          <w:p>
+            <w:r>
+              <w:rPr>
+                <w:rFonts w:ascii="Consolas" w:hAnsi="Consolas"/>
+                <w:sz w:val="20"/>
+              </w:rPr>
+              <w:t>demos/tv1_f01_sqli.py</w:t>
+            </w:r>
+            <w:r>
+              <w:t xml:space="preserve">, kiểm thử </w:t>
+            </w:r>
+            <w:r>
+              <w:rPr>
+                <w:rFonts w:ascii="Consolas" w:hAnsi="Consolas"/>
+                <w:sz w:val="20"/>
+              </w:rPr>
+              <w:t>f01-f02.test.ts</w:t>
+            </w:r>
+          </w:p>
+        </w:tc>
+        <w:tc>
+          <w:tcPr>
+            <w:tcW w:type="dxa" w:w="3213"/>
+          </w:tcPr>
+          <w:p>
+            <w:r>
+              <w:t>Shift-left, SAST, Test-Driven Security — slide kiến trúc DevSecOps</w:t>
+            </w:r>
+          </w:p>
+        </w:tc>
+      </w:tr>
+      <w:tr>
+        <w:tc>
+          <w:tcPr>
+            <w:tcW w:type="dxa" w:w="3213"/>
+          </w:tcPr>
+          <w:p>
+            <w:r>
+              <w:t>Phạm Thị Minh Thúy (F02)</w:t>
+            </w:r>
+          </w:p>
+        </w:tc>
+        <w:tc>
+          <w:tcPr>
+            <w:tcW w:type="dxa" w:w="3213"/>
+          </w:tcPr>
+          <w:p>
+            <w:r>
+              <w:rPr>
+                <w:rFonts w:ascii="Consolas" w:hAnsi="Consolas"/>
+                <w:sz w:val="20"/>
+              </w:rPr>
+              <w:t>demos/tv2_f02_idor.py</w:t>
+            </w:r>
+            <w:r>
+              <w:t>, kiểm thử phân quyền</w:t>
+            </w:r>
+          </w:p>
+        </w:tc>
+        <w:tc>
+          <w:tcPr>
+            <w:tcW w:type="dxa" w:w="3213"/>
+          </w:tcPr>
+          <w:p>
+            <w:r>
+              <w:t>Security as Code, kiểm thử trong CI — slide DevSecOps</w:t>
+            </w:r>
+          </w:p>
+        </w:tc>
+      </w:tr>
+      <w:tr>
+        <w:tc>
+          <w:tcPr>
+            <w:tcW w:type="dxa" w:w="3213"/>
+          </w:tcPr>
+          <w:p>
+            <w:r>
+              <w:t>Đỗ Đức Quốc Anh (F03)</w:t>
+            </w:r>
+          </w:p>
+        </w:tc>
+        <w:tc>
+          <w:tcPr>
+            <w:tcW w:type="dxa" w:w="3213"/>
+          </w:tcPr>
+          <w:p>
+            <w:r>
+              <w:rPr>
+                <w:rFonts w:ascii="Consolas" w:hAnsi="Consolas"/>
+                <w:sz w:val="20"/>
+              </w:rPr>
+              <w:t>demos/tv3_f03_metrics.py</w:t>
+            </w:r>
+            <w:r>
+              <w:t xml:space="preserve">, </w:t>
+            </w:r>
+            <w:r>
+              <w:rPr>
+                <w:rFonts w:ascii="Consolas" w:hAnsi="Consolas"/>
+                <w:sz w:val="20"/>
+              </w:rPr>
+              <w:t>nginx.conf</w:t>
+            </w:r>
+          </w:p>
+        </w:tc>
+        <w:tc>
+          <w:tcPr>
+            <w:tcW w:type="dxa" w:w="3213"/>
+          </w:tcPr>
+          <w:p>
+            <w:r>
+              <w:t>OpSec giảm phơi nhiễm endpoint, reverse proxy &amp; giới hạn tốc độ — slide OpSec/DevSecOps</w:t>
+            </w:r>
+          </w:p>
+        </w:tc>
+      </w:tr>
+      <w:tr>
+        <w:tc>
+          <w:tcPr>
+            <w:tcW w:type="dxa" w:w="3213"/>
+          </w:tcPr>
+          <w:p>
+            <w:r>
+              <w:t>Hồ Anh Vũ (F04)</w:t>
+            </w:r>
+          </w:p>
+        </w:tc>
+        <w:tc>
+          <w:tcPr>
+            <w:tcW w:type="dxa" w:w="3213"/>
+          </w:tcPr>
+          <w:p>
+            <w:r>
+              <w:rPr>
+                <w:rFonts w:ascii="Consolas" w:hAnsi="Consolas"/>
+                <w:sz w:val="20"/>
+              </w:rPr>
+              <w:t>demos/tv4_f04_policy.py</w:t>
+            </w:r>
+            <w:r>
+              <w:t xml:space="preserve">, </w:t>
+            </w:r>
+            <w:r>
+              <w:rPr>
+                <w:rFonts w:ascii="Consolas" w:hAnsi="Consolas"/>
+                <w:sz w:val="20"/>
+              </w:rPr>
+              <w:t>docker_security.rego</w:t>
+            </w:r>
+          </w:p>
+        </w:tc>
+        <w:tc>
+          <w:tcPr>
+            <w:tcW w:type="dxa" w:w="3213"/>
+          </w:tcPr>
+          <w:p>
+            <w:r>
+              <w:t>Policy as Code với Conftest — hướng dẫn Policy as Code (Conftest)</w:t>
+            </w:r>
+          </w:p>
+        </w:tc>
+      </w:tr>
+    </w:tbl>
+    <w:p/>
+    <w:p>
+      <w:pPr>
+        <w:jc w:val="both"/>
+      </w:pPr>
+      <w:r>
+        <w:t>Mỗi thành viên lấy một kỹ thuật trong tài liệu môn học và hiện thực hóa thành đoạn mã chạy được để phát hiện hoặc chặn lỗi của mình.</w:t>
       </w:r>
     </w:p>
     <w:p>
@@ -3380,15 +4936,7 @@
         <w:pStyle w:val="Heading2"/>
       </w:pPr>
       <w:r>
-        <w:t>4.1. F01 — SQL injection tại đăng nhập</w:t>
-      </w:r>
-    </w:p>
-    <w:p>
-      <w:pPr>
-        <w:pStyle w:val="Heading3"/>
-      </w:pPr>
-      <w:r>
-        <w:t>Trước khi sửa</w:t>
+        <w:t>4.1. Đoạn mã dò lỗi cốt lõi của mỗi demo</w:t>
       </w:r>
     </w:p>
     <w:p>
@@ -3396,17 +4944,49 @@
         <w:jc w:val="both"/>
       </w:pPr>
       <w:r>
-        <w:t xml:space="preserve">Route </w:t>
+        <w:t xml:space="preserve">Mỗi script chạy bằng </w:t>
+      </w:r>
+      <w:r>
+        <w:rPr>
+          <w:b/>
+        </w:rPr>
+        <w:t>một lệnh</w:t>
+      </w:r>
+      <w:r>
+        <w:t xml:space="preserve"> (</w:t>
       </w:r>
       <w:r>
         <w:rPr>
           <w:rFonts w:ascii="Consolas" w:hAnsi="Consolas"/>
           <w:sz w:val="20"/>
         </w:rPr>
-        <w:t>routes/login.ts</w:t>
-      </w:r>
-      <w:r>
-        <w:t xml:space="preserve"> ghép thẳng email vào câu SQL:</w:t>
+        <w:t>python report/demos/&lt;tên&gt;.py</w:t>
+      </w:r>
+      <w:r>
+        <w:t>); phần dò lỗi cốt lõi trích dưới đây.</w:t>
+      </w:r>
+    </w:p>
+    <w:p>
+      <w:pPr>
+        <w:jc w:val="both"/>
+      </w:pPr>
+      <w:r>
+        <w:rPr>
+          <w:b/>
+        </w:rPr>
+        <w:t>F01 — `tv1_f01_sqli.py`:</w:t>
+      </w:r>
+      <w:r>
+        <w:t xml:space="preserve"> gửi payload SQL kèm mật khẩu </w:t>
+      </w:r>
+      <w:r>
+        <w:rPr>
+          <w:i/>
+        </w:rPr>
+        <w:t>sai</w:t>
+      </w:r>
+      <w:r>
+        <w:t>; còn lỗ hổng nếu vẫn được cấp token.</w:t>
       </w:r>
     </w:p>
     <w:tbl>
@@ -3433,7 +5013,7 @@
                 <w:rFonts w:ascii="Consolas" w:hAnsi="Consolas"/>
                 <w:sz w:val="17"/>
               </w:rPr>
-              <w:t>models.sequelize.query(`SELECT * FROM Users WHERE email = '${req.body.email || ''}'</w:t>
+              <w:t>status, body = call(base, 'POST', '/rest/user/login', {'email': "' OR 1=1--", 'password': 'wrong-password'})</w:t>
             </w:r>
             <w:r>
               <w:br/>
@@ -3443,7 +5023,7 @@
                 <w:rFonts w:ascii="Consolas" w:hAnsi="Consolas"/>
                 <w:sz w:val="17"/>
               </w:rPr>
-              <w:t xml:space="preserve">  AND password = '${security.hash(req.body.password || '')}' AND deletedAt IS NULL`, { model: UserModel, plain: true })</w:t>
+              <w:t>token = body.get('authentication', {}).get('token')   # có token = vượt xác thực = còn lỗ hổng</w:t>
             </w:r>
           </w:p>
         </w:tc>
@@ -3455,193 +5035,13 @@
         <w:jc w:val="both"/>
       </w:pPr>
       <w:r>
-        <w:t xml:space="preserve">Với email </w:t>
-      </w:r>
-      <w:r>
-        <w:rPr>
-          <w:rFonts w:ascii="Consolas" w:hAnsi="Consolas"/>
-          <w:sz w:val="20"/>
-        </w:rPr>
-        <w:t>' OR 1=1--</w:t>
-      </w:r>
-      <w:r>
-        <w:t>, mệnh đề WHERE luôn đúng và phần kiểm tra mật khẩu bị biến thành chú thích, nên máy chủ cấp token của tài khoản đầu tiên (quản trị) mà không cần mật khẩu. Đây là CWE-89, OWASP A03:2021.</w:t>
-      </w:r>
-    </w:p>
-    <w:p>
-      <w:pPr>
-        <w:jc w:val="both"/>
-      </w:pPr>
-      <w:r>
         <w:rPr>
           <w:b/>
         </w:rPr>
-        <w:t>Phát hiện.</w:t>
-      </w:r>
-      <w:r>
-        <w:t xml:space="preserve"> Semgrep (luật </w:t>
-      </w:r>
-      <w:r>
-        <w:rPr>
-          <w:rFonts w:ascii="Consolas" w:hAnsi="Consolas"/>
-          <w:sz w:val="20"/>
-        </w:rPr>
-        <w:t>express-sequelize-injection</w:t>
-      </w:r>
-      <w:r>
-        <w:t xml:space="preserve">) chỉ đúng dòng lỗi; kiểm thử </w:t>
-      </w:r>
-      <w:r>
-        <w:rPr>
-          <w:rFonts w:ascii="Consolas" w:hAnsi="Consolas"/>
-          <w:sz w:val="20"/>
-        </w:rPr>
-        <w:t>test/api/security/f01-f02.test.ts</w:t>
-      </w:r>
-      <w:r>
-        <w:t xml:space="preserve"> gửi payload kèm mật khẩu sai và yêu cầu nhận 401 — trên mã chưa sửa, test đỏ (Hình 3). Demo </w:t>
-      </w:r>
-      <w:r>
-        <w:rPr>
-          <w:rFonts w:ascii="Consolas" w:hAnsi="Consolas"/>
-          <w:sz w:val="20"/>
-        </w:rPr>
-        <w:t>demos/tv1_f01_sqli.py</w:t>
-      </w:r>
-      <w:r>
-        <w:t xml:space="preserve"> xác nhận token được cấp (Hình 4).</w:t>
-      </w:r>
-    </w:p>
-    <w:p>
-      <w:pPr>
-        <w:jc w:val="center"/>
-      </w:pPr>
-      <w:r>
-        <w:drawing>
-          <wp:inline xmlns:a="http://schemas.openxmlformats.org/drawingml/2006/main" xmlns:pic="http://schemas.openxmlformats.org/drawingml/2006/picture">
-            <wp:extent cx="5760000" cy="3611077"/>
-            <wp:docPr id="2" name="Picture 2"/>
-            <wp:cNvGraphicFramePr>
-              <a:graphicFrameLocks noChangeAspect="1"/>
-            </wp:cNvGraphicFramePr>
-            <a:graphic>
-              <a:graphicData uri="http://schemas.openxmlformats.org/drawingml/2006/picture">
-                <pic:pic>
-                  <pic:nvPicPr>
-                    <pic:cNvPr id="0" name="semgrep.png"/>
-                    <pic:cNvPicPr/>
-                  </pic:nvPicPr>
-                  <pic:blipFill>
-                    <a:blip r:embed="rId11"/>
-                    <a:stretch>
-                      <a:fillRect/>
-                    </a:stretch>
-                  </pic:blipFill>
-                  <pic:spPr>
-                    <a:xfrm>
-                      <a:off x="0" y="0"/>
-                      <a:ext cx="5760000" cy="3611077"/>
-                    </a:xfrm>
-                    <a:prstGeom prst="rect"/>
-                  </pic:spPr>
-                </pic:pic>
-              </a:graphicData>
-            </a:graphic>
-          </wp:inline>
-        </w:drawing>
-      </w:r>
-    </w:p>
-    <w:p>
-      <w:pPr>
-        <w:jc w:val="center"/>
-      </w:pPr>
-      <w:r>
-        <w:rPr>
-          <w:i/>
-          <w:sz w:val="22"/>
-        </w:rPr>
-        <w:t xml:space="preserve">Hình 2. </w:t>
-      </w:r>
-      <w:r>
-        <w:rPr>
-          <w:i/>
-          <w:sz w:val="22"/>
-        </w:rPr>
-        <w:t>Semgrep phát hiện truy vấn nhiễm dữ liệu người dùng tại login.ts và basket.ts</w:t>
-      </w:r>
-    </w:p>
-    <w:p>
-      <w:pPr>
-        <w:jc w:val="center"/>
-      </w:pPr>
-      <w:r>
-        <w:drawing>
-          <wp:inline xmlns:a="http://schemas.openxmlformats.org/drawingml/2006/main" xmlns:pic="http://schemas.openxmlformats.org/drawingml/2006/picture">
-            <wp:extent cx="5400000" cy="2066538"/>
-            <wp:docPr id="3" name="Picture 3"/>
-            <wp:cNvGraphicFramePr>
-              <a:graphicFrameLocks noChangeAspect="1"/>
-            </wp:cNvGraphicFramePr>
-            <a:graphic>
-              <a:graphicData uri="http://schemas.openxmlformats.org/drawingml/2006/picture">
-                <pic:pic>
-                  <pic:nvPicPr>
-                    <pic:cNvPr id="0" name="f0102-red.png"/>
-                    <pic:cNvPicPr/>
-                  </pic:nvPicPr>
-                  <pic:blipFill>
-                    <a:blip r:embed="rId12"/>
-                    <a:stretch>
-                      <a:fillRect/>
-                    </a:stretch>
-                  </pic:blipFill>
-                  <pic:spPr>
-                    <a:xfrm>
-                      <a:off x="0" y="0"/>
-                      <a:ext cx="5400000" cy="2066538"/>
-                    </a:xfrm>
-                    <a:prstGeom prst="rect"/>
-                  </pic:spPr>
-                </pic:pic>
-              </a:graphicData>
-            </a:graphic>
-          </wp:inline>
-        </w:drawing>
-      </w:r>
-    </w:p>
-    <w:p>
-      <w:pPr>
-        <w:jc w:val="center"/>
-      </w:pPr>
-      <w:r>
-        <w:rPr>
-          <w:i/>
-          <w:sz w:val="22"/>
-        </w:rPr>
-        <w:t xml:space="preserve">Hình 3. </w:t>
-      </w:r>
-      <w:r>
-        <w:rPr>
-          <w:i/>
-          <w:sz w:val="22"/>
-        </w:rPr>
-        <w:t>Kiểm thử bảo mật F01/F02 trên mã chưa sửa: các ca kiểm thử đỏ ứng với lỗ hổng còn tồn tại</w:t>
-      </w:r>
-    </w:p>
-    <w:p>
-      <w:pPr>
-        <w:pStyle w:val="Heading3"/>
-      </w:pPr>
-      <w:r>
-        <w:t>Sau khi sửa</w:t>
-      </w:r>
-    </w:p>
-    <w:p>
-      <w:pPr>
-        <w:jc w:val="both"/>
-      </w:pPr>
-      <w:r>
-        <w:t>Dùng truy vấn tham số (bind parameter):</w:t>
+        <w:t>F02 — `tv2_f02_idor.py`:</w:t>
+      </w:r>
+      <w:r>
+        <w:t xml:space="preserve"> dùng token của A đọc giỏ của B; lộ dữ liệu nếu trả đúng giỏ của B.</w:t>
       </w:r>
     </w:p>
     <w:tbl>
@@ -3668,7 +5068,7 @@
                 <w:rFonts w:ascii="Consolas" w:hAnsi="Consolas"/>
                 <w:sz w:val="17"/>
               </w:rPr>
-              <w:t>const email = typeof req.body.email === 'string' ? req.body.email : ''</w:t>
+              <w:t>s, body = call(base, 'GET', f"/rest/basket/{b['bid']}", token=a['token'])</w:t>
             </w:r>
             <w:r>
               <w:br/>
@@ -3678,27 +5078,7 @@
                 <w:rFonts w:ascii="Consolas" w:hAnsi="Consolas"/>
                 <w:sz w:val="17"/>
               </w:rPr>
-              <w:t>const password = typeof req.body.password === 'string' ? req.body.password : ''</w:t>
-            </w:r>
-            <w:r>
-              <w:br/>
-            </w:r>
-            <w:r>
-              <w:rPr>
-                <w:rFonts w:ascii="Consolas" w:hAnsi="Consolas"/>
-                <w:sz w:val="17"/>
-              </w:rPr>
-              <w:t>models.sequelize.query('SELECT * FROM Users WHERE email = $email AND password = $password AND deletedAt IS NULL',</w:t>
-            </w:r>
-            <w:r>
-              <w:br/>
-            </w:r>
-            <w:r>
-              <w:rPr>
-                <w:rFonts w:ascii="Consolas" w:hAnsi="Consolas"/>
-                <w:sz w:val="17"/>
-              </w:rPr>
-              <w:t xml:space="preserve">  { bind: { email, password: security.hash(password) }, model: UserModel, plain: true })</w:t>
+              <w:t>leaked = s == 200 and body['data']['id'] == b['bid']   # đọc được giỏ người khác = IDOR</w:t>
             </w:r>
           </w:p>
         </w:tc>
@@ -3710,159 +5090,23 @@
         <w:jc w:val="both"/>
       </w:pPr>
       <w:r>
-        <w:t>Câu lệnh được biên dịch trước, giá trị gửi riêng nên ký tự SQL trong email chỉ còn là dữ liệu. Sau khi sửa, kiểm thử bảo mật xanh toàn bộ (Hình 6) và demo cho thấy mọi payload đều bị từ chối 401 trong khi đăng nhập hợp lệ vẫn hoạt động (Hình 4).</w:t>
-      </w:r>
-    </w:p>
-    <w:p>
-      <w:pPr>
-        <w:jc w:val="both"/>
-      </w:pPr>
-      <w:r>
-        <w:t xml:space="preserve">Giới hạn còn lại: bản vá chỉ xử lý injection; cùng dòng code vẫn gọi </w:t>
+        <w:rPr>
+          <w:b/>
+        </w:rPr>
+        <w:t>F03 — `tv3_f03_metrics.py`:</w:t>
+      </w:r>
+      <w:r>
+        <w:t xml:space="preserve"> gọi </w:t>
       </w:r>
       <w:r>
         <w:rPr>
           <w:rFonts w:ascii="Consolas" w:hAnsi="Consolas"/>
           <w:sz w:val="20"/>
         </w:rPr>
-        <w:t>security.hash</w:t>
-      </w:r>
-      <w:r>
-        <w:t xml:space="preserve"> của Juice Shop — hàm này băm mật khẩu bằng </w:t>
-      </w:r>
-      <w:r>
-        <w:rPr>
-          <w:b/>
-        </w:rPr>
-        <w:t>MD5 không muối</w:t>
-      </w:r>
-      <w:r>
-        <w:t xml:space="preserve"> (</w:t>
-      </w:r>
-      <w:r>
-        <w:rPr>
-          <w:rFonts w:ascii="Consolas" w:hAnsi="Consolas"/>
-          <w:sz w:val="20"/>
-        </w:rPr>
-        <w:t>lib/insecurity.ts</w:t>
-      </w:r>
-      <w:r>
-        <w:t>, CWE-327 / OWASP A02:2021). Đây là lỗ hổng lưu trữ mật khẩu nằm ngoài phạm vi F01 (vốn chỉ chặn vượt xác thực); khi triển khai thật cần thay bằng bcrypt/argon2 có muối.</w:t>
-      </w:r>
-    </w:p>
-    <w:p>
-      <w:pPr>
-        <w:jc w:val="center"/>
-      </w:pPr>
-      <w:r>
-        <w:drawing>
-          <wp:inline xmlns:a="http://schemas.openxmlformats.org/drawingml/2006/main" xmlns:pic="http://schemas.openxmlformats.org/drawingml/2006/picture">
-            <wp:extent cx="5400000" cy="1996579"/>
-            <wp:docPr id="4" name="Picture 4"/>
-            <wp:cNvGraphicFramePr>
-              <a:graphicFrameLocks noChangeAspect="1"/>
-            </wp:cNvGraphicFramePr>
-            <a:graphic>
-              <a:graphicData uri="http://schemas.openxmlformats.org/drawingml/2006/picture">
-                <pic:pic>
-                  <pic:nvPicPr>
-                    <pic:cNvPr id="0" name="tv1.png"/>
-                    <pic:cNvPicPr/>
-                  </pic:nvPicPr>
-                  <pic:blipFill>
-                    <a:blip r:embed="rId13"/>
-                    <a:stretch>
-                      <a:fillRect/>
-                    </a:stretch>
-                  </pic:blipFill>
-                  <pic:spPr>
-                    <a:xfrm>
-                      <a:off x="0" y="0"/>
-                      <a:ext cx="5400000" cy="1996579"/>
-                    </a:xfrm>
-                    <a:prstGeom prst="rect"/>
-                  </pic:spPr>
-                </pic:pic>
-              </a:graphicData>
-            </a:graphic>
-          </wp:inline>
-        </w:drawing>
-      </w:r>
-    </w:p>
-    <w:p>
-      <w:pPr>
-        <w:jc w:val="center"/>
-      </w:pPr>
-      <w:r>
-        <w:rPr>
-          <w:i/>
-          <w:sz w:val="22"/>
-        </w:rPr>
-        <w:t xml:space="preserve">Hình 4. </w:t>
-      </w:r>
-      <w:r>
-        <w:rPr>
-          <w:i/>
-          <w:sz w:val="22"/>
-        </w:rPr>
-        <w:t>Demo F01: cùng payload, trước khi sửa được cấp token, sau khi sửa bị từ chối</w:t>
-      </w:r>
-    </w:p>
-    <w:p>
-      <w:pPr>
-        <w:jc w:val="both"/>
-      </w:pPr>
-      <w:r>
-        <w:rPr>
-          <w:b/>
-        </w:rPr>
-        <w:t>Chính sách vi phạm:</w:t>
-      </w:r>
-      <w:r>
-        <w:t xml:space="preserve"> GDPR Điều 32(1)(b) (bảo mật khi xử lý dữ liệu); Nghị định 13/2023 Điều 26 (biện pháp kỹ thuật bảo vệ dữ liệu cá nhân); Luật ATTTM 2015 Điều 19. </w:t>
-      </w:r>
-      <w:r>
-        <w:rPr>
-          <w:b/>
-        </w:rPr>
-        <w:t>Pha &amp; Security as Code:</w:t>
-      </w:r>
-      <w:r>
-        <w:t xml:space="preserve"> phát hiện ở pha Code (SAST), chặn tái diễn ở pha Test bằng kiểm thử bảo mật trong pipeline.</w:t>
-      </w:r>
-    </w:p>
-    <w:p>
-      <w:pPr>
-        <w:pStyle w:val="Heading2"/>
-      </w:pPr>
-      <w:r>
-        <w:t>4.2. F02 — IDOR khi đọc giỏ hàng</w:t>
-      </w:r>
-    </w:p>
-    <w:p>
-      <w:pPr>
-        <w:pStyle w:val="Heading3"/>
-      </w:pPr>
-      <w:r>
-        <w:t>Trước khi sửa</w:t>
-      </w:r>
-    </w:p>
-    <w:p>
-      <w:pPr>
-        <w:jc w:val="both"/>
-      </w:pPr>
-      <w:r>
-        <w:t xml:space="preserve">Route </w:t>
-      </w:r>
-      <w:r>
-        <w:rPr>
-          <w:rFonts w:ascii="Consolas" w:hAnsi="Consolas"/>
-          <w:sz w:val="20"/>
-        </w:rPr>
-        <w:t>routes/basket.ts</w:t>
-      </w:r>
-      <w:r>
-        <w:t xml:space="preserve"> tìm giỏ chỉ theo mã trên URL:</w:t>
+        <w:t>/metrics</w:t>
+      </w:r>
+      <w:r>
+        <w:t>; trước vá 200 (lộ), sau vá qua proxy trả 404.</w:t>
       </w:r>
     </w:p>
     <w:tbl>
@@ -3889,7 +5133,17 @@
                 <w:rFonts w:ascii="Consolas" w:hAnsi="Consolas"/>
                 <w:sz w:val="17"/>
               </w:rPr>
-              <w:t>const basket = await BasketModel.findOne({ where: { id }, include: [{ model: ProductModel, as: 'Products' }] })</w:t>
+              <w:t>s, body = call(BEFORE[1], 'GET', '/metrics')   # trước vá (3100): 200 + hàng trăm dòng số liệu</w:t>
+            </w:r>
+            <w:r>
+              <w:br/>
+            </w:r>
+            <w:r>
+              <w:rPr>
+                <w:rFonts w:ascii="Consolas" w:hAnsi="Consolas"/>
+                <w:sz w:val="17"/>
+              </w:rPr>
+              <w:t>s, _ = call(AFTER[1], 'GET', '/metrics')        # sau vá, qua proxy (3102): 404</w:t>
             </w:r>
           </w:p>
         </w:tc>
@@ -3901,67 +5155,13 @@
         <w:jc w:val="both"/>
       </w:pPr>
       <w:r>
-        <w:t xml:space="preserve">Middleware chỉ kiểm tra token hợp lệ, không kiểm tra quyền sở hữu, nên đổi </w:t>
-      </w:r>
-      <w:r>
-        <w:rPr>
-          <w:rFonts w:ascii="Consolas" w:hAnsi="Consolas"/>
-          <w:sz w:val="20"/>
-        </w:rPr>
-        <w:t>/rest/basket/8</w:t>
-      </w:r>
-      <w:r>
-        <w:t xml:space="preserve"> thành </w:t>
-      </w:r>
-      <w:r>
-        <w:rPr>
-          <w:rFonts w:ascii="Consolas" w:hAnsi="Consolas"/>
-          <w:sz w:val="20"/>
-        </w:rPr>
-        <w:t>/rest/basket/9</w:t>
-      </w:r>
-      <w:r>
-        <w:t xml:space="preserve"> là đọc được giỏ người khác (CWE-639, OWASP A01:2021).</w:t>
-      </w:r>
-    </w:p>
-    <w:p>
-      <w:pPr>
-        <w:jc w:val="both"/>
-      </w:pPr>
-      <w:r>
         <w:rPr>
           <w:b/>
         </w:rPr>
-        <w:t>Phát hiện.</w:t>
-      </w:r>
-      <w:r>
-        <w:t xml:space="preserve"> Kiểm thử hai tài khoản A, B: dùng token của A đọc giỏ của B. Trên mã chưa sửa trả về đúng giỏ của B (Hình 5); các ca tương ứng trong </w:t>
-      </w:r>
-      <w:r>
-        <w:rPr>
-          <w:rFonts w:ascii="Consolas" w:hAnsi="Consolas"/>
-          <w:sz w:val="20"/>
-        </w:rPr>
-        <w:t>f01-f02.test.ts</w:t>
-      </w:r>
-      <w:r>
-        <w:t xml:space="preserve"> đỏ.</w:t>
-      </w:r>
-    </w:p>
-    <w:p>
-      <w:pPr>
-        <w:pStyle w:val="Heading3"/>
-      </w:pPr>
-      <w:r>
-        <w:t>Sau khi sửa</w:t>
-      </w:r>
-    </w:p>
-    <w:p>
-      <w:pPr>
-        <w:jc w:val="both"/>
-      </w:pPr>
-      <w:r>
-        <w:t>Ràng buộc chủ sở hữu ngay trong truy vấn, danh tính lấy từ phiên do máy chủ cấp:</w:t>
+        <w:t>F04 — `tv4_f04_policy.py`:</w:t>
+      </w:r>
+      <w:r>
+        <w:t xml:space="preserve"> chạy Conftest trên Dockerfile; thoát khác 0 nghĩa là gate chặn.</w:t>
       </w:r>
     </w:p>
     <w:tbl>
@@ -3988,7 +5188,7 @@
                 <w:rFonts w:ascii="Consolas" w:hAnsi="Consolas"/>
                 <w:sz w:val="17"/>
               </w:rPr>
-              <w:t>const user = security.authenticatedUsers.from(req)</w:t>
+              <w:t>p = sh(*CF, 'test', target, '--parser', 'dockerfile', '-p', 'policy', '--namespace', 'dockerfile')</w:t>
             </w:r>
             <w:r>
               <w:br/>
@@ -3998,17 +5198,80 @@
                 <w:rFonts w:ascii="Consolas" w:hAnsi="Consolas"/>
                 <w:sz w:val="17"/>
               </w:rPr>
-              <w:t>if (!user?.data?.id) return res.status(401).end()</w:t>
-            </w:r>
-            <w:r>
-              <w:br/>
-            </w:r>
+              <w:t># p.returncode != 0 -&gt; gate chặn; mỗi dòng FAIL là một luật Rego bị vi phạm</w:t>
+            </w:r>
+          </w:p>
+        </w:tc>
+      </w:tr>
+    </w:tbl>
+    <w:p/>
+    <w:p>
+      <w:pPr>
+        <w:pStyle w:val="Heading1"/>
+      </w:pPr>
+      <w:r>
+        <w:t>5. Bốn lỗi an toàn: phát hiện và xử lý</w:t>
+      </w:r>
+    </w:p>
+    <w:p>
+      <w:pPr>
+        <w:pStyle w:val="Heading2"/>
+      </w:pPr>
+      <w:r>
+        <w:t>5.1. F01 — SQL injection tại đăng nhập</w:t>
+      </w:r>
+    </w:p>
+    <w:p>
+      <w:pPr>
+        <w:pStyle w:val="Heading3"/>
+      </w:pPr>
+      <w:r>
+        <w:t>Trước khi sửa</w:t>
+      </w:r>
+    </w:p>
+    <w:p>
+      <w:pPr>
+        <w:jc w:val="both"/>
+      </w:pPr>
+      <w:r>
+        <w:t xml:space="preserve">Route </w:t>
+      </w:r>
+      <w:r>
+        <w:rPr>
+          <w:rFonts w:ascii="Consolas" w:hAnsi="Consolas"/>
+          <w:sz w:val="20"/>
+        </w:rPr>
+        <w:t>routes/login.ts</w:t>
+      </w:r>
+      <w:r>
+        <w:t xml:space="preserve"> ghép thẳng email vào câu SQL:</w:t>
+      </w:r>
+    </w:p>
+    <w:tbl>
+      <w:tblPr>
+        <w:tblStyle w:val="TableGrid"/>
+        <w:tblW w:type="auto" w:w="0"/>
+        <w:tblLook w:firstColumn="1" w:firstRow="1" w:lastColumn="0" w:lastRow="0" w:noHBand="0" w:noVBand="1" w:val="04A0"/>
+      </w:tblPr>
+      <w:tblGrid>
+        <w:gridCol w:w="9638"/>
+      </w:tblGrid>
+      <w:tr>
+        <w:tc>
+          <w:tcPr>
+            <w:tcW w:type="dxa" w:w="9638"/>
+            <w:shd w:val="clear" w:color="auto" w:fill="F6F8FA"/>
+          </w:tcPr>
+          <w:p>
+            <w:pPr>
+              <w:spacing w:after="0"/>
+            </w:pPr>
             <w:r>
               <w:rPr>
                 <w:rFonts w:ascii="Consolas" w:hAnsi="Consolas"/>
                 <w:sz w:val="17"/>
               </w:rPr>
-              <w:t>const id = Number(req.params.id)</w:t>
+              <w:t>models.sequelize.query(`SELECT * FROM Users WHERE email = '${req.body.email || ''}'</w:t>
             </w:r>
             <w:r>
               <w:br/>
@@ -4018,27 +5281,7 @@
                 <w:rFonts w:ascii="Consolas" w:hAnsi="Consolas"/>
                 <w:sz w:val="17"/>
               </w:rPr>
-              <w:t>if (!Number.isSafeInteger(id) || id &lt;= 0) return res.status(400).end()</w:t>
-            </w:r>
-            <w:r>
-              <w:br/>
-            </w:r>
-            <w:r>
-              <w:rPr>
-                <w:rFonts w:ascii="Consolas" w:hAnsi="Consolas"/>
-                <w:sz w:val="17"/>
-              </w:rPr>
-              <w:t>const basket = await BasketModel.findOne({ where: { id, UserId: user.data.id }, include: [{ model: ProductModel, as: 'Products' }] })</w:t>
-            </w:r>
-            <w:r>
-              <w:br/>
-            </w:r>
-            <w:r>
-              <w:rPr>
-                <w:rFonts w:ascii="Consolas" w:hAnsi="Consolas"/>
-                <w:sz w:val="17"/>
-              </w:rPr>
-              <w:t>if (!basket) return res.status(404).end()</w:t>
+              <w:t xml:space="preserve">  AND password = '${security.hash(req.body.password || '')}' AND deletedAt IS NULL`, { model: UserModel, plain: true })</w:t>
             </w:r>
           </w:p>
         </w:tc>
@@ -4050,7 +5293,61 @@
         <w:jc w:val="both"/>
       </w:pPr>
       <w:r>
-        <w:t>Sau khi sửa, A đọc giỏ của B nhận 404, giỏ của chính mình vẫn 200 (Hình 5).</w:t>
+        <w:t xml:space="preserve">Với email </w:t>
+      </w:r>
+      <w:r>
+        <w:rPr>
+          <w:rFonts w:ascii="Consolas" w:hAnsi="Consolas"/>
+          <w:sz w:val="20"/>
+        </w:rPr>
+        <w:t>' OR 1=1--</w:t>
+      </w:r>
+      <w:r>
+        <w:t>, mệnh đề WHERE luôn đúng và phần kiểm tra mật khẩu bị biến thành chú thích, nên máy chủ cấp token của tài khoản đầu tiên (quản trị) mà không cần mật khẩu. Đây là CWE-89, OWASP A03:2021.</w:t>
+      </w:r>
+    </w:p>
+    <w:p>
+      <w:pPr>
+        <w:jc w:val="both"/>
+      </w:pPr>
+      <w:r>
+        <w:rPr>
+          <w:b/>
+        </w:rPr>
+        <w:t>Phát hiện.</w:t>
+      </w:r>
+      <w:r>
+        <w:t xml:space="preserve"> Semgrep (luật </w:t>
+      </w:r>
+      <w:r>
+        <w:rPr>
+          <w:rFonts w:ascii="Consolas" w:hAnsi="Consolas"/>
+          <w:sz w:val="20"/>
+        </w:rPr>
+        <w:t>express-sequelize-injection</w:t>
+      </w:r>
+      <w:r>
+        <w:t xml:space="preserve">) chỉ đúng dòng lỗi; kiểm thử </w:t>
+      </w:r>
+      <w:r>
+        <w:rPr>
+          <w:rFonts w:ascii="Consolas" w:hAnsi="Consolas"/>
+          <w:sz w:val="20"/>
+        </w:rPr>
+        <w:t>test/api/security/f01-f02.test.ts</w:t>
+      </w:r>
+      <w:r>
+        <w:t xml:space="preserve"> gửi payload kèm mật khẩu sai và yêu cầu nhận 401 — trên mã chưa sửa, test đỏ (Hình 7). Demo </w:t>
+      </w:r>
+      <w:r>
+        <w:rPr>
+          <w:rFonts w:ascii="Consolas" w:hAnsi="Consolas"/>
+          <w:sz w:val="20"/>
+        </w:rPr>
+        <w:t>demos/tv1_f01_sqli.py</w:t>
+      </w:r>
+      <w:r>
+        <w:t xml:space="preserve"> xác nhận token được cấp (Hình 8).</w:t>
       </w:r>
     </w:p>
     <w:p>
@@ -4060,8 +5357,549 @@
       <w:r>
         <w:drawing>
           <wp:inline xmlns:a="http://schemas.openxmlformats.org/drawingml/2006/main" xmlns:pic="http://schemas.openxmlformats.org/drawingml/2006/picture">
+            <wp:extent cx="5760000" cy="3611077"/>
+            <wp:docPr id="6" name="Picture 6"/>
+            <wp:cNvGraphicFramePr>
+              <a:graphicFrameLocks noChangeAspect="1"/>
+            </wp:cNvGraphicFramePr>
+            <a:graphic>
+              <a:graphicData uri="http://schemas.openxmlformats.org/drawingml/2006/picture">
+                <pic:pic>
+                  <pic:nvPicPr>
+                    <pic:cNvPr id="0" name="semgrep.png"/>
+                    <pic:cNvPicPr/>
+                  </pic:nvPicPr>
+                  <pic:blipFill>
+                    <a:blip r:embed="rId15"/>
+                    <a:stretch>
+                      <a:fillRect/>
+                    </a:stretch>
+                  </pic:blipFill>
+                  <pic:spPr>
+                    <a:xfrm>
+                      <a:off x="0" y="0"/>
+                      <a:ext cx="5760000" cy="3611077"/>
+                    </a:xfrm>
+                    <a:prstGeom prst="rect"/>
+                  </pic:spPr>
+                </pic:pic>
+              </a:graphicData>
+            </a:graphic>
+          </wp:inline>
+        </w:drawing>
+      </w:r>
+    </w:p>
+    <w:p>
+      <w:pPr>
+        <w:jc w:val="center"/>
+      </w:pPr>
+      <w:r>
+        <w:rPr>
+          <w:i/>
+          <w:sz w:val="22"/>
+        </w:rPr>
+        <w:t xml:space="preserve">Hình 6. </w:t>
+      </w:r>
+      <w:r>
+        <w:rPr>
+          <w:i/>
+          <w:sz w:val="22"/>
+        </w:rPr>
+        <w:t>Semgrep phát hiện truy vấn nhiễm dữ liệu người dùng tại login.ts và basket.ts</w:t>
+      </w:r>
+    </w:p>
+    <w:p>
+      <w:pPr>
+        <w:jc w:val="center"/>
+      </w:pPr>
+      <w:r>
+        <w:drawing>
+          <wp:inline xmlns:a="http://schemas.openxmlformats.org/drawingml/2006/main" xmlns:pic="http://schemas.openxmlformats.org/drawingml/2006/picture">
+            <wp:extent cx="5400000" cy="2066538"/>
+            <wp:docPr id="7" name="Picture 7"/>
+            <wp:cNvGraphicFramePr>
+              <a:graphicFrameLocks noChangeAspect="1"/>
+            </wp:cNvGraphicFramePr>
+            <a:graphic>
+              <a:graphicData uri="http://schemas.openxmlformats.org/drawingml/2006/picture">
+                <pic:pic>
+                  <pic:nvPicPr>
+                    <pic:cNvPr id="0" name="f0102-red.png"/>
+                    <pic:cNvPicPr/>
+                  </pic:nvPicPr>
+                  <pic:blipFill>
+                    <a:blip r:embed="rId16"/>
+                    <a:stretch>
+                      <a:fillRect/>
+                    </a:stretch>
+                  </pic:blipFill>
+                  <pic:spPr>
+                    <a:xfrm>
+                      <a:off x="0" y="0"/>
+                      <a:ext cx="5400000" cy="2066538"/>
+                    </a:xfrm>
+                    <a:prstGeom prst="rect"/>
+                  </pic:spPr>
+                </pic:pic>
+              </a:graphicData>
+            </a:graphic>
+          </wp:inline>
+        </w:drawing>
+      </w:r>
+    </w:p>
+    <w:p>
+      <w:pPr>
+        <w:jc w:val="center"/>
+      </w:pPr>
+      <w:r>
+        <w:rPr>
+          <w:i/>
+          <w:sz w:val="22"/>
+        </w:rPr>
+        <w:t xml:space="preserve">Hình 7. </w:t>
+      </w:r>
+      <w:r>
+        <w:rPr>
+          <w:i/>
+          <w:sz w:val="22"/>
+        </w:rPr>
+        <w:t>Kiểm thử bảo mật F01/F02 trên mã chưa sửa: các ca kiểm thử đỏ ứng với lỗ hổng còn tồn tại</w:t>
+      </w:r>
+    </w:p>
+    <w:p>
+      <w:pPr>
+        <w:pStyle w:val="Heading3"/>
+      </w:pPr>
+      <w:r>
+        <w:t>Sau khi sửa</w:t>
+      </w:r>
+    </w:p>
+    <w:p>
+      <w:pPr>
+        <w:jc w:val="both"/>
+      </w:pPr>
+      <w:r>
+        <w:t>Dùng truy vấn tham số (bind parameter):</w:t>
+      </w:r>
+    </w:p>
+    <w:tbl>
+      <w:tblPr>
+        <w:tblStyle w:val="TableGrid"/>
+        <w:tblW w:type="auto" w:w="0"/>
+        <w:tblLook w:firstColumn="1" w:firstRow="1" w:lastColumn="0" w:lastRow="0" w:noHBand="0" w:noVBand="1" w:val="04A0"/>
+      </w:tblPr>
+      <w:tblGrid>
+        <w:gridCol w:w="9638"/>
+      </w:tblGrid>
+      <w:tr>
+        <w:tc>
+          <w:tcPr>
+            <w:tcW w:type="dxa" w:w="9638"/>
+            <w:shd w:val="clear" w:color="auto" w:fill="F6F8FA"/>
+          </w:tcPr>
+          <w:p>
+            <w:pPr>
+              <w:spacing w:after="0"/>
+            </w:pPr>
+            <w:r>
+              <w:rPr>
+                <w:rFonts w:ascii="Consolas" w:hAnsi="Consolas"/>
+                <w:sz w:val="17"/>
+              </w:rPr>
+              <w:t>const email = typeof req.body.email === 'string' ? req.body.email : ''</w:t>
+            </w:r>
+            <w:r>
+              <w:br/>
+            </w:r>
+            <w:r>
+              <w:rPr>
+                <w:rFonts w:ascii="Consolas" w:hAnsi="Consolas"/>
+                <w:sz w:val="17"/>
+              </w:rPr>
+              <w:t>const password = typeof req.body.password === 'string' ? req.body.password : ''</w:t>
+            </w:r>
+            <w:r>
+              <w:br/>
+            </w:r>
+            <w:r>
+              <w:rPr>
+                <w:rFonts w:ascii="Consolas" w:hAnsi="Consolas"/>
+                <w:sz w:val="17"/>
+              </w:rPr>
+              <w:t>models.sequelize.query('SELECT * FROM Users WHERE email = $email AND password = $password AND deletedAt IS NULL',</w:t>
+            </w:r>
+            <w:r>
+              <w:br/>
+            </w:r>
+            <w:r>
+              <w:rPr>
+                <w:rFonts w:ascii="Consolas" w:hAnsi="Consolas"/>
+                <w:sz w:val="17"/>
+              </w:rPr>
+              <w:t xml:space="preserve">  { bind: { email, password: security.hash(password) }, model: UserModel, plain: true })</w:t>
+            </w:r>
+          </w:p>
+        </w:tc>
+      </w:tr>
+    </w:tbl>
+    <w:p/>
+    <w:p>
+      <w:pPr>
+        <w:jc w:val="both"/>
+      </w:pPr>
+      <w:r>
+        <w:t>Câu lệnh được biên dịch trước, giá trị gửi riêng nên ký tự SQL trong email chỉ còn là dữ liệu. Sau khi sửa, kiểm thử bảo mật xanh toàn bộ (Hình 10) và demo cho thấy mọi payload đều bị từ chối 401 trong khi đăng nhập hợp lệ vẫn hoạt động (Hình 8).</w:t>
+      </w:r>
+    </w:p>
+    <w:p>
+      <w:pPr>
+        <w:jc w:val="both"/>
+      </w:pPr>
+      <w:r>
+        <w:t xml:space="preserve">Giới hạn còn lại: bản vá chỉ xử lý injection; cùng dòng code vẫn gọi </w:t>
+      </w:r>
+      <w:r>
+        <w:rPr>
+          <w:rFonts w:ascii="Consolas" w:hAnsi="Consolas"/>
+          <w:sz w:val="20"/>
+        </w:rPr>
+        <w:t>security.hash</w:t>
+      </w:r>
+      <w:r>
+        <w:t xml:space="preserve"> của Juice Shop — hàm này băm mật khẩu bằng </w:t>
+      </w:r>
+      <w:r>
+        <w:rPr>
+          <w:b/>
+        </w:rPr>
+        <w:t>MD5 không muối</w:t>
+      </w:r>
+      <w:r>
+        <w:t xml:space="preserve"> (</w:t>
+      </w:r>
+      <w:r>
+        <w:rPr>
+          <w:rFonts w:ascii="Consolas" w:hAnsi="Consolas"/>
+          <w:sz w:val="20"/>
+        </w:rPr>
+        <w:t>lib/insecurity.ts</w:t>
+      </w:r>
+      <w:r>
+        <w:t>, CWE-327 / OWASP A02:2021). Đây là lỗ hổng lưu trữ mật khẩu nằm ngoài phạm vi F01 (vốn chỉ chặn vượt xác thực); khi triển khai thật cần thay bằng bcrypt/argon2 có muối.</w:t>
+      </w:r>
+    </w:p>
+    <w:p>
+      <w:pPr>
+        <w:jc w:val="center"/>
+      </w:pPr>
+      <w:r>
+        <w:drawing>
+          <wp:inline xmlns:a="http://schemas.openxmlformats.org/drawingml/2006/main" xmlns:pic="http://schemas.openxmlformats.org/drawingml/2006/picture">
+            <wp:extent cx="5400000" cy="1996579"/>
+            <wp:docPr id="8" name="Picture 8"/>
+            <wp:cNvGraphicFramePr>
+              <a:graphicFrameLocks noChangeAspect="1"/>
+            </wp:cNvGraphicFramePr>
+            <a:graphic>
+              <a:graphicData uri="http://schemas.openxmlformats.org/drawingml/2006/picture">
+                <pic:pic>
+                  <pic:nvPicPr>
+                    <pic:cNvPr id="0" name="tv1.png"/>
+                    <pic:cNvPicPr/>
+                  </pic:nvPicPr>
+                  <pic:blipFill>
+                    <a:blip r:embed="rId17"/>
+                    <a:stretch>
+                      <a:fillRect/>
+                    </a:stretch>
+                  </pic:blipFill>
+                  <pic:spPr>
+                    <a:xfrm>
+                      <a:off x="0" y="0"/>
+                      <a:ext cx="5400000" cy="1996579"/>
+                    </a:xfrm>
+                    <a:prstGeom prst="rect"/>
+                  </pic:spPr>
+                </pic:pic>
+              </a:graphicData>
+            </a:graphic>
+          </wp:inline>
+        </w:drawing>
+      </w:r>
+    </w:p>
+    <w:p>
+      <w:pPr>
+        <w:jc w:val="center"/>
+      </w:pPr>
+      <w:r>
+        <w:rPr>
+          <w:i/>
+          <w:sz w:val="22"/>
+        </w:rPr>
+        <w:t xml:space="preserve">Hình 8. </w:t>
+      </w:r>
+      <w:r>
+        <w:rPr>
+          <w:i/>
+          <w:sz w:val="22"/>
+        </w:rPr>
+        <w:t>Demo F01: cùng payload, trước khi sửa được cấp token, sau khi sửa bị từ chối</w:t>
+      </w:r>
+    </w:p>
+    <w:p>
+      <w:pPr>
+        <w:jc w:val="both"/>
+      </w:pPr>
+      <w:r>
+        <w:rPr>
+          <w:b/>
+        </w:rPr>
+        <w:t>Chính sách vi phạm:</w:t>
+      </w:r>
+      <w:r>
+        <w:t xml:space="preserve"> GDPR Điều 32(1)(b) (bảo mật khi xử lý dữ liệu); Nghị định 13/2023 Điều 26 (biện pháp kỹ thuật bảo vệ dữ liệu cá nhân); Luật ATTTM 2015 Điều 19. </w:t>
+      </w:r>
+      <w:r>
+        <w:rPr>
+          <w:b/>
+        </w:rPr>
+        <w:t>Pha &amp; Security as Code:</w:t>
+      </w:r>
+      <w:r>
+        <w:t xml:space="preserve"> phát hiện ở pha Code (SAST), chặn tái diễn ở pha Test bằng kiểm thử bảo mật trong pipeline.</w:t>
+      </w:r>
+    </w:p>
+    <w:p>
+      <w:pPr>
+        <w:pStyle w:val="Heading2"/>
+      </w:pPr>
+      <w:r>
+        <w:t>5.2. F02 — IDOR khi đọc giỏ hàng</w:t>
+      </w:r>
+    </w:p>
+    <w:p>
+      <w:pPr>
+        <w:pStyle w:val="Heading3"/>
+      </w:pPr>
+      <w:r>
+        <w:t>Trước khi sửa</w:t>
+      </w:r>
+    </w:p>
+    <w:p>
+      <w:pPr>
+        <w:jc w:val="both"/>
+      </w:pPr>
+      <w:r>
+        <w:t xml:space="preserve">Route </w:t>
+      </w:r>
+      <w:r>
+        <w:rPr>
+          <w:rFonts w:ascii="Consolas" w:hAnsi="Consolas"/>
+          <w:sz w:val="20"/>
+        </w:rPr>
+        <w:t>routes/basket.ts</w:t>
+      </w:r>
+      <w:r>
+        <w:t xml:space="preserve"> tìm giỏ chỉ theo mã trên URL:</w:t>
+      </w:r>
+    </w:p>
+    <w:tbl>
+      <w:tblPr>
+        <w:tblStyle w:val="TableGrid"/>
+        <w:tblW w:type="auto" w:w="0"/>
+        <w:tblLook w:firstColumn="1" w:firstRow="1" w:lastColumn="0" w:lastRow="0" w:noHBand="0" w:noVBand="1" w:val="04A0"/>
+      </w:tblPr>
+      <w:tblGrid>
+        <w:gridCol w:w="9638"/>
+      </w:tblGrid>
+      <w:tr>
+        <w:tc>
+          <w:tcPr>
+            <w:tcW w:type="dxa" w:w="9638"/>
+            <w:shd w:val="clear" w:color="auto" w:fill="F6F8FA"/>
+          </w:tcPr>
+          <w:p>
+            <w:pPr>
+              <w:spacing w:after="0"/>
+            </w:pPr>
+            <w:r>
+              <w:rPr>
+                <w:rFonts w:ascii="Consolas" w:hAnsi="Consolas"/>
+                <w:sz w:val="17"/>
+              </w:rPr>
+              <w:t>const basket = await BasketModel.findOne({ where: { id }, include: [{ model: ProductModel, as: 'Products' }] })</w:t>
+            </w:r>
+          </w:p>
+        </w:tc>
+      </w:tr>
+    </w:tbl>
+    <w:p/>
+    <w:p>
+      <w:pPr>
+        <w:jc w:val="both"/>
+      </w:pPr>
+      <w:r>
+        <w:t xml:space="preserve">Middleware chỉ kiểm tra token hợp lệ, không kiểm tra quyền sở hữu, nên đổi </w:t>
+      </w:r>
+      <w:r>
+        <w:rPr>
+          <w:rFonts w:ascii="Consolas" w:hAnsi="Consolas"/>
+          <w:sz w:val="20"/>
+        </w:rPr>
+        <w:t>/rest/basket/8</w:t>
+      </w:r>
+      <w:r>
+        <w:t xml:space="preserve"> thành </w:t>
+      </w:r>
+      <w:r>
+        <w:rPr>
+          <w:rFonts w:ascii="Consolas" w:hAnsi="Consolas"/>
+          <w:sz w:val="20"/>
+        </w:rPr>
+        <w:t>/rest/basket/9</w:t>
+      </w:r>
+      <w:r>
+        <w:t xml:space="preserve"> là đọc được giỏ người khác (CWE-639, OWASP A01:2021).</w:t>
+      </w:r>
+    </w:p>
+    <w:p>
+      <w:pPr>
+        <w:jc w:val="both"/>
+      </w:pPr>
+      <w:r>
+        <w:rPr>
+          <w:b/>
+        </w:rPr>
+        <w:t>Phát hiện.</w:t>
+      </w:r>
+      <w:r>
+        <w:t xml:space="preserve"> Kiểm thử hai tài khoản A, B: dùng token của A đọc giỏ của B. Trên mã chưa sửa trả về đúng giỏ của B (Hình 9); các ca tương ứng trong </w:t>
+      </w:r>
+      <w:r>
+        <w:rPr>
+          <w:rFonts w:ascii="Consolas" w:hAnsi="Consolas"/>
+          <w:sz w:val="20"/>
+        </w:rPr>
+        <w:t>f01-f02.test.ts</w:t>
+      </w:r>
+      <w:r>
+        <w:t xml:space="preserve"> đỏ.</w:t>
+      </w:r>
+    </w:p>
+    <w:p>
+      <w:pPr>
+        <w:pStyle w:val="Heading3"/>
+      </w:pPr>
+      <w:r>
+        <w:t>Sau khi sửa</w:t>
+      </w:r>
+    </w:p>
+    <w:p>
+      <w:pPr>
+        <w:jc w:val="both"/>
+      </w:pPr>
+      <w:r>
+        <w:t>Ràng buộc chủ sở hữu ngay trong truy vấn, danh tính lấy từ phiên do máy chủ cấp:</w:t>
+      </w:r>
+    </w:p>
+    <w:tbl>
+      <w:tblPr>
+        <w:tblStyle w:val="TableGrid"/>
+        <w:tblW w:type="auto" w:w="0"/>
+        <w:tblLook w:firstColumn="1" w:firstRow="1" w:lastColumn="0" w:lastRow="0" w:noHBand="0" w:noVBand="1" w:val="04A0"/>
+      </w:tblPr>
+      <w:tblGrid>
+        <w:gridCol w:w="9638"/>
+      </w:tblGrid>
+      <w:tr>
+        <w:tc>
+          <w:tcPr>
+            <w:tcW w:type="dxa" w:w="9638"/>
+            <w:shd w:val="clear" w:color="auto" w:fill="F6F8FA"/>
+          </w:tcPr>
+          <w:p>
+            <w:pPr>
+              <w:spacing w:after="0"/>
+            </w:pPr>
+            <w:r>
+              <w:rPr>
+                <w:rFonts w:ascii="Consolas" w:hAnsi="Consolas"/>
+                <w:sz w:val="17"/>
+              </w:rPr>
+              <w:t>const user = security.authenticatedUsers.from(req)</w:t>
+            </w:r>
+            <w:r>
+              <w:br/>
+            </w:r>
+            <w:r>
+              <w:rPr>
+                <w:rFonts w:ascii="Consolas" w:hAnsi="Consolas"/>
+                <w:sz w:val="17"/>
+              </w:rPr>
+              <w:t>if (!user?.data?.id) return res.status(401).end()</w:t>
+            </w:r>
+            <w:r>
+              <w:br/>
+            </w:r>
+            <w:r>
+              <w:rPr>
+                <w:rFonts w:ascii="Consolas" w:hAnsi="Consolas"/>
+                <w:sz w:val="17"/>
+              </w:rPr>
+              <w:t>const id = Number(req.params.id)</w:t>
+            </w:r>
+            <w:r>
+              <w:br/>
+            </w:r>
+            <w:r>
+              <w:rPr>
+                <w:rFonts w:ascii="Consolas" w:hAnsi="Consolas"/>
+                <w:sz w:val="17"/>
+              </w:rPr>
+              <w:t>if (!Number.isSafeInteger(id) || id &lt;= 0) return res.status(400).end()</w:t>
+            </w:r>
+            <w:r>
+              <w:br/>
+            </w:r>
+            <w:r>
+              <w:rPr>
+                <w:rFonts w:ascii="Consolas" w:hAnsi="Consolas"/>
+                <w:sz w:val="17"/>
+              </w:rPr>
+              <w:t>const basket = await BasketModel.findOne({ where: { id, UserId: user.data.id }, include: [{ model: ProductModel, as: 'Products' }] })</w:t>
+            </w:r>
+            <w:r>
+              <w:br/>
+            </w:r>
+            <w:r>
+              <w:rPr>
+                <w:rFonts w:ascii="Consolas" w:hAnsi="Consolas"/>
+                <w:sz w:val="17"/>
+              </w:rPr>
+              <w:t>if (!basket) return res.status(404).end()</w:t>
+            </w:r>
+          </w:p>
+        </w:tc>
+      </w:tr>
+    </w:tbl>
+    <w:p/>
+    <w:p>
+      <w:pPr>
+        <w:jc w:val="both"/>
+      </w:pPr>
+      <w:r>
+        <w:t>Sau khi sửa, A đọc giỏ của B nhận 404, giỏ của chính mình vẫn 200 (Hình 9).</w:t>
+      </w:r>
+    </w:p>
+    <w:p>
+      <w:pPr>
+        <w:jc w:val="center"/>
+      </w:pPr>
+      <w:r>
+        <w:drawing>
+          <wp:inline xmlns:a="http://schemas.openxmlformats.org/drawingml/2006/main" xmlns:pic="http://schemas.openxmlformats.org/drawingml/2006/picture">
             <wp:extent cx="5040000" cy="1604842"/>
-            <wp:docPr id="5" name="Picture 5"/>
+            <wp:docPr id="9" name="Picture 9"/>
             <wp:cNvGraphicFramePr>
               <a:graphicFrameLocks noChangeAspect="1"/>
             </wp:cNvGraphicFramePr>
@@ -4073,7 +5911,7 @@
                     <pic:cNvPicPr/>
                   </pic:nvPicPr>
                   <pic:blipFill>
-                    <a:blip r:embed="rId14"/>
+                    <a:blip r:embed="rId18"/>
                     <a:stretch>
                       <a:fillRect/>
                     </a:stretch>
@@ -4101,7 +5939,7 @@
           <w:i/>
           <w:sz w:val="22"/>
         </w:rPr>
-        <w:t xml:space="preserve">Hình 5. </w:t>
+        <w:t xml:space="preserve">Hình 9. </w:t>
       </w:r>
       <w:r>
         <w:rPr>
@@ -4119,7 +5957,7 @@
         <w:drawing>
           <wp:inline xmlns:a="http://schemas.openxmlformats.org/drawingml/2006/main" xmlns:pic="http://schemas.openxmlformats.org/drawingml/2006/picture">
             <wp:extent cx="5400000" cy="2066538"/>
-            <wp:docPr id="6" name="Picture 6"/>
+            <wp:docPr id="10" name="Picture 10"/>
             <wp:cNvGraphicFramePr>
               <a:graphicFrameLocks noChangeAspect="1"/>
             </wp:cNvGraphicFramePr>
@@ -4131,7 +5969,7 @@
                     <pic:cNvPicPr/>
                   </pic:nvPicPr>
                   <pic:blipFill>
-                    <a:blip r:embed="rId15"/>
+                    <a:blip r:embed="rId19"/>
                     <a:stretch>
                       <a:fillRect/>
                     </a:stretch>
@@ -4159,7 +5997,7 @@
           <w:i/>
           <w:sz w:val="22"/>
         </w:rPr>
-        <w:t xml:space="preserve">Hình 6. </w:t>
+        <w:t xml:space="preserve">Hình 10. </w:t>
       </w:r>
       <w:r>
         <w:rPr>
@@ -4197,7 +6035,7 @@
         <w:pStyle w:val="Heading2"/>
       </w:pPr>
       <w:r>
-        <w:t>4.3. F03 — Lộ endpoint /metrics không xác thực</w:t>
+        <w:t>5.3. F03 — Lộ endpoint /metrics không xác thực</w:t>
       </w:r>
     </w:p>
     <w:p>
@@ -4266,7 +6104,7 @@
         <w:t>/metrics</w:t>
       </w:r>
       <w:r>
-        <w:t xml:space="preserve"> từ host: trước khi sửa trả 200 với hàng trăm dòng số liệu (Hình 7).</w:t>
+        <w:t xml:space="preserve"> từ host: trước khi sửa trả 200 với hàng trăm dòng số liệu (Hình 11).</w:t>
       </w:r>
     </w:p>
     <w:p>
@@ -4421,7 +6259,7 @@
         <w:t>từ host</w:t>
       </w:r>
       <w:r>
-        <w:t xml:space="preserve"> — tức chặn ở lối vào từ bên ngoài, không phải đóng tuyệt đối: trong mạng internal, hệ thống giám sát vẫn đọc được metrics đúng mục đích (Hình 7).</w:t>
+        <w:t xml:space="preserve"> — tức chặn ở lối vào từ bên ngoài, không phải đóng tuyệt đối: trong mạng internal, hệ thống giám sát vẫn đọc được metrics đúng mục đích (Hình 11).</w:t>
       </w:r>
     </w:p>
     <w:p>
@@ -4432,7 +6270,7 @@
         <w:drawing>
           <wp:inline xmlns:a="http://schemas.openxmlformats.org/drawingml/2006/main" xmlns:pic="http://schemas.openxmlformats.org/drawingml/2006/picture">
             <wp:extent cx="5400000" cy="3006346"/>
-            <wp:docPr id="7" name="Picture 7"/>
+            <wp:docPr id="11" name="Picture 11"/>
             <wp:cNvGraphicFramePr>
               <a:graphicFrameLocks noChangeAspect="1"/>
             </wp:cNvGraphicFramePr>
@@ -4444,7 +6282,7 @@
                     <pic:cNvPicPr/>
                   </pic:nvPicPr>
                   <pic:blipFill>
-                    <a:blip r:embed="rId16"/>
+                    <a:blip r:embed="rId20"/>
                     <a:stretch>
                       <a:fillRect/>
                     </a:stretch>
@@ -4472,7 +6310,7 @@
           <w:i/>
           <w:sz w:val="22"/>
         </w:rPr>
-        <w:t xml:space="preserve">Hình 7. </w:t>
+        <w:t xml:space="preserve">Hình 11. </w:t>
       </w:r>
       <w:r>
         <w:rPr>
@@ -4512,7 +6350,7 @@
         <w:t>compose.rego</w:t>
       </w:r>
       <w:r>
-        <w:t xml:space="preserve"> chặn mọi cấu hình cho backend mở cổng (mục 5).</w:t>
+        <w:t xml:space="preserve"> chặn mọi cấu hình cho backend mở cổng (mục 4).</w:t>
       </w:r>
     </w:p>
     <w:p>
@@ -4520,7 +6358,7 @@
         <w:pStyle w:val="Heading2"/>
       </w:pPr>
       <w:r>
-        <w:t>4.4. F04 — Sai cấu hình an toàn của container</w:t>
+        <w:t>5.4. F04 — Sai cấu hình an toàn của container</w:t>
       </w:r>
     </w:p>
     <w:p>
@@ -5224,7 +7062,7 @@
           <w:i/>
           <w:sz w:val="22"/>
         </w:rPr>
-        <w:t>Bảng 8. Luật kiểm tra cấu hình container — luật yêu cầu gì và dựa trên chuẩn nào</w:t>
+        <w:t>Bảng 11. Luật kiểm tra cấu hình container — luật yêu cầu gì và dựa trên chuẩn nào</w:t>
       </w:r>
     </w:p>
     <w:tbl>
@@ -5635,7 +7473,7 @@
         <w:t>đạt toàn bộ chính sách an toàn</w:t>
       </w:r>
       <w:r>
-        <w:t xml:space="preserve"> (Hình 8).</w:t>
+        <w:t xml:space="preserve"> (Hình 12).</w:t>
       </w:r>
     </w:p>
     <w:p>
@@ -5646,7 +7484,7 @@
         <w:drawing>
           <wp:inline xmlns:a="http://schemas.openxmlformats.org/drawingml/2006/main" xmlns:pic="http://schemas.openxmlformats.org/drawingml/2006/picture">
             <wp:extent cx="5400000" cy="2128846"/>
-            <wp:docPr id="8" name="Picture 8"/>
+            <wp:docPr id="12" name="Picture 12"/>
             <wp:cNvGraphicFramePr>
               <a:graphicFrameLocks noChangeAspect="1"/>
             </wp:cNvGraphicFramePr>
@@ -5658,7 +7496,7 @@
                     <pic:cNvPicPr/>
                   </pic:nvPicPr>
                   <pic:blipFill>
-                    <a:blip r:embed="rId17"/>
+                    <a:blip r:embed="rId21"/>
                     <a:stretch>
                       <a:fillRect/>
                     </a:stretch>
@@ -5686,7 +7524,7 @@
           <w:i/>
           <w:sz w:val="22"/>
         </w:rPr>
-        <w:t xml:space="preserve">Hình 8. </w:t>
+        <w:t xml:space="preserve">Hình 12. </w:t>
       </w:r>
       <w:r>
         <w:rPr>
@@ -5840,7 +7678,7 @@
         <w:pStyle w:val="Heading1"/>
       </w:pPr>
       <w:r>
-        <w:t>5. Policy as Code và Security as Code</w:t>
+        <w:t>6. Đối chiếu chính sách bảo vệ dữ liệu</w:t>
       </w:r>
     </w:p>
     <w:p>
@@ -5848,7 +7686,34 @@
         <w:jc w:val="both"/>
       </w:pPr>
       <w:r>
-        <w:t>Toàn bộ việc phát hiện và chống tái diễn bốn lỗi được viết thành mã và chạy tự động như một chuỗi kiểm soát (pipeline cục bộ), đúng tinh thần DevSecOps. Hình dưới ánh xạ từng lỗi và cổng kiểm soát vào các pha của vòng đời DevSecOps (xanh dương = Security as Code cho F01/F02; xanh lá = Policy as Code cho F03/F04):</w:t>
+        <w:t xml:space="preserve">Nhóm đối chiếu mỗi lỗi với cả khung </w:t>
+      </w:r>
+      <w:r>
+        <w:rPr>
+          <w:b/>
+        </w:rPr>
+        <w:t>quốc tế (GDPR)</w:t>
+      </w:r>
+      <w:r>
+        <w:t xml:space="preserve"> và </w:t>
+      </w:r>
+      <w:r>
+        <w:rPr>
+          <w:b/>
+        </w:rPr>
+        <w:t>pháp luật Việt Nam</w:t>
+      </w:r>
+      <w:r>
+        <w:t xml:space="preserve"> — Nghị định 13/2023/NĐ-CP (bảo vệ dữ liệu cá nhân) và Luật An toàn thông tin mạng 2015. Ý nghĩa cụ thể của từng điều khoản xem </w:t>
+      </w:r>
+      <w:r>
+        <w:rPr>
+          <w:b/>
+        </w:rPr>
+        <w:t>Bảng tra ở mục 3.2</w:t>
+      </w:r>
+      <w:r>
+        <w:t>.</w:t>
       </w:r>
     </w:p>
     <w:p>
@@ -5856,262 +7721,11 @@
         <w:jc w:val="center"/>
       </w:pPr>
       <w:r>
-        <w:drawing>
-          <wp:inline xmlns:a="http://schemas.openxmlformats.org/drawingml/2006/main" xmlns:pic="http://schemas.openxmlformats.org/drawingml/2006/picture">
-            <wp:extent cx="5760000" cy="2618182"/>
-            <wp:docPr id="9" name="Picture 9"/>
-            <wp:cNvGraphicFramePr>
-              <a:graphicFrameLocks noChangeAspect="1"/>
-            </wp:cNvGraphicFramePr>
-            <a:graphic>
-              <a:graphicData uri="http://schemas.openxmlformats.org/drawingml/2006/picture">
-                <pic:pic>
-                  <pic:nvPicPr>
-                    <pic:cNvPr id="0" name="devsecops-pipeline.png"/>
-                    <pic:cNvPicPr/>
-                  </pic:nvPicPr>
-                  <pic:blipFill>
-                    <a:blip r:embed="rId18"/>
-                    <a:stretch>
-                      <a:fillRect/>
-                    </a:stretch>
-                  </pic:blipFill>
-                  <pic:spPr>
-                    <a:xfrm>
-                      <a:off x="0" y="0"/>
-                      <a:ext cx="5760000" cy="2618182"/>
-                    </a:xfrm>
-                    <a:prstGeom prst="rect"/>
-                  </pic:spPr>
-                </pic:pic>
-              </a:graphicData>
-            </a:graphic>
-          </wp:inline>
-        </w:drawing>
-      </w:r>
-    </w:p>
-    <w:p>
-      <w:pPr>
-        <w:jc w:val="center"/>
-      </w:pPr>
-      <w:r>
         <w:rPr>
           <w:i/>
           <w:sz w:val="22"/>
         </w:rPr>
-        <w:t xml:space="preserve">Hình 9. </w:t>
-      </w:r>
-      <w:r>
-        <w:rPr>
-          <w:i/>
-          <w:sz w:val="22"/>
-        </w:rPr>
-        <w:t>Quy trình DevSecOps: ánh xạ bốn lỗi F01–F04 và các cổng kiểm soát theo từng pha; Security as Code cho F01/F02, Policy as Code cho F03/F04</w:t>
-      </w:r>
-    </w:p>
-    <w:p>
-      <w:pPr>
-        <w:jc w:val="both"/>
-      </w:pPr>
-      <w:r>
-        <w:t>Hai nhóm kiểm soát trong hình:</w:t>
-      </w:r>
-    </w:p>
-    <w:p>
-      <w:pPr>
-        <w:pStyle w:val="ListBullet"/>
-      </w:pPr>
-      <w:r>
-        <w:rPr>
-          <w:b/>
-        </w:rPr>
-        <w:t>Security as Code:</w:t>
-      </w:r>
-      <w:r>
-        <w:t xml:space="preserve"> quét secret (Gitleaks), SAST (Semgrep) cho F01/F02, và kiểm thử bảo mật </w:t>
-      </w:r>
-      <w:r>
-        <w:rPr>
-          <w:rFonts w:ascii="Consolas" w:hAnsi="Consolas"/>
-          <w:sz w:val="20"/>
-        </w:rPr>
-        <w:t>f01-f02.test.ts</w:t>
-      </w:r>
-      <w:r>
-        <w:t xml:space="preserve"> (đỏ trước vá, xanh sau vá).</w:t>
-      </w:r>
-    </w:p>
-    <w:p>
-      <w:pPr>
-        <w:pStyle w:val="ListBullet"/>
-      </w:pPr>
-      <w:r>
-        <w:rPr>
-          <w:b/>
-        </w:rPr>
-        <w:t>Policy as Code (build-time):</w:t>
-      </w:r>
-      <w:r>
-        <w:t xml:space="preserve"> luật Rego cho Dockerfile (F04) và cho </w:t>
-      </w:r>
-      <w:r>
-        <w:rPr>
-          <w:rFonts w:ascii="Consolas" w:hAnsi="Consolas"/>
-          <w:sz w:val="20"/>
-        </w:rPr>
-        <w:t>docker-compose</w:t>
-      </w:r>
-      <w:r>
-        <w:t xml:space="preserve"> (F03) — chặn cấu hình mở cổng backend hay chạy root </w:t>
-      </w:r>
-      <w:r>
-        <w:rPr>
-          <w:b/>
-        </w:rPr>
-        <w:t>trước khi triển khai</w:t>
-      </w:r>
-      <w:r>
-        <w:t>.</w:t>
-      </w:r>
-    </w:p>
-    <w:p>
-      <w:pPr>
-        <w:pStyle w:val="ListBullet"/>
-      </w:pPr>
-      <w:r>
-        <w:rPr>
-          <w:b/>
-        </w:rPr>
-        <w:t>Compliance as Code (runtime):</w:t>
-      </w:r>
-      <w:r>
-        <w:t xml:space="preserve"> kiểm tra </w:t>
-      </w:r>
-      <w:r>
-        <w:rPr>
-          <w:b/>
-        </w:rPr>
-        <w:t>container đang chạy</w:t>
-      </w:r>
-      <w:r>
-        <w:t xml:space="preserve"> bằng </w:t>
-      </w:r>
-      <w:r>
-        <w:rPr>
-          <w:rFonts w:ascii="Consolas" w:hAnsi="Consolas"/>
-          <w:sz w:val="20"/>
-        </w:rPr>
-        <w:t>docker inspect</w:t>
-      </w:r>
-      <w:r>
-        <w:t xml:space="preserve"> + luật Rego runtime (</w:t>
-      </w:r>
-      <w:r>
-        <w:rPr>
-          <w:rFonts w:ascii="Consolas" w:hAnsi="Consolas"/>
-          <w:sz w:val="20"/>
-        </w:rPr>
-        <w:t>report/policy/runtime.rego</w:t>
-      </w:r>
-      <w:r>
-        <w:t xml:space="preserve">, </w:t>
-      </w:r>
-      <w:r>
-        <w:rPr>
-          <w:rFonts w:ascii="Consolas" w:hAnsi="Consolas"/>
-          <w:sz w:val="20"/>
-        </w:rPr>
-        <w:t>checks/hardening.py</w:t>
-      </w:r>
-      <w:r>
-        <w:t xml:space="preserve">) — xác nhận non-root, drop capability, chỉ proxy mở cổng loopback. So sánh container đối chứng (trước vá) với bản triển khai (sau vá) chính là cặp ca </w:t>
-      </w:r>
-      <w:r>
-        <w:rPr>
-          <w:i/>
-        </w:rPr>
-        <w:t>lỗi cố ý / đạt</w:t>
-      </w:r>
-      <w:r>
-        <w:t xml:space="preserve"> của kiểm tra tuân thủ.</w:t>
-      </w:r>
-    </w:p>
-    <w:p>
-      <w:pPr>
-        <w:jc w:val="both"/>
-      </w:pPr>
-      <w:r>
-        <w:t xml:space="preserve">Các kiểm soát này được viết thành mã, chạy lặp lại được — hiện chạy cục bộ (xem </w:t>
-      </w:r>
-      <w:r>
-        <w:rPr>
-          <w:rFonts w:ascii="Consolas" w:hAnsi="Consolas"/>
-          <w:sz w:val="20"/>
-        </w:rPr>
-        <w:t>DEMO.md</w:t>
-      </w:r>
-      <w:r>
-        <w:t xml:space="preserve">), và có thể ghép thành một chuỗi cổng (gate) trong CI. Mỗi cổng trả PASS/WARN/FAIL; chỉ mức </w:t>
-      </w:r>
-      <w:r>
-        <w:rPr>
-          <w:b/>
-        </w:rPr>
-        <w:t>FAIL (luật `deny`)</w:t>
-      </w:r>
-      <w:r>
-        <w:t xml:space="preserve"> mới chặn phát hành, còn mức </w:t>
-      </w:r>
-      <w:r>
-        <w:rPr>
-          <w:b/>
-        </w:rPr>
-        <w:t>WARN (luật `warn`)</w:t>
-      </w:r>
-      <w:r>
-        <w:t xml:space="preserve"> chỉ cảnh báo, không chặn. Trong </w:t>
-      </w:r>
-      <w:r>
-        <w:rPr>
-          <w:rFonts w:ascii="Consolas" w:hAnsi="Consolas"/>
-          <w:sz w:val="20"/>
-        </w:rPr>
-        <w:t>compose.rego</w:t>
-      </w:r>
-      <w:r>
-        <w:t xml:space="preserve">, các luật </w:t>
-      </w:r>
-      <w:r>
-        <w:rPr>
-          <w:rFonts w:ascii="Consolas" w:hAnsi="Consolas"/>
-          <w:sz w:val="20"/>
-        </w:rPr>
-        <w:t>cap_drop</w:t>
-      </w:r>
-      <w:r>
-        <w:t>/</w:t>
-      </w:r>
-      <w:r>
-        <w:rPr>
-          <w:rFonts w:ascii="Consolas" w:hAnsi="Consolas"/>
-          <w:sz w:val="20"/>
-        </w:rPr>
-        <w:t>read_only</w:t>
-      </w:r>
-      <w:r>
-        <w:t xml:space="preserve"> là mức WARN (khuyến cáo), còn các luật mở cổng backend, bind ngoài loopback, privileged, mount docker.sock, secret nội tuyến là mức FAIL (chặn).</w:t>
-      </w:r>
-    </w:p>
-    <w:p>
-      <w:pPr>
-        <w:jc w:val="center"/>
-      </w:pPr>
-      <w:r>
-        <w:rPr>
-          <w:i/>
-          <w:sz w:val="22"/>
-        </w:rPr>
-        <w:t>Bảng 9. Các cổng kiểm soát và lệnh chạy</w:t>
+        <w:t>Bảng 12. Ánh xạ lỗi với chính sách (quốc tế và Việt Nam)</w:t>
       </w:r>
     </w:p>
     <w:tbl>
@@ -6139,7 +7753,7 @@
                 <w:b/>
                 <w:color w:val="FFFFFF"/>
               </w:rPr>
-              <w:t>Cổng kiểm soát</w:t>
+              <w:t>Lỗi</w:t>
             </w:r>
           </w:p>
         </w:tc>
@@ -6154,7 +7768,7 @@
                 <w:b/>
                 <w:color w:val="FFFFFF"/>
               </w:rPr>
-              <w:t>Công cụ</w:t>
+              <w:t>GDPR</w:t>
             </w:r>
           </w:p>
         </w:tc>
@@ -6169,7 +7783,7 @@
                 <w:b/>
                 <w:color w:val="FFFFFF"/>
               </w:rPr>
-              <w:t>Lỗi được kiểm soát</w:t>
+              <w:t>Nghị định 13/2023</w:t>
             </w:r>
           </w:p>
         </w:tc>
@@ -6184,7 +7798,7 @@
                 <w:b/>
                 <w:color w:val="FFFFFF"/>
               </w:rPr>
-              <w:t>Chặn phát hành</w:t>
+              <w:t>Luật ATTTM 2015</w:t>
             </w:r>
           </w:p>
         </w:tc>
@@ -6196,7 +7810,7 @@
           </w:tcPr>
           <w:p>
             <w:r>
-              <w:t>Quét secret</w:t>
+              <w:t>F01 SQL injection</w:t>
             </w:r>
           </w:p>
         </w:tc>
@@ -6206,7 +7820,7 @@
           </w:tcPr>
           <w:p>
             <w:r>
-              <w:t>Gitleaks</w:t>
+              <w:t>Điều 5(1)(f), 32(1)(b)</w:t>
             </w:r>
           </w:p>
         </w:tc>
@@ -6216,7 +7830,7 @@
           </w:tcPr>
           <w:p>
             <w:r>
-              <w:t>khóa/bí mật lộ trong mã</w:t>
+              <w:t>Điều 26</w:t>
             </w:r>
           </w:p>
         </w:tc>
@@ -6226,7 +7840,7 @@
           </w:tcPr>
           <w:p>
             <w:r>
-              <w:t>có</w:t>
+              <w:t>Điều 19</w:t>
             </w:r>
           </w:p>
         </w:tc>
@@ -6238,7 +7852,7 @@
           </w:tcPr>
           <w:p>
             <w:r>
-              <w:t>SAST</w:t>
+              <w:t>F02 IDOR</w:t>
             </w:r>
           </w:p>
         </w:tc>
@@ -6248,7 +7862,7 @@
           </w:tcPr>
           <w:p>
             <w:r>
-              <w:t>Semgrep</w:t>
+              <w:t>Điều 5(1)(f), 25(2)</w:t>
             </w:r>
           </w:p>
         </w:tc>
@@ -6258,7 +7872,7 @@
           </w:tcPr>
           <w:p>
             <w:r>
-              <w:t>F01, F02</w:t>
+              <w:t>Điều 3, 26</w:t>
             </w:r>
           </w:p>
         </w:tc>
@@ -6268,7 +7882,7 @@
           </w:tcPr>
           <w:p>
             <w:r>
-              <w:t>có</w:t>
+              <w:t>Điều 17, 19</w:t>
             </w:r>
           </w:p>
         </w:tc>
@@ -6280,7 +7894,7 @@
           </w:tcPr>
           <w:p>
             <w:r>
-              <w:t>Kiểm thử bảo mật</w:t>
+              <w:t>F03 /metrics</w:t>
             </w:r>
           </w:p>
         </w:tc>
@@ -6290,7 +7904,7 @@
           </w:tcPr>
           <w:p>
             <w:r>
-              <w:t>node:test (Supertest)</w:t>
+              <w:t>Điều 25(2), 32(1)(b)</w:t>
             </w:r>
           </w:p>
         </w:tc>
@@ -6300,7 +7914,7 @@
           </w:tcPr>
           <w:p>
             <w:r>
-              <w:t>F01, F02 (đỏ→xanh)</w:t>
+              <w:t>Điều 26</w:t>
             </w:r>
           </w:p>
         </w:tc>
@@ -6310,7 +7924,7 @@
           </w:tcPr>
           <w:p>
             <w:r>
-              <w:t>có</w:t>
+              <w:t>Điều 17, 19</w:t>
             </w:r>
           </w:p>
         </w:tc>
@@ -6322,7 +7936,7 @@
           </w:tcPr>
           <w:p>
             <w:r>
-              <w:t>Policy as Code — build</w:t>
+              <w:t>F04 cấu hình container</w:t>
             </w:r>
           </w:p>
         </w:tc>
@@ -6332,7 +7946,7 @@
           </w:tcPr>
           <w:p>
             <w:r>
-              <w:t>Conftest/OPA (Rego)</w:t>
+              <w:t>Điều 25(1), 32(1)(d)</w:t>
             </w:r>
           </w:p>
         </w:tc>
@@ -6342,7 +7956,7 @@
           </w:tcPr>
           <w:p>
             <w:r>
-              <w:t>F03, F04 (Dockerfile, compose)</w:t>
+              <w:t>Điều 26</w:t>
             </w:r>
           </w:p>
         </w:tc>
@@ -6352,76 +7966,7 @@
           </w:tcPr>
           <w:p>
             <w:r>
-              <w:t xml:space="preserve">có — luật </w:t>
-            </w:r>
-            <w:r>
-              <w:rPr>
-                <w:rFonts w:ascii="Consolas" w:hAnsi="Consolas"/>
-                <w:sz w:val="20"/>
-              </w:rPr>
-              <w:t>deny</w:t>
-            </w:r>
-            <w:r>
-              <w:t xml:space="preserve">; luật </w:t>
-            </w:r>
-            <w:r>
-              <w:rPr>
-                <w:rFonts w:ascii="Consolas" w:hAnsi="Consolas"/>
-                <w:sz w:val="20"/>
-              </w:rPr>
-              <w:t>warn</w:t>
-            </w:r>
-            <w:r>
-              <w:t xml:space="preserve"> chỉ cảnh báo</w:t>
-            </w:r>
-          </w:p>
-        </w:tc>
-      </w:tr>
-      <w:tr>
-        <w:tc>
-          <w:tcPr>
-            <w:tcW w:type="dxa" w:w="2409"/>
-          </w:tcPr>
-          <w:p>
-            <w:r>
-              <w:t>Compliance as Code — runtime</w:t>
-            </w:r>
-          </w:p>
-        </w:tc>
-        <w:tc>
-          <w:tcPr>
-            <w:tcW w:type="dxa" w:w="2409"/>
-          </w:tcPr>
-          <w:p>
-            <w:r>
-              <w:t xml:space="preserve">Conftest + </w:t>
-            </w:r>
-            <w:r>
-              <w:rPr>
-                <w:rFonts w:ascii="Consolas" w:hAnsi="Consolas"/>
-                <w:sz w:val="20"/>
-              </w:rPr>
-              <w:t>docker inspect</w:t>
-            </w:r>
-          </w:p>
-        </w:tc>
-        <w:tc>
-          <w:tcPr>
-            <w:tcW w:type="dxa" w:w="2409"/>
-          </w:tcPr>
-          <w:p>
-            <w:r>
-              <w:t>F03, F04 (container đang chạy)</w:t>
-            </w:r>
-          </w:p>
-        </w:tc>
-        <w:tc>
-          <w:tcPr>
-            <w:tcW w:type="dxa" w:w="2409"/>
-          </w:tcPr>
-          <w:p>
-            <w:r>
-              <w:t>cảnh báo</w:t>
+              <w:t>Điều 19</w:t>
             </w:r>
           </w:p>
         </w:tc>
@@ -6433,17 +7978,23 @@
         <w:jc w:val="both"/>
       </w:pPr>
       <w:r>
-        <w:t xml:space="preserve">Lệnh chạy cụ thể cho từng cổng và từng demo được ghi trong </w:t>
-      </w:r>
-      <w:r>
-        <w:rPr>
-          <w:rFonts w:ascii="Consolas" w:hAnsi="Consolas"/>
-          <w:sz w:val="20"/>
-        </w:rPr>
-        <w:t>DEMO.md</w:t>
-      </w:r>
-      <w:r>
-        <w:t xml:space="preserve"> (thư mục gốc) và </w:t>
+        <w:t>Đây là ánh xạ rủi ro kỹ thuật, không phải kết luận pháp lý. Riêng F04, cấu hình triển khai còn đối chiếu TCVN 11930:2017 (yêu cầu an toàn hệ thống thông tin theo cấp độ).</w:t>
+      </w:r>
+    </w:p>
+    <w:p>
+      <w:pPr>
+        <w:pStyle w:val="Heading1"/>
+      </w:pPr>
+      <w:r>
+        <w:t>7. Kết luận</w:t>
+      </w:r>
+    </w:p>
+    <w:p>
+      <w:pPr>
+        <w:jc w:val="both"/>
+      </w:pPr>
+      <w:r>
+        <w:t xml:space="preserve">Bốn lỗi an toàn (hai lỗi mã nguồn F01/F02, hai lỗi triển khai F03/F04) đều được phát hiện bằng công cụ hoặc kiểm thử, xử lý và kiểm chứng theo mạch trước→sau, kèm đoạn mã demo của từng thành viên. Việc phát hiện và chống tái diễn được thể hiện dưới dạng Policy as Code và Security as Code trong một chuỗi kiểm soát DevSecOps. Các biện pháp này không có sẵn trong Juice Shop gốc (ứng dụng cố ý để lỗ hổng, không có truy vấn tham số, không reverse proxy/giới hạn tốc độ, không chính sách cấu hình container, không cổng kiểm soát trong CI) — đó là phần giá trị mà báo cáo bổ sung. Hướng dẫn tái lập nằm trong </w:t>
       </w:r>
       <w:r>
         <w:rPr>
@@ -6458,889 +8009,6 @@
     </w:p>
     <w:p>
       <w:pPr>
-        <w:jc w:val="both"/>
-      </w:pPr>
-      <w:r>
-        <w:t xml:space="preserve">Đoạn mã demo của mỗi thành viên không tách rời tài liệu môn học mà </w:t>
-      </w:r>
-      <w:r>
-        <w:rPr>
-          <w:b/>
-        </w:rPr>
-        <w:t>áp dụng trực tiếp</w:t>
-      </w:r>
-      <w:r>
-        <w:t xml:space="preserve"> kỹ thuật được dạy trong đó:</w:t>
-      </w:r>
-    </w:p>
-    <w:p>
-      <w:pPr>
-        <w:jc w:val="center"/>
-      </w:pPr>
-      <w:r>
-        <w:rPr>
-          <w:i/>
-          <w:sz w:val="22"/>
-        </w:rPr>
-        <w:t>Bảng 10. Liên hệ đoạn mã demo với tài liệu môn học</w:t>
-      </w:r>
-    </w:p>
-    <w:tbl>
-      <w:tblPr>
-        <w:tblStyle w:val="TableGrid"/>
-        <w:tblW w:type="auto" w:w="0"/>
-        <w:jc w:val="center"/>
-        <w:tblLook w:firstColumn="1" w:firstRow="1" w:lastColumn="0" w:lastRow="0" w:noHBand="0" w:noVBand="1" w:val="04A0"/>
-      </w:tblPr>
-      <w:tblGrid>
-        <w:gridCol w:w="3213"/>
-        <w:gridCol w:w="3213"/>
-        <w:gridCol w:w="3213"/>
-      </w:tblGrid>
-      <w:tr>
-        <w:tc>
-          <w:tcPr>
-            <w:tcW w:type="dxa" w:w="3213"/>
-            <w:shd w:val="clear" w:color="auto" w:fill="0B2A4A"/>
-          </w:tcPr>
-          <w:p>
-            <w:r>
-              <w:rPr>
-                <w:b/>
-                <w:color w:val="FFFFFF"/>
-              </w:rPr>
-              <w:t>Thành viên</w:t>
-            </w:r>
-          </w:p>
-        </w:tc>
-        <w:tc>
-          <w:tcPr>
-            <w:tcW w:type="dxa" w:w="3213"/>
-            <w:shd w:val="clear" w:color="auto" w:fill="0B2A4A"/>
-          </w:tcPr>
-          <w:p>
-            <w:r>
-              <w:rPr>
-                <w:b/>
-                <w:color w:val="FFFFFF"/>
-              </w:rPr>
-              <w:t>Đoạn mã demo</w:t>
-            </w:r>
-          </w:p>
-        </w:tc>
-        <w:tc>
-          <w:tcPr>
-            <w:tcW w:type="dxa" w:w="3213"/>
-            <w:shd w:val="clear" w:color="auto" w:fill="0B2A4A"/>
-          </w:tcPr>
-          <w:p>
-            <w:r>
-              <w:rPr>
-                <w:b/>
-                <w:color w:val="FFFFFF"/>
-              </w:rPr>
-              <w:t>Kỹ thuật &amp; tài liệu môn học áp dụng</w:t>
-            </w:r>
-          </w:p>
-        </w:tc>
-      </w:tr>
-      <w:tr>
-        <w:tc>
-          <w:tcPr>
-            <w:tcW w:type="dxa" w:w="3213"/>
-          </w:tcPr>
-          <w:p>
-            <w:r>
-              <w:t>Nguyễn Toàn Thắng (F01)</w:t>
-            </w:r>
-          </w:p>
-        </w:tc>
-        <w:tc>
-          <w:tcPr>
-            <w:tcW w:type="dxa" w:w="3213"/>
-          </w:tcPr>
-          <w:p>
-            <w:r>
-              <w:rPr>
-                <w:rFonts w:ascii="Consolas" w:hAnsi="Consolas"/>
-                <w:sz w:val="20"/>
-              </w:rPr>
-              <w:t>demos/tv1_f01_sqli.py</w:t>
-            </w:r>
-            <w:r>
-              <w:t xml:space="preserve">, kiểm thử </w:t>
-            </w:r>
-            <w:r>
-              <w:rPr>
-                <w:rFonts w:ascii="Consolas" w:hAnsi="Consolas"/>
-                <w:sz w:val="20"/>
-              </w:rPr>
-              <w:t>f01-f02.test.ts</w:t>
-            </w:r>
-          </w:p>
-        </w:tc>
-        <w:tc>
-          <w:tcPr>
-            <w:tcW w:type="dxa" w:w="3213"/>
-          </w:tcPr>
-          <w:p>
-            <w:r>
-              <w:t>Shift-left, SAST, Test-Driven Security — slide kiến trúc DevSecOps</w:t>
-            </w:r>
-          </w:p>
-        </w:tc>
-      </w:tr>
-      <w:tr>
-        <w:tc>
-          <w:tcPr>
-            <w:tcW w:type="dxa" w:w="3213"/>
-          </w:tcPr>
-          <w:p>
-            <w:r>
-              <w:t>Phạm Thị Minh Thúy (F02)</w:t>
-            </w:r>
-          </w:p>
-        </w:tc>
-        <w:tc>
-          <w:tcPr>
-            <w:tcW w:type="dxa" w:w="3213"/>
-          </w:tcPr>
-          <w:p>
-            <w:r>
-              <w:rPr>
-                <w:rFonts w:ascii="Consolas" w:hAnsi="Consolas"/>
-                <w:sz w:val="20"/>
-              </w:rPr>
-              <w:t>demos/tv2_f02_idor.py</w:t>
-            </w:r>
-            <w:r>
-              <w:t>, kiểm thử phân quyền</w:t>
-            </w:r>
-          </w:p>
-        </w:tc>
-        <w:tc>
-          <w:tcPr>
-            <w:tcW w:type="dxa" w:w="3213"/>
-          </w:tcPr>
-          <w:p>
-            <w:r>
-              <w:t>Security as Code, kiểm thử trong CI — slide DevSecOps</w:t>
-            </w:r>
-          </w:p>
-        </w:tc>
-      </w:tr>
-      <w:tr>
-        <w:tc>
-          <w:tcPr>
-            <w:tcW w:type="dxa" w:w="3213"/>
-          </w:tcPr>
-          <w:p>
-            <w:r>
-              <w:t>Đỗ Đức Quốc Anh (F03)</w:t>
-            </w:r>
-          </w:p>
-        </w:tc>
-        <w:tc>
-          <w:tcPr>
-            <w:tcW w:type="dxa" w:w="3213"/>
-          </w:tcPr>
-          <w:p>
-            <w:r>
-              <w:rPr>
-                <w:rFonts w:ascii="Consolas" w:hAnsi="Consolas"/>
-                <w:sz w:val="20"/>
-              </w:rPr>
-              <w:t>demos/tv3_f03_metrics.py</w:t>
-            </w:r>
-            <w:r>
-              <w:t xml:space="preserve">, </w:t>
-            </w:r>
-            <w:r>
-              <w:rPr>
-                <w:rFonts w:ascii="Consolas" w:hAnsi="Consolas"/>
-                <w:sz w:val="20"/>
-              </w:rPr>
-              <w:t>nginx.conf</w:t>
-            </w:r>
-          </w:p>
-        </w:tc>
-        <w:tc>
-          <w:tcPr>
-            <w:tcW w:type="dxa" w:w="3213"/>
-          </w:tcPr>
-          <w:p>
-            <w:r>
-              <w:t>OpSec giảm phơi nhiễm endpoint, reverse proxy &amp; giới hạn tốc độ — slide OpSec/DevSecOps</w:t>
-            </w:r>
-          </w:p>
-        </w:tc>
-      </w:tr>
-      <w:tr>
-        <w:tc>
-          <w:tcPr>
-            <w:tcW w:type="dxa" w:w="3213"/>
-          </w:tcPr>
-          <w:p>
-            <w:r>
-              <w:t>Hồ Anh Vũ (F04)</w:t>
-            </w:r>
-          </w:p>
-        </w:tc>
-        <w:tc>
-          <w:tcPr>
-            <w:tcW w:type="dxa" w:w="3213"/>
-          </w:tcPr>
-          <w:p>
-            <w:r>
-              <w:rPr>
-                <w:rFonts w:ascii="Consolas" w:hAnsi="Consolas"/>
-                <w:sz w:val="20"/>
-              </w:rPr>
-              <w:t>demos/tv4_f04_policy.py</w:t>
-            </w:r>
-            <w:r>
-              <w:t xml:space="preserve">, </w:t>
-            </w:r>
-            <w:r>
-              <w:rPr>
-                <w:rFonts w:ascii="Consolas" w:hAnsi="Consolas"/>
-                <w:sz w:val="20"/>
-              </w:rPr>
-              <w:t>docker_security.rego</w:t>
-            </w:r>
-          </w:p>
-        </w:tc>
-        <w:tc>
-          <w:tcPr>
-            <w:tcW w:type="dxa" w:w="3213"/>
-          </w:tcPr>
-          <w:p>
-            <w:r>
-              <w:t>Policy as Code với Conftest — hướng dẫn Policy as Code (Conftest)</w:t>
-            </w:r>
-          </w:p>
-        </w:tc>
-      </w:tr>
-    </w:tbl>
-    <w:p/>
-    <w:p>
-      <w:pPr>
-        <w:jc w:val="both"/>
-      </w:pPr>
-      <w:r>
-        <w:t>Mỗi thành viên lấy một kỹ thuật trong tài liệu môn học và hiện thực hóa thành đoạn mã chạy được để phát hiện hoặc chặn lỗi của mình.</w:t>
-      </w:r>
-    </w:p>
-    <w:p>
-      <w:pPr>
-        <w:pStyle w:val="Heading2"/>
-      </w:pPr>
-      <w:r>
-        <w:t>5.1. Đoạn mã dò lỗi cốt lõi của mỗi demo</w:t>
-      </w:r>
-    </w:p>
-    <w:p>
-      <w:pPr>
-        <w:jc w:val="both"/>
-      </w:pPr>
-      <w:r>
-        <w:t xml:space="preserve">Mỗi script chạy bằng </w:t>
-      </w:r>
-      <w:r>
-        <w:rPr>
-          <w:b/>
-        </w:rPr>
-        <w:t>một lệnh</w:t>
-      </w:r>
-      <w:r>
-        <w:t xml:space="preserve"> (</w:t>
-      </w:r>
-      <w:r>
-        <w:rPr>
-          <w:rFonts w:ascii="Consolas" w:hAnsi="Consolas"/>
-          <w:sz w:val="20"/>
-        </w:rPr>
-        <w:t>python report/demos/&lt;tên&gt;.py</w:t>
-      </w:r>
-      <w:r>
-        <w:t>); phần dò lỗi cốt lõi trích dưới đây.</w:t>
-      </w:r>
-    </w:p>
-    <w:p>
-      <w:pPr>
-        <w:jc w:val="both"/>
-      </w:pPr>
-      <w:r>
-        <w:rPr>
-          <w:b/>
-        </w:rPr>
-        <w:t>F01 — `tv1_f01_sqli.py`:</w:t>
-      </w:r>
-      <w:r>
-        <w:t xml:space="preserve"> gửi payload SQL kèm mật khẩu </w:t>
-      </w:r>
-      <w:r>
-        <w:rPr>
-          <w:i/>
-        </w:rPr>
-        <w:t>sai</w:t>
-      </w:r>
-      <w:r>
-        <w:t>; còn lỗ hổng nếu vẫn được cấp token.</w:t>
-      </w:r>
-    </w:p>
-    <w:tbl>
-      <w:tblPr>
-        <w:tblStyle w:val="TableGrid"/>
-        <w:tblW w:type="auto" w:w="0"/>
-        <w:tblLook w:firstColumn="1" w:firstRow="1" w:lastColumn="0" w:lastRow="0" w:noHBand="0" w:noVBand="1" w:val="04A0"/>
-      </w:tblPr>
-      <w:tblGrid>
-        <w:gridCol w:w="9638"/>
-      </w:tblGrid>
-      <w:tr>
-        <w:tc>
-          <w:tcPr>
-            <w:tcW w:type="dxa" w:w="9638"/>
-            <w:shd w:val="clear" w:color="auto" w:fill="F6F8FA"/>
-          </w:tcPr>
-          <w:p>
-            <w:pPr>
-              <w:spacing w:after="0"/>
-            </w:pPr>
-            <w:r>
-              <w:rPr>
-                <w:rFonts w:ascii="Consolas" w:hAnsi="Consolas"/>
-                <w:sz w:val="17"/>
-              </w:rPr>
-              <w:t>status, body = call(base, 'POST', '/rest/user/login', {'email': "' OR 1=1--", 'password': 'wrong-password'})</w:t>
-            </w:r>
-            <w:r>
-              <w:br/>
-            </w:r>
-            <w:r>
-              <w:rPr>
-                <w:rFonts w:ascii="Consolas" w:hAnsi="Consolas"/>
-                <w:sz w:val="17"/>
-              </w:rPr>
-              <w:t>token = body.get('authentication', {}).get('token')   # có token = vượt xác thực = còn lỗ hổng</w:t>
-            </w:r>
-          </w:p>
-        </w:tc>
-      </w:tr>
-    </w:tbl>
-    <w:p/>
-    <w:p>
-      <w:pPr>
-        <w:jc w:val="both"/>
-      </w:pPr>
-      <w:r>
-        <w:rPr>
-          <w:b/>
-        </w:rPr>
-        <w:t>F02 — `tv2_f02_idor.py`:</w:t>
-      </w:r>
-      <w:r>
-        <w:t xml:space="preserve"> dùng token của A đọc giỏ của B; lộ dữ liệu nếu trả đúng giỏ của B.</w:t>
-      </w:r>
-    </w:p>
-    <w:tbl>
-      <w:tblPr>
-        <w:tblStyle w:val="TableGrid"/>
-        <w:tblW w:type="auto" w:w="0"/>
-        <w:tblLook w:firstColumn="1" w:firstRow="1" w:lastColumn="0" w:lastRow="0" w:noHBand="0" w:noVBand="1" w:val="04A0"/>
-      </w:tblPr>
-      <w:tblGrid>
-        <w:gridCol w:w="9638"/>
-      </w:tblGrid>
-      <w:tr>
-        <w:tc>
-          <w:tcPr>
-            <w:tcW w:type="dxa" w:w="9638"/>
-            <w:shd w:val="clear" w:color="auto" w:fill="F6F8FA"/>
-          </w:tcPr>
-          <w:p>
-            <w:pPr>
-              <w:spacing w:after="0"/>
-            </w:pPr>
-            <w:r>
-              <w:rPr>
-                <w:rFonts w:ascii="Consolas" w:hAnsi="Consolas"/>
-                <w:sz w:val="17"/>
-              </w:rPr>
-              <w:t>s, body = call(base, 'GET', f"/rest/basket/{b['bid']}", token=a['token'])</w:t>
-            </w:r>
-            <w:r>
-              <w:br/>
-            </w:r>
-            <w:r>
-              <w:rPr>
-                <w:rFonts w:ascii="Consolas" w:hAnsi="Consolas"/>
-                <w:sz w:val="17"/>
-              </w:rPr>
-              <w:t>leaked = s == 200 and body['data']['id'] == b['bid']   # đọc được giỏ người khác = IDOR</w:t>
-            </w:r>
-          </w:p>
-        </w:tc>
-      </w:tr>
-    </w:tbl>
-    <w:p/>
-    <w:p>
-      <w:pPr>
-        <w:jc w:val="both"/>
-      </w:pPr>
-      <w:r>
-        <w:rPr>
-          <w:b/>
-        </w:rPr>
-        <w:t>F03 — `tv3_f03_metrics.py`:</w:t>
-      </w:r>
-      <w:r>
-        <w:t xml:space="preserve"> gọi </w:t>
-      </w:r>
-      <w:r>
-        <w:rPr>
-          <w:rFonts w:ascii="Consolas" w:hAnsi="Consolas"/>
-          <w:sz w:val="20"/>
-        </w:rPr>
-        <w:t>/metrics</w:t>
-      </w:r>
-      <w:r>
-        <w:t>; trước vá 200 (lộ), sau vá qua proxy trả 404.</w:t>
-      </w:r>
-    </w:p>
-    <w:tbl>
-      <w:tblPr>
-        <w:tblStyle w:val="TableGrid"/>
-        <w:tblW w:type="auto" w:w="0"/>
-        <w:tblLook w:firstColumn="1" w:firstRow="1" w:lastColumn="0" w:lastRow="0" w:noHBand="0" w:noVBand="1" w:val="04A0"/>
-      </w:tblPr>
-      <w:tblGrid>
-        <w:gridCol w:w="9638"/>
-      </w:tblGrid>
-      <w:tr>
-        <w:tc>
-          <w:tcPr>
-            <w:tcW w:type="dxa" w:w="9638"/>
-            <w:shd w:val="clear" w:color="auto" w:fill="F6F8FA"/>
-          </w:tcPr>
-          <w:p>
-            <w:pPr>
-              <w:spacing w:after="0"/>
-            </w:pPr>
-            <w:r>
-              <w:rPr>
-                <w:rFonts w:ascii="Consolas" w:hAnsi="Consolas"/>
-                <w:sz w:val="17"/>
-              </w:rPr>
-              <w:t>s, body = call(BEFORE[1], 'GET', '/metrics')   # trước vá (3100): 200 + hàng trăm dòng số liệu</w:t>
-            </w:r>
-            <w:r>
-              <w:br/>
-            </w:r>
-            <w:r>
-              <w:rPr>
-                <w:rFonts w:ascii="Consolas" w:hAnsi="Consolas"/>
-                <w:sz w:val="17"/>
-              </w:rPr>
-              <w:t>s, _ = call(AFTER[1], 'GET', '/metrics')        # sau vá, qua proxy (3102): 404</w:t>
-            </w:r>
-          </w:p>
-        </w:tc>
-      </w:tr>
-    </w:tbl>
-    <w:p/>
-    <w:p>
-      <w:pPr>
-        <w:jc w:val="both"/>
-      </w:pPr>
-      <w:r>
-        <w:rPr>
-          <w:b/>
-        </w:rPr>
-        <w:t>F04 — `tv4_f04_policy.py`:</w:t>
-      </w:r>
-      <w:r>
-        <w:t xml:space="preserve"> chạy Conftest trên Dockerfile; thoát khác 0 nghĩa là gate chặn.</w:t>
-      </w:r>
-    </w:p>
-    <w:tbl>
-      <w:tblPr>
-        <w:tblStyle w:val="TableGrid"/>
-        <w:tblW w:type="auto" w:w="0"/>
-        <w:tblLook w:firstColumn="1" w:firstRow="1" w:lastColumn="0" w:lastRow="0" w:noHBand="0" w:noVBand="1" w:val="04A0"/>
-      </w:tblPr>
-      <w:tblGrid>
-        <w:gridCol w:w="9638"/>
-      </w:tblGrid>
-      <w:tr>
-        <w:tc>
-          <w:tcPr>
-            <w:tcW w:type="dxa" w:w="9638"/>
-            <w:shd w:val="clear" w:color="auto" w:fill="F6F8FA"/>
-          </w:tcPr>
-          <w:p>
-            <w:pPr>
-              <w:spacing w:after="0"/>
-            </w:pPr>
-            <w:r>
-              <w:rPr>
-                <w:rFonts w:ascii="Consolas" w:hAnsi="Consolas"/>
-                <w:sz w:val="17"/>
-              </w:rPr>
-              <w:t>p = sh(*CF, 'test', target, '--parser', 'dockerfile', '-p', 'policy', '--namespace', 'dockerfile')</w:t>
-            </w:r>
-            <w:r>
-              <w:br/>
-            </w:r>
-            <w:r>
-              <w:rPr>
-                <w:rFonts w:ascii="Consolas" w:hAnsi="Consolas"/>
-                <w:sz w:val="17"/>
-              </w:rPr>
-              <w:t># p.returncode != 0 -&gt; gate chặn; mỗi dòng FAIL là một luật Rego bị vi phạm</w:t>
-            </w:r>
-          </w:p>
-        </w:tc>
-      </w:tr>
-    </w:tbl>
-    <w:p/>
-    <w:p>
-      <w:pPr>
-        <w:pStyle w:val="Heading1"/>
-      </w:pPr>
-      <w:r>
-        <w:t>6. Đối chiếu chính sách bảo vệ dữ liệu</w:t>
-      </w:r>
-    </w:p>
-    <w:p>
-      <w:pPr>
-        <w:jc w:val="both"/>
-      </w:pPr>
-      <w:r>
-        <w:t xml:space="preserve">Nhóm đối chiếu mỗi lỗi với cả khung </w:t>
-      </w:r>
-      <w:r>
-        <w:rPr>
-          <w:b/>
-        </w:rPr>
-        <w:t>quốc tế (GDPR)</w:t>
-      </w:r>
-      <w:r>
-        <w:t xml:space="preserve"> và </w:t>
-      </w:r>
-      <w:r>
-        <w:rPr>
-          <w:b/>
-        </w:rPr>
-        <w:t>pháp luật Việt Nam</w:t>
-      </w:r>
-      <w:r>
-        <w:t xml:space="preserve"> — Nghị định 13/2023/NĐ-CP (bảo vệ dữ liệu cá nhân) và Luật An toàn thông tin mạng 2015. Ý nghĩa cụ thể của từng điều khoản xem </w:t>
-      </w:r>
-      <w:r>
-        <w:rPr>
-          <w:b/>
-        </w:rPr>
-        <w:t>Bảng tra ở mục 3.2</w:t>
-      </w:r>
-      <w:r>
-        <w:t>.</w:t>
-      </w:r>
-    </w:p>
-    <w:p>
-      <w:pPr>
-        <w:jc w:val="center"/>
-      </w:pPr>
-      <w:r>
-        <w:rPr>
-          <w:i/>
-          <w:sz w:val="22"/>
-        </w:rPr>
-        <w:t>Bảng 11. Ánh xạ lỗi với chính sách (quốc tế và Việt Nam)</w:t>
-      </w:r>
-    </w:p>
-    <w:tbl>
-      <w:tblPr>
-        <w:tblStyle w:val="TableGrid"/>
-        <w:tblW w:type="auto" w:w="0"/>
-        <w:jc w:val="center"/>
-        <w:tblLook w:firstColumn="1" w:firstRow="1" w:lastColumn="0" w:lastRow="0" w:noHBand="0" w:noVBand="1" w:val="04A0"/>
-      </w:tblPr>
-      <w:tblGrid>
-        <w:gridCol w:w="2409"/>
-        <w:gridCol w:w="2409"/>
-        <w:gridCol w:w="2409"/>
-        <w:gridCol w:w="2409"/>
-      </w:tblGrid>
-      <w:tr>
-        <w:tc>
-          <w:tcPr>
-            <w:tcW w:type="dxa" w:w="2409"/>
-            <w:shd w:val="clear" w:color="auto" w:fill="0B2A4A"/>
-          </w:tcPr>
-          <w:p>
-            <w:r>
-              <w:rPr>
-                <w:b/>
-                <w:color w:val="FFFFFF"/>
-              </w:rPr>
-              <w:t>Lỗi</w:t>
-            </w:r>
-          </w:p>
-        </w:tc>
-        <w:tc>
-          <w:tcPr>
-            <w:tcW w:type="dxa" w:w="2409"/>
-            <w:shd w:val="clear" w:color="auto" w:fill="0B2A4A"/>
-          </w:tcPr>
-          <w:p>
-            <w:r>
-              <w:rPr>
-                <w:b/>
-                <w:color w:val="FFFFFF"/>
-              </w:rPr>
-              <w:t>GDPR</w:t>
-            </w:r>
-          </w:p>
-        </w:tc>
-        <w:tc>
-          <w:tcPr>
-            <w:tcW w:type="dxa" w:w="2409"/>
-            <w:shd w:val="clear" w:color="auto" w:fill="0B2A4A"/>
-          </w:tcPr>
-          <w:p>
-            <w:r>
-              <w:rPr>
-                <w:b/>
-                <w:color w:val="FFFFFF"/>
-              </w:rPr>
-              <w:t>Nghị định 13/2023</w:t>
-            </w:r>
-          </w:p>
-        </w:tc>
-        <w:tc>
-          <w:tcPr>
-            <w:tcW w:type="dxa" w:w="2409"/>
-            <w:shd w:val="clear" w:color="auto" w:fill="0B2A4A"/>
-          </w:tcPr>
-          <w:p>
-            <w:r>
-              <w:rPr>
-                <w:b/>
-                <w:color w:val="FFFFFF"/>
-              </w:rPr>
-              <w:t>Luật ATTTM 2015</w:t>
-            </w:r>
-          </w:p>
-        </w:tc>
-      </w:tr>
-      <w:tr>
-        <w:tc>
-          <w:tcPr>
-            <w:tcW w:type="dxa" w:w="2409"/>
-          </w:tcPr>
-          <w:p>
-            <w:r>
-              <w:t>F01 SQL injection</w:t>
-            </w:r>
-          </w:p>
-        </w:tc>
-        <w:tc>
-          <w:tcPr>
-            <w:tcW w:type="dxa" w:w="2409"/>
-          </w:tcPr>
-          <w:p>
-            <w:r>
-              <w:t>Điều 5(1)(f), 32(1)(b)</w:t>
-            </w:r>
-          </w:p>
-        </w:tc>
-        <w:tc>
-          <w:tcPr>
-            <w:tcW w:type="dxa" w:w="2409"/>
-          </w:tcPr>
-          <w:p>
-            <w:r>
-              <w:t>Điều 26</w:t>
-            </w:r>
-          </w:p>
-        </w:tc>
-        <w:tc>
-          <w:tcPr>
-            <w:tcW w:type="dxa" w:w="2409"/>
-          </w:tcPr>
-          <w:p>
-            <w:r>
-              <w:t>Điều 19</w:t>
-            </w:r>
-          </w:p>
-        </w:tc>
-      </w:tr>
-      <w:tr>
-        <w:tc>
-          <w:tcPr>
-            <w:tcW w:type="dxa" w:w="2409"/>
-          </w:tcPr>
-          <w:p>
-            <w:r>
-              <w:t>F02 IDOR</w:t>
-            </w:r>
-          </w:p>
-        </w:tc>
-        <w:tc>
-          <w:tcPr>
-            <w:tcW w:type="dxa" w:w="2409"/>
-          </w:tcPr>
-          <w:p>
-            <w:r>
-              <w:t>Điều 5(1)(f), 25(2)</w:t>
-            </w:r>
-          </w:p>
-        </w:tc>
-        <w:tc>
-          <w:tcPr>
-            <w:tcW w:type="dxa" w:w="2409"/>
-          </w:tcPr>
-          <w:p>
-            <w:r>
-              <w:t>Điều 3, 26</w:t>
-            </w:r>
-          </w:p>
-        </w:tc>
-        <w:tc>
-          <w:tcPr>
-            <w:tcW w:type="dxa" w:w="2409"/>
-          </w:tcPr>
-          <w:p>
-            <w:r>
-              <w:t>Điều 17, 19</w:t>
-            </w:r>
-          </w:p>
-        </w:tc>
-      </w:tr>
-      <w:tr>
-        <w:tc>
-          <w:tcPr>
-            <w:tcW w:type="dxa" w:w="2409"/>
-          </w:tcPr>
-          <w:p>
-            <w:r>
-              <w:t>F03 /metrics</w:t>
-            </w:r>
-          </w:p>
-        </w:tc>
-        <w:tc>
-          <w:tcPr>
-            <w:tcW w:type="dxa" w:w="2409"/>
-          </w:tcPr>
-          <w:p>
-            <w:r>
-              <w:t>Điều 25(2), 32(1)(b)</w:t>
-            </w:r>
-          </w:p>
-        </w:tc>
-        <w:tc>
-          <w:tcPr>
-            <w:tcW w:type="dxa" w:w="2409"/>
-          </w:tcPr>
-          <w:p>
-            <w:r>
-              <w:t>Điều 26</w:t>
-            </w:r>
-          </w:p>
-        </w:tc>
-        <w:tc>
-          <w:tcPr>
-            <w:tcW w:type="dxa" w:w="2409"/>
-          </w:tcPr>
-          <w:p>
-            <w:r>
-              <w:t>Điều 17, 19</w:t>
-            </w:r>
-          </w:p>
-        </w:tc>
-      </w:tr>
-      <w:tr>
-        <w:tc>
-          <w:tcPr>
-            <w:tcW w:type="dxa" w:w="2409"/>
-          </w:tcPr>
-          <w:p>
-            <w:r>
-              <w:t>F04 cấu hình container</w:t>
-            </w:r>
-          </w:p>
-        </w:tc>
-        <w:tc>
-          <w:tcPr>
-            <w:tcW w:type="dxa" w:w="2409"/>
-          </w:tcPr>
-          <w:p>
-            <w:r>
-              <w:t>Điều 25(1), 32(1)(d)</w:t>
-            </w:r>
-          </w:p>
-        </w:tc>
-        <w:tc>
-          <w:tcPr>
-            <w:tcW w:type="dxa" w:w="2409"/>
-          </w:tcPr>
-          <w:p>
-            <w:r>
-              <w:t>Điều 26</w:t>
-            </w:r>
-          </w:p>
-        </w:tc>
-        <w:tc>
-          <w:tcPr>
-            <w:tcW w:type="dxa" w:w="2409"/>
-          </w:tcPr>
-          <w:p>
-            <w:r>
-              <w:t>Điều 19</w:t>
-            </w:r>
-          </w:p>
-        </w:tc>
-      </w:tr>
-    </w:tbl>
-    <w:p/>
-    <w:p>
-      <w:pPr>
-        <w:jc w:val="both"/>
-      </w:pPr>
-      <w:r>
-        <w:t>Đây là ánh xạ rủi ro kỹ thuật, không phải kết luận pháp lý. Riêng F04, cấu hình triển khai còn đối chiếu TCVN 11930:2017 (yêu cầu an toàn hệ thống thông tin theo cấp độ).</w:t>
-      </w:r>
-    </w:p>
-    <w:p>
-      <w:pPr>
-        <w:pStyle w:val="Heading1"/>
-      </w:pPr>
-      <w:r>
-        <w:t>7. Kết luận</w:t>
-      </w:r>
-    </w:p>
-    <w:p>
-      <w:pPr>
-        <w:jc w:val="both"/>
-      </w:pPr>
-      <w:r>
-        <w:t xml:space="preserve">Bốn lỗi an toàn (hai lỗi mã nguồn F01/F02, hai lỗi triển khai F03/F04) đều được phát hiện bằng công cụ hoặc kiểm thử, xử lý và kiểm chứng theo mạch trước→sau, kèm đoạn mã demo của từng thành viên. Việc phát hiện và chống tái diễn được thể hiện dưới dạng Policy as Code và Security as Code trong một chuỗi kiểm soát DevSecOps. Các biện pháp này không có sẵn trong Juice Shop gốc (ứng dụng cố ý để lỗ hổng, không có truy vấn tham số, không reverse proxy/giới hạn tốc độ, không chính sách cấu hình container, không cổng kiểm soát trong CI) — đó là phần giá trị mà báo cáo bổ sung. Hướng dẫn tái lập nằm trong </w:t>
-      </w:r>
-      <w:r>
-        <w:rPr>
-          <w:rFonts w:ascii="Consolas" w:hAnsi="Consolas"/>
-          <w:sz w:val="20"/>
-        </w:rPr>
-        <w:t>report/HUONG_DAN_DEMO.md</w:t>
-      </w:r>
-      <w:r>
-        <w:t>.</w:t>
-      </w:r>
-    </w:p>
-    <w:p>
-      <w:pPr>
         <w:pStyle w:val="Heading1"/>
       </w:pPr>
       <w:r>
@@ -7354,7 +8022,7 @@
       <w:r>
         <w:t xml:space="preserve">OWASP Juice Shop — </w:t>
       </w:r>
-      <w:hyperlink r:id="rId19">
+      <w:hyperlink r:id="rId22">
         <w:r>
           <w:rPr>
             <w:color w:val="0B4EA2"/>
@@ -7447,7 +8115,7 @@
         <w:t>tự viết luật `SECRET-IN-IMAGE`</w:t>
       </w:r>
       <w:r>
-        <w:t xml:space="preserve"> (xem mục 4.4). Namespace </w:t>
+        <w:t xml:space="preserve"> (xem mục 5.4). Namespace </w:t>
       </w:r>
       <w:r>
         <w:rPr>

</xml_diff>

<commit_message>
docs(report): doi bang tra y nghia tieu chuan xuong Phu luc C (phan dau chi ghi ma)
- Bang glossary 28 dong chuyen tu §3.2 -> Phu luc C (giai thich tieu chuan). §3.2 gon lai,
  chi giu bullet tong quan + con tro 'xem Phu luc C'.
- Cap nhat con tro o §2, §5.4 (bang luat), §6: 'Bang tra muc 3.2' -> 'Phu luc C'.
- Chuan hoa line ending ve LF. Rebuild DOCX (PDF se rebuild sau — user dang mo).
</commit_message>
<xml_diff>
--- a/report/BaoCao_DevSecOps_JuiceShop_gon.docx
+++ b/report/BaoCao_DevSecOps_JuiceShop_gon.docx
@@ -1469,7 +1469,7 @@
         <w:rPr>
           <w:b/>
         </w:rPr>
-        <w:t>Bảng tra ở mục 3.2</w:t>
+        <w:t>Phụ lục C</w:t>
       </w:r>
       <w:r>
         <w:t>.</w:t>
@@ -2559,814 +2559,27 @@
         <w:jc w:val="both"/>
       </w:pPr>
       <w:r>
-        <w:t xml:space="preserve">Để </w:t>
+        <w:t>Ý nghĩa cụ thể (</w:t>
       </w:r>
       <w:r>
         <w:rPr>
           <w:b/>
         </w:rPr>
-        <w:t>mọi</w:t>
-      </w:r>
-      <w:r>
-        <w:t xml:space="preserve"> trích dẫn trong báo cáo không chỉ là tên + mã số, bảng sau tóm gọn </w:t>
+        <w:t>yêu cầu gì</w:t>
+      </w:r>
+      <w:r>
+        <w:t xml:space="preserve">) của từng điều khoản tham chiếu trong báo cáo được tóm gọn trong </w:t>
       </w:r>
       <w:r>
         <w:rPr>
           <w:b/>
         </w:rPr>
-        <w:t>mỗi điều khoản yêu cầu gì</w:t>
-      </w:r>
-      <w:r>
-        <w:t>. Bảng này phủ toàn bộ tiêu chuẩn được dùng; các bảng và mục khác chỉ ghi mã, tra ý nghĩa tại đây.</w:t>
+        <w:t>Phụ lục C</w:t>
+      </w:r>
+      <w:r>
+        <w:t xml:space="preserve"> (bảng tra). Các bảng và mục trong phần thân chỉ ghi mã điều khoản; tra ý nghĩa ở Phụ lục C.</w:t>
       </w:r>
     </w:p>
-    <w:p>
-      <w:pPr>
-        <w:jc w:val="center"/>
-      </w:pPr>
-      <w:r>
-        <w:rPr>
-          <w:i/>
-          <w:sz w:val="22"/>
-        </w:rPr>
-        <w:t>Bảng 7. Tra cứu — mỗi tiêu chuẩn/điều khoản tham chiếu yêu cầu gì</w:t>
-      </w:r>
-    </w:p>
-    <w:tbl>
-      <w:tblPr>
-        <w:tblStyle w:val="TableGrid"/>
-        <w:tblW w:type="auto" w:w="0"/>
-        <w:jc w:val="center"/>
-        <w:tblLook w:firstColumn="1" w:firstRow="1" w:lastColumn="0" w:lastRow="0" w:noHBand="0" w:noVBand="1" w:val="04A0"/>
-      </w:tblPr>
-      <w:tblGrid>
-        <w:gridCol w:w="4819"/>
-        <w:gridCol w:w="4819"/>
-      </w:tblGrid>
-      <w:tr>
-        <w:tc>
-          <w:tcPr>
-            <w:tcW w:type="dxa" w:w="4819"/>
-            <w:shd w:val="clear" w:color="auto" w:fill="0B2A4A"/>
-          </w:tcPr>
-          <w:p>
-            <w:r>
-              <w:rPr>
-                <w:b/>
-                <w:color w:val="FFFFFF"/>
-              </w:rPr>
-              <w:t>Điều khoản</w:t>
-            </w:r>
-          </w:p>
-        </w:tc>
-        <w:tc>
-          <w:tcPr>
-            <w:tcW w:type="dxa" w:w="4819"/>
-            <w:shd w:val="clear" w:color="auto" w:fill="0B2A4A"/>
-          </w:tcPr>
-          <w:p>
-            <w:r>
-              <w:rPr>
-                <w:b/>
-                <w:color w:val="FFFFFF"/>
-              </w:rPr>
-              <w:t>Yêu cầu / ý nghĩa tóm gọn</w:t>
-            </w:r>
-          </w:p>
-        </w:tc>
-      </w:tr>
-      <w:tr>
-        <w:tc>
-          <w:tcPr>
-            <w:tcW w:type="dxa" w:w="4819"/>
-          </w:tcPr>
-          <w:p>
-            <w:r>
-              <w:t>GDPR Điều 5(1)(f)</w:t>
-            </w:r>
-          </w:p>
-        </w:tc>
-        <w:tc>
-          <w:tcPr>
-            <w:tcW w:type="dxa" w:w="4819"/>
-          </w:tcPr>
-          <w:p>
-            <w:r>
-              <w:t xml:space="preserve">Nguyên tắc </w:t>
-            </w:r>
-            <w:r>
-              <w:rPr>
-                <w:i/>
-              </w:rPr>
-              <w:t>toàn vẹn &amp; bảo mật</w:t>
-            </w:r>
-            <w:r>
-              <w:t>: xử lý dữ liệu một cách an toàn</w:t>
-            </w:r>
-          </w:p>
-        </w:tc>
-      </w:tr>
-      <w:tr>
-        <w:tc>
-          <w:tcPr>
-            <w:tcW w:type="dxa" w:w="4819"/>
-          </w:tcPr>
-          <w:p>
-            <w:r>
-              <w:t>GDPR Điều 25</w:t>
-            </w:r>
-          </w:p>
-        </w:tc>
-        <w:tc>
-          <w:tcPr>
-            <w:tcW w:type="dxa" w:w="4819"/>
-          </w:tcPr>
-          <w:p>
-            <w:r>
-              <w:t xml:space="preserve">Bảo vệ dữ liệu </w:t>
-            </w:r>
-            <w:r>
-              <w:rPr>
-                <w:i/>
-              </w:rPr>
-              <w:t>từ thiết kế</w:t>
-            </w:r>
-            <w:r>
-              <w:t xml:space="preserve"> (khoản 1) và </w:t>
-            </w:r>
-            <w:r>
-              <w:rPr>
-                <w:i/>
-              </w:rPr>
-              <w:t>theo mặc định</w:t>
-            </w:r>
-            <w:r>
-              <w:t xml:space="preserve"> (khoản 2)</w:t>
-            </w:r>
-          </w:p>
-        </w:tc>
-      </w:tr>
-      <w:tr>
-        <w:tc>
-          <w:tcPr>
-            <w:tcW w:type="dxa" w:w="4819"/>
-          </w:tcPr>
-          <w:p>
-            <w:r>
-              <w:t>GDPR Điều 32</w:t>
-            </w:r>
-          </w:p>
-        </w:tc>
-        <w:tc>
-          <w:tcPr>
-            <w:tcW w:type="dxa" w:w="4819"/>
-          </w:tcPr>
-          <w:p>
-            <w:r>
-              <w:t>Biện pháp kỹ thuật &amp; tổ chức bảo đảm an toàn khi xử lý — (1)(b) bí mật/toàn vẹn, (1)(d) kiểm thử &amp; đánh giá định kỳ</w:t>
-            </w:r>
-          </w:p>
-        </w:tc>
-      </w:tr>
-      <w:tr>
-        <w:tc>
-          <w:tcPr>
-            <w:tcW w:type="dxa" w:w="4819"/>
-          </w:tcPr>
-          <w:p>
-            <w:r>
-              <w:t>OWASP A01:2021 / CWE-639</w:t>
-            </w:r>
-          </w:p>
-        </w:tc>
-        <w:tc>
-          <w:tcPr>
-            <w:tcW w:type="dxa" w:w="4819"/>
-          </w:tcPr>
-          <w:p>
-            <w:r>
-              <w:rPr>
-                <w:i/>
-              </w:rPr>
-              <w:t>Broken Access Control</w:t>
-            </w:r>
-            <w:r>
-              <w:t xml:space="preserve"> — kiểm soát truy cập bị phá vỡ (IDOR)</w:t>
-            </w:r>
-          </w:p>
-        </w:tc>
-      </w:tr>
-      <w:tr>
-        <w:tc>
-          <w:tcPr>
-            <w:tcW w:type="dxa" w:w="4819"/>
-          </w:tcPr>
-          <w:p>
-            <w:r>
-              <w:t>OWASP A02:2021 / CWE-327</w:t>
-            </w:r>
-          </w:p>
-        </w:tc>
-        <w:tc>
-          <w:tcPr>
-            <w:tcW w:type="dxa" w:w="4819"/>
-          </w:tcPr>
-          <w:p>
-            <w:r>
-              <w:rPr>
-                <w:i/>
-              </w:rPr>
-              <w:t>Cryptographic Failures</w:t>
-            </w:r>
-            <w:r>
-              <w:t xml:space="preserve"> — lỗi mật mã (vd băm mật khẩu bằng thuật toán yếu)</w:t>
-            </w:r>
-          </w:p>
-        </w:tc>
-      </w:tr>
-      <w:tr>
-        <w:tc>
-          <w:tcPr>
-            <w:tcW w:type="dxa" w:w="4819"/>
-          </w:tcPr>
-          <w:p>
-            <w:r>
-              <w:t>OWASP A03:2021 / CWE-89</w:t>
-            </w:r>
-          </w:p>
-        </w:tc>
-        <w:tc>
-          <w:tcPr>
-            <w:tcW w:type="dxa" w:w="4819"/>
-          </w:tcPr>
-          <w:p>
-            <w:r>
-              <w:rPr>
-                <w:i/>
-              </w:rPr>
-              <w:t>Injection</w:t>
-            </w:r>
-            <w:r>
-              <w:t xml:space="preserve"> — tiêm nhiễm dữ liệu vào câu lệnh (SQL injection)</w:t>
-            </w:r>
-          </w:p>
-        </w:tc>
-      </w:tr>
-      <w:tr>
-        <w:tc>
-          <w:tcPr>
-            <w:tcW w:type="dxa" w:w="4819"/>
-          </w:tcPr>
-          <w:p>
-            <w:r>
-              <w:t>PCI-DSS 2.2</w:t>
-            </w:r>
-          </w:p>
-        </w:tc>
-        <w:tc>
-          <w:tcPr>
-            <w:tcW w:type="dxa" w:w="4819"/>
-          </w:tcPr>
-          <w:p>
-            <w:r>
-              <w:t>Cấu hình tham số an toàn hệ thống, chạy với đặc quyền tối thiểu</w:t>
-            </w:r>
-          </w:p>
-        </w:tc>
-      </w:tr>
-      <w:tr>
-        <w:tc>
-          <w:tcPr>
-            <w:tcW w:type="dxa" w:w="4819"/>
-          </w:tcPr>
-          <w:p>
-            <w:r>
-              <w:t>PCI-DSS 3.4</w:t>
-            </w:r>
-          </w:p>
-        </w:tc>
-        <w:tc>
-          <w:tcPr>
-            <w:tcW w:type="dxa" w:w="4819"/>
-          </w:tcPr>
-          <w:p>
-            <w:r>
-              <w:t>Làm số thẻ (PAN) không đọc được ở mọi nơi lưu trữ</w:t>
-            </w:r>
-          </w:p>
-        </w:tc>
-      </w:tr>
-      <w:tr>
-        <w:tc>
-          <w:tcPr>
-            <w:tcW w:type="dxa" w:w="4819"/>
-          </w:tcPr>
-          <w:p>
-            <w:r>
-              <w:t>PCI-DSS 8.2.1</w:t>
-            </w:r>
-          </w:p>
-        </w:tc>
-        <w:tc>
-          <w:tcPr>
-            <w:tcW w:type="dxa" w:w="4819"/>
-          </w:tcPr>
-          <w:p>
-            <w:r>
-              <w:t>Không lưu thông tin xác thực (credential) ở dạng đọc được</w:t>
-            </w:r>
-          </w:p>
-        </w:tc>
-      </w:tr>
-      <w:tr>
-        <w:tc>
-          <w:tcPr>
-            <w:tcW w:type="dxa" w:w="4819"/>
-          </w:tcPr>
-          <w:p>
-            <w:r>
-              <w:t>CIS Docker 4.1</w:t>
-            </w:r>
-          </w:p>
-        </w:tc>
-        <w:tc>
-          <w:tcPr>
-            <w:tcW w:type="dxa" w:w="4819"/>
-          </w:tcPr>
-          <w:p>
-            <w:r>
-              <w:t xml:space="preserve">Chạy container bằng user riêng, </w:t>
-            </w:r>
-            <w:r>
-              <w:rPr>
-                <w:b/>
-              </w:rPr>
-              <w:t>không phải root</w:t>
-            </w:r>
-          </w:p>
-        </w:tc>
-      </w:tr>
-      <w:tr>
-        <w:tc>
-          <w:tcPr>
-            <w:tcW w:type="dxa" w:w="4819"/>
-          </w:tcPr>
-          <w:p>
-            <w:r>
-              <w:t>CIS Docker 4.5</w:t>
-            </w:r>
-          </w:p>
-        </w:tc>
-        <w:tc>
-          <w:tcPr>
-            <w:tcW w:type="dxa" w:w="4819"/>
-          </w:tcPr>
-          <w:p>
-            <w:r>
-              <w:t xml:space="preserve">Dùng ảnh nền tin cậy, ghim phiên bản/digest (tránh tag động </w:t>
-            </w:r>
-            <w:r>
-              <w:rPr>
-                <w:rFonts w:ascii="Consolas" w:hAnsi="Consolas"/>
-                <w:sz w:val="20"/>
-              </w:rPr>
-              <w:t>:latest</w:t>
-            </w:r>
-            <w:r>
-              <w:t>)</w:t>
-            </w:r>
-          </w:p>
-        </w:tc>
-      </w:tr>
-      <w:tr>
-        <w:tc>
-          <w:tcPr>
-            <w:tcW w:type="dxa" w:w="4819"/>
-          </w:tcPr>
-          <w:p>
-            <w:r>
-              <w:t>CIS Docker 4.9</w:t>
-            </w:r>
-          </w:p>
-        </w:tc>
-        <w:tc>
-          <w:tcPr>
-            <w:tcW w:type="dxa" w:w="4819"/>
-          </w:tcPr>
-          <w:p>
-            <w:r>
-              <w:t xml:space="preserve">Dùng </w:t>
-            </w:r>
-            <w:r>
-              <w:rPr>
-                <w:rFonts w:ascii="Consolas" w:hAnsi="Consolas"/>
-                <w:sz w:val="20"/>
-              </w:rPr>
-              <w:t>COPY</w:t>
-            </w:r>
-            <w:r>
-              <w:t xml:space="preserve"> thay cho </w:t>
-            </w:r>
-            <w:r>
-              <w:rPr>
-                <w:rFonts w:ascii="Consolas" w:hAnsi="Consolas"/>
-                <w:sz w:val="20"/>
-              </w:rPr>
-              <w:t>ADD</w:t>
-            </w:r>
-            <w:r>
-              <w:t xml:space="preserve"> (tránh kéo nội dung từ xa ngoài kiểm soát)</w:t>
-            </w:r>
-          </w:p>
-        </w:tc>
-      </w:tr>
-      <w:tr>
-        <w:tc>
-          <w:tcPr>
-            <w:tcW w:type="dxa" w:w="4819"/>
-          </w:tcPr>
-          <w:p>
-            <w:r>
-              <w:t>CIS Docker 4.10</w:t>
-            </w:r>
-          </w:p>
-        </w:tc>
-        <w:tc>
-          <w:tcPr>
-            <w:tcW w:type="dxa" w:w="4819"/>
-          </w:tcPr>
-          <w:p>
-            <w:r>
-              <w:t>Không lưu bí mật trong Dockerfile</w:t>
-            </w:r>
-          </w:p>
-        </w:tc>
-      </w:tr>
-      <w:tr>
-        <w:tc>
-          <w:tcPr>
-            <w:tcW w:type="dxa" w:w="4819"/>
-          </w:tcPr>
-          <w:p>
-            <w:r>
-              <w:t>CIS Docker 5.3</w:t>
-            </w:r>
-          </w:p>
-        </w:tc>
-        <w:tc>
-          <w:tcPr>
-            <w:tcW w:type="dxa" w:w="4819"/>
-          </w:tcPr>
-          <w:p>
-            <w:r>
-              <w:t>Loại bỏ Linux capabilities không cần (</w:t>
-            </w:r>
-            <w:r>
-              <w:rPr>
-                <w:rFonts w:ascii="Consolas" w:hAnsi="Consolas"/>
-                <w:sz w:val="20"/>
-              </w:rPr>
-              <w:t>cap_drop: ALL</w:t>
-            </w:r>
-            <w:r>
-              <w:t>)</w:t>
-            </w:r>
-          </w:p>
-        </w:tc>
-      </w:tr>
-      <w:tr>
-        <w:tc>
-          <w:tcPr>
-            <w:tcW w:type="dxa" w:w="4819"/>
-          </w:tcPr>
-          <w:p>
-            <w:r>
-              <w:t>CIS Docker 5.4</w:t>
-            </w:r>
-          </w:p>
-        </w:tc>
-        <w:tc>
-          <w:tcPr>
-            <w:tcW w:type="dxa" w:w="4819"/>
-          </w:tcPr>
-          <w:p>
-            <w:r>
-              <w:t xml:space="preserve">Không chạy container ở chế độ </w:t>
-            </w:r>
-            <w:r>
-              <w:rPr>
-                <w:rFonts w:ascii="Consolas" w:hAnsi="Consolas"/>
-                <w:sz w:val="20"/>
-              </w:rPr>
-              <w:t>privileged</w:t>
-            </w:r>
-          </w:p>
-        </w:tc>
-      </w:tr>
-      <w:tr>
-        <w:tc>
-          <w:tcPr>
-            <w:tcW w:type="dxa" w:w="4819"/>
-          </w:tcPr>
-          <w:p>
-            <w:r>
-              <w:t>CIS Docker 5.8</w:t>
-            </w:r>
-          </w:p>
-        </w:tc>
-        <w:tc>
-          <w:tcPr>
-            <w:tcW w:type="dxa" w:w="4819"/>
-          </w:tcPr>
-          <w:p>
-            <w:r>
-              <w:t>Chỉ mở đúng cổng cần thiết (không mở cổng quản trị/CSDL)</w:t>
-            </w:r>
-          </w:p>
-        </w:tc>
-      </w:tr>
-      <w:tr>
-        <w:tc>
-          <w:tcPr>
-            <w:tcW w:type="dxa" w:w="4819"/>
-          </w:tcPr>
-          <w:p>
-            <w:r>
-              <w:t>CIS Docker 5.12</w:t>
-            </w:r>
-          </w:p>
-        </w:tc>
-        <w:tc>
-          <w:tcPr>
-            <w:tcW w:type="dxa" w:w="4819"/>
-          </w:tcPr>
-          <w:p>
-            <w:r>
-              <w:t>Gắn hệ thống tệp gốc ở chế độ chỉ đọc (</w:t>
-            </w:r>
-            <w:r>
-              <w:rPr>
-                <w:rFonts w:ascii="Consolas" w:hAnsi="Consolas"/>
-                <w:sz w:val="20"/>
-              </w:rPr>
-              <w:t>read_only</w:t>
-            </w:r>
-            <w:r>
-              <w:t>)</w:t>
-            </w:r>
-          </w:p>
-        </w:tc>
-      </w:tr>
-      <w:tr>
-        <w:tc>
-          <w:tcPr>
-            <w:tcW w:type="dxa" w:w="4819"/>
-          </w:tcPr>
-          <w:p>
-            <w:r>
-              <w:t>CIS Docker 5.31</w:t>
-            </w:r>
-          </w:p>
-        </w:tc>
-        <w:tc>
-          <w:tcPr>
-            <w:tcW w:type="dxa" w:w="4819"/>
-          </w:tcPr>
-          <w:p>
-            <w:r>
-              <w:t>Không mount Docker socket vào container</w:t>
-            </w:r>
-          </w:p>
-        </w:tc>
-      </w:tr>
-      <w:tr>
-        <w:tc>
-          <w:tcPr>
-            <w:tcW w:type="dxa" w:w="4819"/>
-          </w:tcPr>
-          <w:p>
-            <w:r>
-              <w:t>OCI image-spec</w:t>
-            </w:r>
-          </w:p>
-        </w:tc>
-        <w:tc>
-          <w:tcPr>
-            <w:tcW w:type="dxa" w:w="4819"/>
-          </w:tcPr>
-          <w:p>
-            <w:r>
-              <w:t>Chuẩn định dạng ảnh container + nhãn metadata nguồn gốc</w:t>
-            </w:r>
-          </w:p>
-        </w:tc>
-      </w:tr>
-      <w:tr>
-        <w:tc>
-          <w:tcPr>
-            <w:tcW w:type="dxa" w:w="4819"/>
-          </w:tcPr>
-          <w:p>
-            <w:r>
-              <w:t>SLSA (L1)</w:t>
-            </w:r>
-          </w:p>
-        </w:tc>
-        <w:tc>
-          <w:tcPr>
-            <w:tcW w:type="dxa" w:w="4819"/>
-          </w:tcPr>
-          <w:p>
-            <w:r>
-              <w:t xml:space="preserve">Khung toàn vẹn chuỗi cung ứng; mức L1 = </w:t>
-            </w:r>
-            <w:r>
-              <w:rPr>
-                <w:i/>
-              </w:rPr>
-              <w:t>có khai báo nguồn gốc (provenance)</w:t>
-            </w:r>
-          </w:p>
-        </w:tc>
-      </w:tr>
-      <w:tr>
-        <w:tc>
-          <w:tcPr>
-            <w:tcW w:type="dxa" w:w="4819"/>
-          </w:tcPr>
-          <w:p>
-            <w:r>
-              <w:t>NIST SP 800-190</w:t>
-            </w:r>
-          </w:p>
-        </w:tc>
-        <w:tc>
-          <w:tcPr>
-            <w:tcW w:type="dxa" w:w="4819"/>
-          </w:tcPr>
-          <w:p>
-            <w:r>
-              <w:t>Hướng dẫn an toàn cho container</w:t>
-            </w:r>
-          </w:p>
-        </w:tc>
-      </w:tr>
-      <w:tr>
-        <w:tc>
-          <w:tcPr>
-            <w:tcW w:type="dxa" w:w="4819"/>
-          </w:tcPr>
-          <w:p>
-            <w:r>
-              <w:t>NĐ 13/2023 Điều 3</w:t>
-            </w:r>
-          </w:p>
-        </w:tc>
-        <w:tc>
-          <w:tcPr>
-            <w:tcW w:type="dxa" w:w="4819"/>
-          </w:tcPr>
-          <w:p>
-            <w:r>
-              <w:t>Nguyên tắc bảo vệ dữ liệu cá nhân (gồm nguyên tắc bảo mật, an toàn)</w:t>
-            </w:r>
-          </w:p>
-        </w:tc>
-      </w:tr>
-      <w:tr>
-        <w:tc>
-          <w:tcPr>
-            <w:tcW w:type="dxa" w:w="4819"/>
-          </w:tcPr>
-          <w:p>
-            <w:r>
-              <w:t>NĐ 13/2023 Điều 26</w:t>
-            </w:r>
-          </w:p>
-        </w:tc>
-        <w:tc>
-          <w:tcPr>
-            <w:tcW w:type="dxa" w:w="4819"/>
-          </w:tcPr>
-          <w:p>
-            <w:r>
-              <w:t>Biện pháp quản lý &amp; kỹ thuật bảo vệ dữ liệu cá nhân, từ đầu và suốt quá trình xử lý</w:t>
-            </w:r>
-          </w:p>
-        </w:tc>
-      </w:tr>
-      <w:tr>
-        <w:tc>
-          <w:tcPr>
-            <w:tcW w:type="dxa" w:w="4819"/>
-          </w:tcPr>
-          <w:p>
-            <w:r>
-              <w:t>NĐ 13/2023 Điều 27</w:t>
-            </w:r>
-          </w:p>
-        </w:tc>
-        <w:tc>
-          <w:tcPr>
-            <w:tcW w:type="dxa" w:w="4819"/>
-          </w:tcPr>
-          <w:p>
-            <w:r>
-              <w:t>Biện pháp bảo vệ dữ liệu cá nhân cơ bản</w:t>
-            </w:r>
-          </w:p>
-        </w:tc>
-      </w:tr>
-      <w:tr>
-        <w:tc>
-          <w:tcPr>
-            <w:tcW w:type="dxa" w:w="4819"/>
-          </w:tcPr>
-          <w:p>
-            <w:r>
-              <w:t>Luật ATTTM 2015 Điều 16</w:t>
-            </w:r>
-          </w:p>
-        </w:tc>
-        <w:tc>
-          <w:tcPr>
-            <w:tcW w:type="dxa" w:w="4819"/>
-          </w:tcPr>
-          <w:p>
-            <w:r>
-              <w:t>Nguyên tắc bảo vệ thông tin cá nhân</w:t>
-            </w:r>
-          </w:p>
-        </w:tc>
-      </w:tr>
-      <w:tr>
-        <w:tc>
-          <w:tcPr>
-            <w:tcW w:type="dxa" w:w="4819"/>
-          </w:tcPr>
-          <w:p>
-            <w:r>
-              <w:t>Luật ATTTM 2015 Điều 17</w:t>
-            </w:r>
-          </w:p>
-        </w:tc>
-        <w:tc>
-          <w:tcPr>
-            <w:tcW w:type="dxa" w:w="4819"/>
-          </w:tcPr>
-          <w:p>
-            <w:r>
-              <w:t>Không chia sẻ thông tin cá nhân cho bên thứ ba khi chưa được đồng ý</w:t>
-            </w:r>
-          </w:p>
-        </w:tc>
-      </w:tr>
-      <w:tr>
-        <w:tc>
-          <w:tcPr>
-            <w:tcW w:type="dxa" w:w="4819"/>
-          </w:tcPr>
-          <w:p>
-            <w:r>
-              <w:t>Luật ATTTM 2015 Điều 19</w:t>
-            </w:r>
-          </w:p>
-        </w:tc>
-        <w:tc>
-          <w:tcPr>
-            <w:tcW w:type="dxa" w:w="4819"/>
-          </w:tcPr>
-          <w:p>
-            <w:r>
-              <w:t>Biện pháp quản lý &amp; kỹ thuật bảo đảm an toàn thông tin cá nhân; tuân thủ tiêu chuẩn kỹ thuật</w:t>
-            </w:r>
-          </w:p>
-        </w:tc>
-      </w:tr>
-      <w:tr>
-        <w:tc>
-          <w:tcPr>
-            <w:tcW w:type="dxa" w:w="4819"/>
-          </w:tcPr>
-          <w:p>
-            <w:r>
-              <w:t>TCVN 11930:2017</w:t>
-            </w:r>
-          </w:p>
-        </w:tc>
-        <w:tc>
-          <w:tcPr>
-            <w:tcW w:type="dxa" w:w="4819"/>
-          </w:tcPr>
-          <w:p>
-            <w:r>
-              <w:t>Yêu cầu cơ bản về an toàn hệ thống thông tin theo cấp độ</w:t>
-            </w:r>
-          </w:p>
-        </w:tc>
-      </w:tr>
-    </w:tbl>
-    <w:p/>
     <w:p>
       <w:pPr>
         <w:pStyle w:val="Heading1"/>
@@ -3756,7 +2969,7 @@
           <w:i/>
           <w:sz w:val="22"/>
         </w:rPr>
-        <w:t>Bảng 8. Các cổng kiểm soát và lệnh chạy</w:t>
+        <w:t>Bảng 7. Các cổng kiểm soát và lệnh chạy</w:t>
       </w:r>
     </w:p>
     <w:tbl>
@@ -4136,7 +3349,7 @@
           <w:i/>
           <w:sz w:val="22"/>
         </w:rPr>
-        <w:t>Bảng 9. Bảy pha DevSecOps của tài liệu lab và cách báo cáo phủ</w:t>
+        <w:t>Bảng 8. Bảy pha DevSecOps của tài liệu lab và cách báo cáo phủ</w:t>
       </w:r>
     </w:p>
     <w:tbl>
@@ -4682,7 +3895,7 @@
           <w:i/>
           <w:sz w:val="22"/>
         </w:rPr>
-        <w:t>Bảng 10. Liên hệ đoạn mã demo với tài liệu môn học</w:t>
+        <w:t>Bảng 9. Liên hệ đoạn mã demo với tài liệu môn học</w:t>
       </w:r>
     </w:p>
     <w:tbl>
@@ -7062,7 +6275,7 @@
           <w:i/>
           <w:sz w:val="22"/>
         </w:rPr>
-        <w:t>Bảng 11. Luật kiểm tra cấu hình container — luật yêu cầu gì và dựa trên chuẩn nào</w:t>
+        <w:t>Bảng 10. Luật kiểm tra cấu hình container — luật yêu cầu gì và dựa trên chuẩn nào</w:t>
       </w:r>
     </w:p>
     <w:tbl>
@@ -7119,7 +6332,7 @@
                 <w:b/>
                 <w:color w:val="FFFFFF"/>
               </w:rPr>
-              <w:t>Tiêu chuẩn (ý nghĩa xem Bảng tra ở mục 3.2)</w:t>
+              <w:t>Tiêu chuẩn (ý nghĩa xem Phụ lục C)</w:t>
             </w:r>
           </w:p>
         </w:tc>
@@ -7710,7 +6923,7 @@
         <w:rPr>
           <w:b/>
         </w:rPr>
-        <w:t>Bảng tra ở mục 3.2</w:t>
+        <w:t>Phụ lục C</w:t>
       </w:r>
       <w:r>
         <w:t>.</w:t>
@@ -7725,7 +6938,7 @@
           <w:i/>
           <w:sz w:val="22"/>
         </w:rPr>
-        <w:t>Bảng 12. Ánh xạ lỗi với chính sách (quốc tế và Việt Nam)</w:t>
+        <w:t>Bảng 11. Ánh xạ lỗi với chính sách (quốc tế và Việt Nam)</w:t>
       </w:r>
     </w:p>
     <w:tbl>
@@ -10293,6 +9506,823 @@
                 <w:sz w:val="17"/>
               </w:rPr>
               <w:t>}</w:t>
+            </w:r>
+          </w:p>
+        </w:tc>
+      </w:tr>
+    </w:tbl>
+    <w:p/>
+    <w:p>
+      <w:r>
+        <w:br w:type="page"/>
+      </w:r>
+    </w:p>
+    <w:p>
+      <w:pPr>
+        <w:pStyle w:val="Heading1"/>
+      </w:pPr>
+      <w:r>
+        <w:t>Phụ lục C — Giải thích tiêu chuẩn và điều khoản tham chiếu</w:t>
+      </w:r>
+    </w:p>
+    <w:p>
+      <w:pPr>
+        <w:jc w:val="both"/>
+      </w:pPr>
+      <w:r>
+        <w:t>Bảng tra ý nghĩa (</w:t>
+      </w:r>
+      <w:r>
+        <w:rPr>
+          <w:b/>
+        </w:rPr>
+        <w:t>yêu cầu gì</w:t>
+      </w:r>
+      <w:r>
+        <w:t>) của mọi tiêu chuẩn/điều khoản được trích trong báo cáo. Phần thân chỉ ghi mã; ý nghĩa tra tại đây.</w:t>
+      </w:r>
+    </w:p>
+    <w:p>
+      <w:pPr>
+        <w:jc w:val="center"/>
+      </w:pPr>
+      <w:r>
+        <w:rPr>
+          <w:i/>
+          <w:sz w:val="22"/>
+        </w:rPr>
+        <w:t>Bảng 12. Tra cứu — mỗi tiêu chuẩn/điều khoản tham chiếu yêu cầu gì</w:t>
+      </w:r>
+    </w:p>
+    <w:tbl>
+      <w:tblPr>
+        <w:tblStyle w:val="TableGrid"/>
+        <w:tblW w:type="auto" w:w="0"/>
+        <w:jc w:val="center"/>
+        <w:tblLook w:firstColumn="1" w:firstRow="1" w:lastColumn="0" w:lastRow="0" w:noHBand="0" w:noVBand="1" w:val="04A0"/>
+      </w:tblPr>
+      <w:tblGrid>
+        <w:gridCol w:w="4819"/>
+        <w:gridCol w:w="4819"/>
+      </w:tblGrid>
+      <w:tr>
+        <w:tc>
+          <w:tcPr>
+            <w:tcW w:type="dxa" w:w="4819"/>
+            <w:shd w:val="clear" w:color="auto" w:fill="0B2A4A"/>
+          </w:tcPr>
+          <w:p>
+            <w:r>
+              <w:rPr>
+                <w:b/>
+                <w:color w:val="FFFFFF"/>
+              </w:rPr>
+              <w:t>Điều khoản</w:t>
+            </w:r>
+          </w:p>
+        </w:tc>
+        <w:tc>
+          <w:tcPr>
+            <w:tcW w:type="dxa" w:w="4819"/>
+            <w:shd w:val="clear" w:color="auto" w:fill="0B2A4A"/>
+          </w:tcPr>
+          <w:p>
+            <w:r>
+              <w:rPr>
+                <w:b/>
+                <w:color w:val="FFFFFF"/>
+              </w:rPr>
+              <w:t>Yêu cầu / ý nghĩa tóm gọn</w:t>
+            </w:r>
+          </w:p>
+        </w:tc>
+      </w:tr>
+      <w:tr>
+        <w:tc>
+          <w:tcPr>
+            <w:tcW w:type="dxa" w:w="4819"/>
+          </w:tcPr>
+          <w:p>
+            <w:r>
+              <w:t>GDPR Điều 5(1)(f)</w:t>
+            </w:r>
+          </w:p>
+        </w:tc>
+        <w:tc>
+          <w:tcPr>
+            <w:tcW w:type="dxa" w:w="4819"/>
+          </w:tcPr>
+          <w:p>
+            <w:r>
+              <w:t xml:space="preserve">Nguyên tắc </w:t>
+            </w:r>
+            <w:r>
+              <w:rPr>
+                <w:i/>
+              </w:rPr>
+              <w:t>toàn vẹn &amp; bảo mật</w:t>
+            </w:r>
+            <w:r>
+              <w:t>: xử lý dữ liệu một cách an toàn</w:t>
+            </w:r>
+          </w:p>
+        </w:tc>
+      </w:tr>
+      <w:tr>
+        <w:tc>
+          <w:tcPr>
+            <w:tcW w:type="dxa" w:w="4819"/>
+          </w:tcPr>
+          <w:p>
+            <w:r>
+              <w:t>GDPR Điều 25</w:t>
+            </w:r>
+          </w:p>
+        </w:tc>
+        <w:tc>
+          <w:tcPr>
+            <w:tcW w:type="dxa" w:w="4819"/>
+          </w:tcPr>
+          <w:p>
+            <w:r>
+              <w:t xml:space="preserve">Bảo vệ dữ liệu </w:t>
+            </w:r>
+            <w:r>
+              <w:rPr>
+                <w:i/>
+              </w:rPr>
+              <w:t>từ thiết kế</w:t>
+            </w:r>
+            <w:r>
+              <w:t xml:space="preserve"> (khoản 1) và </w:t>
+            </w:r>
+            <w:r>
+              <w:rPr>
+                <w:i/>
+              </w:rPr>
+              <w:t>theo mặc định</w:t>
+            </w:r>
+            <w:r>
+              <w:t xml:space="preserve"> (khoản 2)</w:t>
+            </w:r>
+          </w:p>
+        </w:tc>
+      </w:tr>
+      <w:tr>
+        <w:tc>
+          <w:tcPr>
+            <w:tcW w:type="dxa" w:w="4819"/>
+          </w:tcPr>
+          <w:p>
+            <w:r>
+              <w:t>GDPR Điều 32</w:t>
+            </w:r>
+          </w:p>
+        </w:tc>
+        <w:tc>
+          <w:tcPr>
+            <w:tcW w:type="dxa" w:w="4819"/>
+          </w:tcPr>
+          <w:p>
+            <w:r>
+              <w:t>Biện pháp kỹ thuật &amp; tổ chức bảo đảm an toàn khi xử lý — (1)(b) bí mật/toàn vẹn, (1)(d) kiểm thử &amp; đánh giá định kỳ</w:t>
+            </w:r>
+          </w:p>
+        </w:tc>
+      </w:tr>
+      <w:tr>
+        <w:tc>
+          <w:tcPr>
+            <w:tcW w:type="dxa" w:w="4819"/>
+          </w:tcPr>
+          <w:p>
+            <w:r>
+              <w:t>OWASP A01:2021 / CWE-639</w:t>
+            </w:r>
+          </w:p>
+        </w:tc>
+        <w:tc>
+          <w:tcPr>
+            <w:tcW w:type="dxa" w:w="4819"/>
+          </w:tcPr>
+          <w:p>
+            <w:r>
+              <w:rPr>
+                <w:i/>
+              </w:rPr>
+              <w:t>Broken Access Control</w:t>
+            </w:r>
+            <w:r>
+              <w:t xml:space="preserve"> — kiểm soát truy cập bị phá vỡ (IDOR)</w:t>
+            </w:r>
+          </w:p>
+        </w:tc>
+      </w:tr>
+      <w:tr>
+        <w:tc>
+          <w:tcPr>
+            <w:tcW w:type="dxa" w:w="4819"/>
+          </w:tcPr>
+          <w:p>
+            <w:r>
+              <w:t>OWASP A02:2021 / CWE-327</w:t>
+            </w:r>
+          </w:p>
+        </w:tc>
+        <w:tc>
+          <w:tcPr>
+            <w:tcW w:type="dxa" w:w="4819"/>
+          </w:tcPr>
+          <w:p>
+            <w:r>
+              <w:rPr>
+                <w:i/>
+              </w:rPr>
+              <w:t>Cryptographic Failures</w:t>
+            </w:r>
+            <w:r>
+              <w:t xml:space="preserve"> — lỗi mật mã (vd băm mật khẩu bằng thuật toán yếu)</w:t>
+            </w:r>
+          </w:p>
+        </w:tc>
+      </w:tr>
+      <w:tr>
+        <w:tc>
+          <w:tcPr>
+            <w:tcW w:type="dxa" w:w="4819"/>
+          </w:tcPr>
+          <w:p>
+            <w:r>
+              <w:t>OWASP A03:2021 / CWE-89</w:t>
+            </w:r>
+          </w:p>
+        </w:tc>
+        <w:tc>
+          <w:tcPr>
+            <w:tcW w:type="dxa" w:w="4819"/>
+          </w:tcPr>
+          <w:p>
+            <w:r>
+              <w:rPr>
+                <w:i/>
+              </w:rPr>
+              <w:t>Injection</w:t>
+            </w:r>
+            <w:r>
+              <w:t xml:space="preserve"> — tiêm nhiễm dữ liệu vào câu lệnh (SQL injection)</w:t>
+            </w:r>
+          </w:p>
+        </w:tc>
+      </w:tr>
+      <w:tr>
+        <w:tc>
+          <w:tcPr>
+            <w:tcW w:type="dxa" w:w="4819"/>
+          </w:tcPr>
+          <w:p>
+            <w:r>
+              <w:t>PCI-DSS 2.2</w:t>
+            </w:r>
+          </w:p>
+        </w:tc>
+        <w:tc>
+          <w:tcPr>
+            <w:tcW w:type="dxa" w:w="4819"/>
+          </w:tcPr>
+          <w:p>
+            <w:r>
+              <w:t>Cấu hình tham số an toàn hệ thống, chạy với đặc quyền tối thiểu</w:t>
+            </w:r>
+          </w:p>
+        </w:tc>
+      </w:tr>
+      <w:tr>
+        <w:tc>
+          <w:tcPr>
+            <w:tcW w:type="dxa" w:w="4819"/>
+          </w:tcPr>
+          <w:p>
+            <w:r>
+              <w:t>PCI-DSS 3.4</w:t>
+            </w:r>
+          </w:p>
+        </w:tc>
+        <w:tc>
+          <w:tcPr>
+            <w:tcW w:type="dxa" w:w="4819"/>
+          </w:tcPr>
+          <w:p>
+            <w:r>
+              <w:t>Làm số thẻ (PAN) không đọc được ở mọi nơi lưu trữ</w:t>
+            </w:r>
+          </w:p>
+        </w:tc>
+      </w:tr>
+      <w:tr>
+        <w:tc>
+          <w:tcPr>
+            <w:tcW w:type="dxa" w:w="4819"/>
+          </w:tcPr>
+          <w:p>
+            <w:r>
+              <w:t>PCI-DSS 8.2.1</w:t>
+            </w:r>
+          </w:p>
+        </w:tc>
+        <w:tc>
+          <w:tcPr>
+            <w:tcW w:type="dxa" w:w="4819"/>
+          </w:tcPr>
+          <w:p>
+            <w:r>
+              <w:t>Không lưu thông tin xác thực (credential) ở dạng đọc được</w:t>
+            </w:r>
+          </w:p>
+        </w:tc>
+      </w:tr>
+      <w:tr>
+        <w:tc>
+          <w:tcPr>
+            <w:tcW w:type="dxa" w:w="4819"/>
+          </w:tcPr>
+          <w:p>
+            <w:r>
+              <w:t>CIS Docker 4.1</w:t>
+            </w:r>
+          </w:p>
+        </w:tc>
+        <w:tc>
+          <w:tcPr>
+            <w:tcW w:type="dxa" w:w="4819"/>
+          </w:tcPr>
+          <w:p>
+            <w:r>
+              <w:t xml:space="preserve">Chạy container bằng user riêng, </w:t>
+            </w:r>
+            <w:r>
+              <w:rPr>
+                <w:b/>
+              </w:rPr>
+              <w:t>không phải root</w:t>
+            </w:r>
+          </w:p>
+        </w:tc>
+      </w:tr>
+      <w:tr>
+        <w:tc>
+          <w:tcPr>
+            <w:tcW w:type="dxa" w:w="4819"/>
+          </w:tcPr>
+          <w:p>
+            <w:r>
+              <w:t>CIS Docker 4.5</w:t>
+            </w:r>
+          </w:p>
+        </w:tc>
+        <w:tc>
+          <w:tcPr>
+            <w:tcW w:type="dxa" w:w="4819"/>
+          </w:tcPr>
+          <w:p>
+            <w:r>
+              <w:t xml:space="preserve">Dùng ảnh nền tin cậy, ghim phiên bản/digest (tránh tag động </w:t>
+            </w:r>
+            <w:r>
+              <w:rPr>
+                <w:rFonts w:ascii="Consolas" w:hAnsi="Consolas"/>
+                <w:sz w:val="20"/>
+              </w:rPr>
+              <w:t>:latest</w:t>
+            </w:r>
+            <w:r>
+              <w:t>)</w:t>
+            </w:r>
+          </w:p>
+        </w:tc>
+      </w:tr>
+      <w:tr>
+        <w:tc>
+          <w:tcPr>
+            <w:tcW w:type="dxa" w:w="4819"/>
+          </w:tcPr>
+          <w:p>
+            <w:r>
+              <w:t>CIS Docker 4.9</w:t>
+            </w:r>
+          </w:p>
+        </w:tc>
+        <w:tc>
+          <w:tcPr>
+            <w:tcW w:type="dxa" w:w="4819"/>
+          </w:tcPr>
+          <w:p>
+            <w:r>
+              <w:t xml:space="preserve">Dùng </w:t>
+            </w:r>
+            <w:r>
+              <w:rPr>
+                <w:rFonts w:ascii="Consolas" w:hAnsi="Consolas"/>
+                <w:sz w:val="20"/>
+              </w:rPr>
+              <w:t>COPY</w:t>
+            </w:r>
+            <w:r>
+              <w:t xml:space="preserve"> thay cho </w:t>
+            </w:r>
+            <w:r>
+              <w:rPr>
+                <w:rFonts w:ascii="Consolas" w:hAnsi="Consolas"/>
+                <w:sz w:val="20"/>
+              </w:rPr>
+              <w:t>ADD</w:t>
+            </w:r>
+            <w:r>
+              <w:t xml:space="preserve"> (tránh kéo nội dung từ xa ngoài kiểm soát)</w:t>
+            </w:r>
+          </w:p>
+        </w:tc>
+      </w:tr>
+      <w:tr>
+        <w:tc>
+          <w:tcPr>
+            <w:tcW w:type="dxa" w:w="4819"/>
+          </w:tcPr>
+          <w:p>
+            <w:r>
+              <w:t>CIS Docker 4.10</w:t>
+            </w:r>
+          </w:p>
+        </w:tc>
+        <w:tc>
+          <w:tcPr>
+            <w:tcW w:type="dxa" w:w="4819"/>
+          </w:tcPr>
+          <w:p>
+            <w:r>
+              <w:t>Không lưu bí mật trong Dockerfile</w:t>
+            </w:r>
+          </w:p>
+        </w:tc>
+      </w:tr>
+      <w:tr>
+        <w:tc>
+          <w:tcPr>
+            <w:tcW w:type="dxa" w:w="4819"/>
+          </w:tcPr>
+          <w:p>
+            <w:r>
+              <w:t>CIS Docker 5.3</w:t>
+            </w:r>
+          </w:p>
+        </w:tc>
+        <w:tc>
+          <w:tcPr>
+            <w:tcW w:type="dxa" w:w="4819"/>
+          </w:tcPr>
+          <w:p>
+            <w:r>
+              <w:t>Loại bỏ Linux capabilities không cần (</w:t>
+            </w:r>
+            <w:r>
+              <w:rPr>
+                <w:rFonts w:ascii="Consolas" w:hAnsi="Consolas"/>
+                <w:sz w:val="20"/>
+              </w:rPr>
+              <w:t>cap_drop: ALL</w:t>
+            </w:r>
+            <w:r>
+              <w:t>)</w:t>
+            </w:r>
+          </w:p>
+        </w:tc>
+      </w:tr>
+      <w:tr>
+        <w:tc>
+          <w:tcPr>
+            <w:tcW w:type="dxa" w:w="4819"/>
+          </w:tcPr>
+          <w:p>
+            <w:r>
+              <w:t>CIS Docker 5.4</w:t>
+            </w:r>
+          </w:p>
+        </w:tc>
+        <w:tc>
+          <w:tcPr>
+            <w:tcW w:type="dxa" w:w="4819"/>
+          </w:tcPr>
+          <w:p>
+            <w:r>
+              <w:t xml:space="preserve">Không chạy container ở chế độ </w:t>
+            </w:r>
+            <w:r>
+              <w:rPr>
+                <w:rFonts w:ascii="Consolas" w:hAnsi="Consolas"/>
+                <w:sz w:val="20"/>
+              </w:rPr>
+              <w:t>privileged</w:t>
+            </w:r>
+          </w:p>
+        </w:tc>
+      </w:tr>
+      <w:tr>
+        <w:tc>
+          <w:tcPr>
+            <w:tcW w:type="dxa" w:w="4819"/>
+          </w:tcPr>
+          <w:p>
+            <w:r>
+              <w:t>CIS Docker 5.8</w:t>
+            </w:r>
+          </w:p>
+        </w:tc>
+        <w:tc>
+          <w:tcPr>
+            <w:tcW w:type="dxa" w:w="4819"/>
+          </w:tcPr>
+          <w:p>
+            <w:r>
+              <w:t>Chỉ mở đúng cổng cần thiết (không mở cổng quản trị/CSDL)</w:t>
+            </w:r>
+          </w:p>
+        </w:tc>
+      </w:tr>
+      <w:tr>
+        <w:tc>
+          <w:tcPr>
+            <w:tcW w:type="dxa" w:w="4819"/>
+          </w:tcPr>
+          <w:p>
+            <w:r>
+              <w:t>CIS Docker 5.12</w:t>
+            </w:r>
+          </w:p>
+        </w:tc>
+        <w:tc>
+          <w:tcPr>
+            <w:tcW w:type="dxa" w:w="4819"/>
+          </w:tcPr>
+          <w:p>
+            <w:r>
+              <w:t>Gắn hệ thống tệp gốc ở chế độ chỉ đọc (</w:t>
+            </w:r>
+            <w:r>
+              <w:rPr>
+                <w:rFonts w:ascii="Consolas" w:hAnsi="Consolas"/>
+                <w:sz w:val="20"/>
+              </w:rPr>
+              <w:t>read_only</w:t>
+            </w:r>
+            <w:r>
+              <w:t>)</w:t>
+            </w:r>
+          </w:p>
+        </w:tc>
+      </w:tr>
+      <w:tr>
+        <w:tc>
+          <w:tcPr>
+            <w:tcW w:type="dxa" w:w="4819"/>
+          </w:tcPr>
+          <w:p>
+            <w:r>
+              <w:t>CIS Docker 5.31</w:t>
+            </w:r>
+          </w:p>
+        </w:tc>
+        <w:tc>
+          <w:tcPr>
+            <w:tcW w:type="dxa" w:w="4819"/>
+          </w:tcPr>
+          <w:p>
+            <w:r>
+              <w:t>Không mount Docker socket vào container</w:t>
+            </w:r>
+          </w:p>
+        </w:tc>
+      </w:tr>
+      <w:tr>
+        <w:tc>
+          <w:tcPr>
+            <w:tcW w:type="dxa" w:w="4819"/>
+          </w:tcPr>
+          <w:p>
+            <w:r>
+              <w:t>OCI image-spec</w:t>
+            </w:r>
+          </w:p>
+        </w:tc>
+        <w:tc>
+          <w:tcPr>
+            <w:tcW w:type="dxa" w:w="4819"/>
+          </w:tcPr>
+          <w:p>
+            <w:r>
+              <w:t>Chuẩn định dạng ảnh container + nhãn metadata nguồn gốc</w:t>
+            </w:r>
+          </w:p>
+        </w:tc>
+      </w:tr>
+      <w:tr>
+        <w:tc>
+          <w:tcPr>
+            <w:tcW w:type="dxa" w:w="4819"/>
+          </w:tcPr>
+          <w:p>
+            <w:r>
+              <w:t>SLSA (L1)</w:t>
+            </w:r>
+          </w:p>
+        </w:tc>
+        <w:tc>
+          <w:tcPr>
+            <w:tcW w:type="dxa" w:w="4819"/>
+          </w:tcPr>
+          <w:p>
+            <w:r>
+              <w:t xml:space="preserve">Khung toàn vẹn chuỗi cung ứng; mức L1 = </w:t>
+            </w:r>
+            <w:r>
+              <w:rPr>
+                <w:i/>
+              </w:rPr>
+              <w:t>có khai báo nguồn gốc (provenance)</w:t>
+            </w:r>
+          </w:p>
+        </w:tc>
+      </w:tr>
+      <w:tr>
+        <w:tc>
+          <w:tcPr>
+            <w:tcW w:type="dxa" w:w="4819"/>
+          </w:tcPr>
+          <w:p>
+            <w:r>
+              <w:t>NIST SP 800-190</w:t>
+            </w:r>
+          </w:p>
+        </w:tc>
+        <w:tc>
+          <w:tcPr>
+            <w:tcW w:type="dxa" w:w="4819"/>
+          </w:tcPr>
+          <w:p>
+            <w:r>
+              <w:t>Hướng dẫn an toàn cho container</w:t>
+            </w:r>
+          </w:p>
+        </w:tc>
+      </w:tr>
+      <w:tr>
+        <w:tc>
+          <w:tcPr>
+            <w:tcW w:type="dxa" w:w="4819"/>
+          </w:tcPr>
+          <w:p>
+            <w:r>
+              <w:t>NĐ 13/2023 Điều 3</w:t>
+            </w:r>
+          </w:p>
+        </w:tc>
+        <w:tc>
+          <w:tcPr>
+            <w:tcW w:type="dxa" w:w="4819"/>
+          </w:tcPr>
+          <w:p>
+            <w:r>
+              <w:t>Nguyên tắc bảo vệ dữ liệu cá nhân (gồm nguyên tắc bảo mật, an toàn)</w:t>
+            </w:r>
+          </w:p>
+        </w:tc>
+      </w:tr>
+      <w:tr>
+        <w:tc>
+          <w:tcPr>
+            <w:tcW w:type="dxa" w:w="4819"/>
+          </w:tcPr>
+          <w:p>
+            <w:r>
+              <w:t>NĐ 13/2023 Điều 26</w:t>
+            </w:r>
+          </w:p>
+        </w:tc>
+        <w:tc>
+          <w:tcPr>
+            <w:tcW w:type="dxa" w:w="4819"/>
+          </w:tcPr>
+          <w:p>
+            <w:r>
+              <w:t>Biện pháp quản lý &amp; kỹ thuật bảo vệ dữ liệu cá nhân, từ đầu và suốt quá trình xử lý</w:t>
+            </w:r>
+          </w:p>
+        </w:tc>
+      </w:tr>
+      <w:tr>
+        <w:tc>
+          <w:tcPr>
+            <w:tcW w:type="dxa" w:w="4819"/>
+          </w:tcPr>
+          <w:p>
+            <w:r>
+              <w:t>NĐ 13/2023 Điều 27</w:t>
+            </w:r>
+          </w:p>
+        </w:tc>
+        <w:tc>
+          <w:tcPr>
+            <w:tcW w:type="dxa" w:w="4819"/>
+          </w:tcPr>
+          <w:p>
+            <w:r>
+              <w:t>Biện pháp bảo vệ dữ liệu cá nhân cơ bản</w:t>
+            </w:r>
+          </w:p>
+        </w:tc>
+      </w:tr>
+      <w:tr>
+        <w:tc>
+          <w:tcPr>
+            <w:tcW w:type="dxa" w:w="4819"/>
+          </w:tcPr>
+          <w:p>
+            <w:r>
+              <w:t>Luật ATTTM 2015 Điều 16</w:t>
+            </w:r>
+          </w:p>
+        </w:tc>
+        <w:tc>
+          <w:tcPr>
+            <w:tcW w:type="dxa" w:w="4819"/>
+          </w:tcPr>
+          <w:p>
+            <w:r>
+              <w:t>Nguyên tắc bảo vệ thông tin cá nhân</w:t>
+            </w:r>
+          </w:p>
+        </w:tc>
+      </w:tr>
+      <w:tr>
+        <w:tc>
+          <w:tcPr>
+            <w:tcW w:type="dxa" w:w="4819"/>
+          </w:tcPr>
+          <w:p>
+            <w:r>
+              <w:t>Luật ATTTM 2015 Điều 17</w:t>
+            </w:r>
+          </w:p>
+        </w:tc>
+        <w:tc>
+          <w:tcPr>
+            <w:tcW w:type="dxa" w:w="4819"/>
+          </w:tcPr>
+          <w:p>
+            <w:r>
+              <w:t>Không chia sẻ thông tin cá nhân cho bên thứ ba khi chưa được đồng ý</w:t>
+            </w:r>
+          </w:p>
+        </w:tc>
+      </w:tr>
+      <w:tr>
+        <w:tc>
+          <w:tcPr>
+            <w:tcW w:type="dxa" w:w="4819"/>
+          </w:tcPr>
+          <w:p>
+            <w:r>
+              <w:t>Luật ATTTM 2015 Điều 19</w:t>
+            </w:r>
+          </w:p>
+        </w:tc>
+        <w:tc>
+          <w:tcPr>
+            <w:tcW w:type="dxa" w:w="4819"/>
+          </w:tcPr>
+          <w:p>
+            <w:r>
+              <w:t>Biện pháp quản lý &amp; kỹ thuật bảo đảm an toàn thông tin cá nhân; tuân thủ tiêu chuẩn kỹ thuật</w:t>
+            </w:r>
+          </w:p>
+        </w:tc>
+      </w:tr>
+      <w:tr>
+        <w:tc>
+          <w:tcPr>
+            <w:tcW w:type="dxa" w:w="4819"/>
+          </w:tcPr>
+          <w:p>
+            <w:r>
+              <w:t>TCVN 11930:2017</w:t>
+            </w:r>
+          </w:p>
+        </w:tc>
+        <w:tc>
+          <w:tcPr>
+            <w:tcW w:type="dxa" w:w="4819"/>
+          </w:tcPr>
+          <w:p>
+            <w:r>
+              <w:t>Yêu cầu cơ bản về an toàn hệ thống thông tin theo cấp độ</w:t>
             </w:r>
           </w:p>
         </w:tc>

</xml_diff>

<commit_message>
docs(report): anh quet that (Semgrep 37 findings + Conftest fail) + van phong bao cao + tach §4/§5
- §4.1 doi thanh 'Quet va phat hien loi - ket qua thuc te': them anh Semgrep quet TOAN BO ma
  (37 findings/25 tep, highlight F01/F02/MD5) + anh chi tiet 3 loi xu ly + anh Conftest fail.
- Sua nhan kho hieu 'Pha & Security as Code' -> 'Pha DevSecOps: ... Kiem soat (Security/Policy as Code): ...'.
- Van phong bao cao: bo 'ngay tho', 'muoi'->salt, giam 'nhom tu viet/tu lam' -> 'bo sung/viet rieng'.
- report/figures/capture_runs.py: them 3 anh (semgrep-overview/scan highlight, conftest-fail).
- Rebuild PDF 30 trang + DOCX.
</commit_message>
<xml_diff>
--- a/report/BaoCao_DevSecOps_JuiceShop_gon.docx
+++ b/report/BaoCao_DevSecOps_JuiceShop_gon.docx
@@ -3554,7 +3554,7 @@
           </w:tcPr>
           <w:p>
             <w:r>
-              <w:t>Hình 6; mục 5.1, 5.2, 6</w:t>
+              <w:t>Hình 9; mục 5.1, 5.2, 6</w:t>
             </w:r>
           </w:p>
         </w:tc>
@@ -3596,7 +3596,7 @@
           </w:tcPr>
           <w:p>
             <w:r>
-              <w:t>Hình 7, Hình 10</w:t>
+              <w:t>Hình 10, Hình 13</w:t>
             </w:r>
           </w:p>
         </w:tc>
@@ -4149,7 +4149,7 @@
         <w:pStyle w:val="Heading2"/>
       </w:pPr>
       <w:r>
-        <w:t>4.1. Đoạn mã dò lỗi cốt lõi của mỗi demo</w:t>
+        <w:t>4.1. Quét và phát hiện lỗi — kết quả thực tế</w:t>
       </w:r>
     </w:p>
     <w:p>
@@ -4157,16 +4157,292 @@
         <w:jc w:val="both"/>
       </w:pPr>
       <w:r>
-        <w:t xml:space="preserve">Mỗi script chạy bằng </w:t>
-      </w:r>
+        <w:t xml:space="preserve">Các cổng quét tự động chạy trên mã nguồn và cấu hình </w:t>
+      </w:r>
+      <w:r>
+        <w:rPr>
+          <w:i/>
+        </w:rPr>
+        <w:t>chưa vá</w:t>
+      </w:r>
+      <w:r>
+        <w:t>, phát hiện điểm yếu trước khi sửa.</w:t>
+      </w:r>
+    </w:p>
+    <w:p>
+      <w:pPr>
+        <w:jc w:val="both"/>
+      </w:pPr>
       <w:r>
         <w:rPr>
           <w:b/>
         </w:rPr>
-        <w:t>một lệnh</w:t>
-      </w:r>
-      <w:r>
-        <w:t xml:space="preserve"> (</w:t>
+        <w:t>SAST (Semgrep).</w:t>
+      </w:r>
+      <w:r>
+        <w:t xml:space="preserve"> Quét toàn bộ </w:t>
+      </w:r>
+      <w:r>
+        <w:rPr>
+          <w:rFonts w:ascii="Consolas" w:hAnsi="Consolas"/>
+          <w:sz w:val="20"/>
+        </w:rPr>
+        <w:t>routes/</w:t>
+      </w:r>
+      <w:r>
+        <w:t xml:space="preserve"> và </w:t>
+      </w:r>
+      <w:r>
+        <w:rPr>
+          <w:rFonts w:ascii="Consolas" w:hAnsi="Consolas"/>
+          <w:sz w:val="20"/>
+        </w:rPr>
+        <w:t>lib/</w:t>
+      </w:r>
+      <w:r>
+        <w:t xml:space="preserve"> cho ra 37 điểm yếu trên 25 tệp (NoSQL injection, XSS, băm yếu, JWT secret cố định…). Báo cáo tập trung ba điểm thuộc phạm vi phân công: F01 (</w:t>
+      </w:r>
+      <w:r>
+        <w:rPr>
+          <w:rFonts w:ascii="Consolas" w:hAnsi="Consolas"/>
+          <w:sz w:val="20"/>
+        </w:rPr>
+        <w:t>login.ts</w:t>
+      </w:r>
+      <w:r>
+        <w:t xml:space="preserve"> — SQL injection), F02 (</w:t>
+      </w:r>
+      <w:r>
+        <w:rPr>
+          <w:rFonts w:ascii="Consolas" w:hAnsi="Consolas"/>
+          <w:sz w:val="20"/>
+        </w:rPr>
+        <w:t>basket.ts</w:t>
+      </w:r>
+      <w:r>
+        <w:t xml:space="preserve"> — truy vấn giỏ hàng không ràng buộc chủ sở hữu) và hạn chế băm mật khẩu bằng MD5 không salt tại </w:t>
+      </w:r>
+      <w:r>
+        <w:rPr>
+          <w:rFonts w:ascii="Consolas" w:hAnsi="Consolas"/>
+          <w:sz w:val="20"/>
+        </w:rPr>
+        <w:t>lib/insecurity.ts</w:t>
+      </w:r>
+      <w:r>
+        <w:t>.</w:t>
+      </w:r>
+    </w:p>
+    <w:p>
+      <w:pPr>
+        <w:jc w:val="center"/>
+      </w:pPr>
+      <w:r>
+        <w:drawing>
+          <wp:inline xmlns:a="http://schemas.openxmlformats.org/drawingml/2006/main" xmlns:pic="http://schemas.openxmlformats.org/drawingml/2006/picture">
+            <wp:extent cx="5760000" cy="2755459"/>
+            <wp:docPr id="6" name="Picture 6"/>
+            <wp:cNvGraphicFramePr>
+              <a:graphicFrameLocks noChangeAspect="1"/>
+            </wp:cNvGraphicFramePr>
+            <a:graphic>
+              <a:graphicData uri="http://schemas.openxmlformats.org/drawingml/2006/picture">
+                <pic:pic>
+                  <pic:nvPicPr>
+                    <pic:cNvPr id="0" name="semgrep-overview.png"/>
+                    <pic:cNvPicPr/>
+                  </pic:nvPicPr>
+                  <pic:blipFill>
+                    <a:blip r:embed="rId15"/>
+                    <a:stretch>
+                      <a:fillRect/>
+                    </a:stretch>
+                  </pic:blipFill>
+                  <pic:spPr>
+                    <a:xfrm>
+                      <a:off x="0" y="0"/>
+                      <a:ext cx="5760000" cy="2755459"/>
+                    </a:xfrm>
+                    <a:prstGeom prst="rect"/>
+                  </pic:spPr>
+                </pic:pic>
+              </a:graphicData>
+            </a:graphic>
+          </wp:inline>
+        </w:drawing>
+      </w:r>
+    </w:p>
+    <w:p>
+      <w:pPr>
+        <w:jc w:val="center"/>
+      </w:pPr>
+      <w:r>
+        <w:rPr>
+          <w:i/>
+          <w:sz w:val="22"/>
+        </w:rPr>
+        <w:t xml:space="preserve">Hình 6. </w:t>
+      </w:r>
+      <w:r>
+        <w:rPr>
+          <w:i/>
+          <w:sz w:val="22"/>
+        </w:rPr>
+        <w:t>Semgrep quét toàn bộ mã nguồn: 37 điểm yếu trên 25 tệp; tô vàng ba điểm thuộc phạm vi báo cáo</w:t>
+      </w:r>
+    </w:p>
+    <w:p>
+      <w:pPr>
+        <w:jc w:val="center"/>
+      </w:pPr>
+      <w:r>
+        <w:drawing>
+          <wp:inline xmlns:a="http://schemas.openxmlformats.org/drawingml/2006/main" xmlns:pic="http://schemas.openxmlformats.org/drawingml/2006/picture">
+            <wp:extent cx="5760000" cy="696649"/>
+            <wp:docPr id="7" name="Picture 7"/>
+            <wp:cNvGraphicFramePr>
+              <a:graphicFrameLocks noChangeAspect="1"/>
+            </wp:cNvGraphicFramePr>
+            <a:graphic>
+              <a:graphicData uri="http://schemas.openxmlformats.org/drawingml/2006/picture">
+                <pic:pic>
+                  <pic:nvPicPr>
+                    <pic:cNvPr id="0" name="semgrep-scan.png"/>
+                    <pic:cNvPicPr/>
+                  </pic:nvPicPr>
+                  <pic:blipFill>
+                    <a:blip r:embed="rId16"/>
+                    <a:stretch>
+                      <a:fillRect/>
+                    </a:stretch>
+                  </pic:blipFill>
+                  <pic:spPr>
+                    <a:xfrm>
+                      <a:off x="0" y="0"/>
+                      <a:ext cx="5760000" cy="696649"/>
+                    </a:xfrm>
+                    <a:prstGeom prst="rect"/>
+                  </pic:spPr>
+                </pic:pic>
+              </a:graphicData>
+            </a:graphic>
+          </wp:inline>
+        </w:drawing>
+      </w:r>
+    </w:p>
+    <w:p>
+      <w:pPr>
+        <w:jc w:val="center"/>
+      </w:pPr>
+      <w:r>
+        <w:rPr>
+          <w:i/>
+          <w:sz w:val="22"/>
+        </w:rPr>
+        <w:t xml:space="preserve">Hình 7. </w:t>
+      </w:r>
+      <w:r>
+        <w:rPr>
+          <w:i/>
+          <w:sz w:val="22"/>
+        </w:rPr>
+        <w:t>Ba điểm yếu báo cáo xử lý: F01 SQL injection (login.ts), F02 truy vấn giỏ hàng (basket.ts) và MD5 không salt (insecurity.ts)</w:t>
+      </w:r>
+    </w:p>
+    <w:p>
+      <w:pPr>
+        <w:jc w:val="both"/>
+      </w:pPr>
+      <w:r>
+        <w:rPr>
+          <w:b/>
+        </w:rPr>
+        <w:t>Policy as Code (Conftest).</w:t>
+      </w:r>
+      <w:r>
+        <w:t xml:space="preserve"> Quét </w:t>
+      </w:r>
+      <w:r>
+        <w:rPr>
+          <w:rFonts w:ascii="Consolas" w:hAnsi="Consolas"/>
+          <w:sz w:val="20"/>
+        </w:rPr>
+        <w:t>Dockerfile.vulnerable</w:t>
+      </w:r>
+      <w:r>
+        <w:t xml:space="preserve"> phát hiện 6 vi phạm thuộc 4 nhóm luật; gate chặn phát hành (chi tiết F04 ở mục 5.4):</w:t>
+      </w:r>
+    </w:p>
+    <w:p>
+      <w:pPr>
+        <w:jc w:val="center"/>
+      </w:pPr>
+      <w:r>
+        <w:drawing>
+          <wp:inline xmlns:a="http://schemas.openxmlformats.org/drawingml/2006/main" xmlns:pic="http://schemas.openxmlformats.org/drawingml/2006/picture">
+            <wp:extent cx="5760000" cy="965189"/>
+            <wp:docPr id="8" name="Picture 8"/>
+            <wp:cNvGraphicFramePr>
+              <a:graphicFrameLocks noChangeAspect="1"/>
+            </wp:cNvGraphicFramePr>
+            <a:graphic>
+              <a:graphicData uri="http://schemas.openxmlformats.org/drawingml/2006/picture">
+                <pic:pic>
+                  <pic:nvPicPr>
+                    <pic:cNvPr id="0" name="conftest-fail.png"/>
+                    <pic:cNvPicPr/>
+                  </pic:nvPicPr>
+                  <pic:blipFill>
+                    <a:blip r:embed="rId17"/>
+                    <a:stretch>
+                      <a:fillRect/>
+                    </a:stretch>
+                  </pic:blipFill>
+                  <pic:spPr>
+                    <a:xfrm>
+                      <a:off x="0" y="0"/>
+                      <a:ext cx="5760000" cy="965189"/>
+                    </a:xfrm>
+                    <a:prstGeom prst="rect"/>
+                  </pic:spPr>
+                </pic:pic>
+              </a:graphicData>
+            </a:graphic>
+          </wp:inline>
+        </w:drawing>
+      </w:r>
+    </w:p>
+    <w:p>
+      <w:pPr>
+        <w:jc w:val="center"/>
+      </w:pPr>
+      <w:r>
+        <w:rPr>
+          <w:i/>
+          <w:sz w:val="22"/>
+        </w:rPr>
+        <w:t xml:space="preserve">Hình 8. </w:t>
+      </w:r>
+      <w:r>
+        <w:rPr>
+          <w:i/>
+          <w:sz w:val="22"/>
+        </w:rPr>
+        <w:t>Conftest quét Dockerfile.vulnerable: 6 vi phạm thuộc 4 nhóm luật, gate chặn phát hành</w:t>
+      </w:r>
+    </w:p>
+    <w:p>
+      <w:pPr>
+        <w:jc w:val="both"/>
+      </w:pPr>
+      <w:r>
+        <w:rPr>
+          <w:b/>
+        </w:rPr>
+        <w:t>Đoạn mã dò lỗi trong script demo.</w:t>
+      </w:r>
+      <w:r>
+        <w:t xml:space="preserve"> Mỗi script chạy bằng một lệnh (</w:t>
       </w:r>
       <w:r>
         <w:rPr>
@@ -4176,7 +4452,7 @@
         <w:t>python report/demos/&lt;tên&gt;.py</w:t>
       </w:r>
       <w:r>
-        <w:t>); phần dò lỗi cốt lõi trích dưới đây.</w:t>
+        <w:t>); phần dò lỗi cốt lõi như sau.</w:t>
       </w:r>
     </w:p>
     <w:p>
@@ -4550,7 +4826,7 @@
         <w:t>test/api/security/f01-f02.test.ts</w:t>
       </w:r>
       <w:r>
-        <w:t xml:space="preserve"> gửi payload kèm mật khẩu sai và yêu cầu nhận 401 — trên mã chưa sửa, test đỏ (Hình 7). Demo </w:t>
+        <w:t xml:space="preserve"> gửi payload kèm mật khẩu sai và yêu cầu nhận 401 — trên mã chưa sửa, test đỏ (Hình 10). Demo </w:t>
       </w:r>
       <w:r>
         <w:rPr>
@@ -4560,7 +4836,7 @@
         <w:t>demos/tv1_f01_sqli.py</w:t>
       </w:r>
       <w:r>
-        <w:t xml:space="preserve"> xác nhận token được cấp (Hình 8).</w:t>
+        <w:t xml:space="preserve"> xác nhận token được cấp (Hình 11).</w:t>
       </w:r>
     </w:p>
     <w:p>
@@ -4571,7 +4847,7 @@
         <w:drawing>
           <wp:inline xmlns:a="http://schemas.openxmlformats.org/drawingml/2006/main" xmlns:pic="http://schemas.openxmlformats.org/drawingml/2006/picture">
             <wp:extent cx="5760000" cy="3611077"/>
-            <wp:docPr id="6" name="Picture 6"/>
+            <wp:docPr id="9" name="Picture 9"/>
             <wp:cNvGraphicFramePr>
               <a:graphicFrameLocks noChangeAspect="1"/>
             </wp:cNvGraphicFramePr>
@@ -4583,7 +4859,7 @@
                     <pic:cNvPicPr/>
                   </pic:nvPicPr>
                   <pic:blipFill>
-                    <a:blip r:embed="rId15"/>
+                    <a:blip r:embed="rId18"/>
                     <a:stretch>
                       <a:fillRect/>
                     </a:stretch>
@@ -4611,7 +4887,7 @@
           <w:i/>
           <w:sz w:val="22"/>
         </w:rPr>
-        <w:t xml:space="preserve">Hình 6. </w:t>
+        <w:t xml:space="preserve">Hình 9. </w:t>
       </w:r>
       <w:r>
         <w:rPr>
@@ -4629,7 +4905,7 @@
         <w:drawing>
           <wp:inline xmlns:a="http://schemas.openxmlformats.org/drawingml/2006/main" xmlns:pic="http://schemas.openxmlformats.org/drawingml/2006/picture">
             <wp:extent cx="5400000" cy="2066538"/>
-            <wp:docPr id="7" name="Picture 7"/>
+            <wp:docPr id="10" name="Picture 10"/>
             <wp:cNvGraphicFramePr>
               <a:graphicFrameLocks noChangeAspect="1"/>
             </wp:cNvGraphicFramePr>
@@ -4641,7 +4917,7 @@
                     <pic:cNvPicPr/>
                   </pic:nvPicPr>
                   <pic:blipFill>
-                    <a:blip r:embed="rId16"/>
+                    <a:blip r:embed="rId19"/>
                     <a:stretch>
                       <a:fillRect/>
                     </a:stretch>
@@ -4669,7 +4945,7 @@
           <w:i/>
           <w:sz w:val="22"/>
         </w:rPr>
-        <w:t xml:space="preserve">Hình 7. </w:t>
+        <w:t xml:space="preserve">Hình 10. </w:t>
       </w:r>
       <w:r>
         <w:rPr>
@@ -4761,7 +5037,7 @@
         <w:jc w:val="both"/>
       </w:pPr>
       <w:r>
-        <w:t>Câu lệnh được biên dịch trước, giá trị gửi riêng nên ký tự SQL trong email chỉ còn là dữ liệu. Sau khi sửa, kiểm thử bảo mật xanh toàn bộ (Hình 10) và demo cho thấy mọi payload đều bị từ chối 401 trong khi đăng nhập hợp lệ vẫn hoạt động (Hình 8).</w:t>
+        <w:t>Câu lệnh được biên dịch trước, giá trị gửi riêng nên ký tự SQL trong email chỉ còn là dữ liệu. Sau khi sửa, kiểm thử bảo mật xanh toàn bộ (Hình 13) và demo cho thấy mọi payload đều bị từ chối 401 trong khi đăng nhập hợp lệ vẫn hoạt động (Hình 11).</w:t>
       </w:r>
     </w:p>
     <w:p>
@@ -4785,7 +5061,7 @@
         <w:rPr>
           <w:b/>
         </w:rPr>
-        <w:t>MD5 không muối</w:t>
+        <w:t>MD5 không salt</w:t>
       </w:r>
       <w:r>
         <w:t xml:space="preserve"> (</w:t>
@@ -4798,7 +5074,7 @@
         <w:t>lib/insecurity.ts</w:t>
       </w:r>
       <w:r>
-        <w:t>, CWE-327 / OWASP A02:2021). Đây là lỗ hổng lưu trữ mật khẩu nằm ngoài phạm vi F01 (vốn chỉ chặn vượt xác thực); khi triển khai thật cần thay bằng bcrypt/argon2 có muối.</w:t>
+        <w:t>, CWE-327 / OWASP A02:2021). Đây là lỗ hổng lưu trữ mật khẩu nằm ngoài phạm vi F01 (vốn chỉ chặn vượt xác thực); khi triển khai thật cần thay bằng bcrypt hoặc argon2 có salt.</w:t>
       </w:r>
     </w:p>
     <w:p>
@@ -4809,7 +5085,7 @@
         <w:drawing>
           <wp:inline xmlns:a="http://schemas.openxmlformats.org/drawingml/2006/main" xmlns:pic="http://schemas.openxmlformats.org/drawingml/2006/picture">
             <wp:extent cx="5400000" cy="1996579"/>
-            <wp:docPr id="8" name="Picture 8"/>
+            <wp:docPr id="11" name="Picture 11"/>
             <wp:cNvGraphicFramePr>
               <a:graphicFrameLocks noChangeAspect="1"/>
             </wp:cNvGraphicFramePr>
@@ -4821,7 +5097,7 @@
                     <pic:cNvPicPr/>
                   </pic:nvPicPr>
                   <pic:blipFill>
-                    <a:blip r:embed="rId17"/>
+                    <a:blip r:embed="rId20"/>
                     <a:stretch>
                       <a:fillRect/>
                     </a:stretch>
@@ -4849,7 +5125,7 @@
           <w:i/>
           <w:sz w:val="22"/>
         </w:rPr>
-        <w:t xml:space="preserve">Hình 8. </w:t>
+        <w:t xml:space="preserve">Hình 11. </w:t>
       </w:r>
       <w:r>
         <w:rPr>
@@ -4876,10 +5152,19 @@
         <w:rPr>
           <w:b/>
         </w:rPr>
-        <w:t>Pha &amp; Security as Code:</w:t>
-      </w:r>
-      <w:r>
-        <w:t xml:space="preserve"> phát hiện ở pha Code (SAST), chặn tái diễn ở pha Test bằng kiểm thử bảo mật trong pipeline.</w:t>
+        <w:t>Pha DevSecOps:</w:t>
+      </w:r>
+      <w:r>
+        <w:t xml:space="preserve"> Code → Test. </w:t>
+      </w:r>
+      <w:r>
+        <w:rPr>
+          <w:b/>
+        </w:rPr>
+        <w:t>Kiểm soát (Security as Code):</w:t>
+      </w:r>
+      <w:r>
+        <w:t xml:space="preserve"> phát hiện bằng SAST ở pha Code, chặn tái diễn bằng kiểm thử bảo mật tự động ở pha Test.</w:t>
       </w:r>
     </w:p>
     <w:p>
@@ -4986,7 +5271,7 @@
         <w:t>Phát hiện.</w:t>
       </w:r>
       <w:r>
-        <w:t xml:space="preserve"> Kiểm thử hai tài khoản A, B: dùng token của A đọc giỏ của B. Trên mã chưa sửa trả về đúng giỏ của B (Hình 9); các ca tương ứng trong </w:t>
+        <w:t xml:space="preserve"> Kiểm thử hai tài khoản A, B: dùng token của A đọc giỏ của B. Trên mã chưa sửa trả về đúng giỏ của B (Hình 12); các ca tương ứng trong </w:t>
       </w:r>
       <w:r>
         <w:rPr>
@@ -5101,7 +5386,7 @@
         <w:jc w:val="both"/>
       </w:pPr>
       <w:r>
-        <w:t>Sau khi sửa, A đọc giỏ của B nhận 404, giỏ của chính mình vẫn 200 (Hình 9).</w:t>
+        <w:t>Sau khi sửa, A đọc giỏ của B nhận 404, giỏ của chính mình vẫn 200 (Hình 12).</w:t>
       </w:r>
     </w:p>
     <w:p>
@@ -5112,7 +5397,7 @@
         <w:drawing>
           <wp:inline xmlns:a="http://schemas.openxmlformats.org/drawingml/2006/main" xmlns:pic="http://schemas.openxmlformats.org/drawingml/2006/picture">
             <wp:extent cx="5040000" cy="1604842"/>
-            <wp:docPr id="9" name="Picture 9"/>
+            <wp:docPr id="12" name="Picture 12"/>
             <wp:cNvGraphicFramePr>
               <a:graphicFrameLocks noChangeAspect="1"/>
             </wp:cNvGraphicFramePr>
@@ -5124,7 +5409,7 @@
                     <pic:cNvPicPr/>
                   </pic:nvPicPr>
                   <pic:blipFill>
-                    <a:blip r:embed="rId18"/>
+                    <a:blip r:embed="rId21"/>
                     <a:stretch>
                       <a:fillRect/>
                     </a:stretch>
@@ -5152,7 +5437,7 @@
           <w:i/>
           <w:sz w:val="22"/>
         </w:rPr>
-        <w:t xml:space="preserve">Hình 9. </w:t>
+        <w:t xml:space="preserve">Hình 12. </w:t>
       </w:r>
       <w:r>
         <w:rPr>
@@ -5170,7 +5455,7 @@
         <w:drawing>
           <wp:inline xmlns:a="http://schemas.openxmlformats.org/drawingml/2006/main" xmlns:pic="http://schemas.openxmlformats.org/drawingml/2006/picture">
             <wp:extent cx="5400000" cy="2066538"/>
-            <wp:docPr id="10" name="Picture 10"/>
+            <wp:docPr id="13" name="Picture 13"/>
             <wp:cNvGraphicFramePr>
               <a:graphicFrameLocks noChangeAspect="1"/>
             </wp:cNvGraphicFramePr>
@@ -5182,7 +5467,7 @@
                     <pic:cNvPicPr/>
                   </pic:nvPicPr>
                   <pic:blipFill>
-                    <a:blip r:embed="rId19"/>
+                    <a:blip r:embed="rId22"/>
                     <a:stretch>
                       <a:fillRect/>
                     </a:stretch>
@@ -5210,7 +5495,7 @@
           <w:i/>
           <w:sz w:val="22"/>
         </w:rPr>
-        <w:t xml:space="preserve">Hình 10. </w:t>
+        <w:t xml:space="preserve">Hình 13. </w:t>
       </w:r>
       <w:r>
         <w:rPr>
@@ -5237,10 +5522,19 @@
         <w:rPr>
           <w:b/>
         </w:rPr>
-        <w:t>Pha &amp; Security as Code:</w:t>
-      </w:r>
-      <w:r>
-        <w:t xml:space="preserve"> phát hiện ở Test (kiểm thử phân quyền), giữ trong pipeline để chống tái diễn.</w:t>
+        <w:t>Pha DevSecOps:</w:t>
+      </w:r>
+      <w:r>
+        <w:t xml:space="preserve"> Design → Test. </w:t>
+      </w:r>
+      <w:r>
+        <w:rPr>
+          <w:b/>
+        </w:rPr>
+        <w:t>Kiểm soát (Security as Code):</w:t>
+      </w:r>
+      <w:r>
+        <w:t xml:space="preserve"> kiểm thử phân quyền tự động trong pipeline, chống tái diễn.</w:t>
       </w:r>
     </w:p>
     <w:p>
@@ -5317,7 +5611,7 @@
         <w:t>/metrics</w:t>
       </w:r>
       <w:r>
-        <w:t xml:space="preserve"> từ host: trước khi sửa trả 200 với hàng trăm dòng số liệu (Hình 11).</w:t>
+        <w:t xml:space="preserve"> từ host: trước khi sửa trả 200 với hàng trăm dòng số liệu (Hình 14).</w:t>
       </w:r>
     </w:p>
     <w:p>
@@ -5472,7 +5766,7 @@
         <w:t>từ host</w:t>
       </w:r>
       <w:r>
-        <w:t xml:space="preserve"> — tức chặn ở lối vào từ bên ngoài, không phải đóng tuyệt đối: trong mạng internal, hệ thống giám sát vẫn đọc được metrics đúng mục đích (Hình 11).</w:t>
+        <w:t xml:space="preserve"> — tức chặn ở lối vào từ bên ngoài, không phải đóng tuyệt đối: trong mạng internal, hệ thống giám sát vẫn đọc được metrics đúng mục đích (Hình 14).</w:t>
       </w:r>
     </w:p>
     <w:p>
@@ -5483,7 +5777,7 @@
         <w:drawing>
           <wp:inline xmlns:a="http://schemas.openxmlformats.org/drawingml/2006/main" xmlns:pic="http://schemas.openxmlformats.org/drawingml/2006/picture">
             <wp:extent cx="5400000" cy="3006346"/>
-            <wp:docPr id="11" name="Picture 11"/>
+            <wp:docPr id="14" name="Picture 14"/>
             <wp:cNvGraphicFramePr>
               <a:graphicFrameLocks noChangeAspect="1"/>
             </wp:cNvGraphicFramePr>
@@ -5495,7 +5789,7 @@
                     <pic:cNvPicPr/>
                   </pic:nvPicPr>
                   <pic:blipFill>
-                    <a:blip r:embed="rId20"/>
+                    <a:blip r:embed="rId23"/>
                     <a:stretch>
                       <a:fillRect/>
                     </a:stretch>
@@ -5523,7 +5817,7 @@
           <w:i/>
           <w:sz w:val="22"/>
         </w:rPr>
-        <w:t xml:space="preserve">Hình 11. </w:t>
+        <w:t xml:space="preserve">Hình 14. </w:t>
       </w:r>
       <w:r>
         <w:rPr>
@@ -5550,10 +5844,19 @@
         <w:rPr>
           <w:b/>
         </w:rPr>
-        <w:t>Pha &amp; Policy as Code:</w:t>
-      </w:r>
-      <w:r>
-        <w:t xml:space="preserve"> lỗi ở Deploy/Operate; luật </w:t>
+        <w:t>Pha DevSecOps:</w:t>
+      </w:r>
+      <w:r>
+        <w:t xml:space="preserve"> Deploy → Operate. </w:t>
+      </w:r>
+      <w:r>
+        <w:rPr>
+          <w:b/>
+        </w:rPr>
+        <w:t>Kiểm soát (Policy as Code):</w:t>
+      </w:r>
+      <w:r>
+        <w:t xml:space="preserve"> luật </w:t>
       </w:r>
       <w:r>
         <w:rPr>
@@ -5563,7 +5866,7 @@
         <w:t>compose.rego</w:t>
       </w:r>
       <w:r>
-        <w:t xml:space="preserve"> chặn mọi cấu hình cho backend mở cổng (mục 4).</w:t>
+        <w:t xml:space="preserve"> chặn mọi cấu hình để backend mở cổng host (mục 4).</w:t>
       </w:r>
     </w:p>
     <w:p>
@@ -5676,7 +5979,47 @@
         <w:jc w:val="both"/>
       </w:pPr>
       <w:r>
-        <w:t xml:space="preserve">Các kiểm tra ngây thơ dễ bị qua mặt: "có lệnh USER" bỏ qua Dockerfile nhiều stage; "EXPOSE không chứa cổng cấm" vô nghĩa vì EXPOSE chỉ là tài liệu; nhãn </w:t>
+        <w:t xml:space="preserve">Những cách kiểm tra sơ sài dễ bị qua mặt: kiểm tra "có lệnh </w:t>
+      </w:r>
+      <w:r>
+        <w:rPr>
+          <w:rFonts w:ascii="Consolas" w:hAnsi="Consolas"/>
+          <w:sz w:val="20"/>
+        </w:rPr>
+        <w:t>USER</w:t>
+      </w:r>
+      <w:r>
+        <w:t xml:space="preserve">" bỏ sót Dockerfile nhiều stage (lệnh </w:t>
+      </w:r>
+      <w:r>
+        <w:rPr>
+          <w:rFonts w:ascii="Consolas" w:hAnsi="Consolas"/>
+          <w:sz w:val="20"/>
+        </w:rPr>
+        <w:t>USER</w:t>
+      </w:r>
+      <w:r>
+        <w:t xml:space="preserve"> ở stage builder không áp dụng cho image chạy thật); kiểm tra "</w:t>
+      </w:r>
+      <w:r>
+        <w:rPr>
+          <w:rFonts w:ascii="Consolas" w:hAnsi="Consolas"/>
+          <w:sz w:val="20"/>
+        </w:rPr>
+        <w:t>EXPOSE</w:t>
+      </w:r>
+      <w:r>
+        <w:t xml:space="preserve"> không chứa cổng cấm" không có giá trị vì </w:t>
+      </w:r>
+      <w:r>
+        <w:rPr>
+          <w:rFonts w:ascii="Consolas" w:hAnsi="Consolas"/>
+          <w:sz w:val="20"/>
+        </w:rPr>
+        <w:t>EXPOSE</w:t>
+      </w:r>
+      <w:r>
+        <w:t xml:space="preserve"> chỉ mang tính tài liệu; nhãn </w:t>
       </w:r>
       <w:r>
         <w:rPr>
@@ -5686,7 +6029,7 @@
         <w:t>mfa="true"</w:t>
       </w:r>
       <w:r>
-        <w:t xml:space="preserve"> tự khai được.</w:t>
+        <w:t xml:space="preserve"> có thể tự khai mà không phản ánh cấu hình thực tế.</w:t>
       </w:r>
     </w:p>
     <w:p>
@@ -6243,7 +6586,7 @@
         <w:rPr>
           <w:b/>
         </w:rPr>
-        <w:t>bộ luật Rego nhóm viết</w:t>
+        <w:t>bộ luật Rego được viết riêng</w:t>
       </w:r>
       <w:r>
         <w:t xml:space="preserve"> (kèm mười một unit test chứng minh luật bắt đúng và không bị qua mặt) mới là </w:t>
@@ -6516,7 +6859,7 @@
               <w:rPr>
                 <w:i/>
               </w:rPr>
-              <w:t>(nhóm bổ sung)</w:t>
+              <w:t>(bổ sung)</w:t>
             </w:r>
           </w:p>
         </w:tc>
@@ -6532,7 +6875,7 @@
               <w:t>Không</w:t>
             </w:r>
             <w:r>
-              <w:t xml:space="preserve"> đặt bí mật/credential trong </w:t>
+              <w:t xml:space="preserve"> đặt secret/credential trong </w:t>
             </w:r>
             <w:r>
               <w:rPr>
@@ -6686,7 +7029,7 @@
         <w:t>đạt toàn bộ chính sách an toàn</w:t>
       </w:r>
       <w:r>
-        <w:t xml:space="preserve"> (Hình 12).</w:t>
+        <w:t xml:space="preserve"> (Hình 15).</w:t>
       </w:r>
     </w:p>
     <w:p>
@@ -6697,7 +7040,7 @@
         <w:drawing>
           <wp:inline xmlns:a="http://schemas.openxmlformats.org/drawingml/2006/main" xmlns:pic="http://schemas.openxmlformats.org/drawingml/2006/picture">
             <wp:extent cx="5400000" cy="2128846"/>
-            <wp:docPr id="12" name="Picture 12"/>
+            <wp:docPr id="15" name="Picture 15"/>
             <wp:cNvGraphicFramePr>
               <a:graphicFrameLocks noChangeAspect="1"/>
             </wp:cNvGraphicFramePr>
@@ -6709,7 +7052,7 @@
                     <pic:cNvPicPr/>
                   </pic:nvPicPr>
                   <pic:blipFill>
-                    <a:blip r:embed="rId21"/>
+                    <a:blip r:embed="rId24"/>
                     <a:stretch>
                       <a:fillRect/>
                     </a:stretch>
@@ -6737,7 +7080,7 @@
           <w:i/>
           <w:sz w:val="22"/>
         </w:rPr>
-        <w:t xml:space="preserve">Hình 12. </w:t>
+        <w:t xml:space="preserve">Hình 15. </w:t>
       </w:r>
       <w:r>
         <w:rPr>
@@ -6777,7 +7120,17 @@
         <w:t>kế thừa</w:t>
       </w:r>
       <w:r>
-        <w:t xml:space="preserve"> cấu trúc và bốn luật cốt lõi từ Appendix A.1 của tài liệu lab (LEAST-PRIVILEGE theo USER ở stage cuối, ATTACK-SURFACE theo cổng cấm, nhãn provenance OCI, SUPPLY-CHAIN </w:t>
+        <w:t xml:space="preserve"> cấu trúc và bốn luật cốt lõi từ Appendix A.1 của tài liệu lab (LEAST-PRIVILEGE theo </w:t>
+      </w:r>
+      <w:r>
+        <w:rPr>
+          <w:rFonts w:ascii="Consolas" w:hAnsi="Consolas"/>
+          <w:sz w:val="20"/>
+        </w:rPr>
+        <w:t>USER</w:t>
+      </w:r>
+      <w:r>
+        <w:t xml:space="preserve"> ở stage cuối, ATTACK-SURFACE theo cổng cấm, nhãn provenance OCI, SUPPLY-CHAIN </w:t>
       </w:r>
       <w:r>
         <w:rPr>
@@ -6793,10 +7146,10 @@
         <w:rPr>
           <w:b/>
         </w:rPr>
-        <w:t>Phần nhóm tự làm</w:t>
-      </w:r>
-      <w:r>
-        <w:t xml:space="preserve"> gồm: (a) bỏ luật HEALTHCHECK/OBSERVABILITY của lab (thiên về vận hành hơn an toàn, và distroless không chạy được); (b) gộp provenance vào nhóm SUPPLY-CHAIN và nêu rõ đây là provenance </w:t>
+        <w:t>Phần bổ sung so với tài liệu lab</w:t>
+      </w:r>
+      <w:r>
+        <w:t xml:space="preserve"> gồm: (a) loại bỏ luật HEALTHCHECK/OBSERVABILITY (thiên về vận hành hơn an toàn, và image distroless không chạy được); (b) gộp provenance vào nhóm SUPPLY-CHAIN, nêu rõ đây là provenance </w:t>
       </w:r>
       <w:r>
         <w:rPr>
@@ -6805,25 +7158,46 @@
         <w:t>khai báo</w:t>
       </w:r>
       <w:r>
-        <w:t xml:space="preserve"> (SLSA L1); (c) </w:t>
+        <w:t xml:space="preserve"> (SLSA L1); (c) bổ sung luật </w:t>
+      </w:r>
+      <w:r>
+        <w:rPr>
+          <w:rFonts w:ascii="Consolas" w:hAnsi="Consolas"/>
+          <w:sz w:val="20"/>
+        </w:rPr>
+        <w:t>SECRET-IN-IMAGE</w:t>
+      </w:r>
+      <w:r>
+        <w:t xml:space="preserve"> chặn secret nhúng trong </w:t>
+      </w:r>
+      <w:r>
+        <w:rPr>
+          <w:rFonts w:ascii="Consolas" w:hAnsi="Consolas"/>
+          <w:sz w:val="20"/>
+        </w:rPr>
+        <w:t>ENV</w:t>
+      </w:r>
+      <w:r>
+        <w:t>/</w:t>
+      </w:r>
+      <w:r>
+        <w:rPr>
+          <w:rFonts w:ascii="Consolas" w:hAnsi="Consolas"/>
+          <w:sz w:val="20"/>
+        </w:rPr>
+        <w:t>ARG</w:t>
+      </w:r>
+      <w:r>
+        <w:t xml:space="preserve"> — luật </w:t>
       </w:r>
       <w:r>
         <w:rPr>
           <w:b/>
         </w:rPr>
-        <w:t>tự viết luật `SECRET-IN-IMAGE`</w:t>
-      </w:r>
-      <w:r>
-        <w:t xml:space="preserve"> chặn bí mật nhúng trong ENV/ARG — luật này </w:t>
-      </w:r>
-      <w:r>
-        <w:rPr>
-          <w:b/>
-        </w:rPr>
-        <w:t>không có trong lab</w:t>
-      </w:r>
-      <w:r>
-        <w:t xml:space="preserve">, kèm hai unit test. Riêng chính sách </w:t>
+        <w:t>không có trong tài liệu lab</w:t>
+      </w:r>
+      <w:r>
+        <w:t xml:space="preserve">, kèm hai unit test. Chính sách </w:t>
       </w:r>
       <w:r>
         <w:rPr>
@@ -6833,16 +7207,7 @@
         <w:t>compose.rego</w:t>
       </w:r>
       <w:r>
-        <w:t xml:space="preserve"> (F03) là </w:t>
-      </w:r>
-      <w:r>
-        <w:rPr>
-          <w:b/>
-        </w:rPr>
-        <w:t>do nhóm tự viết cho docker-compose</w:t>
-      </w:r>
-      <w:r>
-        <w:t xml:space="preserve">: lab chỉ enforce trên manifest Kubernetes (k8s.rego), nhóm chuyển các ý tưởng least-privilege/firewall/secret sang đúng định dạng triển khai thật của mình. Mã nguồn đầy đủ ở </w:t>
+        <w:t xml:space="preserve"> (F03) được viết bổ sung cho docker-compose: tài liệu lab chỉ áp dụng trên manifest Kubernetes (k8s.rego), báo cáo chuyển các nguyên tắc least-privilege/firewall/secret sang đúng định dạng triển khai thực tế. Mã nguồn đầy đủ ở </w:t>
       </w:r>
       <w:r>
         <w:rPr>
@@ -6880,10 +7245,19 @@
         <w:rPr>
           <w:b/>
         </w:rPr>
-        <w:t>Pha &amp; Policy as Code:</w:t>
-      </w:r>
-      <w:r>
-        <w:t xml:space="preserve"> lỗi ở Build/Release; chính sách chạy như một cổng kiểm tra trong pipeline.</w:t>
+        <w:t>Pha DevSecOps:</w:t>
+      </w:r>
+      <w:r>
+        <w:t xml:space="preserve"> Build → Release. </w:t>
+      </w:r>
+      <w:r>
+        <w:rPr>
+          <w:b/>
+        </w:rPr>
+        <w:t>Kiểm soát (Policy as Code):</w:t>
+      </w:r>
+      <w:r>
+        <w:t xml:space="preserve"> bộ luật Rego chạy như một cổng kiểm tra bắt buộc trong pipeline.</w:t>
       </w:r>
     </w:p>
     <w:p>
@@ -7235,7 +7609,7 @@
       <w:r>
         <w:t xml:space="preserve">OWASP Juice Shop — </w:t>
       </w:r>
-      <w:hyperlink r:id="rId22">
+      <w:hyperlink r:id="rId25">
         <w:r>
           <w:rPr>
             <w:color w:val="0B4EA2"/>

</xml_diff>

<commit_message>
docs(report): go phan ghi chu thuyet trinh khoi bao cao chinh thuc, chuyen ra file rieng
- Bo: doan ma do loi trong script demo, 'Noi dung mot luat & cach trich chuan', 'Phan dinh nguon',
  cot 'Minh chung' (bang Bay pha), dong 'Lenh chay cu the ... DEMO.md', 'Huong dan tai lap ...',
  moi tham chieu DEMO.md/HUONG_DAN_DEMO.md, va §6 (Doi chieu chinh sach - trung lap voi tung finding).
- Danh so lai §7->§6 (Ket luan), §8->§7 (Tai lieu tham khao).
- Chuyen phan 'de nhom biet noi gi' ra file rieng report/GHI_CHU_NOI_KHI_BAO_CAO.md.
- Rebuild PDF 28 trang + DOCX.
</commit_message>
<xml_diff>
--- a/report/BaoCao_DevSecOps_JuiceShop_gon.docx
+++ b/report/BaoCao_DevSecOps_JuiceShop_gon.docx
@@ -1222,7 +1222,7 @@
         <w:t>Luật An toàn thông tin mạng 2015</w:t>
       </w:r>
       <w:r>
-        <w:t xml:space="preserve"> (chi tiết ở mục 3.2 và 6).</w:t>
+        <w:t xml:space="preserve"> (chi tiết ở mục 3.2).</w:t>
       </w:r>
     </w:p>
     <w:p>
@@ -1873,12 +1873,39 @@
     <w:p/>
     <w:p>
       <w:pPr>
+        <w:jc w:val="both"/>
+      </w:pPr>
+      <w:r>
+        <w:t xml:space="preserve">Các kiểm soát trên được </w:t>
+      </w:r>
+      <w:r>
+        <w:rPr>
+          <w:b/>
+        </w:rPr>
+        <w:t>xác minh trên container đang chạy</w:t>
+      </w:r>
+      <w:r>
+        <w:t xml:space="preserve"> bằng </w:t>
+      </w:r>
+      <w:r>
+        <w:rPr>
+          <w:rFonts w:ascii="Consolas" w:hAnsi="Consolas"/>
+          <w:sz w:val="20"/>
+        </w:rPr>
+        <w:t>docker inspect</w:t>
+      </w:r>
+      <w:r>
+        <w:t xml:space="preserve"> (Compliance as Code), chứng minh chúng được áp dụng thực tế chứ không chỉ khai trong file cấu hình:</w:t>
+      </w:r>
+    </w:p>
+    <w:p>
+      <w:pPr>
         <w:jc w:val="center"/>
       </w:pPr>
       <w:r>
         <w:drawing>
           <wp:inline xmlns:a="http://schemas.openxmlformats.org/drawingml/2006/main" xmlns:pic="http://schemas.openxmlformats.org/drawingml/2006/picture">
-            <wp:extent cx="5760000" cy="1682526"/>
+            <wp:extent cx="5760000" cy="1054703"/>
             <wp:docPr id="1" name="Picture 1"/>
             <wp:cNvGraphicFramePr>
               <a:graphicFrameLocks noChangeAspect="1"/>
@@ -1899,7 +1926,7 @@
                   <pic:spPr>
                     <a:xfrm>
                       <a:off x="0" y="0"/>
-                      <a:ext cx="5760000" cy="1682526"/>
+                      <a:ext cx="5760000" cy="1054703"/>
                     </a:xfrm>
                     <a:prstGeom prst="rect"/>
                   </pic:spPr>
@@ -1926,7 +1953,52 @@
           <w:i/>
           <w:sz w:val="22"/>
         </w:rPr>
-        <w:t>Cấu hình an toàn của các container đang chạy: không chạy root, drop capability, chỉ proxy mở cổng loopback</w:t>
+        <w:t xml:space="preserve">Bằng chứng runtime qua </w:t>
+      </w:r>
+      <w:r>
+        <w:rPr>
+          <w:rFonts w:ascii="Consolas" w:hAnsi="Consolas"/>
+          <w:i/>
+          <w:sz w:val="22"/>
+        </w:rPr>
+        <w:t>docker inspect</w:t>
+      </w:r>
+      <w:r>
+        <w:rPr>
+          <w:i/>
+          <w:sz w:val="22"/>
+        </w:rPr>
+        <w:t xml:space="preserve">: cả ba container chạy non-root (USER), </w:t>
+      </w:r>
+      <w:r>
+        <w:rPr>
+          <w:rFonts w:ascii="Consolas" w:hAnsi="Consolas"/>
+          <w:i/>
+          <w:sz w:val="22"/>
+        </w:rPr>
+        <w:t>cap_drop: ALL</w:t>
+      </w:r>
+      <w:r>
+        <w:rPr>
+          <w:i/>
+          <w:sz w:val="22"/>
+        </w:rPr>
+        <w:t xml:space="preserve">, </w:t>
+      </w:r>
+      <w:r>
+        <w:rPr>
+          <w:rFonts w:ascii="Consolas" w:hAnsi="Consolas"/>
+          <w:i/>
+          <w:sz w:val="22"/>
+        </w:rPr>
+        <w:t>no-new-privileges</w:t>
+      </w:r>
+      <w:r>
+        <w:rPr>
+          <w:i/>
+          <w:sz w:val="22"/>
+        </w:rPr>
+        <w:t>; backend không mở cổng host (CỔNG HOST = “-”, mạng internal), chỉ proxy mở loopback 127.0.0.1:3102</w:t>
       </w:r>
     </w:p>
     <w:p>
@@ -2899,17 +2971,7 @@
         <w:jc w:val="both"/>
       </w:pPr>
       <w:r>
-        <w:t xml:space="preserve">Các kiểm soát này được viết thành mã, chạy lặp lại được — hiện chạy cục bộ (xem </w:t>
-      </w:r>
-      <w:r>
-        <w:rPr>
-          <w:rFonts w:ascii="Consolas" w:hAnsi="Consolas"/>
-          <w:sz w:val="20"/>
-        </w:rPr>
-        <w:t>DEMO.md</w:t>
-      </w:r>
-      <w:r>
-        <w:t xml:space="preserve">), và có thể ghép thành một chuỗi cổng (gate) trong CI. Mỗi cổng trả PASS/WARN/FAIL; chỉ mức </w:t>
+        <w:t xml:space="preserve">Các kiểm soát này được viết thành mã, chạy lặp lại được — hiện chạy cục bộ, và có thể ghép thành một chuỗi cổng (gate) trong CI. Mỗi cổng trả PASS/WARN/FAIL; chỉ mức </w:t>
       </w:r>
       <w:r>
         <w:rPr>
@@ -2969,7 +3031,7 @@
           <w:i/>
           <w:sz w:val="22"/>
         </w:rPr>
-        <w:t>Bảng 7. Các cổng kiểm soát và lệnh chạy</w:t>
+        <w:t>Bảng 7. Các cổng kiểm soát</w:t>
       </w:r>
     </w:p>
     <w:tbl>
@@ -3291,34 +3353,6 @@
         <w:jc w:val="both"/>
       </w:pPr>
       <w:r>
-        <w:t xml:space="preserve">Lệnh chạy cụ thể cho từng cổng và từng demo được ghi trong </w:t>
-      </w:r>
-      <w:r>
-        <w:rPr>
-          <w:rFonts w:ascii="Consolas" w:hAnsi="Consolas"/>
-          <w:sz w:val="20"/>
-        </w:rPr>
-        <w:t>DEMO.md</w:t>
-      </w:r>
-      <w:r>
-        <w:t xml:space="preserve"> (thư mục gốc) và </w:t>
-      </w:r>
-      <w:r>
-        <w:rPr>
-          <w:rFonts w:ascii="Consolas" w:hAnsi="Consolas"/>
-          <w:sz w:val="20"/>
-        </w:rPr>
-        <w:t>report/HUONG_DAN_DEMO.md</w:t>
-      </w:r>
-      <w:r>
-        <w:t>.</w:t>
-      </w:r>
-    </w:p>
-    <w:p>
-      <w:pPr>
-        <w:jc w:val="both"/>
-      </w:pPr>
-      <w:r>
         <w:t xml:space="preserve">Báo cáo bám theo </w:t>
       </w:r>
       <w:r>
@@ -3360,15 +3394,14 @@
         <w:tblLook w:firstColumn="1" w:firstRow="1" w:lastColumn="0" w:lastRow="0" w:noHBand="0" w:noVBand="1" w:val="04A0"/>
       </w:tblPr>
       <w:tblGrid>
-        <w:gridCol w:w="2409"/>
-        <w:gridCol w:w="2409"/>
-        <w:gridCol w:w="2409"/>
-        <w:gridCol w:w="2409"/>
+        <w:gridCol w:w="3213"/>
+        <w:gridCol w:w="3213"/>
+        <w:gridCol w:w="3213"/>
       </w:tblGrid>
       <w:tr>
         <w:tc>
           <w:tcPr>
-            <w:tcW w:type="dxa" w:w="2409"/>
+            <w:tcW w:type="dxa" w:w="3213"/>
             <w:shd w:val="clear" w:color="auto" w:fill="0B2A4A"/>
           </w:tcPr>
           <w:p>
@@ -3383,7 +3416,7 @@
         </w:tc>
         <w:tc>
           <w:tcPr>
-            <w:tcW w:type="dxa" w:w="2409"/>
+            <w:tcW w:type="dxa" w:w="3213"/>
             <w:shd w:val="clear" w:color="auto" w:fill="0B2A4A"/>
           </w:tcPr>
           <w:p>
@@ -3398,7 +3431,7 @@
         </w:tc>
         <w:tc>
           <w:tcPr>
-            <w:tcW w:type="dxa" w:w="2409"/>
+            <w:tcW w:type="dxa" w:w="3213"/>
             <w:shd w:val="clear" w:color="auto" w:fill="0B2A4A"/>
           </w:tcPr>
           <w:p>
@@ -3407,22 +3440,7 @@
                 <w:b/>
                 <w:color w:val="FFFFFF"/>
               </w:rPr>
-              <w:t>Công cụ nhóm dùng</w:t>
-            </w:r>
-          </w:p>
-        </w:tc>
-        <w:tc>
-          <w:tcPr>
-            <w:tcW w:type="dxa" w:w="2409"/>
-            <w:shd w:val="clear" w:color="auto" w:fill="0B2A4A"/>
-          </w:tcPr>
-          <w:p>
-            <w:r>
-              <w:rPr>
-                <w:b/>
-                <w:color w:val="FFFFFF"/>
-              </w:rPr>
-              <w:t>Minh chứng</w:t>
+              <w:t>Công cụ</w:t>
             </w:r>
           </w:p>
         </w:tc>
@@ -3430,7 +3448,7 @@
       <w:tr>
         <w:tc>
           <w:tcPr>
-            <w:tcW w:type="dxa" w:w="2409"/>
+            <w:tcW w:type="dxa" w:w="3213"/>
           </w:tcPr>
           <w:p>
             <w:r>
@@ -3440,31 +3458,21 @@
         </w:tc>
         <w:tc>
           <w:tcPr>
-            <w:tcW w:type="dxa" w:w="2409"/>
+            <w:tcW w:type="dxa" w:w="3213"/>
           </w:tcPr>
           <w:p>
             <w:r>
-              <w:t>Dựng 2 môi trường trước/sau vá bằng Docker</w:t>
+              <w:t>Dựng hai môi trường trước/sau vá bằng Docker</w:t>
             </w:r>
           </w:p>
         </w:tc>
         <w:tc>
           <w:tcPr>
-            <w:tcW w:type="dxa" w:w="2409"/>
+            <w:tcW w:type="dxa" w:w="3213"/>
           </w:tcPr>
           <w:p>
             <w:r>
               <w:t>Docker Compose, Node</w:t>
-            </w:r>
-          </w:p>
-        </w:tc>
-        <w:tc>
-          <w:tcPr>
-            <w:tcW w:type="dxa" w:w="2409"/>
-          </w:tcPr>
-          <w:p>
-            <w:r>
-              <w:t>Hình 3</w:t>
             </w:r>
           </w:p>
         </w:tc>
@@ -3472,7 +3480,7 @@
       <w:tr>
         <w:tc>
           <w:tcPr>
-            <w:tcW w:type="dxa" w:w="2409"/>
+            <w:tcW w:type="dxa" w:w="3213"/>
           </w:tcPr>
           <w:p>
             <w:r>
@@ -3482,7 +3490,7 @@
         </w:tc>
         <w:tc>
           <w:tcPr>
-            <w:tcW w:type="dxa" w:w="2409"/>
+            <w:tcW w:type="dxa" w:w="3213"/>
           </w:tcPr>
           <w:p>
             <w:r>
@@ -3492,21 +3500,11 @@
         </w:tc>
         <w:tc>
           <w:tcPr>
-            <w:tcW w:type="dxa" w:w="2409"/>
+            <w:tcW w:type="dxa" w:w="3213"/>
           </w:tcPr>
           <w:p>
             <w:r>
               <w:t>Conftest/OPA (Rego)</w:t>
-            </w:r>
-          </w:p>
-        </w:tc>
-        <w:tc>
-          <w:tcPr>
-            <w:tcW w:type="dxa" w:w="2409"/>
-          </w:tcPr>
-          <w:p>
-            <w:r>
-              <w:t>Hình 5; mục 5.3, 5.4</w:t>
             </w:r>
           </w:p>
         </w:tc>
@@ -3514,27 +3512,27 @@
       <w:tr>
         <w:tc>
           <w:tcPr>
-            <w:tcW w:type="dxa" w:w="2409"/>
+            <w:tcW w:type="dxa" w:w="3213"/>
           </w:tcPr>
           <w:p>
             <w:r>
-              <w:t>3. SAST &amp; ánh xạ pháp lý</w:t>
+              <w:t>3. SAST</w:t>
             </w:r>
           </w:p>
         </w:tc>
         <w:tc>
           <w:tcPr>
-            <w:tcW w:type="dxa" w:w="2409"/>
+            <w:tcW w:type="dxa" w:w="3213"/>
           </w:tcPr>
           <w:p>
             <w:r>
-              <w:t>Quét tĩnh tìm lỗi mã; ánh xạ GDPR/PCI</w:t>
+              <w:t>Quét tĩnh tìm điểm yếu trong mã nguồn</w:t>
             </w:r>
           </w:p>
         </w:tc>
         <w:tc>
           <w:tcPr>
-            <w:tcW w:type="dxa" w:w="2409"/>
+            <w:tcW w:type="dxa" w:w="3213"/>
           </w:tcPr>
           <w:p>
             <w:r>
@@ -3545,16 +3543,6 @@
                 <w:i/>
               </w:rPr>
               <w:t>(thay SonarQube)</w:t>
-            </w:r>
-          </w:p>
-        </w:tc>
-        <w:tc>
-          <w:tcPr>
-            <w:tcW w:type="dxa" w:w="2409"/>
-          </w:tcPr>
-          <w:p>
-            <w:r>
-              <w:t>Hình 9; mục 5.1, 5.2, 6</w:t>
             </w:r>
           </w:p>
         </w:tc>
@@ -3562,7 +3550,7 @@
       <w:tr>
         <w:tc>
           <w:tcPr>
-            <w:tcW w:type="dxa" w:w="2409"/>
+            <w:tcW w:type="dxa" w:w="3213"/>
           </w:tcPr>
           <w:p>
             <w:r>
@@ -3572,31 +3560,21 @@
         </w:tc>
         <w:tc>
           <w:tcPr>
-            <w:tcW w:type="dxa" w:w="2409"/>
+            <w:tcW w:type="dxa" w:w="3213"/>
           </w:tcPr>
           <w:p>
             <w:r>
-              <w:t>Viết test đỏ trước vá → xanh sau vá</w:t>
+              <w:t>Viết kiểm thử đỏ trước vá → xanh sau vá</w:t>
             </w:r>
           </w:p>
         </w:tc>
         <w:tc>
           <w:tcPr>
-            <w:tcW w:type="dxa" w:w="2409"/>
+            <w:tcW w:type="dxa" w:w="3213"/>
           </w:tcPr>
           <w:p>
             <w:r>
               <w:t>node:test (Supertest)</w:t>
-            </w:r>
-          </w:p>
-        </w:tc>
-        <w:tc>
-          <w:tcPr>
-            <w:tcW w:type="dxa" w:w="2409"/>
-          </w:tcPr>
-          <w:p>
-            <w:r>
-              <w:t>Hình 10, Hình 13</w:t>
             </w:r>
           </w:p>
         </w:tc>
@@ -3604,7 +3582,7 @@
       <w:tr>
         <w:tc>
           <w:tcPr>
-            <w:tcW w:type="dxa" w:w="2409"/>
+            <w:tcW w:type="dxa" w:w="3213"/>
           </w:tcPr>
           <w:p>
             <w:r>
@@ -3614,7 +3592,7 @@
         </w:tc>
         <w:tc>
           <w:tcPr>
-            <w:tcW w:type="dxa" w:w="2409"/>
+            <w:tcW w:type="dxa" w:w="3213"/>
           </w:tcPr>
           <w:p>
             <w:r>
@@ -3624,21 +3602,11 @@
         </w:tc>
         <w:tc>
           <w:tcPr>
-            <w:tcW w:type="dxa" w:w="2409"/>
+            <w:tcW w:type="dxa" w:w="3213"/>
           </w:tcPr>
           <w:p>
             <w:r>
               <w:t>TypeScript / Express</w:t>
-            </w:r>
-          </w:p>
-        </w:tc>
-        <w:tc>
-          <w:tcPr>
-            <w:tcW w:type="dxa" w:w="2409"/>
-          </w:tcPr>
-          <w:p>
-            <w:r>
-              <w:t>mục 5.1, 5.2</w:t>
             </w:r>
           </w:p>
         </w:tc>
@@ -3646,7 +3614,7 @@
       <w:tr>
         <w:tc>
           <w:tcPr>
-            <w:tcW w:type="dxa" w:w="2409"/>
+            <w:tcW w:type="dxa" w:w="3213"/>
           </w:tcPr>
           <w:p>
             <w:r>
@@ -3656,7 +3624,7 @@
         </w:tc>
         <w:tc>
           <w:tcPr>
-            <w:tcW w:type="dxa" w:w="2409"/>
+            <w:tcW w:type="dxa" w:w="3213"/>
           </w:tcPr>
           <w:p>
             <w:r>
@@ -3666,7 +3634,7 @@
         </w:tc>
         <w:tc>
           <w:tcPr>
-            <w:tcW w:type="dxa" w:w="2409"/>
+            <w:tcW w:type="dxa" w:w="3213"/>
           </w:tcPr>
           <w:p>
             <w:r>
@@ -3687,16 +3655,6 @@
                 <w:i/>
               </w:rPr>
               <w:t>(thay InSpec)</w:t>
-            </w:r>
-          </w:p>
-        </w:tc>
-        <w:tc>
-          <w:tcPr>
-            <w:tcW w:type="dxa" w:w="2409"/>
-          </w:tcPr>
-          <w:p>
-            <w:r>
-              <w:t>Hình 1</w:t>
             </w:r>
           </w:p>
         </w:tc>
@@ -3704,41 +3662,31 @@
       <w:tr>
         <w:tc>
           <w:tcPr>
-            <w:tcW w:type="dxa" w:w="2409"/>
+            <w:tcW w:type="dxa" w:w="3213"/>
           </w:tcPr>
           <w:p>
             <w:r>
-              <w:t>7. Kiểm chứng &amp; nộp</w:t>
+              <w:t>7. Kiểm chứng</w:t>
             </w:r>
           </w:p>
         </w:tc>
         <w:tc>
           <w:tcPr>
-            <w:tcW w:type="dxa" w:w="2409"/>
+            <w:tcW w:type="dxa" w:w="3213"/>
           </w:tcPr>
           <w:p>
             <w:r>
-              <w:t>Chạy lại toàn bộ cổng; quét secret</w:t>
+              <w:t>Chạy lại toàn bộ cổng kiểm soát; quét secret</w:t>
             </w:r>
           </w:p>
         </w:tc>
         <w:tc>
           <w:tcPr>
-            <w:tcW w:type="dxa" w:w="2409"/>
+            <w:tcW w:type="dxa" w:w="3213"/>
           </w:tcPr>
           <w:p>
             <w:r>
-              <w:t>Conftest verify, Gitleaks</w:t>
-            </w:r>
-          </w:p>
-        </w:tc>
-        <w:tc>
-          <w:tcPr>
-            <w:tcW w:type="dxa" w:w="2409"/>
-          </w:tcPr>
-          <w:p>
-            <w:r>
-              <w:t>Hình 5, Hình 4</w:t>
+              <w:t>Conftest, Gitleaks</w:t>
             </w:r>
           </w:p>
         </w:tc>
@@ -4433,269 +4381,6 @@
     </w:p>
     <w:p>
       <w:pPr>
-        <w:jc w:val="both"/>
-      </w:pPr>
-      <w:r>
-        <w:rPr>
-          <w:b/>
-        </w:rPr>
-        <w:t>Đoạn mã dò lỗi trong script demo.</w:t>
-      </w:r>
-      <w:r>
-        <w:t xml:space="preserve"> Mỗi script chạy bằng một lệnh (</w:t>
-      </w:r>
-      <w:r>
-        <w:rPr>
-          <w:rFonts w:ascii="Consolas" w:hAnsi="Consolas"/>
-          <w:sz w:val="20"/>
-        </w:rPr>
-        <w:t>python report/demos/&lt;tên&gt;.py</w:t>
-      </w:r>
-      <w:r>
-        <w:t>); phần dò lỗi cốt lõi như sau.</w:t>
-      </w:r>
-    </w:p>
-    <w:p>
-      <w:pPr>
-        <w:jc w:val="both"/>
-      </w:pPr>
-      <w:r>
-        <w:rPr>
-          <w:b/>
-        </w:rPr>
-        <w:t>F01 — `tv1_f01_sqli.py`:</w:t>
-      </w:r>
-      <w:r>
-        <w:t xml:space="preserve"> gửi payload SQL kèm mật khẩu </w:t>
-      </w:r>
-      <w:r>
-        <w:rPr>
-          <w:i/>
-        </w:rPr>
-        <w:t>sai</w:t>
-      </w:r>
-      <w:r>
-        <w:t>; còn lỗ hổng nếu vẫn được cấp token.</w:t>
-      </w:r>
-    </w:p>
-    <w:tbl>
-      <w:tblPr>
-        <w:tblStyle w:val="TableGrid"/>
-        <w:tblW w:type="auto" w:w="0"/>
-        <w:tblLook w:firstColumn="1" w:firstRow="1" w:lastColumn="0" w:lastRow="0" w:noHBand="0" w:noVBand="1" w:val="04A0"/>
-      </w:tblPr>
-      <w:tblGrid>
-        <w:gridCol w:w="9638"/>
-      </w:tblGrid>
-      <w:tr>
-        <w:tc>
-          <w:tcPr>
-            <w:tcW w:type="dxa" w:w="9638"/>
-            <w:shd w:val="clear" w:color="auto" w:fill="F6F8FA"/>
-          </w:tcPr>
-          <w:p>
-            <w:pPr>
-              <w:spacing w:after="0"/>
-            </w:pPr>
-            <w:r>
-              <w:rPr>
-                <w:rFonts w:ascii="Consolas" w:hAnsi="Consolas"/>
-                <w:sz w:val="17"/>
-              </w:rPr>
-              <w:t>status, body = call(base, 'POST', '/rest/user/login', {'email': "' OR 1=1--", 'password': 'wrong-password'})</w:t>
-            </w:r>
-            <w:r>
-              <w:br/>
-            </w:r>
-            <w:r>
-              <w:rPr>
-                <w:rFonts w:ascii="Consolas" w:hAnsi="Consolas"/>
-                <w:sz w:val="17"/>
-              </w:rPr>
-              <w:t>token = body.get('authentication', {}).get('token')   # có token = vượt xác thực = còn lỗ hổng</w:t>
-            </w:r>
-          </w:p>
-        </w:tc>
-      </w:tr>
-    </w:tbl>
-    <w:p/>
-    <w:p>
-      <w:pPr>
-        <w:jc w:val="both"/>
-      </w:pPr>
-      <w:r>
-        <w:rPr>
-          <w:b/>
-        </w:rPr>
-        <w:t>F02 — `tv2_f02_idor.py`:</w:t>
-      </w:r>
-      <w:r>
-        <w:t xml:space="preserve"> dùng token của A đọc giỏ của B; lộ dữ liệu nếu trả đúng giỏ của B.</w:t>
-      </w:r>
-    </w:p>
-    <w:tbl>
-      <w:tblPr>
-        <w:tblStyle w:val="TableGrid"/>
-        <w:tblW w:type="auto" w:w="0"/>
-        <w:tblLook w:firstColumn="1" w:firstRow="1" w:lastColumn="0" w:lastRow="0" w:noHBand="0" w:noVBand="1" w:val="04A0"/>
-      </w:tblPr>
-      <w:tblGrid>
-        <w:gridCol w:w="9638"/>
-      </w:tblGrid>
-      <w:tr>
-        <w:tc>
-          <w:tcPr>
-            <w:tcW w:type="dxa" w:w="9638"/>
-            <w:shd w:val="clear" w:color="auto" w:fill="F6F8FA"/>
-          </w:tcPr>
-          <w:p>
-            <w:pPr>
-              <w:spacing w:after="0"/>
-            </w:pPr>
-            <w:r>
-              <w:rPr>
-                <w:rFonts w:ascii="Consolas" w:hAnsi="Consolas"/>
-                <w:sz w:val="17"/>
-              </w:rPr>
-              <w:t>s, body = call(base, 'GET', f"/rest/basket/{b['bid']}", token=a['token'])</w:t>
-            </w:r>
-            <w:r>
-              <w:br/>
-            </w:r>
-            <w:r>
-              <w:rPr>
-                <w:rFonts w:ascii="Consolas" w:hAnsi="Consolas"/>
-                <w:sz w:val="17"/>
-              </w:rPr>
-              <w:t>leaked = s == 200 and body['data']['id'] == b['bid']   # đọc được giỏ người khác = IDOR</w:t>
-            </w:r>
-          </w:p>
-        </w:tc>
-      </w:tr>
-    </w:tbl>
-    <w:p/>
-    <w:p>
-      <w:pPr>
-        <w:jc w:val="both"/>
-      </w:pPr>
-      <w:r>
-        <w:rPr>
-          <w:b/>
-        </w:rPr>
-        <w:t>F03 — `tv3_f03_metrics.py`:</w:t>
-      </w:r>
-      <w:r>
-        <w:t xml:space="preserve"> gọi </w:t>
-      </w:r>
-      <w:r>
-        <w:rPr>
-          <w:rFonts w:ascii="Consolas" w:hAnsi="Consolas"/>
-          <w:sz w:val="20"/>
-        </w:rPr>
-        <w:t>/metrics</w:t>
-      </w:r>
-      <w:r>
-        <w:t>; trước vá 200 (lộ), sau vá qua proxy trả 404.</w:t>
-      </w:r>
-    </w:p>
-    <w:tbl>
-      <w:tblPr>
-        <w:tblStyle w:val="TableGrid"/>
-        <w:tblW w:type="auto" w:w="0"/>
-        <w:tblLook w:firstColumn="1" w:firstRow="1" w:lastColumn="0" w:lastRow="0" w:noHBand="0" w:noVBand="1" w:val="04A0"/>
-      </w:tblPr>
-      <w:tblGrid>
-        <w:gridCol w:w="9638"/>
-      </w:tblGrid>
-      <w:tr>
-        <w:tc>
-          <w:tcPr>
-            <w:tcW w:type="dxa" w:w="9638"/>
-            <w:shd w:val="clear" w:color="auto" w:fill="F6F8FA"/>
-          </w:tcPr>
-          <w:p>
-            <w:pPr>
-              <w:spacing w:after="0"/>
-            </w:pPr>
-            <w:r>
-              <w:rPr>
-                <w:rFonts w:ascii="Consolas" w:hAnsi="Consolas"/>
-                <w:sz w:val="17"/>
-              </w:rPr>
-              <w:t>s, body = call(BEFORE[1], 'GET', '/metrics')   # trước vá (3100): 200 + hàng trăm dòng số liệu</w:t>
-            </w:r>
-            <w:r>
-              <w:br/>
-            </w:r>
-            <w:r>
-              <w:rPr>
-                <w:rFonts w:ascii="Consolas" w:hAnsi="Consolas"/>
-                <w:sz w:val="17"/>
-              </w:rPr>
-              <w:t>s, _ = call(AFTER[1], 'GET', '/metrics')        # sau vá, qua proxy (3102): 404</w:t>
-            </w:r>
-          </w:p>
-        </w:tc>
-      </w:tr>
-    </w:tbl>
-    <w:p/>
-    <w:p>
-      <w:pPr>
-        <w:jc w:val="both"/>
-      </w:pPr>
-      <w:r>
-        <w:rPr>
-          <w:b/>
-        </w:rPr>
-        <w:t>F04 — `tv4_f04_policy.py`:</w:t>
-      </w:r>
-      <w:r>
-        <w:t xml:space="preserve"> chạy Conftest trên Dockerfile; thoát khác 0 nghĩa là gate chặn.</w:t>
-      </w:r>
-    </w:p>
-    <w:tbl>
-      <w:tblPr>
-        <w:tblStyle w:val="TableGrid"/>
-        <w:tblW w:type="auto" w:w="0"/>
-        <w:tblLook w:firstColumn="1" w:firstRow="1" w:lastColumn="0" w:lastRow="0" w:noHBand="0" w:noVBand="1" w:val="04A0"/>
-      </w:tblPr>
-      <w:tblGrid>
-        <w:gridCol w:w="9638"/>
-      </w:tblGrid>
-      <w:tr>
-        <w:tc>
-          <w:tcPr>
-            <w:tcW w:type="dxa" w:w="9638"/>
-            <w:shd w:val="clear" w:color="auto" w:fill="F6F8FA"/>
-          </w:tcPr>
-          <w:p>
-            <w:pPr>
-              <w:spacing w:after="0"/>
-            </w:pPr>
-            <w:r>
-              <w:rPr>
-                <w:rFonts w:ascii="Consolas" w:hAnsi="Consolas"/>
-                <w:sz w:val="17"/>
-              </w:rPr>
-              <w:t>p = sh(*CF, 'test', target, '--parser', 'dockerfile', '-p', 'policy', '--namespace', 'dockerfile')</w:t>
-            </w:r>
-            <w:r>
-              <w:br/>
-            </w:r>
-            <w:r>
-              <w:rPr>
-                <w:rFonts w:ascii="Consolas" w:hAnsi="Consolas"/>
-                <w:sz w:val="17"/>
-              </w:rPr>
-              <w:t># p.returncode != 0 -&gt; gate chặn; mỗi dòng FAIL là một luật Rego bị vi phạm</w:t>
-            </w:r>
-          </w:p>
-        </w:tc>
-      </w:tr>
-    </w:tbl>
-    <w:p/>
-    <w:p>
-      <w:pPr>
         <w:pStyle w:val="Heading1"/>
       </w:pPr>
       <w:r>
@@ -6915,95 +6600,6 @@
       </w:pPr>
       <w:r>
         <w:rPr>
-          <w:b/>
-        </w:rPr>
-        <w:t>Nội dung một luật và cách trích chuẩn.</w:t>
-      </w:r>
-      <w:r>
-        <w:t xml:space="preserve"> Mỗi luật là một mệnh đề Rego: phần </w:t>
-      </w:r>
-      <w:r>
-        <w:rPr>
-          <w:i/>
-        </w:rPr>
-        <w:t>thân</w:t>
-      </w:r>
-      <w:r>
-        <w:t xml:space="preserve"> nêu điều kiện vi phạm trên cây cú pháp của Dockerfile/compose (ví dụ "stage cuối không có lệnh USER", "EXPOSE chứa cổng 22", "ENV chứa từ khóa bí mật"), phần </w:t>
-      </w:r>
-      <w:r>
-        <w:rPr>
-          <w:i/>
-        </w:rPr>
-        <w:t>thông điệp</w:t>
-      </w:r>
-      <w:r>
-        <w:t xml:space="preserve"> (</w:t>
-      </w:r>
-      <w:r>
-        <w:rPr>
-          <w:rFonts w:ascii="Consolas" w:hAnsi="Consolas"/>
-          <w:sz w:val="20"/>
-        </w:rPr>
-        <w:t>msg</w:t>
-      </w:r>
-      <w:r>
-        <w:t xml:space="preserve">) là lý do trả về khi vi phạm. </w:t>
-      </w:r>
-      <w:r>
-        <w:rPr>
-          <w:b/>
-        </w:rPr>
-        <w:t>Cách trích dẫn chuẩn</w:t>
-      </w:r>
-      <w:r>
-        <w:t xml:space="preserve"> được nhúng thẳng vào </w:t>
-      </w:r>
-      <w:r>
-        <w:rPr>
-          <w:rFonts w:ascii="Consolas" w:hAnsi="Consolas"/>
-          <w:sz w:val="20"/>
-        </w:rPr>
-        <w:t>msg</w:t>
-      </w:r>
-      <w:r>
-        <w:t xml:space="preserve">: mỗi thông điệp kết thúc bằng danh sách điều khoản áp dụng — ví dụ luật LEAST-PRIVILEGE trả về </w:t>
-      </w:r>
-      <w:r>
-        <w:rPr>
-          <w:i/>
-        </w:rPr>
-        <w:t>"…container runs as root. (CIS Docker 4.1; PCI-DSS 2.2; NĐ 13/2023 Đ.26; Luật ATTTM 2015 Đ.19)"</w:t>
-      </w:r>
-      <w:r>
-        <w:t xml:space="preserve">. Nhờ vậy khi cổng chặn phát hành, người đọc thấy ngay </w:t>
-      </w:r>
-      <w:r>
-        <w:rPr>
-          <w:b/>
-        </w:rPr>
-        <w:t>luật nào bị vi phạm và nó dựa trên điều khoản nào của chuẩn nào</w:t>
-      </w:r>
-      <w:r>
-        <w:t xml:space="preserve"> — đây chính là cách policy "trích" chuẩn thành mã, kiểm chứng lại được bằng </w:t>
-      </w:r>
-      <w:r>
-        <w:rPr>
-          <w:rFonts w:ascii="Consolas" w:hAnsi="Consolas"/>
-          <w:sz w:val="20"/>
-        </w:rPr>
-        <w:t>conftest</w:t>
-      </w:r>
-      <w:r>
-        <w:t>. Mã đầy đủ (kèm trích dẫn) ở Phụ lục A/B.</w:t>
-      </w:r>
-    </w:p>
-    <w:p>
-      <w:pPr>
-        <w:jc w:val="both"/>
-      </w:pPr>
-      <w:r>
-        <w:rPr>
           <w:rFonts w:ascii="Consolas" w:hAnsi="Consolas"/>
           <w:sz w:val="20"/>
         </w:rPr>
@@ -7098,134 +6694,36 @@
         <w:rPr>
           <w:b/>
         </w:rPr>
-        <w:t>Phân định nguồn.</w:t>
-      </w:r>
-      <w:r>
-        <w:t xml:space="preserve"> Bộ luật </w:t>
-      </w:r>
-      <w:r>
-        <w:rPr>
-          <w:rFonts w:ascii="Consolas" w:hAnsi="Consolas"/>
-          <w:sz w:val="20"/>
-        </w:rPr>
-        <w:t>docker_security.rego</w:t>
-      </w:r>
-      <w:r>
-        <w:t xml:space="preserve"> </w:t>
+        <w:t>Chính sách vi phạm:</w:t>
+      </w:r>
+      <w:r>
+        <w:t xml:space="preserve"> GDPR Điều 25(1), 32(1)(d); CIS Docker Benchmark 4.1; Nghị định 13/2023 Điều 26; Luật ATTTM 2015 Điều 19; TCVN 11930:2017. </w:t>
       </w:r>
       <w:r>
         <w:rPr>
           <w:b/>
         </w:rPr>
-        <w:t>kế thừa</w:t>
-      </w:r>
-      <w:r>
-        <w:t xml:space="preserve"> cấu trúc và bốn luật cốt lõi từ Appendix A.1 của tài liệu lab (LEAST-PRIVILEGE theo </w:t>
-      </w:r>
-      <w:r>
-        <w:rPr>
-          <w:rFonts w:ascii="Consolas" w:hAnsi="Consolas"/>
-          <w:sz w:val="20"/>
-        </w:rPr>
-        <w:t>USER</w:t>
-      </w:r>
-      <w:r>
-        <w:t xml:space="preserve"> ở stage cuối, ATTACK-SURFACE theo cổng cấm, nhãn provenance OCI, SUPPLY-CHAIN </w:t>
-      </w:r>
-      <w:r>
-        <w:rPr>
-          <w:rFonts w:ascii="Consolas" w:hAnsi="Consolas"/>
-          <w:sz w:val="20"/>
-        </w:rPr>
-        <w:t>:latest</w:t>
-      </w:r>
-      <w:r>
-        <w:t xml:space="preserve">/digest) cùng cách viết unit test. </w:t>
+        <w:t>Pha DevSecOps:</w:t>
+      </w:r>
+      <w:r>
+        <w:t xml:space="preserve"> Build → Release. </w:t>
       </w:r>
       <w:r>
         <w:rPr>
           <w:b/>
         </w:rPr>
-        <w:t>Phần bổ sung so với tài liệu lab</w:t>
-      </w:r>
-      <w:r>
-        <w:t xml:space="preserve"> gồm: (a) loại bỏ luật HEALTHCHECK/OBSERVABILITY (thiên về vận hành hơn an toàn, và image distroless không chạy được); (b) gộp provenance vào nhóm SUPPLY-CHAIN, nêu rõ đây là provenance </w:t>
-      </w:r>
-      <w:r>
-        <w:rPr>
-          <w:i/>
-        </w:rPr>
-        <w:t>khai báo</w:t>
-      </w:r>
-      <w:r>
-        <w:t xml:space="preserve"> (SLSA L1); (c) bổ sung luật </w:t>
-      </w:r>
-      <w:r>
-        <w:rPr>
-          <w:rFonts w:ascii="Consolas" w:hAnsi="Consolas"/>
-          <w:sz w:val="20"/>
-        </w:rPr>
-        <w:t>SECRET-IN-IMAGE</w:t>
-      </w:r>
-      <w:r>
-        <w:t xml:space="preserve"> chặn secret nhúng trong </w:t>
-      </w:r>
-      <w:r>
-        <w:rPr>
-          <w:rFonts w:ascii="Consolas" w:hAnsi="Consolas"/>
-          <w:sz w:val="20"/>
-        </w:rPr>
-        <w:t>ENV</w:t>
-      </w:r>
-      <w:r>
-        <w:t>/</w:t>
-      </w:r>
-      <w:r>
-        <w:rPr>
-          <w:rFonts w:ascii="Consolas" w:hAnsi="Consolas"/>
-          <w:sz w:val="20"/>
-        </w:rPr>
-        <w:t>ARG</w:t>
-      </w:r>
-      <w:r>
-        <w:t xml:space="preserve"> — luật </w:t>
-      </w:r>
-      <w:r>
-        <w:rPr>
-          <w:b/>
-        </w:rPr>
-        <w:t>không có trong tài liệu lab</w:t>
-      </w:r>
-      <w:r>
-        <w:t xml:space="preserve">, kèm hai unit test. Chính sách </w:t>
-      </w:r>
-      <w:r>
-        <w:rPr>
-          <w:rFonts w:ascii="Consolas" w:hAnsi="Consolas"/>
-          <w:sz w:val="20"/>
-        </w:rPr>
-        <w:t>compose.rego</w:t>
-      </w:r>
-      <w:r>
-        <w:t xml:space="preserve"> (F03) được viết bổ sung cho docker-compose: tài liệu lab chỉ áp dụng trên manifest Kubernetes (k8s.rego), báo cáo chuyển các nguyên tắc least-privilege/firewall/secret sang đúng định dạng triển khai thực tế. Mã nguồn đầy đủ ở </w:t>
-      </w:r>
-      <w:r>
-        <w:rPr>
-          <w:b/>
-        </w:rPr>
-        <w:t>Phụ lục A</w:t>
-      </w:r>
-      <w:r>
-        <w:t xml:space="preserve"> (Dockerfile) và </w:t>
-      </w:r>
-      <w:r>
-        <w:rPr>
-          <w:b/>
-        </w:rPr>
-        <w:t>Phụ lục B</w:t>
-      </w:r>
-      <w:r>
-        <w:t xml:space="preserve"> (compose).</w:t>
+        <w:t>Kiểm soát (Policy as Code):</w:t>
+      </w:r>
+      <w:r>
+        <w:t xml:space="preserve"> bộ luật Rego chạy như một cổng kiểm tra bắt buộc trong pipeline.</w:t>
+      </w:r>
+    </w:p>
+    <w:p>
+      <w:pPr>
+        <w:pStyle w:val="Heading1"/>
+      </w:pPr>
+      <w:r>
+        <w:t>6. Kết luận</w:t>
       </w:r>
     </w:p>
     <w:p>
@@ -7233,31 +6731,7 @@
         <w:jc w:val="both"/>
       </w:pPr>
       <w:r>
-        <w:rPr>
-          <w:b/>
-        </w:rPr>
-        <w:t>Chính sách vi phạm:</w:t>
-      </w:r>
-      <w:r>
-        <w:t xml:space="preserve"> GDPR Điều 25(1), 32(1)(d); CIS Docker Benchmark 4.1; Nghị định 13/2023 Điều 26; Luật ATTTM 2015 Điều 19; TCVN 11930:2017. </w:t>
-      </w:r>
-      <w:r>
-        <w:rPr>
-          <w:b/>
-        </w:rPr>
-        <w:t>Pha DevSecOps:</w:t>
-      </w:r>
-      <w:r>
-        <w:t xml:space="preserve"> Build → Release. </w:t>
-      </w:r>
-      <w:r>
-        <w:rPr>
-          <w:b/>
-        </w:rPr>
-        <w:t>Kiểm soát (Policy as Code):</w:t>
-      </w:r>
-      <w:r>
-        <w:t xml:space="preserve"> bộ luật Rego chạy như một cổng kiểm tra bắt buộc trong pipeline.</w:t>
+        <w:t>Bốn lỗi an toàn (hai lỗi mã nguồn F01/F02, hai lỗi triển khai F03/F04) đều được phát hiện bằng công cụ hoặc kiểm thử, xử lý và kiểm chứng theo mạch trước→sau, kèm đoạn mã demo của từng thành viên. Việc phát hiện và chống tái diễn được thể hiện dưới dạng Policy as Code và Security as Code trong một chuỗi kiểm soát DevSecOps. Các biện pháp này không có sẵn trong Juice Shop gốc (ứng dụng cố ý để lỗ hổng, không có truy vấn tham số, không reverse proxy/giới hạn tốc độ, không chính sách cấu hình container, không cổng kiểm soát trong CI) — đó là phần giá trị mà báo cáo bổ sung.</w:t>
       </w:r>
     </w:p>
     <w:p>
@@ -7265,341 +6739,7 @@
         <w:pStyle w:val="Heading1"/>
       </w:pPr>
       <w:r>
-        <w:t>6. Đối chiếu chính sách bảo vệ dữ liệu</w:t>
-      </w:r>
-    </w:p>
-    <w:p>
-      <w:pPr>
-        <w:jc w:val="both"/>
-      </w:pPr>
-      <w:r>
-        <w:t xml:space="preserve">Nhóm đối chiếu mỗi lỗi với cả khung </w:t>
-      </w:r>
-      <w:r>
-        <w:rPr>
-          <w:b/>
-        </w:rPr>
-        <w:t>quốc tế (GDPR)</w:t>
-      </w:r>
-      <w:r>
-        <w:t xml:space="preserve"> và </w:t>
-      </w:r>
-      <w:r>
-        <w:rPr>
-          <w:b/>
-        </w:rPr>
-        <w:t>pháp luật Việt Nam</w:t>
-      </w:r>
-      <w:r>
-        <w:t xml:space="preserve"> — Nghị định 13/2023/NĐ-CP (bảo vệ dữ liệu cá nhân) và Luật An toàn thông tin mạng 2015. Ý nghĩa cụ thể của từng điều khoản xem </w:t>
-      </w:r>
-      <w:r>
-        <w:rPr>
-          <w:b/>
-        </w:rPr>
-        <w:t>Phụ lục C</w:t>
-      </w:r>
-      <w:r>
-        <w:t>.</w:t>
-      </w:r>
-    </w:p>
-    <w:p>
-      <w:pPr>
-        <w:jc w:val="center"/>
-      </w:pPr>
-      <w:r>
-        <w:rPr>
-          <w:i/>
-          <w:sz w:val="22"/>
-        </w:rPr>
-        <w:t>Bảng 11. Ánh xạ lỗi với chính sách (quốc tế và Việt Nam)</w:t>
-      </w:r>
-    </w:p>
-    <w:tbl>
-      <w:tblPr>
-        <w:tblStyle w:val="TableGrid"/>
-        <w:tblW w:type="auto" w:w="0"/>
-        <w:jc w:val="center"/>
-        <w:tblLook w:firstColumn="1" w:firstRow="1" w:lastColumn="0" w:lastRow="0" w:noHBand="0" w:noVBand="1" w:val="04A0"/>
-      </w:tblPr>
-      <w:tblGrid>
-        <w:gridCol w:w="2409"/>
-        <w:gridCol w:w="2409"/>
-        <w:gridCol w:w="2409"/>
-        <w:gridCol w:w="2409"/>
-      </w:tblGrid>
-      <w:tr>
-        <w:tc>
-          <w:tcPr>
-            <w:tcW w:type="dxa" w:w="2409"/>
-            <w:shd w:val="clear" w:color="auto" w:fill="0B2A4A"/>
-          </w:tcPr>
-          <w:p>
-            <w:r>
-              <w:rPr>
-                <w:b/>
-                <w:color w:val="FFFFFF"/>
-              </w:rPr>
-              <w:t>Lỗi</w:t>
-            </w:r>
-          </w:p>
-        </w:tc>
-        <w:tc>
-          <w:tcPr>
-            <w:tcW w:type="dxa" w:w="2409"/>
-            <w:shd w:val="clear" w:color="auto" w:fill="0B2A4A"/>
-          </w:tcPr>
-          <w:p>
-            <w:r>
-              <w:rPr>
-                <w:b/>
-                <w:color w:val="FFFFFF"/>
-              </w:rPr>
-              <w:t>GDPR</w:t>
-            </w:r>
-          </w:p>
-        </w:tc>
-        <w:tc>
-          <w:tcPr>
-            <w:tcW w:type="dxa" w:w="2409"/>
-            <w:shd w:val="clear" w:color="auto" w:fill="0B2A4A"/>
-          </w:tcPr>
-          <w:p>
-            <w:r>
-              <w:rPr>
-                <w:b/>
-                <w:color w:val="FFFFFF"/>
-              </w:rPr>
-              <w:t>Nghị định 13/2023</w:t>
-            </w:r>
-          </w:p>
-        </w:tc>
-        <w:tc>
-          <w:tcPr>
-            <w:tcW w:type="dxa" w:w="2409"/>
-            <w:shd w:val="clear" w:color="auto" w:fill="0B2A4A"/>
-          </w:tcPr>
-          <w:p>
-            <w:r>
-              <w:rPr>
-                <w:b/>
-                <w:color w:val="FFFFFF"/>
-              </w:rPr>
-              <w:t>Luật ATTTM 2015</w:t>
-            </w:r>
-          </w:p>
-        </w:tc>
-      </w:tr>
-      <w:tr>
-        <w:tc>
-          <w:tcPr>
-            <w:tcW w:type="dxa" w:w="2409"/>
-          </w:tcPr>
-          <w:p>
-            <w:r>
-              <w:t>F01 SQL injection</w:t>
-            </w:r>
-          </w:p>
-        </w:tc>
-        <w:tc>
-          <w:tcPr>
-            <w:tcW w:type="dxa" w:w="2409"/>
-          </w:tcPr>
-          <w:p>
-            <w:r>
-              <w:t>Điều 5(1)(f), 32(1)(b)</w:t>
-            </w:r>
-          </w:p>
-        </w:tc>
-        <w:tc>
-          <w:tcPr>
-            <w:tcW w:type="dxa" w:w="2409"/>
-          </w:tcPr>
-          <w:p>
-            <w:r>
-              <w:t>Điều 26</w:t>
-            </w:r>
-          </w:p>
-        </w:tc>
-        <w:tc>
-          <w:tcPr>
-            <w:tcW w:type="dxa" w:w="2409"/>
-          </w:tcPr>
-          <w:p>
-            <w:r>
-              <w:t>Điều 19</w:t>
-            </w:r>
-          </w:p>
-        </w:tc>
-      </w:tr>
-      <w:tr>
-        <w:tc>
-          <w:tcPr>
-            <w:tcW w:type="dxa" w:w="2409"/>
-          </w:tcPr>
-          <w:p>
-            <w:r>
-              <w:t>F02 IDOR</w:t>
-            </w:r>
-          </w:p>
-        </w:tc>
-        <w:tc>
-          <w:tcPr>
-            <w:tcW w:type="dxa" w:w="2409"/>
-          </w:tcPr>
-          <w:p>
-            <w:r>
-              <w:t>Điều 5(1)(f), 25(2)</w:t>
-            </w:r>
-          </w:p>
-        </w:tc>
-        <w:tc>
-          <w:tcPr>
-            <w:tcW w:type="dxa" w:w="2409"/>
-          </w:tcPr>
-          <w:p>
-            <w:r>
-              <w:t>Điều 3, 26</w:t>
-            </w:r>
-          </w:p>
-        </w:tc>
-        <w:tc>
-          <w:tcPr>
-            <w:tcW w:type="dxa" w:w="2409"/>
-          </w:tcPr>
-          <w:p>
-            <w:r>
-              <w:t>Điều 17, 19</w:t>
-            </w:r>
-          </w:p>
-        </w:tc>
-      </w:tr>
-      <w:tr>
-        <w:tc>
-          <w:tcPr>
-            <w:tcW w:type="dxa" w:w="2409"/>
-          </w:tcPr>
-          <w:p>
-            <w:r>
-              <w:t>F03 /metrics</w:t>
-            </w:r>
-          </w:p>
-        </w:tc>
-        <w:tc>
-          <w:tcPr>
-            <w:tcW w:type="dxa" w:w="2409"/>
-          </w:tcPr>
-          <w:p>
-            <w:r>
-              <w:t>Điều 25(2), 32(1)(b)</w:t>
-            </w:r>
-          </w:p>
-        </w:tc>
-        <w:tc>
-          <w:tcPr>
-            <w:tcW w:type="dxa" w:w="2409"/>
-          </w:tcPr>
-          <w:p>
-            <w:r>
-              <w:t>Điều 26</w:t>
-            </w:r>
-          </w:p>
-        </w:tc>
-        <w:tc>
-          <w:tcPr>
-            <w:tcW w:type="dxa" w:w="2409"/>
-          </w:tcPr>
-          <w:p>
-            <w:r>
-              <w:t>Điều 17, 19</w:t>
-            </w:r>
-          </w:p>
-        </w:tc>
-      </w:tr>
-      <w:tr>
-        <w:tc>
-          <w:tcPr>
-            <w:tcW w:type="dxa" w:w="2409"/>
-          </w:tcPr>
-          <w:p>
-            <w:r>
-              <w:t>F04 cấu hình container</w:t>
-            </w:r>
-          </w:p>
-        </w:tc>
-        <w:tc>
-          <w:tcPr>
-            <w:tcW w:type="dxa" w:w="2409"/>
-          </w:tcPr>
-          <w:p>
-            <w:r>
-              <w:t>Điều 25(1), 32(1)(d)</w:t>
-            </w:r>
-          </w:p>
-        </w:tc>
-        <w:tc>
-          <w:tcPr>
-            <w:tcW w:type="dxa" w:w="2409"/>
-          </w:tcPr>
-          <w:p>
-            <w:r>
-              <w:t>Điều 26</w:t>
-            </w:r>
-          </w:p>
-        </w:tc>
-        <w:tc>
-          <w:tcPr>
-            <w:tcW w:type="dxa" w:w="2409"/>
-          </w:tcPr>
-          <w:p>
-            <w:r>
-              <w:t>Điều 19</w:t>
-            </w:r>
-          </w:p>
-        </w:tc>
-      </w:tr>
-    </w:tbl>
-    <w:p/>
-    <w:p>
-      <w:pPr>
-        <w:jc w:val="both"/>
-      </w:pPr>
-      <w:r>
-        <w:t>Đây là ánh xạ rủi ro kỹ thuật, không phải kết luận pháp lý. Riêng F04, cấu hình triển khai còn đối chiếu TCVN 11930:2017 (yêu cầu an toàn hệ thống thông tin theo cấp độ).</w:t>
-      </w:r>
-    </w:p>
-    <w:p>
-      <w:pPr>
-        <w:pStyle w:val="Heading1"/>
-      </w:pPr>
-      <w:r>
-        <w:t>7. Kết luận</w:t>
-      </w:r>
-    </w:p>
-    <w:p>
-      <w:pPr>
-        <w:jc w:val="both"/>
-      </w:pPr>
-      <w:r>
-        <w:t xml:space="preserve">Bốn lỗi an toàn (hai lỗi mã nguồn F01/F02, hai lỗi triển khai F03/F04) đều được phát hiện bằng công cụ hoặc kiểm thử, xử lý và kiểm chứng theo mạch trước→sau, kèm đoạn mã demo của từng thành viên. Việc phát hiện và chống tái diễn được thể hiện dưới dạng Policy as Code và Security as Code trong một chuỗi kiểm soát DevSecOps. Các biện pháp này không có sẵn trong Juice Shop gốc (ứng dụng cố ý để lỗ hổng, không có truy vấn tham số, không reverse proxy/giới hạn tốc độ, không chính sách cấu hình container, không cổng kiểm soát trong CI) — đó là phần giá trị mà báo cáo bổ sung. Hướng dẫn tái lập nằm trong </w:t>
-      </w:r>
-      <w:r>
-        <w:rPr>
-          <w:rFonts w:ascii="Consolas" w:hAnsi="Consolas"/>
-          <w:sz w:val="20"/>
-        </w:rPr>
-        <w:t>report/HUONG_DAN_DEMO.md</w:t>
-      </w:r>
-      <w:r>
-        <w:t>.</w:t>
-      </w:r>
-    </w:p>
-    <w:p>
-      <w:pPr>
-        <w:pStyle w:val="Heading1"/>
-      </w:pPr>
-      <w:r>
-        <w:t>8. Tài liệu tham khảo</w:t>
+        <w:t>7. Tài liệu tham khảo</w:t>
       </w:r>
     </w:p>
     <w:p>
@@ -9925,7 +9065,7 @@
           <w:i/>
           <w:sz w:val="22"/>
         </w:rPr>
-        <w:t>Bảng 12. Tra cứu — mỗi tiêu chuẩn/điều khoản tham chiếu yêu cầu gì</w:t>
+        <w:t>Bảng 11. Tra cứu — mỗi tiêu chuẩn/điều khoản tham chiếu yêu cầu gì</w:t>
       </w:r>
     </w:p>
     <w:tbl>

</xml_diff>

<commit_message>
docs(report): humanize van xuoi (giong khach quan, bot gach ngang/sao rong) - giu nguyen so lieu/bang/hinh/phu luc
</commit_message>
<xml_diff>
--- a/report/BaoCao_DevSecOps_JuiceShop_gon.docx
+++ b/report/BaoCao_DevSecOps_JuiceShop_gon.docx
@@ -616,7 +616,7 @@
         <w:t>OWASP Juice Shop v20.2.0</w:t>
       </w:r>
       <w:r>
-        <w:t xml:space="preserve"> theo hướng bảo vệ dữ liệu người dùng. Nhóm bốn thành viên, mỗi người phân tích và xử lý một lỗi an toàn: hai lỗi thuộc mã nguồn và hai lỗi thuộc triển khai/vận hành. Mỗi lỗi trình bày theo mạch </w:t>
+        <w:t xml:space="preserve"> dưới góc độ bảo vệ dữ liệu người dùng. Bốn thành viên thực hiện, mỗi người chịu trách nhiệm một lỗi an toàn: hai lỗi nằm ở mã nguồn, hai lỗi ở khâu triển khai và vận hành. Các lỗi đều được trình bày theo mạch </w:t>
       </w:r>
       <w:r>
         <w:rPr>
@@ -625,7 +625,7 @@
         <w:t>trước khi sửa → sau khi sửa</w:t>
       </w:r>
       <w:r>
-        <w:t>, gồm: cách phát hiện, cách xử lý, chính sách bị vi phạm, pha DevSecOps tương ứng và đoạn mã demo.</w:t>
+        <w:t>, lần lượt gồm cách phát hiện, cách xử lý, chính sách bị vi phạm, pha DevSecOps tương ứng và đoạn mã demo.</w:t>
       </w:r>
     </w:p>
     <w:p>
@@ -633,7 +633,7 @@
         <w:jc w:val="both"/>
       </w:pPr>
       <w:r>
-        <w:t xml:space="preserve">Để chứng minh, nhóm chạy cùng một kịch bản trên hai môi trường: </w:t>
+        <w:t xml:space="preserve">Mỗi kịch bản được chạy song song trên hai môi trường để đối chiếu: bản </w:t>
       </w:r>
       <w:r>
         <w:rPr>
@@ -642,7 +642,7 @@
         <w:t>trước khi sửa</w:t>
       </w:r>
       <w:r>
-        <w:t xml:space="preserve"> là một container chạy image gốc (127.0.0.1:3100), </w:t>
+        <w:t xml:space="preserve"> là container chạy image gốc (127.0.0.1:3100), còn bản </w:t>
       </w:r>
       <w:r>
         <w:rPr>
@@ -651,7 +651,7 @@
         <w:t>sau khi sửa</w:t>
       </w:r>
       <w:r>
-        <w:t xml:space="preserve"> là bản triển khai đã xử lý qua reverse proxy (127.0.0.1:3102). Bên trong, cổng 3000 là cổng mặc định của Juice Shop trong container; ứng dụng đã xử lý lắng nghe 3000 nhưng không mở ra máy chủ mà chỉ cho reverse proxy (cổng 3102) truy cập qua mạng nội bộ; cổng 3100 là container đối chứng chạy image gốc để so sánh. Juice Shop là ứng dụng cố ý chứa lỗ hổng để huấn luyện; các phát hiện nhằm minh họa quy trình, không phải đánh giá dự án gốc.</w:t>
+        <w:t xml:space="preserve"> là bản triển khai đã qua reverse proxy (127.0.0.1:3102). Bên trong container, cổng 3000 là cổng mặc định của Juice Shop; bản đã xử lý vẫn lắng nghe cổng này nhưng không phơi ra host, chỉ reverse proxy (cổng 3102) truy cập được qua mạng nội bộ. Cổng 3100 dành cho container đối chứng chạy image gốc để so sánh. Cũng cần nhắc lại rằng Juice Shop cố ý chứa lỗ hổng phục vụ huấn luyện, nên các phát hiện ở đây minh họa quy trình chứ không nhằm đánh giá dự án gốc.</w:t>
       </w:r>
     </w:p>
     <w:p>
@@ -924,7 +924,7 @@
         <w:jc w:val="both"/>
       </w:pPr>
       <w:r>
-        <w:t>Juice Shop là ứng dụng web thương mại điện tử mô phỏng (bán nước ép), do OWASP phát hành để huấn luyện an toàn ứng dụng. Ứng dụng là một Single Page Application với các thành phần sau:</w:t>
+        <w:t>Juice Shop là một ứng dụng web thương mại điện tử mô phỏng (bán nước ép) do OWASP phát hành nhằm huấn luyện an toàn ứng dụng. Về kiến trúc, đây là một Single Page Application gồm các thành phần sau:</w:t>
       </w:r>
     </w:p>
     <w:p>
@@ -1204,7 +1204,7 @@
         <w:jc w:val="both"/>
       </w:pPr>
       <w:r>
-        <w:t xml:space="preserve">Các thành phần này đều liên quan tới bốn lỗi được phân tích: REST API/ORM (F01, F02), endpoint giám sát (F03) và cách đóng gói container (F04). Yêu cầu bảo vệ dữ liệu được xác định theo GDPR (nguyên tắc tại Điều 5, nghĩa vụ an toàn tại Điều 32) và PCI-DSS cho dữ liệu thẻ thanh toán; đồng thời đối chiếu pháp luật Việt Nam — </w:t>
+        <w:t xml:space="preserve">Cả bốn lỗi được phân tích đều gắn với những thành phần này: REST API và ORM (F01, F02), endpoint giám sát (F03) cùng cách đóng gói container (F04). Yêu cầu bảo vệ dữ liệu được xác định theo GDPR (nguyên tắc ở Điều 5, nghĩa vụ an toàn ở Điều 32) và PCI-DSS cho dữ liệu thẻ thanh toán. Song song với khung quốc tế, báo cáo còn đối chiếu pháp luật Việt Nam, gồm </w:t>
       </w:r>
       <w:r>
         <w:rPr>
@@ -1518,7 +1518,7 @@
         <w:t>routes/login.ts</w:t>
       </w:r>
       <w:r>
-        <w:t xml:space="preserve"> truy vấn bảng Users; nếu khớp thì cấp JWT và mã giỏ hàng. Ranh giới tin cậy quan trọng: email do client gửi đi thẳng vào câu lệnh SQL — đây là gốc của lỗi </w:t>
+        <w:t xml:space="preserve"> truy vấn bảng Users, nếu khớp thì cấp JWT kèm mã giỏ hàng. Vấn đề nằm ở ranh giới tin cậy: email do client gửi lên đi thẳng vào câu lệnh SQL, và đó chính là gốc của lỗi </w:t>
       </w:r>
       <w:r>
         <w:rPr>
@@ -1573,7 +1573,7 @@
         <w:t>id</w:t>
       </w:r>
       <w:r>
-        <w:t xml:space="preserve"> trên URL nhưng không kiểm tra giỏ có thuộc người gọi hay không — gốc của lỗi </w:t>
+        <w:t xml:space="preserve"> trên URL nhưng bỏ qua việc kiểm tra giỏ đó có thuộc về người gọi hay không, và đây là gốc của lỗi </w:t>
       </w:r>
       <w:r>
         <w:rPr>
@@ -1582,7 +1582,7 @@
         <w:t>F02</w:t>
       </w:r>
       <w:r>
-        <w:t>. Dữ liệu giỏ hàng phản ánh thói quen mua sắm của người dùng nên cần được bảo vệ theo quyền sở hữu.</w:t>
+        <w:t>. Vì dữ liệu giỏ hàng phản ánh thói quen mua sắm, nó cần được bảo vệ chặt theo quyền sở hữu.</w:t>
       </w:r>
     </w:p>
     <w:p>
@@ -1598,7 +1598,7 @@
         <w:jc w:val="both"/>
       </w:pPr>
       <w:r>
-        <w:t xml:space="preserve">Ứng dụng chạy bằng Docker trên Windows (WSL2), triển khai bằng </w:t>
+        <w:t xml:space="preserve">Ứng dụng chạy bằng Docker trên Windows (WSL2) và được triển khai qua </w:t>
       </w:r>
       <w:r>
         <w:rPr>
@@ -1608,7 +1608,7 @@
         <w:t>docker-compose.yml</w:t>
       </w:r>
       <w:r>
-        <w:t>. Nhóm áp dụng các yêu cầu an toàn tối thiểu theo CIS Docker Benchmark và nguyên tắc giảm bề mặt tấn công.</w:t>
+        <w:t>. Các yêu cầu an toàn tối thiểu ở đây bám theo CIS Docker Benchmark cùng nguyên tắc giảm bề mặt tấn công.</w:t>
       </w:r>
     </w:p>
     <w:p>
@@ -1876,13 +1876,13 @@
         <w:jc w:val="both"/>
       </w:pPr>
       <w:r>
-        <w:t xml:space="preserve">Các kiểm soát trên được </w:t>
+        <w:t xml:space="preserve">Những kiểm soát này được </w:t>
       </w:r>
       <w:r>
         <w:rPr>
           <w:b/>
         </w:rPr>
-        <w:t>xác minh trên container đang chạy</w:t>
+        <w:t>xác minh ngay trên container đang chạy</w:t>
       </w:r>
       <w:r>
         <w:t xml:space="preserve"> bằng </w:t>
@@ -1895,7 +1895,7 @@
         <w:t>docker inspect</w:t>
       </w:r>
       <w:r>
-        <w:t xml:space="preserve"> (Compliance as Code), chứng minh chúng được áp dụng thực tế chứ không chỉ khai trong file cấu hình:</w:t>
+        <w:t xml:space="preserve"> (Compliance as Code), cho thấy chúng thực sự có hiệu lực chứ không chỉ nằm trên file cấu hình:</w:t>
       </w:r>
     </w:p>
     <w:p>
@@ -2006,7 +2006,7 @@
         <w:jc w:val="both"/>
       </w:pPr>
       <w:r>
-        <w:t>Giới hạn còn lại: container đối chứng 3100 chạy image gốc chỉ dùng để so sánh trước/sau; HTTP nội bộ chưa dùng TLS; base image chưa ghim theo digest (luật Rego hiện mới cảnh báo, chưa bắt buộc trên image đối chứng).</w:t>
+        <w:t>Vẫn còn một số giới hạn: container đối chứng 3100 chạy image gốc chỉ phục vụ so sánh trước/sau; HTTP nội bộ chưa bật TLS; base image chưa ghim theo digest (luật Rego hiện mới cảnh báo chứ chưa bắt buộc trên image đối chứng).</w:t>
       </w:r>
     </w:p>
     <w:p>
@@ -2329,7 +2329,7 @@
         <w:t>tìm ra mẫu lỗi</w:t>
       </w:r>
       <w:r>
-        <w:t xml:space="preserve"> trên mã nguồn, </w:t>
+        <w:t xml:space="preserve"> trên mã nguồn và </w:t>
       </w:r>
       <w:r>
         <w:rPr>
@@ -2338,7 +2338,7 @@
         <w:t>không chứng minh được hành vi khi chạy</w:t>
       </w:r>
       <w:r>
-        <w:t xml:space="preserve"> — ví dụ nó không biết một endpoint xoá dữ liệu có thực sự xoá hay chỉ ghi nhận yêu cầu, hay một API có trả về đầy đủ số thẻ hay không. Những điều đó phải do </w:t>
+        <w:t xml:space="preserve">. Chẳng hạn, nó không biết một endpoint xoá dữ liệu có thực sự xoá hay chỉ ghi nhận yêu cầu, cũng không biết một API có trả về đầy đủ số thẻ hay không. Những điều đó phải nhờ </w:t>
       </w:r>
       <w:r>
         <w:rPr>
@@ -2356,7 +2356,7 @@
         <w:t>rà soát của con người</w:t>
       </w:r>
       <w:r>
-        <w:t xml:space="preserve"> khẳng định. Vì vậy báo cáo kết hợp bốn lớp — SAST, kiểm thử động, Policy as Code (build-time) và Compliance as Code (runtime) — thay vì dựa vào một công cụ duy nhất.</w:t>
+        <w:t xml:space="preserve"> khẳng định. Chính vì thế, báo cáo kết hợp bốn lớp gồm SAST, kiểm thử động, Policy as Code (build-time) và Compliance as Code (runtime), thay vì trông cậy vào một công cụ duy nhất.</w:t>
       </w:r>
     </w:p>
     <w:p>
@@ -2372,7 +2372,7 @@
         <w:jc w:val="both"/>
       </w:pPr>
       <w:r>
-        <w:t xml:space="preserve">Các phát hiện được đối chiếu với chính sách/tiêu chuẩn phổ biến, không phải quy ước tự đặt. Nhóm dùng </w:t>
+        <w:t xml:space="preserve">Các phát hiện được đối chiếu với những chính sách và tiêu chuẩn phổ biến chứ không phải quy ước tự đặt ra, sử dụng </w:t>
       </w:r>
       <w:r>
         <w:rPr>
@@ -2381,7 +2381,7 @@
         <w:t>song song</w:t>
       </w:r>
       <w:r>
-        <w:t xml:space="preserve"> khung quốc tế và pháp luật Việt Nam về bảo vệ dữ liệu cá nhân.</w:t>
+        <w:t xml:space="preserve"> khung quốc tế lẫn pháp luật Việt Nam về bảo vệ dữ liệu cá nhân.</w:t>
       </w:r>
     </w:p>
     <w:p>
@@ -2640,7 +2640,7 @@
         <w:t>yêu cầu gì</w:t>
       </w:r>
       <w:r>
-        <w:t xml:space="preserve">) của từng điều khoản tham chiếu trong báo cáo được tóm gọn trong </w:t>
+        <w:t xml:space="preserve">) của mỗi điều khoản tham chiếu được tóm gọn trong </w:t>
       </w:r>
       <w:r>
         <w:rPr>
@@ -2649,7 +2649,7 @@
         <w:t>Phụ lục C</w:t>
       </w:r>
       <w:r>
-        <w:t xml:space="preserve"> (bảng tra). Các bảng và mục trong phần thân chỉ ghi mã điều khoản; tra ý nghĩa ở Phụ lục C.</w:t>
+        <w:t xml:space="preserve"> (bảng tra). Phần thân chỉ ghi mã điều khoản trong các bảng và các mục, còn ý nghĩa thì tra ở Phụ lục C.</w:t>
       </w:r>
     </w:p>
     <w:p>
@@ -2665,7 +2665,7 @@
         <w:jc w:val="both"/>
       </w:pPr>
       <w:r>
-        <w:t>Toàn bộ việc phát hiện và chống tái diễn bốn lỗi được viết thành mã và chạy tự động như một chuỗi kiểm soát (pipeline cục bộ), đúng tinh thần DevSecOps. Hình dưới ánh xạ từng lỗi và cổng kiểm soát vào các pha của vòng đời DevSecOps (xanh dương = Security as Code cho F01/F02; xanh lá = Policy as Code cho F03/F04):</w:t>
+        <w:t>Việc phát hiện và chống tái diễn cả bốn lỗi đều được viết thành mã và chạy tự động dưới dạng một chuỗi kiểm soát (pipeline cục bộ) theo mô hình DevSecOps. Hình dưới ánh xạ từng lỗi và cổng kiểm soát vào các pha trong vòng đời DevSecOps (xanh dương là Security as Code cho F01/F02, xanh lá là Policy as Code cho F03/F04):</w:t>
       </w:r>
     </w:p>
     <w:p>
@@ -2779,7 +2779,7 @@
         <w:t>docker-compose</w:t>
       </w:r>
       <w:r>
-        <w:t xml:space="preserve"> (F03) — chặn cấu hình mở cổng backend hay chạy root </w:t>
+        <w:t xml:space="preserve"> (F03), chặn ngay những cấu hình mở cổng backend hoặc chạy root </w:t>
       </w:r>
       <w:r>
         <w:rPr>
@@ -2821,7 +2821,7 @@
         <w:t>docker inspect</w:t>
       </w:r>
       <w:r>
-        <w:t xml:space="preserve"> + luật Rego runtime (</w:t>
+        <w:t xml:space="preserve"> cùng luật Rego runtime (</w:t>
       </w:r>
       <w:r>
         <w:rPr>
@@ -2841,7 +2841,7 @@
         <w:t>checks/hardening.py</w:t>
       </w:r>
       <w:r>
-        <w:t xml:space="preserve">) — xác nhận non-root, drop capability, chỉ proxy mở cổng loopback. So sánh container đối chứng (trước vá) với bản triển khai (sau vá) chính là cặp ca </w:t>
+        <w:t xml:space="preserve">), xác nhận non-root, drop capability và chỉ proxy mở cổng loopback. Việc đặt container đối chứng (trước vá) cạnh bản triển khai (sau vá) tạo thành đúng cặp ca </w:t>
       </w:r>
       <w:r>
         <w:rPr>
@@ -2850,7 +2850,7 @@
         <w:t>lỗi cố ý / đạt</w:t>
       </w:r>
       <w:r>
-        <w:t xml:space="preserve"> của kiểm tra tuân thủ.</w:t>
+        <w:t xml:space="preserve"> của một bài kiểm tra tuân thủ.</w:t>
       </w:r>
     </w:p>
     <w:p>
@@ -2858,7 +2858,7 @@
         <w:jc w:val="both"/>
       </w:pPr>
       <w:r>
-        <w:t xml:space="preserve">Nhóm kiểm chứng trên </w:t>
+        <w:t xml:space="preserve">Việc kiểm chứng diễn ra trên </w:t>
       </w:r>
       <w:r>
         <w:rPr>
@@ -2895,7 +2895,7 @@
         <w:t>sau vá</w:t>
       </w:r>
       <w:r>
-        <w:t xml:space="preserve"> (reverse proxy + backend ở mạng internal, </w:t>
+        <w:t xml:space="preserve"> (reverse proxy kèm backend ở mạng internal, </w:t>
       </w:r>
       <w:r>
         <w:rPr>
@@ -2905,7 +2905,7 @@
         <w:t>127.0.0.1:3102</w:t>
       </w:r>
       <w:r>
-        <w:t>). Cả hai đang chạy:</w:t>
+        <w:t>). Cả hai đều đang hoạt động:</w:t>
       </w:r>
     </w:p>
     <w:p>
@@ -2971,7 +2971,7 @@
         <w:jc w:val="both"/>
       </w:pPr>
       <w:r>
-        <w:t xml:space="preserve">Các kiểm soát này được viết thành mã, chạy lặp lại được — hiện chạy cục bộ, và có thể ghép thành một chuỗi cổng (gate) trong CI. Mỗi cổng trả PASS/WARN/FAIL; chỉ mức </w:t>
+        <w:t xml:space="preserve">Toàn bộ kiểm soát này được viết thành mã nên chạy lặp lại được; hiện chúng chạy cục bộ nhưng hoàn toàn có thể ghép thành một chuỗi cổng (gate) trong CI. Mỗi cổng trả về PASS, WARN hoặc FAIL. Chỉ mức </w:t>
       </w:r>
       <w:r>
         <w:rPr>
@@ -2989,7 +2989,7 @@
         <w:t>WARN (luật `warn`)</w:t>
       </w:r>
       <w:r>
-        <w:t xml:space="preserve"> chỉ cảnh báo, không chặn. Trong </w:t>
+        <w:t xml:space="preserve"> dừng ở cảnh báo. Cụ thể trong </w:t>
       </w:r>
       <w:r>
         <w:rPr>
@@ -3009,7 +3009,7 @@
         <w:t>cap_drop</w:t>
       </w:r>
       <w:r>
-        <w:t>/</w:t>
+        <w:t xml:space="preserve"> và </w:t>
       </w:r>
       <w:r>
         <w:rPr>
@@ -3019,7 +3019,7 @@
         <w:t>read_only</w:t>
       </w:r>
       <w:r>
-        <w:t xml:space="preserve"> là mức WARN (khuyến cáo), còn các luật mở cổng backend, bind ngoài loopback, privileged, mount docker.sock, secret nội tuyến là mức FAIL (chặn).</w:t>
+        <w:t xml:space="preserve"> xếp mức WARN (khuyến cáo), trong khi các luật về mở cổng backend, bind ngoài loopback, privileged, mount docker.sock và secret nội tuyến đều ở mức FAIL (chặn).</w:t>
       </w:r>
     </w:p>
     <w:p>
@@ -3371,7 +3371,7 @@
         <w:t>Hands-On Lab Guide: Security as Code with OWASP Juice Shop &amp; Docker</w:t>
       </w:r>
       <w:r>
-        <w:t>), có thay một số công cụ bằng công cụ tương đương:</w:t>
+        <w:t>), chỉ thay một vài công cụ bằng lựa chọn tương đương:</w:t>
       </w:r>
     </w:p>
     <w:p>
@@ -3698,7 +3698,7 @@
         <w:jc w:val="both"/>
       </w:pPr>
       <w:r>
-        <w:t>Hai cổng tự động chạy thật (ảnh chụp output thực tế):</w:t>
+        <w:t>Hai cổng tự động dưới đây đã chạy thật, kèm ảnh chụp output thực tế:</w:t>
       </w:r>
     </w:p>
     <w:p>
@@ -3822,7 +3822,7 @@
         <w:jc w:val="both"/>
       </w:pPr>
       <w:r>
-        <w:t xml:space="preserve">Đoạn mã demo của mỗi thành viên không tách rời tài liệu môn học mà </w:t>
+        <w:t xml:space="preserve">Đoạn mã demo của mỗi thành viên không nằm ngoài tài liệu môn học mà </w:t>
       </w:r>
       <w:r>
         <w:rPr>
@@ -3831,7 +3831,7 @@
         <w:t>áp dụng trực tiếp</w:t>
       </w:r>
       <w:r>
-        <w:t xml:space="preserve"> kỹ thuật được dạy trong đó:</w:t>
+        <w:t xml:space="preserve"> kỹ thuật được dạy ở đó:</w:t>
       </w:r>
     </w:p>
     <w:p>
@@ -4089,7 +4089,7 @@
         <w:jc w:val="both"/>
       </w:pPr>
       <w:r>
-        <w:t>Mỗi thành viên lấy một kỹ thuật trong tài liệu môn học và hiện thực hóa thành đoạn mã chạy được để phát hiện hoặc chặn lỗi của mình.</w:t>
+        <w:t>Nói cách khác, mỗi thành viên chọn một kỹ thuật từ tài liệu môn học rồi hiện thực hóa nó thành đoạn mã chạy được để phát hiện hoặc chặn lỗi mình phụ trách.</w:t>
       </w:r>
     </w:p>
     <w:p>
@@ -4105,7 +4105,7 @@
         <w:jc w:val="both"/>
       </w:pPr>
       <w:r>
-        <w:t xml:space="preserve">Các cổng quét tự động chạy trên mã nguồn và cấu hình </w:t>
+        <w:t xml:space="preserve">Các cổng quét tự động được chạy trên mã nguồn và cấu hình </w:t>
       </w:r>
       <w:r>
         <w:rPr>
@@ -4114,7 +4114,7 @@
         <w:t>chưa vá</w:t>
       </w:r>
       <w:r>
-        <w:t>, phát hiện điểm yếu trước khi sửa.</w:t>
+        <w:t xml:space="preserve"> để lộ ra điểm yếu trước khi sửa.</w:t>
       </w:r>
     </w:p>
     <w:p>
@@ -4148,7 +4148,7 @@
         <w:t>lib/</w:t>
       </w:r>
       <w:r>
-        <w:t xml:space="preserve"> cho ra 37 điểm yếu trên 25 tệp (NoSQL injection, XSS, băm yếu, JWT secret cố định…). Báo cáo tập trung ba điểm thuộc phạm vi phân công: F01 (</w:t>
+        <w:t xml:space="preserve"> cho ra 37 điểm yếu trên 25 tệp (NoSQL injection, XSS, băm yếu, JWT secret cố định…). Trong số đó, báo cáo tập trung ba điểm thuộc phạm vi phân công: F01 ở </w:t>
       </w:r>
       <w:r>
         <w:rPr>
@@ -4158,7 +4158,7 @@
         <w:t>login.ts</w:t>
       </w:r>
       <w:r>
-        <w:t xml:space="preserve"> — SQL injection), F02 (</w:t>
+        <w:t xml:space="preserve"> (SQL injection), F02 ở </w:t>
       </w:r>
       <w:r>
         <w:rPr>
@@ -4168,7 +4168,7 @@
         <w:t>basket.ts</w:t>
       </w:r>
       <w:r>
-        <w:t xml:space="preserve"> — truy vấn giỏ hàng không ràng buộc chủ sở hữu) và hạn chế băm mật khẩu bằng MD5 không salt tại </w:t>
+        <w:t xml:space="preserve"> (truy vấn giỏ hàng không ràng buộc chủ sở hữu) và hạn chế băm mật khẩu bằng MD5 không salt tại </w:t>
       </w:r>
       <w:r>
         <w:rPr>
@@ -4318,7 +4318,7 @@
         <w:t>Dockerfile.vulnerable</w:t>
       </w:r>
       <w:r>
-        <w:t xml:space="preserve"> phát hiện 6 vi phạm thuộc 4 nhóm luật; gate chặn phát hành (chi tiết F04 ở mục 5.4):</w:t>
+        <w:t xml:space="preserve"> cho ra 6 vi phạm thuộc 4 nhóm luật, đủ để gate chặn phát hành (chi tiết F04 ở mục 5.4):</w:t>
       </w:r>
     </w:p>
     <w:p>
@@ -4477,7 +4477,7 @@
         <w:t>' OR 1=1--</w:t>
       </w:r>
       <w:r>
-        <w:t>, mệnh đề WHERE luôn đúng và phần kiểm tra mật khẩu bị biến thành chú thích, nên máy chủ cấp token của tài khoản đầu tiên (quản trị) mà không cần mật khẩu. Đây là CWE-89, OWASP A03:2021.</w:t>
+        <w:t>, mệnh đề WHERE luôn đúng còn phần kiểm tra mật khẩu bị đẩy thành chú thích, nên máy chủ cấp token của tài khoản đầu tiên (tài khoản quản trị) mà không cần mật khẩu. Đây chính là CWE-89, OWASP A03:2021.</w:t>
       </w:r>
     </w:p>
     <w:p>
@@ -4501,7 +4501,7 @@
         <w:t>express-sequelize-injection</w:t>
       </w:r>
       <w:r>
-        <w:t xml:space="preserve">) chỉ đúng dòng lỗi; kiểm thử </w:t>
+        <w:t xml:space="preserve">) chỉ đúng dòng lỗi. Kiểm thử </w:t>
       </w:r>
       <w:r>
         <w:rPr>
@@ -4511,7 +4511,7 @@
         <w:t>test/api/security/f01-f02.test.ts</w:t>
       </w:r>
       <w:r>
-        <w:t xml:space="preserve"> gửi payload kèm mật khẩu sai và yêu cầu nhận 401 — trên mã chưa sửa, test đỏ (Hình 10). Demo </w:t>
+        <w:t xml:space="preserve"> gửi payload kèm mật khẩu sai và đòi nhận về 401; trên mã chưa sửa, test báo đỏ (Hình 10). Demo </w:t>
       </w:r>
       <w:r>
         <w:rPr>
@@ -4521,7 +4521,7 @@
         <w:t>demos/tv1_f01_sqli.py</w:t>
       </w:r>
       <w:r>
-        <w:t xml:space="preserve"> xác nhận token được cấp (Hình 11).</w:t>
+        <w:t xml:space="preserve"> xác nhận token vẫn được cấp (Hình 11).</w:t>
       </w:r>
     </w:p>
     <w:p>
@@ -4722,7 +4722,7 @@
         <w:jc w:val="both"/>
       </w:pPr>
       <w:r>
-        <w:t>Câu lệnh được biên dịch trước, giá trị gửi riêng nên ký tự SQL trong email chỉ còn là dữ liệu. Sau khi sửa, kiểm thử bảo mật xanh toàn bộ (Hình 13) và demo cho thấy mọi payload đều bị từ chối 401 trong khi đăng nhập hợp lệ vẫn hoạt động (Hình 11).</w:t>
+        <w:t>Câu lệnh được biên dịch trước và giá trị truyền riêng, nên mọi ký tự SQL trong email giờ chỉ còn được hiểu là dữ liệu. Sau khi sửa, kiểm thử bảo mật xanh toàn bộ (Hình 13); demo cũng cho thấy mọi payload đều bị từ chối 401 trong khi đăng nhập hợp lệ vẫn hoạt động bình thường (Hình 11).</w:t>
       </w:r>
     </w:p>
     <w:p>
@@ -4730,7 +4730,7 @@
         <w:jc w:val="both"/>
       </w:pPr>
       <w:r>
-        <w:t xml:space="preserve">Giới hạn còn lại: bản vá chỉ xử lý injection; cùng dòng code vẫn gọi </w:t>
+        <w:t xml:space="preserve">Bản vá vẫn còn một giới hạn: nó chỉ xử lý injection, trong khi cùng dòng code đó vẫn gọi </w:t>
       </w:r>
       <w:r>
         <w:rPr>
@@ -4740,7 +4740,7 @@
         <w:t>security.hash</w:t>
       </w:r>
       <w:r>
-        <w:t xml:space="preserve"> của Juice Shop — hàm này băm mật khẩu bằng </w:t>
+        <w:t xml:space="preserve"> của Juice Shop, vốn băm mật khẩu bằng </w:t>
       </w:r>
       <w:r>
         <w:rPr>
@@ -4759,7 +4759,7 @@
         <w:t>lib/insecurity.ts</w:t>
       </w:r>
       <w:r>
-        <w:t>, CWE-327 / OWASP A02:2021). Đây là lỗ hổng lưu trữ mật khẩu nằm ngoài phạm vi F01 (vốn chỉ chặn vượt xác thực); khi triển khai thật cần thay bằng bcrypt hoặc argon2 có salt.</w:t>
+        <w:t>, CWE-327 / OWASP A02:2021). Đây là lỗ hổng lưu trữ mật khẩu nằm ngoài phạm vi F01, vì F01 chỉ chặn việc vượt xác thực; khi triển khai thật, cần thay nó bằng bcrypt hoặc argon2 có salt.</w:t>
       </w:r>
     </w:p>
     <w:p>
@@ -4922,7 +4922,7 @@
         <w:jc w:val="both"/>
       </w:pPr>
       <w:r>
-        <w:t xml:space="preserve">Middleware chỉ kiểm tra token hợp lệ, không kiểm tra quyền sở hữu, nên đổi </w:t>
+        <w:t xml:space="preserve">Middleware chỉ xác nhận token hợp lệ chứ không kiểm tra quyền sở hữu, nên chỉ cần đổi </w:t>
       </w:r>
       <w:r>
         <w:rPr>
@@ -4942,7 +4942,7 @@
         <w:t>/rest/basket/9</w:t>
       </w:r>
       <w:r>
-        <w:t xml:space="preserve"> là đọc được giỏ người khác (CWE-639, OWASP A01:2021).</w:t>
+        <w:t xml:space="preserve"> là đọc được giỏ của người khác (CWE-639, OWASP A01:2021).</w:t>
       </w:r>
     </w:p>
     <w:p>
@@ -4956,7 +4956,7 @@
         <w:t>Phát hiện.</w:t>
       </w:r>
       <w:r>
-        <w:t xml:space="preserve"> Kiểm thử hai tài khoản A, B: dùng token của A đọc giỏ của B. Trên mã chưa sửa trả về đúng giỏ của B (Hình 12); các ca tương ứng trong </w:t>
+        <w:t xml:space="preserve"> Kịch bản kiểm thử dựng hai tài khoản A và B, rồi dùng token của A để đọc giỏ của B. Trên mã chưa sửa, máy chủ trả về đúng giỏ của B (Hình 12) và các ca tương ứng trong </w:t>
       </w:r>
       <w:r>
         <w:rPr>
@@ -4966,7 +4966,7 @@
         <w:t>f01-f02.test.ts</w:t>
       </w:r>
       <w:r>
-        <w:t xml:space="preserve"> đỏ.</w:t>
+        <w:t xml:space="preserve"> báo đỏ.</w:t>
       </w:r>
     </w:p>
     <w:p>
@@ -4982,7 +4982,7 @@
         <w:jc w:val="both"/>
       </w:pPr>
       <w:r>
-        <w:t>Ràng buộc chủ sở hữu ngay trong truy vấn, danh tính lấy từ phiên do máy chủ cấp:</w:t>
+        <w:t>Giải pháp là ràng buộc chủ sở hữu ngay trong truy vấn, với danh tính lấy từ phiên do máy chủ cấp:</w:t>
       </w:r>
     </w:p>
     <w:tbl>
@@ -5071,7 +5071,7 @@
         <w:jc w:val="both"/>
       </w:pPr>
       <w:r>
-        <w:t>Sau khi sửa, A đọc giỏ của B nhận 404, giỏ của chính mình vẫn 200 (Hình 12).</w:t>
+        <w:t>Sau khi sửa, A đọc giỏ của B chỉ nhận 404, còn giỏ của chính A vẫn trả 200 (Hình 12).</w:t>
       </w:r>
     </w:p>
     <w:p>
@@ -5243,7 +5243,7 @@
         <w:jc w:val="both"/>
       </w:pPr>
       <w:r>
-        <w:t xml:space="preserve">Juice Shop mở </w:t>
+        <w:t xml:space="preserve">Juice Shop mở sẵn </w:t>
       </w:r>
       <w:r>
         <w:rPr>
@@ -5253,7 +5253,7 @@
         <w:t>/metrics</w:t>
       </w:r>
       <w:r>
-        <w:t xml:space="preserve"> (Prometheus) không cần đăng nhập, lộ số người dùng, số đơn hàng, tổng số dư ví. Khi container publish thẳng cổng ứng dụng, ai cũng gọi được từ host. Đây là lỗi </w:t>
+        <w:t xml:space="preserve"> (Prometheus) mà không yêu cầu đăng nhập, để lộ số người dùng, số đơn hàng và tổng số dư ví. Khi container publish thẳng cổng ứng dụng ra ngoài, bất kỳ ai cũng gọi được endpoint này từ host. Đây là một lỗi thuộc khâu </w:t>
       </w:r>
       <w:r>
         <w:rPr>
@@ -5296,7 +5296,7 @@
         <w:t>/metrics</w:t>
       </w:r>
       <w:r>
-        <w:t xml:space="preserve"> từ host: trước khi sửa trả 200 với hàng trăm dòng số liệu (Hình 14).</w:t>
+        <w:t xml:space="preserve"> từ host; trước khi sửa, endpoint trả về 200 kèm hàng trăm dòng số liệu (Hình 14).</w:t>
       </w:r>
     </w:p>
     <w:p>
@@ -5312,7 +5312,7 @@
         <w:jc w:val="both"/>
       </w:pPr>
       <w:r>
-        <w:t xml:space="preserve">Bỏ cổng host của backend, chỉ cho reverse proxy mở cổng loopback; proxy chặn </w:t>
+        <w:t xml:space="preserve">Hướng xử lý là bỏ cổng host của backend và chỉ để reverse proxy mở cổng loopback; tại proxy, </w:t>
       </w:r>
       <w:r>
         <w:rPr>
@@ -5322,7 +5322,7 @@
         <w:t>/metrics</w:t>
       </w:r>
       <w:r>
-        <w:t xml:space="preserve"> và giới hạn tốc độ đăng nhập:</w:t>
+        <w:t xml:space="preserve"> bị chặn và tốc độ đăng nhập bị giới hạn:</w:t>
       </w:r>
     </w:p>
     <w:tbl>
@@ -5432,7 +5432,7 @@
         <w:jc w:val="both"/>
       </w:pPr>
       <w:r>
-        <w:t xml:space="preserve">Sau khi sửa: </w:t>
+        <w:t xml:space="preserve">Sau khi sửa, </w:t>
       </w:r>
       <w:r>
         <w:rPr>
@@ -5442,7 +5442,7 @@
         <w:t>/metrics</w:t>
       </w:r>
       <w:r>
-        <w:t xml:space="preserve"> qua proxy trả 404 và cổng backend cũ bị từ chối kết nối </w:t>
+        <w:t xml:space="preserve"> đi qua proxy trả về 404 và cổng backend cũ bị từ chối kết nối </w:t>
       </w:r>
       <w:r>
         <w:rPr>
@@ -5451,7 +5451,7 @@
         <w:t>từ host</w:t>
       </w:r>
       <w:r>
-        <w:t xml:space="preserve"> — tức chặn ở lối vào từ bên ngoài, không phải đóng tuyệt đối: trong mạng internal, hệ thống giám sát vẫn đọc được metrics đúng mục đích (Hình 14).</w:t>
+        <w:t>. Đây là chặn ở lối vào từ bên ngoài chứ không phải khóa tuyệt đối: trong mạng internal, hệ thống giám sát vẫn đọc được metrics đúng mục đích (Hình 14).</w:t>
       </w:r>
     </w:p>
     <w:p>
@@ -5575,7 +5575,7 @@
         <w:jc w:val="both"/>
       </w:pPr>
       <w:r>
-        <w:t xml:space="preserve">Image đóng gói Juice Shop có thể vi phạm chính sách an toàn tối thiểu mà vẫn bị bỏ sót nếu kiểm tra sai chỗ. Một </w:t>
+        <w:t xml:space="preserve">Một image đóng gói Juice Shop có thể vi phạm chính sách an toàn tối thiểu mà vẫn lọt qua nếu kiểm tra đặt sai chỗ. </w:t>
       </w:r>
       <w:r>
         <w:rPr>
@@ -5585,7 +5585,7 @@
         <w:t>Dockerfile.vulnerable</w:t>
       </w:r>
       <w:r>
-        <w:t xml:space="preserve"> minh họa bốn vi phạm:</w:t>
+        <w:t xml:space="preserve"> dưới đây minh họa bốn vi phạm như vậy:</w:t>
       </w:r>
     </w:p>
     <w:tbl>
@@ -5664,7 +5664,7 @@
         <w:jc w:val="both"/>
       </w:pPr>
       <w:r>
-        <w:t xml:space="preserve">Những cách kiểm tra sơ sài dễ bị qua mặt: kiểm tra "có lệnh </w:t>
+        <w:t xml:space="preserve">Những cách kiểm tra sơ sài rất dễ bị qua mặt. Kiểm tra kiểu "có lệnh </w:t>
       </w:r>
       <w:r>
         <w:rPr>
@@ -5674,7 +5674,7 @@
         <w:t>USER</w:t>
       </w:r>
       <w:r>
-        <w:t xml:space="preserve">" bỏ sót Dockerfile nhiều stage (lệnh </w:t>
+        <w:t xml:space="preserve">" sẽ bỏ sót Dockerfile nhiều stage, bởi lệnh </w:t>
       </w:r>
       <w:r>
         <w:rPr>
@@ -5684,7 +5684,7 @@
         <w:t>USER</w:t>
       </w:r>
       <w:r>
-        <w:t xml:space="preserve"> ở stage builder không áp dụng cho image chạy thật); kiểm tra "</w:t>
+        <w:t xml:space="preserve"> ở stage builder không áp dụng cho image chạy thật. Kiểm tra "</w:t>
       </w:r>
       <w:r>
         <w:rPr>
@@ -5694,7 +5694,7 @@
         <w:t>EXPOSE</w:t>
       </w:r>
       <w:r>
-        <w:t xml:space="preserve"> không chứa cổng cấm" không có giá trị vì </w:t>
+        <w:t xml:space="preserve"> không chứa cổng cấm" thì gần như vô nghĩa vì </w:t>
       </w:r>
       <w:r>
         <w:rPr>
@@ -5704,7 +5704,7 @@
         <w:t>EXPOSE</w:t>
       </w:r>
       <w:r>
-        <w:t xml:space="preserve"> chỉ mang tính tài liệu; nhãn </w:t>
+        <w:t xml:space="preserve"> chỉ mang tính tài liệu. Còn nhãn </w:t>
       </w:r>
       <w:r>
         <w:rPr>
@@ -5714,7 +5714,7 @@
         <w:t>mfa="true"</w:t>
       </w:r>
       <w:r>
-        <w:t xml:space="preserve"> có thể tự khai mà không phản ánh cấu hình thực tế.</w:t>
+        <w:t xml:space="preserve"> thì ai cũng tự khai được mà chẳng phản ánh cấu hình thực tế.</w:t>
       </w:r>
     </w:p>
     <w:p>
@@ -5728,7 +5728,7 @@
         <w:t>Rủi ro nếu để nguyên, không vá.</w:t>
       </w:r>
       <w:r>
-        <w:t xml:space="preserve"> Mỗi vi phạm dẫn tới một rủi ro an toàn cụ thể:</w:t>
+        <w:t xml:space="preserve"> Mỗi vi phạm kéo theo một rủi ro an toàn cụ thể:</w:t>
       </w:r>
     </w:p>
     <w:p>
@@ -5742,7 +5742,7 @@
         <w:t>Chạy bằng root (LEAST-PRIVILEGE):</w:t>
       </w:r>
       <w:r>
-        <w:t xml:space="preserve"> khi ứng dụng bị chiếm quyền qua một lỗ hổng khác — ví dụ chính F01 — tiến trình độc hại có ngay quyền root </w:t>
+        <w:t xml:space="preserve"> nếu ứng dụng bị chiếm quyền qua một lỗ hổng khác, chẳng hạn chính F01, tiến trình độc hại sẽ có ngay quyền root </w:t>
       </w:r>
       <w:r>
         <w:rPr>
@@ -5751,16 +5751,16 @@
         <w:t>bên trong</w:t>
       </w:r>
       <w:r>
-        <w:t xml:space="preserve"> container, dễ ghi đè file hệ thống, cài công cụ, và nếu kết hợp một lỗ hổng nhân hệ điều hành thì </w:t>
+        <w:t xml:space="preserve"> container. Khi đó kẻ tấn công dễ ghi đè file hệ thống, cài thêm công cụ, và nếu ghép thêm một lỗ hổng nhân hệ điều hành thì có thể </w:t>
       </w:r>
       <w:r>
         <w:rPr>
           <w:b/>
         </w:rPr>
-        <w:t>thoát container, leo thang đặc quyền</w:t>
-      </w:r>
-      <w:r>
-        <w:t xml:space="preserve"> lên máy chủ. Chạy non-root (UID 65532) giới hạn thiệt hại ngay cả khi ứng dụng bị khai thác.</w:t>
+        <w:t>thoát container và leo thang đặc quyền</w:t>
+      </w:r>
+      <w:r>
+        <w:t xml:space="preserve"> lên máy chủ. Chạy non-root (UID 65532) giúp khoanh vùng thiệt hại ngay cả khi ứng dụng bị khai thác.</w:t>
       </w:r>
     </w:p>
     <w:p>
@@ -5774,7 +5774,7 @@
         <w:t>Mở cổng quản trị/CSDL (ATTACK-SURFACE):</w:t>
       </w:r>
       <w:r>
-        <w:t xml:space="preserve"> khai báo EXPOSE 22 (SSH), 3306 (MySQL) báo hiệu các dịch vụ này có thể được bật, </w:t>
+        <w:t xml:space="preserve"> khai báo EXPOSE 22 (SSH) và 3306 (MySQL) cho thấy các dịch vụ này có thể được bật, qua đó </w:t>
       </w:r>
       <w:r>
         <w:rPr>
@@ -5783,7 +5783,7 @@
         <w:t>mở rộng bề mặt tấn công</w:t>
       </w:r>
       <w:r>
-        <w:t xml:space="preserve"> và tạo đường dò quét, đăng nhập vét cạn vào dịch vụ quản trị và cơ sở dữ liệu — nơi chứa dữ liệu người dùng.</w:t>
+        <w:t xml:space="preserve"> và tạo đường cho kẻ xấu dò quét, đăng nhập vét cạn vào dịch vụ quản trị và cơ sở dữ liệu, chính là nơi chứa dữ liệu người dùng.</w:t>
       </w:r>
     </w:p>
     <w:p>
@@ -5797,7 +5797,7 @@
         <w:t>Rủi ro chuỗi cung ứng (SUPPLY-CHAIN):</w:t>
       </w:r>
       <w:r>
-        <w:t xml:space="preserve"> thiếu nhãn nguồn gốc </w:t>
+        <w:t xml:space="preserve"> nếu thiếu nhãn nguồn gốc </w:t>
       </w:r>
       <w:r>
         <w:rPr>
@@ -5817,7 +5817,7 @@
         <w:t>revision</w:t>
       </w:r>
       <w:r>
-        <w:t xml:space="preserve"> thì khi có sự cố </w:t>
+        <w:t xml:space="preserve">, khi có sự cố sẽ </w:t>
       </w:r>
       <w:r>
         <w:rPr>
@@ -5826,7 +5826,7 @@
         <w:t>không truy vết được image bắt nguồn từ commit nào</w:t>
       </w:r>
       <w:r>
-        <w:t xml:space="preserve"> để điều tra, thu hồi (đây là </w:t>
+        <w:t xml:space="preserve"> để điều tra hay thu hồi (đây là </w:t>
       </w:r>
       <w:r>
         <w:rPr>
@@ -5835,7 +5835,7 @@
         <w:t>provenance khai báo</w:t>
       </w:r>
       <w:r>
-        <w:t xml:space="preserve"> theo SLSA L1 — phục vụ truy vết; muốn chắc chắn hơn thì ký </w:t>
+        <w:t xml:space="preserve"> theo SLSA L1, phục vụ truy vết; muốn chắc chắn hơn thì phải ký </w:t>
       </w:r>
       <w:r>
         <w:rPr>
@@ -5844,7 +5844,7 @@
         <w:t>attestation</w:t>
       </w:r>
       <w:r>
-        <w:t xml:space="preserve">). Ngoài ra, dùng </w:t>
+        <w:t xml:space="preserve">). Thêm vào đó, dùng </w:t>
       </w:r>
       <w:r>
         <w:rPr>
@@ -5854,7 +5854,7 @@
         <w:t>:latest</w:t>
       </w:r>
       <w:r>
-        <w:t xml:space="preserve"> hay chưa ghim digest khiến image có thể </w:t>
+        <w:t xml:space="preserve"> hoặc chưa ghim digest khiến image có thể </w:t>
       </w:r>
       <w:r>
         <w:rPr>
@@ -5863,7 +5863,7 @@
         <w:t>bị đổi âm thầm</w:t>
       </w:r>
       <w:r>
-        <w:t xml:space="preserve"> giữa các lần build, bản chạy thật khác bản đã kiểm thử; lệnh </w:t>
+        <w:t xml:space="preserve"> giữa các lần build, làm cho bản chạy thật khác với bản đã kiểm thử, còn lệnh </w:t>
       </w:r>
       <w:r>
         <w:rPr>
@@ -5873,7 +5873,7 @@
         <w:t>ADD</w:t>
       </w:r>
       <w:r>
-        <w:t xml:space="preserve"> có thể kéo nội dung từ xa không kiểm soát. Ghim digest, gắn nhãn nguồn gốc và dùng COPY giúp image </w:t>
+        <w:t xml:space="preserve"> thì có thể kéo nội dung từ xa ngoài kiểm soát. Ghim digest, gắn nhãn nguồn gốc và dùng COPY sẽ giúp image </w:t>
       </w:r>
       <w:r>
         <w:rPr>
@@ -5896,7 +5896,7 @@
         <w:t>Bí mật nhúng trong image (SECRET-IN-IMAGE):</w:t>
       </w:r>
       <w:r>
-        <w:t xml:space="preserve"> đặt mật khẩu/token trong </w:t>
+        <w:t xml:space="preserve"> đặt mật khẩu hay token trong </w:t>
       </w:r>
       <w:r>
         <w:rPr>
@@ -5916,7 +5916,7 @@
         <w:t>ARG</w:t>
       </w:r>
       <w:r>
-        <w:t xml:space="preserve"> làm bí mật </w:t>
+        <w:t xml:space="preserve"> khiến bí mật </w:t>
       </w:r>
       <w:r>
         <w:rPr>
@@ -5925,7 +5925,7 @@
         <w:t>bị bake vào layer của ảnh</w:t>
       </w:r>
       <w:r>
-        <w:t xml:space="preserve"> — bất kỳ ai </w:t>
+        <w:t xml:space="preserve">, và bất kỳ ai </w:t>
       </w:r>
       <w:r>
         <w:rPr>
@@ -5945,7 +5945,7 @@
         <w:t>docker history</w:t>
       </w:r>
       <w:r>
-        <w:t xml:space="preserve"> đều đọc được, kể cả khi dòng đó đã bị xóa ở layer sau. Thay vào đó dùng </w:t>
+        <w:t xml:space="preserve"> đều đọc được, kể cả khi dòng đó đã bị xóa ở layer sau. Cách đúng là dùng </w:t>
       </w:r>
       <w:r>
         <w:rPr>
@@ -5960,7 +5960,7 @@
         <w:rPr>
           <w:b/>
         </w:rPr>
-        <w:t>luật riêng nhóm bổ sung</w:t>
+        <w:t>luật do nhóm bổ sung</w:t>
       </w:r>
       <w:r>
         <w:t>, không có trong bản mẫu của lab.)</w:t>
@@ -6006,7 +6006,7 @@
         <w:t>viết chính sách kiểm tra tự động</w:t>
       </w:r>
       <w:r>
-        <w:t xml:space="preserve"> để chống tái diễn. Cần nói rõ: </w:t>
+        <w:t xml:space="preserve"> để chống tái diễn. Cũng cần nói rõ rằng </w:t>
       </w:r>
       <w:r>
         <w:rPr>
@@ -6015,7 +6015,7 @@
         <w:t>Conftest không tự sửa file</w:t>
       </w:r>
       <w:r>
-        <w:t xml:space="preserve"> — nó chỉ là </w:t>
+        <w:t xml:space="preserve">: nó chỉ đóng vai trò </w:t>
       </w:r>
       <w:r>
         <w:rPr>
@@ -6024,7 +6024,7 @@
         <w:t>cổng kiểm tra</w:t>
       </w:r>
       <w:r>
-        <w:t>, đọc Dockerfile và trả PASS/FAIL kèm lý do; nếu còn vi phạm thì chặn phát hành. Người viết Dockerfile mới là người sửa.</w:t>
+        <w:t>, đọc Dockerfile rồi trả PASS/FAIL kèm lý do, và chặn phát hành nếu còn vi phạm. Người sửa thực sự vẫn là người viết Dockerfile.</w:t>
       </w:r>
     </w:p>
     <w:p>
@@ -6048,7 +6048,7 @@
         <w:t>report/fixtures/Dockerfile.remediated</w:t>
       </w:r>
       <w:r>
-        <w:t>) sửa các điểm tương ứng từng vi phạm:</w:t>
+        <w:t>) khắc phục đúng từng vi phạm tương ứng:</w:t>
       </w:r>
     </w:p>
     <w:tbl>
@@ -6167,7 +6167,7 @@
         <w:jc w:val="both"/>
       </w:pPr>
       <w:r>
-        <w:t xml:space="preserve">Tức: thêm lệnh </w:t>
+        <w:t xml:space="preserve">Cụ thể, bản vá thêm lệnh </w:t>
       </w:r>
       <w:r>
         <w:rPr>
@@ -6177,7 +6177,7 @@
         <w:t>USER</w:t>
       </w:r>
       <w:r>
-        <w:t xml:space="preserve"> chạy non-root, bỏ hai cổng quản trị/CSDL khỏi </w:t>
+        <w:t xml:space="preserve"> để chạy non-root, loại hai cổng quản trị/CSDL khỏi </w:t>
       </w:r>
       <w:r>
         <w:rPr>
@@ -6187,7 +6187,7 @@
         <w:t>EXPOSE</w:t>
       </w:r>
       <w:r>
-        <w:t xml:space="preserve">, thêm nhãn nguồn gốc OCI, và </w:t>
+        <w:t xml:space="preserve">, bổ sung nhãn nguồn gốc OCI và </w:t>
       </w:r>
       <w:r>
         <w:rPr>
@@ -6205,7 +6205,7 @@
         <w:t>build secret</w:t>
       </w:r>
       <w:r>
-        <w:t xml:space="preserve"> hoặc nạp biến môi trường lúc chạy). Khi phát hành thật nên ghim base image theo digest (hiện luật Rego mới cảnh báo, chưa chặn). Image triển khai thực tế của nhóm (</w:t>
+        <w:t xml:space="preserve"> hoặc nạp biến môi trường lúc chạy). Khi phát hành thật, nên ghim base image theo digest, dù hiện luật Rego mới chỉ cảnh báo chứ chưa chặn. Image triển khai thực tế của nhóm (</w:t>
       </w:r>
       <w:r>
         <w:rPr>
@@ -6215,7 +6215,7 @@
         <w:t>deploy/Dockerfile.hotfix</w:t>
       </w:r>
       <w:r>
-        <w:t>) và cả Dockerfile gốc của Juice Shop đều đã thỏa các điều này.</w:t>
+        <w:t>) lẫn Dockerfile gốc của Juice Shop đều đã thỏa những yêu cầu này.</w:t>
       </w:r>
     </w:p>
     <w:p>
@@ -6239,7 +6239,7 @@
         <w:t>juice-shop/policy/docker_security.rego</w:t>
       </w:r>
       <w:r>
-        <w:t xml:space="preserve">), đặt mỗi luật đúng điểm thực thi để không bị qua mặt. Mã nguồn đầy đủ của bộ luật ở </w:t>
+        <w:t xml:space="preserve">), với mỗi luật được đặt đúng điểm thực thi để không bị qua mặt. Mã nguồn đầy đủ của bộ luật nằm ở </w:t>
       </w:r>
       <w:r>
         <w:rPr>
@@ -6256,16 +6256,16 @@
         <w:jc w:val="both"/>
       </w:pPr>
       <w:r>
-        <w:t xml:space="preserve">Cần lưu ý Conftest là </w:t>
+        <w:t xml:space="preserve">Cần lưu ý rằng Conftest là </w:t>
       </w:r>
       <w:r>
         <w:rPr>
           <w:b/>
         </w:rPr>
-        <w:t>bộ máy chính sách tổng quát, không có luật sẵn</w:t>
-      </w:r>
-      <w:r>
-        <w:t xml:space="preserve">: bản thân nó không tự quét ra lỗi nào. Chính </w:t>
+        <w:t>bộ máy chính sách tổng quát và không có luật sẵn</w:t>
+      </w:r>
+      <w:r>
+        <w:t xml:space="preserve">, nên tự nó không quét ra lỗi nào. Chính </w:t>
       </w:r>
       <w:r>
         <w:rPr>
@@ -6283,7 +6283,7 @@
         <w:t>cách phát hiện</w:t>
       </w:r>
       <w:r>
-        <w:t xml:space="preserve"> của F04 — đúng tinh thần Policy as Code: tổ chức tự mã hóa chính sách của mình thành mã, kiểm chứng và chạy lại được trong CI.</w:t>
+        <w:t xml:space="preserve"> của F04. Đây cũng là cách Policy as Code vận hành: tổ chức tự mã hóa chính sách của mình, kiểm chứng và chạy lại được trong CI.</w:t>
       </w:r>
     </w:p>
     <w:p>
@@ -6599,6 +6599,9 @@
         <w:jc w:val="both"/>
       </w:pPr>
       <w:r>
+        <w:t xml:space="preserve">Lệnh </w:t>
+      </w:r>
+      <w:r>
         <w:rPr>
           <w:rFonts w:ascii="Consolas" w:hAnsi="Consolas"/>
           <w:sz w:val="20"/>
@@ -6606,7 +6609,7 @@
         <w:t>conftest verify</w:t>
       </w:r>
       <w:r>
-        <w:t xml:space="preserve"> cho toàn bộ chính sách đạt 17/17 ca kiểm thử (11 ca cho chính sách Dockerfile của F04, 6 ca cho chính sách compose của F03). Kết quả: </w:t>
+        <w:t xml:space="preserve"> chạy toàn bộ chính sách đạt 17/17 ca kiểm thử (11 ca cho chính sách Dockerfile của F04 và 6 ca cho chính sách compose của F03). Kết quả cho thấy </w:t>
       </w:r>
       <w:r>
         <w:rPr>
@@ -6616,7 +6619,7 @@
         <w:t>Dockerfile.vulnerable</w:t>
       </w:r>
       <w:r>
-        <w:t xml:space="preserve"> bị chặn 4 nhóm luật (LEAST-PRIVILEGE, ATTACK-SURFACE, SUPPLY-CHAIN, SECRET-IN-IMAGE), bản vá đạt, và Dockerfile gốc distroless của Juice Shop </w:t>
+        <w:t xml:space="preserve"> bị chặn bởi 4 nhóm luật (LEAST-PRIVILEGE, ATTACK-SURFACE, SUPPLY-CHAIN, SECRET-IN-IMAGE), bản vá thì đạt, và Dockerfile gốc distroless của Juice Shop cũng </w:t>
       </w:r>
       <w:r>
         <w:rPr>
@@ -6731,7 +6734,7 @@
         <w:jc w:val="both"/>
       </w:pPr>
       <w:r>
-        <w:t>Bốn lỗi an toàn (hai lỗi mã nguồn F01/F02, hai lỗi triển khai F03/F04) đều được phát hiện bằng công cụ hoặc kiểm thử, xử lý và kiểm chứng theo mạch trước→sau, kèm đoạn mã demo của từng thành viên. Việc phát hiện và chống tái diễn được thể hiện dưới dạng Policy as Code và Security as Code trong một chuỗi kiểm soát DevSecOps. Các biện pháp này không có sẵn trong Juice Shop gốc (ứng dụng cố ý để lỗ hổng, không có truy vấn tham số, không reverse proxy/giới hạn tốc độ, không chính sách cấu hình container, không cổng kiểm soát trong CI) — đó là phần giá trị mà báo cáo bổ sung.</w:t>
+        <w:t>Cả bốn lỗi an toàn (hai lỗi mã nguồn F01/F02 và hai lỗi triển khai F03/F04) đều được phát hiện bằng công cụ hoặc kiểm thử, rồi xử lý và kiểm chứng theo mạch trước→sau, kèm đoạn mã demo của từng thành viên. Toàn bộ quá trình phát hiện và chống tái diễn được thể hiện dưới dạng Policy as Code và Security as Code trong một chuỗi kiểm soát DevSecOps. Những biện pháp này vốn không có sẵn trong Juice Shop gốc, nơi lỗ hổng được để lại một cách cố ý, không có truy vấn tham số, không reverse proxy hay giới hạn tốc độ, không chính sách cấu hình container và cũng không có cổng kiểm soát nào trong CI. Đó chính là phần giá trị mà báo cáo bổ sung.</w:t>
       </w:r>
     </w:p>
     <w:p>

</xml_diff>

<commit_message>
docs(report): them bang Phuong phap thuc nghiem (baseline/patch commit, seed, phien ban cong cu, tieu chi dat) - R09
</commit_message>
<xml_diff>
--- a/report/BaoCao_DevSecOps_JuiceShop_gon.docx
+++ b/report/BaoCao_DevSecOps_JuiceShop_gon.docx
@@ -1631,6 +1631,14 @@
     </w:p>
     <w:p>
       <w:pPr>
+        <w:jc w:val="both"/>
+      </w:pPr>
+      <w:r>
+        <w:t>Để mỗi kết luận truy được về dữ liệu, thực nghiệm cố định các biến sau và chỉ thay đúng phần cần kiểm chứng (F01/F02 giữ nguyên seed/harness, chỉ thay route; F03 giữ logic ứng dụng, chỉ thay cấu hình truy cập; F04 chạy fixture trước/sau độc lập):</w:t>
+      </w:r>
+    </w:p>
+    <w:p>
+      <w:pPr>
         <w:jc w:val="center"/>
       </w:pPr>
       <w:r>
@@ -1638,7 +1646,295 @@
           <w:i/>
           <w:sz w:val="22"/>
         </w:rPr>
-        <w:t>Bảng 5. Kiểm soát an toàn tối thiểu</w:t>
+        <w:t>Bảng 5. Phương pháp thực nghiệm</w:t>
+      </w:r>
+    </w:p>
+    <w:tbl>
+      <w:tblPr>
+        <w:tblStyle w:val="TableGrid"/>
+        <w:tblW w:type="auto" w:w="0"/>
+        <w:jc w:val="center"/>
+        <w:tblLook w:firstColumn="1" w:firstRow="1" w:lastColumn="0" w:lastRow="0" w:noHBand="0" w:noVBand="1" w:val="04A0"/>
+      </w:tblPr>
+      <w:tblGrid>
+        <w:gridCol w:w="4819"/>
+        <w:gridCol w:w="4819"/>
+      </w:tblGrid>
+      <w:tr>
+        <w:tc>
+          <w:tcPr>
+            <w:tcW w:type="dxa" w:w="4819"/>
+            <w:shd w:val="clear" w:color="auto" w:fill="0B2A4A"/>
+          </w:tcPr>
+          <w:p>
+            <w:r>
+              <w:rPr>
+                <w:b/>
+                <w:color w:val="FFFFFF"/>
+              </w:rPr>
+              <w:t>Hạng mục</w:t>
+            </w:r>
+          </w:p>
+        </w:tc>
+        <w:tc>
+          <w:tcPr>
+            <w:tcW w:type="dxa" w:w="4819"/>
+            <w:shd w:val="clear" w:color="auto" w:fill="0B2A4A"/>
+          </w:tcPr>
+          <w:p>
+            <w:r>
+              <w:rPr>
+                <w:b/>
+                <w:color w:val="FFFFFF"/>
+              </w:rPr>
+              <w:t>Giá trị cố định</w:t>
+            </w:r>
+          </w:p>
+        </w:tc>
+      </w:tr>
+      <w:tr>
+        <w:tc>
+          <w:tcPr>
+            <w:tcW w:type="dxa" w:w="4819"/>
+          </w:tcPr>
+          <w:p>
+            <w:r>
+              <w:t>Mã nguồn trước vá (baseline)</w:t>
+            </w:r>
+          </w:p>
+        </w:tc>
+        <w:tc>
+          <w:tcPr>
+            <w:tcW w:type="dxa" w:w="4819"/>
+          </w:tcPr>
+          <w:p>
+            <w:r>
+              <w:t xml:space="preserve">commit </w:t>
+            </w:r>
+            <w:r>
+              <w:rPr>
+                <w:rFonts w:ascii="Consolas" w:hAnsi="Consolas"/>
+                <w:sz w:val="20"/>
+              </w:rPr>
+              <w:t>21219d66d</w:t>
+            </w:r>
+            <w:r>
+              <w:t xml:space="preserve"> (routes/, lib/ chưa vá) — dùng cho Semgrep và ca kiểm thử đỏ</w:t>
+            </w:r>
+          </w:p>
+        </w:tc>
+      </w:tr>
+      <w:tr>
+        <w:tc>
+          <w:tcPr>
+            <w:tcW w:type="dxa" w:w="4819"/>
+          </w:tcPr>
+          <w:p>
+            <w:r>
+              <w:t>Mã nguồn sau vá</w:t>
+            </w:r>
+          </w:p>
+        </w:tc>
+        <w:tc>
+          <w:tcPr>
+            <w:tcW w:type="dxa" w:w="4819"/>
+          </w:tcPr>
+          <w:p>
+            <w:r>
+              <w:t xml:space="preserve">nhánh </w:t>
+            </w:r>
+            <w:r>
+              <w:rPr>
+                <w:rFonts w:ascii="Consolas" w:hAnsi="Consolas"/>
+                <w:sz w:val="20"/>
+              </w:rPr>
+              <w:t>fix/f01-f04</w:t>
+            </w:r>
+            <w:r>
+              <w:t xml:space="preserve"> (HEAD)</w:t>
+            </w:r>
+          </w:p>
+        </w:tc>
+      </w:tr>
+      <w:tr>
+        <w:tc>
+          <w:tcPr>
+            <w:tcW w:type="dxa" w:w="4819"/>
+          </w:tcPr>
+          <w:p>
+            <w:r>
+              <w:t>Hai môi trường</w:t>
+            </w:r>
+          </w:p>
+        </w:tc>
+        <w:tc>
+          <w:tcPr>
+            <w:tcW w:type="dxa" w:w="4819"/>
+          </w:tcPr>
+          <w:p>
+            <w:r>
+              <w:t xml:space="preserve">đối chứng </w:t>
+            </w:r>
+            <w:r>
+              <w:rPr>
+                <w:rFonts w:ascii="Consolas" w:hAnsi="Consolas"/>
+                <w:sz w:val="20"/>
+              </w:rPr>
+              <w:t>127.0.0.1:3100</w:t>
+            </w:r>
+            <w:r>
+              <w:t xml:space="preserve"> (image gốc) ↔ triển khai </w:t>
+            </w:r>
+            <w:r>
+              <w:rPr>
+                <w:rFonts w:ascii="Consolas" w:hAnsi="Consolas"/>
+                <w:sz w:val="20"/>
+              </w:rPr>
+              <w:t>127.0.0.1:3102</w:t>
+            </w:r>
+            <w:r>
+              <w:t xml:space="preserve"> (proxy + backend mạng internal)</w:t>
+            </w:r>
+          </w:p>
+        </w:tc>
+      </w:tr>
+      <w:tr>
+        <w:tc>
+          <w:tcPr>
+            <w:tcW w:type="dxa" w:w="4819"/>
+          </w:tcPr>
+          <w:p>
+            <w:r>
+              <w:t>Dữ liệu</w:t>
+            </w:r>
+          </w:p>
+        </w:tc>
+        <w:tc>
+          <w:tcPr>
+            <w:tcW w:type="dxa" w:w="4819"/>
+          </w:tcPr>
+          <w:p>
+            <w:r>
+              <w:t>seed mặc định của Juice Shop (dữ liệu giả lập)</w:t>
+            </w:r>
+          </w:p>
+        </w:tc>
+      </w:tr>
+      <w:tr>
+        <w:tc>
+          <w:tcPr>
+            <w:tcW w:type="dxa" w:w="4819"/>
+          </w:tcPr>
+          <w:p>
+            <w:r>
+              <w:t>Công cụ (phiên bản)</w:t>
+            </w:r>
+          </w:p>
+        </w:tc>
+        <w:tc>
+          <w:tcPr>
+            <w:tcW w:type="dxa" w:w="4819"/>
+          </w:tcPr>
+          <w:p>
+            <w:r>
+              <w:t>Semgrep 1.180.0; Gitleaks v8.30.1; Conftest/OPA v0.71.1; node:test + Supertest</w:t>
+            </w:r>
+          </w:p>
+        </w:tc>
+      </w:tr>
+      <w:tr>
+        <w:tc>
+          <w:tcPr>
+            <w:tcW w:type="dxa" w:w="4819"/>
+          </w:tcPr>
+          <w:p>
+            <w:r>
+              <w:t>Tiêu chí đạt</w:t>
+            </w:r>
+          </w:p>
+        </w:tc>
+        <w:tc>
+          <w:tcPr>
+            <w:tcW w:type="dxa" w:w="4819"/>
+          </w:tcPr>
+          <w:p>
+            <w:r>
+              <w:t xml:space="preserve">F01/F02: ca kiểm thử xanh; F03: </w:t>
+            </w:r>
+            <w:r>
+              <w:rPr>
+                <w:rFonts w:ascii="Consolas" w:hAnsi="Consolas"/>
+                <w:sz w:val="20"/>
+              </w:rPr>
+              <w:t>/metrics</w:t>
+            </w:r>
+            <w:r>
+              <w:t xml:space="preserve"> trả 404 từ ngoài; F04: conftest </w:t>
+            </w:r>
+            <w:r>
+              <w:rPr>
+                <w:rFonts w:ascii="Consolas" w:hAnsi="Consolas"/>
+                <w:sz w:val="20"/>
+              </w:rPr>
+              <w:t>exit 0</w:t>
+            </w:r>
+            <w:r>
+              <w:t xml:space="preserve"> với bản tốt, </w:t>
+            </w:r>
+            <w:r>
+              <w:rPr>
+                <w:rFonts w:ascii="Consolas" w:hAnsi="Consolas"/>
+                <w:sz w:val="20"/>
+              </w:rPr>
+              <w:t>exit 1</w:t>
+            </w:r>
+            <w:r>
+              <w:t xml:space="preserve"> với fixture lỗi</w:t>
+            </w:r>
+          </w:p>
+        </w:tc>
+      </w:tr>
+      <w:tr>
+        <w:tc>
+          <w:tcPr>
+            <w:tcW w:type="dxa" w:w="4819"/>
+          </w:tcPr>
+          <w:p>
+            <w:r>
+              <w:t>Bằng chứng</w:t>
+            </w:r>
+          </w:p>
+        </w:tc>
+        <w:tc>
+          <w:tcPr>
+            <w:tcW w:type="dxa" w:w="4819"/>
+          </w:tcPr>
+          <w:p>
+            <w:r>
+              <w:rPr>
+                <w:rFonts w:ascii="Consolas" w:hAnsi="Consolas"/>
+                <w:sz w:val="20"/>
+              </w:rPr>
+              <w:t>report/evidence/*.log</w:t>
+            </w:r>
+            <w:r>
+              <w:t xml:space="preserve"> (kèm exit code), kiểm thử, demo (tổng hợp ở mục 4.2)</w:t>
+            </w:r>
+          </w:p>
+        </w:tc>
+      </w:tr>
+    </w:tbl>
+    <w:p/>
+    <w:p>
+      <w:pPr>
+        <w:jc w:val="center"/>
+      </w:pPr>
+      <w:r>
+        <w:rPr>
+          <w:i/>
+          <w:sz w:val="22"/>
+        </w:rPr>
+        <w:t>Bảng 6. Kiểm soát an toàn tối thiểu</w:t>
       </w:r>
     </w:p>
     <w:tbl>
@@ -2044,7 +2340,7 @@
           <w:i/>
           <w:sz w:val="22"/>
         </w:rPr>
-        <w:t>Bảng 6. Công cụ và vai trò</w:t>
+        <w:t>Bảng 7. Công cụ và vai trò</w:t>
       </w:r>
     </w:p>
     <w:tbl>
@@ -3229,7 +3525,7 @@
           <w:i/>
           <w:sz w:val="22"/>
         </w:rPr>
-        <w:t>Bảng 7. Các cổng kiểm soát và vai trò đã kiểm chứng</w:t>
+        <w:t>Bảng 8. Các cổng kiểm soát và vai trò đã kiểm chứng</w:t>
       </w:r>
     </w:p>
     <w:tbl>
@@ -3616,7 +3912,7 @@
           <w:i/>
           <w:sz w:val="22"/>
         </w:rPr>
-        <w:t>Bảng 8. Bảy pha của tài liệu lab và cách báo cáo phủ</w:t>
+        <w:t>Bảng 9. Bảy pha của tài liệu lab và cách báo cáo phủ</w:t>
       </w:r>
     </w:p>
     <w:tbl>
@@ -4176,7 +4472,7 @@
           <w:i/>
           <w:sz w:val="22"/>
         </w:rPr>
-        <w:t>Bảng 9. Liên hệ đoạn mã demo với tài liệu môn học</w:t>
+        <w:t>Bảng 10. Liên hệ đoạn mã demo với tài liệu môn học</w:t>
       </w:r>
     </w:p>
     <w:tbl>
@@ -4919,7 +5215,7 @@
           <w:i/>
           <w:sz w:val="22"/>
         </w:rPr>
-        <w:t>Bảng 10. Kết quả hợp nhất bốn tình huống (điều kiện → kỳ vọng → trước/sau vá → bằng chứng → rủi ro còn lại)</w:t>
+        <w:t>Bảng 11. Kết quả hợp nhất bốn tình huống (điều kiện → kỳ vọng → trước/sau vá → bằng chứng → rủi ro còn lại)</w:t>
       </w:r>
     </w:p>
     <w:tbl>
@@ -7634,7 +7930,7 @@
           <w:i/>
           <w:sz w:val="22"/>
         </w:rPr>
-        <w:t>Bảng 11. Luật kiểm tra cấu hình container — luật yêu cầu gì và dựa trên chuẩn nào</w:t>
+        <w:t>Bảng 12. Luật kiểm tra cấu hình container — luật yêu cầu gì và dựa trên chuẩn nào</w:t>
       </w:r>
     </w:p>
     <w:tbl>
@@ -10581,7 +10877,7 @@
           <w:i/>
           <w:sz w:val="22"/>
         </w:rPr>
-        <w:t>Bảng 12. Tra cứu — mỗi tiêu chuẩn/điều khoản tham chiếu yêu cầu gì</w:t>
+        <w:t>Bảng 13. Tra cứu — mỗi tiêu chuẩn/điều khoản tham chiếu yêu cầu gì</w:t>
       </w:r>
     </w:p>
     <w:tbl>

</xml_diff>

<commit_message>
docs(report): chuyen sang van phong bao cao chuyen nghiep, sua cach trinh bay F02
- F02: bo cach "gan vao Semgrep"; neu ro cach tim ra la ra soat ma nguon
  (findOne khong rang buoc chu so huu) + kiem thu dong cheo A/B. Anh
  semgrep chi highlight F01 va MD5 (dung pham vi SAST); basket.ts chi la
  mot canh bao NoSQLi trong danh sach rong, khong con gan nhan F02.
- Bo khung "bai tap": khong con "bay pha cua tai lieu lab", bo bang "lien
  he demo voi tai lieu mon hoc", bo moi reference "slide DevSecOps";
  trinh bay quy trinh DevSecOps nhu phuong phap ap dung.
- Lam ro thuat ngu: "seed mac dinh" -> "bo du lieu mau Juice Shop tu nap
  khi khoi dong"; "baseline commit" -> "phien ban ma truoc khi va tai
  commit 21219d66d"; "filesystem chi doc noi duoc" -> "he thong tep goc
  che do chi doc o cac service ho tro".
- Tai lieu tham khao + phu luc: bo ten file .docx, dung "phuong phap luan
  tham khao".
</commit_message>
<xml_diff>
--- a/report/BaoCao_DevSecOps_JuiceShop_gon.docx
+++ b/report/BaoCao_DevSecOps_JuiceShop_gon.docx
@@ -1699,7 +1699,7 @@
           </w:tcPr>
           <w:p>
             <w:r>
-              <w:t>Mã nguồn trước vá (baseline)</w:t>
+              <w:t>Phiên bản mã trước khi vá</w:t>
             </w:r>
           </w:p>
         </w:tc>
@@ -1709,7 +1709,7 @@
           </w:tcPr>
           <w:p>
             <w:r>
-              <w:t xml:space="preserve">commit </w:t>
+              <w:t xml:space="preserve">Bản mã Juice Shop gốc tại commit </w:t>
             </w:r>
             <w:r>
               <w:rPr>
@@ -1719,7 +1719,27 @@
               <w:t>21219d66d</w:t>
             </w:r>
             <w:r>
-              <w:t xml:space="preserve"> (routes/, lib/ chưa vá) — dùng cho Semgrep và ca kiểm thử đỏ</w:t>
+              <w:t xml:space="preserve"> (thư mục </w:t>
+            </w:r>
+            <w:r>
+              <w:rPr>
+                <w:rFonts w:ascii="Consolas" w:hAnsi="Consolas"/>
+                <w:sz w:val="20"/>
+              </w:rPr>
+              <w:t>routes/</w:t>
+            </w:r>
+            <w:r>
+              <w:t xml:space="preserve">, </w:t>
+            </w:r>
+            <w:r>
+              <w:rPr>
+                <w:rFonts w:ascii="Consolas" w:hAnsi="Consolas"/>
+                <w:sz w:val="20"/>
+              </w:rPr>
+              <w:t>lib/</w:t>
+            </w:r>
+            <w:r>
+              <w:t xml:space="preserve"> chưa chỉnh) — dùng để quét Semgrep và chạy ca kiểm thử đỏ</w:t>
             </w:r>
           </w:p>
         </w:tc>
@@ -1731,7 +1751,7 @@
           </w:tcPr>
           <w:p>
             <w:r>
-              <w:t>Mã nguồn sau vá</w:t>
+              <w:t>Phiên bản mã sau khi vá</w:t>
             </w:r>
           </w:p>
         </w:tc>
@@ -1741,7 +1761,7 @@
           </w:tcPr>
           <w:p>
             <w:r>
-              <w:t xml:space="preserve">nhánh </w:t>
+              <w:t xml:space="preserve">Nhánh </w:t>
             </w:r>
             <w:r>
               <w:rPr>
@@ -1751,7 +1771,7 @@
               <w:t>fix/f01-f04</w:t>
             </w:r>
             <w:r>
-              <w:t xml:space="preserve"> (HEAD)</w:t>
+              <w:t xml:space="preserve"> (bản vá của nhóm)</w:t>
             </w:r>
           </w:p>
         </w:tc>
@@ -1773,7 +1793,7 @@
           </w:tcPr>
           <w:p>
             <w:r>
-              <w:t xml:space="preserve">đối chứng </w:t>
+              <w:t xml:space="preserve">Đối chứng </w:t>
             </w:r>
             <w:r>
               <w:rPr>
@@ -1805,7 +1825,7 @@
           </w:tcPr>
           <w:p>
             <w:r>
-              <w:t>Dữ liệu</w:t>
+              <w:t>Dữ liệu thử nghiệm</w:t>
             </w:r>
           </w:p>
         </w:tc>
@@ -1815,7 +1835,7 @@
           </w:tcPr>
           <w:p>
             <w:r>
-              <w:t>seed mặc định của Juice Shop (dữ liệu giả lập)</w:t>
+              <w:t>Bộ dữ liệu mẫu Juice Shop tự nạp khi khởi động (người dùng, giỏ hàng, sản phẩm giả lập)</w:t>
             </w:r>
           </w:p>
         </w:tc>
@@ -2094,7 +2114,7 @@
               <w:t>no-new-privileges</w:t>
             </w:r>
             <w:r>
-              <w:t>, filesystem chỉ đọc nơi được</w:t>
+              <w:t>; hệ thống tệp gốc đặt chế độ chỉ đọc ở các service hỗ trợ</w:t>
             </w:r>
           </w:p>
         </w:tc>
@@ -2493,16 +2513,7 @@
           </w:tcPr>
           <w:p>
             <w:r>
-              <w:t xml:space="preserve">Đọc mã nguồn (không chạy), chỉ đúng dòng F01; với F02 chỉ đưa </w:t>
-            </w:r>
-            <w:r>
-              <w:rPr>
-                <w:i/>
-              </w:rPr>
-              <w:t>cảnh báo NoSQLi</w:t>
-            </w:r>
-            <w:r>
-              <w:t xml:space="preserve"> làm gợi ý vị trí, IDOR xác nhận riêng bằng kiểm thử (xem 5.2)</w:t>
+              <w:t>Đọc mã nguồn (không chạy) để chỉ ra các mẫu lỗi; trong phạm vi báo cáo, xác định chính xác dòng SQL injection của F01</w:t>
             </w:r>
           </w:p>
         </w:tc>
@@ -2752,7 +2763,7 @@
         <w:t>đối chiếu lịch sử</w:t>
       </w:r>
       <w:r>
-        <w:t xml:space="preserve"> bám theo tài liệu môn học (bản hiện hành là v4.0.1, các số điều có thay đổi, ví dụ 3.4 → 3.5.1).</w:t>
+        <w:t xml:space="preserve"> (bản hiện hành là v4.0.1, các số điều có thay đổi, ví dụ 3.4 → 3.5.1).</w:t>
       </w:r>
     </w:p>
     <w:p>
@@ -3882,25 +3893,7 @@
         <w:jc w:val="both"/>
       </w:pPr>
       <w:r>
-        <w:t xml:space="preserve">Báo cáo bám theo </w:t>
-      </w:r>
-      <w:r>
-        <w:rPr>
-          <w:b/>
-        </w:rPr>
-        <w:t>bảy pha của tài liệu lab</w:t>
-      </w:r>
-      <w:r>
-        <w:t xml:space="preserve"> (</w:t>
-      </w:r>
-      <w:r>
-        <w:rPr>
-          <w:i/>
-        </w:rPr>
-        <w:t>Hands-On Lab Guide: Security as Code with OWASP Juice Shop &amp; Docker</w:t>
-      </w:r>
-      <w:r>
-        <w:t>), chỉ thay một vài công cụ bằng lựa chọn tương đương:</w:t>
+        <w:t>Quy trình được tổ chức thành bảy bước nối tiếp theo vòng đời DevSecOps, mỗi bước gắn với một nhóm công cụ kiểm soát cụ thể:</w:t>
       </w:r>
     </w:p>
     <w:p>
@@ -3912,7 +3905,7 @@
           <w:i/>
           <w:sz w:val="22"/>
         </w:rPr>
-        <w:t>Bảng 9. Bảy pha của tài liệu lab và cách báo cáo phủ</w:t>
+        <w:t>Bảng 9. Bảy bước của quy trình DevSecOps áp dụng</w:t>
       </w:r>
     </w:p>
     <w:tbl>
@@ -3939,7 +3932,7 @@
                 <w:b/>
                 <w:color w:val="FFFFFF"/>
               </w:rPr>
-              <w:t>Pha (tên theo tài liệu lab)</w:t>
+              <w:t>Bước</w:t>
             </w:r>
           </w:p>
         </w:tc>
@@ -3954,7 +3947,7 @@
                 <w:b/>
                 <w:color w:val="FFFFFF"/>
               </w:rPr>
-              <w:t>Hoạt động trong báo cáo</w:t>
+              <w:t>Hoạt động</w:t>
             </w:r>
           </w:p>
         </w:tc>
@@ -3981,7 +3974,7 @@
           </w:tcPr>
           <w:p>
             <w:r>
-              <w:t>1. Environment setup</w:t>
+              <w:t>1. Thiết lập môi trường</w:t>
             </w:r>
           </w:p>
         </w:tc>
@@ -4013,7 +4006,7 @@
           </w:tcPr>
           <w:p>
             <w:r>
-              <w:t>2. Policy as Code with Conftest</w:t>
+              <w:t>2. Policy as Code</w:t>
             </w:r>
           </w:p>
         </w:tc>
@@ -4023,7 +4016,7 @@
           </w:tcPr>
           <w:p>
             <w:r>
-              <w:t>Kiểm chính sách Dockerfile &amp; compose trước khi triển khai</w:t>
+              <w:t>Kiểm chính sách Dockerfile và compose trước khi triển khai</w:t>
             </w:r>
           </w:p>
         </w:tc>
@@ -4045,7 +4038,7 @@
           </w:tcPr>
           <w:p>
             <w:r>
-              <w:t>3. Vulnerability discovery &amp; regulatory mapping</w:t>
+              <w:t>3. Phát hiện điểm yếu và đối chiếu quy định</w:t>
             </w:r>
           </w:p>
         </w:tc>
@@ -4055,7 +4048,7 @@
           </w:tcPr>
           <w:p>
             <w:r>
-              <w:t>Quét tĩnh tìm điểm yếu, đối chiếu điều khoản</w:t>
+              <w:t>Quét tĩnh mã nguồn, ánh xạ sang điều khoản</w:t>
             </w:r>
           </w:p>
         </w:tc>
@@ -4065,13 +4058,7 @@
           </w:tcPr>
           <w:p>
             <w:r>
-              <w:t xml:space="preserve">Semgrep </w:t>
-            </w:r>
-            <w:r>
-              <w:rPr>
-                <w:i/>
-              </w:rPr>
-              <w:t>(thay SonarQube — xem ghi chú)</w:t>
+              <w:t>Semgrep</w:t>
             </w:r>
           </w:p>
         </w:tc>
@@ -4093,7 +4080,7 @@
           </w:tcPr>
           <w:p>
             <w:r>
-              <w:t>Viết kiểm thử đỏ trước vá → xanh sau vá</w:t>
+              <w:t>Viết kiểm thử đỏ trước vá, xanh sau vá</w:t>
             </w:r>
           </w:p>
         </w:tc>
@@ -4115,7 +4102,7 @@
           </w:tcPr>
           <w:p>
             <w:r>
-              <w:t>5. Application patching</w:t>
+              <w:t>5. Vá ứng dụng</w:t>
             </w:r>
           </w:p>
         </w:tc>
@@ -4147,7 +4134,7 @@
           </w:tcPr>
           <w:p>
             <w:r>
-              <w:t>6. Compliance as Code (Chef InSpec)</w:t>
+              <w:t>6. Compliance as Code</w:t>
             </w:r>
           </w:p>
         </w:tc>
@@ -4157,7 +4144,7 @@
           </w:tcPr>
           <w:p>
             <w:r>
-              <w:t>Soi container đang chạy (runtime)</w:t>
+              <w:t>Soi container đang chạy ở thời điểm runtime</w:t>
             </w:r>
           </w:p>
         </w:tc>
@@ -4175,15 +4162,6 @@
                 <w:sz w:val="20"/>
               </w:rPr>
               <w:t>docker inspect</w:t>
-            </w:r>
-            <w:r>
-              <w:t xml:space="preserve"> </w:t>
-            </w:r>
-            <w:r>
-              <w:rPr>
-                <w:i/>
-              </w:rPr>
-              <w:t>(thay InSpec)</w:t>
             </w:r>
           </w:p>
         </w:tc>
@@ -4195,7 +4173,7 @@
           </w:tcPr>
           <w:p>
             <w:r>
-              <w:t>7. Verification &amp; deliverables</w:t>
+              <w:t>7. Kiểm chứng và bàn giao</w:t>
             </w:r>
           </w:p>
         </w:tc>
@@ -4222,33 +4200,6 @@
       </w:tr>
     </w:tbl>
     <w:p/>
-    <w:p>
-      <w:pPr>
-        <w:jc w:val="both"/>
-      </w:pPr>
-      <w:r>
-        <w:t xml:space="preserve">Tài liệu lab Pha 3 dùng SonarQube làm SAST chính (kèm npm audit, Semgrep tùy chọn); báo cáo thay bằng Semgrep do phiên bản SonarQube của lab đã ngừng, nhưng vẫn giữ nguyên mục tiêu của pha là </w:t>
-      </w:r>
-      <w:r>
-        <w:rPr>
-          <w:i/>
-        </w:rPr>
-        <w:t>phát hiện điểm yếu và ánh xạ điều khoản</w:t>
-      </w:r>
-      <w:r>
-        <w:t xml:space="preserve">. Pha 6 dùng Chef InSpec; báo cáo thay bằng Conftest + </w:t>
-      </w:r>
-      <w:r>
-        <w:rPr>
-          <w:rFonts w:ascii="Consolas" w:hAnsi="Consolas"/>
-          <w:sz w:val="20"/>
-        </w:rPr>
-        <w:t>docker inspect</w:t>
-      </w:r>
-      <w:r>
-        <w:t xml:space="preserve"> cho cùng mục đích kiểm tra container đang chạy.</w:t>
-      </w:r>
-    </w:p>
     <w:p>
       <w:pPr>
         <w:jc w:val="both"/>
@@ -4451,16 +4402,171 @@
         <w:jc w:val="both"/>
       </w:pPr>
       <w:r>
-        <w:t xml:space="preserve">Đoạn mã demo của mỗi thành viên không nằm ngoài tài liệu môn học mà </w:t>
-      </w:r>
+        <w:t>Mỗi lỗi đi kèm một script demo (</w:t>
+      </w:r>
+      <w:r>
+        <w:rPr>
+          <w:rFonts w:ascii="Consolas" w:hAnsi="Consolas"/>
+          <w:sz w:val="20"/>
+        </w:rPr>
+        <w:t>demos/tv1</w:t>
+      </w:r>
+      <w:r>
+        <w:t>…</w:t>
+      </w:r>
+      <w:r>
+        <w:rPr>
+          <w:rFonts w:ascii="Consolas" w:hAnsi="Consolas"/>
+          <w:sz w:val="20"/>
+        </w:rPr>
+        <w:t>tv4</w:t>
+      </w:r>
+      <w:r>
+        <w:t>) tái hiện lỗi trước khi vá và kiểm chứng sau khi vá; các script này được trình bày trong từng mục tương ứng ở phần 5.</w:t>
+      </w:r>
+    </w:p>
+    <w:p>
+      <w:pPr>
+        <w:pStyle w:val="Heading2"/>
+      </w:pPr>
+      <w:r>
+        <w:t>4.1. Quét và phát hiện lỗi — kết quả thực tế</w:t>
+      </w:r>
+    </w:p>
+    <w:p>
+      <w:pPr>
+        <w:jc w:val="both"/>
+      </w:pPr>
+      <w:r>
+        <w:t xml:space="preserve">Các cổng quét tự động được chạy trên mã nguồn và cấu hình </w:t>
+      </w:r>
+      <w:r>
+        <w:rPr>
+          <w:i/>
+        </w:rPr>
+        <w:t>chưa vá</w:t>
+      </w:r>
+      <w:r>
+        <w:t xml:space="preserve"> để lộ ra điểm yếu trước khi sửa.</w:t>
+      </w:r>
+    </w:p>
+    <w:p>
+      <w:pPr>
+        <w:jc w:val="both"/>
+      </w:pPr>
       <w:r>
         <w:rPr>
           <w:b/>
         </w:rPr>
-        <w:t>áp dụng trực tiếp</w:t>
-      </w:r>
-      <w:r>
-        <w:t xml:space="preserve"> kỹ thuật được dạy ở đó:</w:t>
+        <w:t>SAST (Semgrep).</w:t>
+      </w:r>
+      <w:r>
+        <w:t xml:space="preserve"> Quét toàn bộ </w:t>
+      </w:r>
+      <w:r>
+        <w:rPr>
+          <w:rFonts w:ascii="Consolas" w:hAnsi="Consolas"/>
+          <w:sz w:val="20"/>
+        </w:rPr>
+        <w:t>routes/</w:t>
+      </w:r>
+      <w:r>
+        <w:t xml:space="preserve"> và </w:t>
+      </w:r>
+      <w:r>
+        <w:rPr>
+          <w:rFonts w:ascii="Consolas" w:hAnsi="Consolas"/>
+          <w:sz w:val="20"/>
+        </w:rPr>
+        <w:t>lib/</w:t>
+      </w:r>
+      <w:r>
+        <w:t xml:space="preserve"> (mã </w:t>
+      </w:r>
+      <w:r>
+        <w:rPr>
+          <w:i/>
+        </w:rPr>
+        <w:t>chưa vá</w:t>
+      </w:r>
+      <w:r>
+        <w:t xml:space="preserve">) cho ra </w:t>
+      </w:r>
+      <w:r>
+        <w:rPr>
+          <w:b/>
+        </w:rPr>
+        <w:t>38 cảnh báo</w:t>
+      </w:r>
+      <w:r>
+        <w:t xml:space="preserve"> trên 25 tệp (SQL/NoSQL injection, XSS, băm yếu, JWT secret cố định…). Đây là </w:t>
+      </w:r>
+      <w:r>
+        <w:rPr>
+          <w:b/>
+        </w:rPr>
+        <w:t>cảnh báo công cụ, chưa phải 38 lỗ hổng đã xác nhận</w:t>
+      </w:r>
+      <w:r>
+        <w:t xml:space="preserve">; mỗi cảnh báo là một điểm cần rà soát thêm. Ở tầng mã nguồn, phân tích tĩnh chỉ ra chính xác hai điểm thuộc phạm vi: </w:t>
+      </w:r>
+      <w:r>
+        <w:rPr>
+          <w:b/>
+        </w:rPr>
+        <w:t>F01</w:t>
+      </w:r>
+      <w:r>
+        <w:t xml:space="preserve"> tại </w:t>
+      </w:r>
+      <w:r>
+        <w:rPr>
+          <w:rFonts w:ascii="Consolas" w:hAnsi="Consolas"/>
+          <w:sz w:val="20"/>
+        </w:rPr>
+        <w:t>login.ts</w:t>
+      </w:r>
+      <w:r>
+        <w:t xml:space="preserve"> (rule </w:t>
+      </w:r>
+      <w:r>
+        <w:rPr>
+          <w:rFonts w:ascii="Consolas" w:hAnsi="Consolas"/>
+          <w:sz w:val="20"/>
+        </w:rPr>
+        <w:t>express-sequelize-injection</w:t>
+      </w:r>
+      <w:r>
+        <w:t xml:space="preserve">, trỏ đúng dòng ghép chuỗi SQL) và </w:t>
+      </w:r>
+      <w:r>
+        <w:rPr>
+          <w:b/>
+        </w:rPr>
+        <w:t>băm mật khẩu MD5 không salt</w:t>
+      </w:r>
+      <w:r>
+        <w:t xml:space="preserve"> tại </w:t>
+      </w:r>
+      <w:r>
+        <w:rPr>
+          <w:rFonts w:ascii="Consolas" w:hAnsi="Consolas"/>
+          <w:sz w:val="20"/>
+        </w:rPr>
+        <w:t>lib/insecurity.ts</w:t>
+      </w:r>
+      <w:r>
+        <w:t xml:space="preserve"> (rule </w:t>
+      </w:r>
+      <w:r>
+        <w:rPr>
+          <w:rFonts w:ascii="Consolas" w:hAnsi="Consolas"/>
+          <w:sz w:val="20"/>
+        </w:rPr>
+        <w:t>node_md5</w:t>
+      </w:r>
+      <w:r>
+        <w:t>, CWE-327 — rủi ro lưu trữ còn lại). Lỗi F02 thuộc loại kiểm soát truy cập, không phải loại mà SAST phát hiện được; cách tìm ra F02 trình bày ở mục 5.2.</w:t>
       </w:r>
     </w:p>
     <w:p>
@@ -4468,430 +4574,9 @@
         <w:jc w:val="center"/>
       </w:pPr>
       <w:r>
-        <w:rPr>
-          <w:i/>
-          <w:sz w:val="22"/>
-        </w:rPr>
-        <w:t>Bảng 10. Liên hệ đoạn mã demo với tài liệu môn học</w:t>
-      </w:r>
-    </w:p>
-    <w:tbl>
-      <w:tblPr>
-        <w:tblStyle w:val="TableGrid"/>
-        <w:tblW w:type="auto" w:w="0"/>
-        <w:jc w:val="center"/>
-        <w:tblLook w:firstColumn="1" w:firstRow="1" w:lastColumn="0" w:lastRow="0" w:noHBand="0" w:noVBand="1" w:val="04A0"/>
-      </w:tblPr>
-      <w:tblGrid>
-        <w:gridCol w:w="3213"/>
-        <w:gridCol w:w="3213"/>
-        <w:gridCol w:w="3213"/>
-      </w:tblGrid>
-      <w:tr>
-        <w:tc>
-          <w:tcPr>
-            <w:tcW w:type="dxa" w:w="3213"/>
-            <w:shd w:val="clear" w:color="auto" w:fill="0B2A4A"/>
-          </w:tcPr>
-          <w:p>
-            <w:r>
-              <w:rPr>
-                <w:b/>
-                <w:color w:val="FFFFFF"/>
-              </w:rPr>
-              <w:t>Thành viên</w:t>
-            </w:r>
-          </w:p>
-        </w:tc>
-        <w:tc>
-          <w:tcPr>
-            <w:tcW w:type="dxa" w:w="3213"/>
-            <w:shd w:val="clear" w:color="auto" w:fill="0B2A4A"/>
-          </w:tcPr>
-          <w:p>
-            <w:r>
-              <w:rPr>
-                <w:b/>
-                <w:color w:val="FFFFFF"/>
-              </w:rPr>
-              <w:t>Đoạn mã demo</w:t>
-            </w:r>
-          </w:p>
-        </w:tc>
-        <w:tc>
-          <w:tcPr>
-            <w:tcW w:type="dxa" w:w="3213"/>
-            <w:shd w:val="clear" w:color="auto" w:fill="0B2A4A"/>
-          </w:tcPr>
-          <w:p>
-            <w:r>
-              <w:rPr>
-                <w:b/>
-                <w:color w:val="FFFFFF"/>
-              </w:rPr>
-              <w:t>Kỹ thuật &amp; tài liệu môn học áp dụng</w:t>
-            </w:r>
-          </w:p>
-        </w:tc>
-      </w:tr>
-      <w:tr>
-        <w:tc>
-          <w:tcPr>
-            <w:tcW w:type="dxa" w:w="3213"/>
-          </w:tcPr>
-          <w:p>
-            <w:r>
-              <w:t>Nguyễn Toàn Thắng (F01)</w:t>
-            </w:r>
-          </w:p>
-        </w:tc>
-        <w:tc>
-          <w:tcPr>
-            <w:tcW w:type="dxa" w:w="3213"/>
-          </w:tcPr>
-          <w:p>
-            <w:r>
-              <w:rPr>
-                <w:rFonts w:ascii="Consolas" w:hAnsi="Consolas"/>
-                <w:sz w:val="20"/>
-              </w:rPr>
-              <w:t>demos/tv1_f01_sqli.py</w:t>
-            </w:r>
-            <w:r>
-              <w:t xml:space="preserve">, kiểm thử </w:t>
-            </w:r>
-            <w:r>
-              <w:rPr>
-                <w:rFonts w:ascii="Consolas" w:hAnsi="Consolas"/>
-                <w:sz w:val="20"/>
-              </w:rPr>
-              <w:t>f01-f02.test.ts</w:t>
-            </w:r>
-          </w:p>
-        </w:tc>
-        <w:tc>
-          <w:tcPr>
-            <w:tcW w:type="dxa" w:w="3213"/>
-          </w:tcPr>
-          <w:p>
-            <w:r>
-              <w:t>Shift-left, SAST, Test-Driven Security — slide kiến trúc DevSecOps</w:t>
-            </w:r>
-          </w:p>
-        </w:tc>
-      </w:tr>
-      <w:tr>
-        <w:tc>
-          <w:tcPr>
-            <w:tcW w:type="dxa" w:w="3213"/>
-          </w:tcPr>
-          <w:p>
-            <w:r>
-              <w:t>Phạm Thị Minh Thúy (F02)</w:t>
-            </w:r>
-          </w:p>
-        </w:tc>
-        <w:tc>
-          <w:tcPr>
-            <w:tcW w:type="dxa" w:w="3213"/>
-          </w:tcPr>
-          <w:p>
-            <w:r>
-              <w:rPr>
-                <w:rFonts w:ascii="Consolas" w:hAnsi="Consolas"/>
-                <w:sz w:val="20"/>
-              </w:rPr>
-              <w:t>demos/tv2_f02_idor.py</w:t>
-            </w:r>
-            <w:r>
-              <w:t>, kiểm thử phân quyền</w:t>
-            </w:r>
-          </w:p>
-        </w:tc>
-        <w:tc>
-          <w:tcPr>
-            <w:tcW w:type="dxa" w:w="3213"/>
-          </w:tcPr>
-          <w:p>
-            <w:r>
-              <w:t>Security as Code, kiểm thử trong CI — slide DevSecOps</w:t>
-            </w:r>
-          </w:p>
-        </w:tc>
-      </w:tr>
-      <w:tr>
-        <w:tc>
-          <w:tcPr>
-            <w:tcW w:type="dxa" w:w="3213"/>
-          </w:tcPr>
-          <w:p>
-            <w:r>
-              <w:t>Đỗ Đức Quốc Anh (F03)</w:t>
-            </w:r>
-          </w:p>
-        </w:tc>
-        <w:tc>
-          <w:tcPr>
-            <w:tcW w:type="dxa" w:w="3213"/>
-          </w:tcPr>
-          <w:p>
-            <w:r>
-              <w:rPr>
-                <w:rFonts w:ascii="Consolas" w:hAnsi="Consolas"/>
-                <w:sz w:val="20"/>
-              </w:rPr>
-              <w:t>demos/tv3_f03_metrics.py</w:t>
-            </w:r>
-            <w:r>
-              <w:t xml:space="preserve">, </w:t>
-            </w:r>
-            <w:r>
-              <w:rPr>
-                <w:rFonts w:ascii="Consolas" w:hAnsi="Consolas"/>
-                <w:sz w:val="20"/>
-              </w:rPr>
-              <w:t>nginx.conf</w:t>
-            </w:r>
-          </w:p>
-        </w:tc>
-        <w:tc>
-          <w:tcPr>
-            <w:tcW w:type="dxa" w:w="3213"/>
-          </w:tcPr>
-          <w:p>
-            <w:r>
-              <w:t>OpSec giảm phơi nhiễm endpoint, reverse proxy &amp; giới hạn tốc độ — slide OpSec/DevSecOps</w:t>
-            </w:r>
-          </w:p>
-        </w:tc>
-      </w:tr>
-      <w:tr>
-        <w:tc>
-          <w:tcPr>
-            <w:tcW w:type="dxa" w:w="3213"/>
-          </w:tcPr>
-          <w:p>
-            <w:r>
-              <w:t>Hồ Anh Vũ (F04)</w:t>
-            </w:r>
-          </w:p>
-        </w:tc>
-        <w:tc>
-          <w:tcPr>
-            <w:tcW w:type="dxa" w:w="3213"/>
-          </w:tcPr>
-          <w:p>
-            <w:r>
-              <w:rPr>
-                <w:rFonts w:ascii="Consolas" w:hAnsi="Consolas"/>
-                <w:sz w:val="20"/>
-              </w:rPr>
-              <w:t>demos/tv4_f04_policy.py</w:t>
-            </w:r>
-            <w:r>
-              <w:t xml:space="preserve">, </w:t>
-            </w:r>
-            <w:r>
-              <w:rPr>
-                <w:rFonts w:ascii="Consolas" w:hAnsi="Consolas"/>
-                <w:sz w:val="20"/>
-              </w:rPr>
-              <w:t>docker_security.rego</w:t>
-            </w:r>
-          </w:p>
-        </w:tc>
-        <w:tc>
-          <w:tcPr>
-            <w:tcW w:type="dxa" w:w="3213"/>
-          </w:tcPr>
-          <w:p>
-            <w:r>
-              <w:t>Policy as Code với Conftest — hướng dẫn Policy as Code (Conftest)</w:t>
-            </w:r>
-          </w:p>
-        </w:tc>
-      </w:tr>
-    </w:tbl>
-    <w:p/>
-    <w:p>
-      <w:pPr>
-        <w:jc w:val="both"/>
-      </w:pPr>
-      <w:r>
-        <w:t>Nói cách khác, mỗi thành viên chọn một kỹ thuật từ tài liệu môn học rồi hiện thực hóa nó thành đoạn mã chạy được để phát hiện hoặc chặn lỗi mình phụ trách.</w:t>
-      </w:r>
-    </w:p>
-    <w:p>
-      <w:pPr>
-        <w:pStyle w:val="Heading2"/>
-      </w:pPr>
-      <w:r>
-        <w:t>4.1. Quét và phát hiện lỗi — kết quả thực tế</w:t>
-      </w:r>
-    </w:p>
-    <w:p>
-      <w:pPr>
-        <w:jc w:val="both"/>
-      </w:pPr>
-      <w:r>
-        <w:t xml:space="preserve">Các cổng quét tự động được chạy trên mã nguồn và cấu hình </w:t>
-      </w:r>
-      <w:r>
-        <w:rPr>
-          <w:i/>
-        </w:rPr>
-        <w:t>chưa vá</w:t>
-      </w:r>
-      <w:r>
-        <w:t xml:space="preserve"> để lộ ra điểm yếu trước khi sửa.</w:t>
-      </w:r>
-    </w:p>
-    <w:p>
-      <w:pPr>
-        <w:jc w:val="both"/>
-      </w:pPr>
-      <w:r>
-        <w:rPr>
-          <w:b/>
-        </w:rPr>
-        <w:t>SAST (Semgrep).</w:t>
-      </w:r>
-      <w:r>
-        <w:t xml:space="preserve"> Quét toàn bộ </w:t>
-      </w:r>
-      <w:r>
-        <w:rPr>
-          <w:rFonts w:ascii="Consolas" w:hAnsi="Consolas"/>
-          <w:sz w:val="20"/>
-        </w:rPr>
-        <w:t>routes/</w:t>
-      </w:r>
-      <w:r>
-        <w:t xml:space="preserve"> và </w:t>
-      </w:r>
-      <w:r>
-        <w:rPr>
-          <w:rFonts w:ascii="Consolas" w:hAnsi="Consolas"/>
-          <w:sz w:val="20"/>
-        </w:rPr>
-        <w:t>lib/</w:t>
-      </w:r>
-      <w:r>
-        <w:t xml:space="preserve"> (mã </w:t>
-      </w:r>
-      <w:r>
-        <w:rPr>
-          <w:i/>
-        </w:rPr>
-        <w:t>chưa vá</w:t>
-      </w:r>
-      <w:r>
-        <w:t xml:space="preserve">) cho ra </w:t>
-      </w:r>
-      <w:r>
-        <w:rPr>
-          <w:b/>
-        </w:rPr>
-        <w:t>38 cảnh báo</w:t>
-      </w:r>
-      <w:r>
-        <w:t xml:space="preserve"> trên 25 tệp (NoSQL injection, XSS, băm yếu, JWT secret cố định…). Cần nhấn mạnh: đây là </w:t>
-      </w:r>
-      <w:r>
-        <w:rPr>
-          <w:b/>
-        </w:rPr>
-        <w:t>cảnh báo công cụ, chưa phải 38 lỗ hổng đã xác nhận</w:t>
-      </w:r>
-      <w:r>
-        <w:t xml:space="preserve"> — mỗi cảnh báo là một </w:t>
-      </w:r>
-      <w:r>
-        <w:rPr>
-          <w:i/>
-        </w:rPr>
-        <w:t>gợi ý vị trí cần rà</w:t>
-      </w:r>
-      <w:r>
-        <w:t xml:space="preserve">. Trong số đó, báo cáo tập trung ba điểm thuộc phạm vi phân công: F01 ở </w:t>
-      </w:r>
-      <w:r>
-        <w:rPr>
-          <w:rFonts w:ascii="Consolas" w:hAnsi="Consolas"/>
-          <w:sz w:val="20"/>
-        </w:rPr>
-        <w:t>login.ts</w:t>
-      </w:r>
-      <w:r>
-        <w:t xml:space="preserve"> (rule </w:t>
-      </w:r>
-      <w:r>
-        <w:rPr>
-          <w:rFonts w:ascii="Consolas" w:hAnsi="Consolas"/>
-          <w:sz w:val="20"/>
-        </w:rPr>
-        <w:t>express-sequelize-injection</w:t>
-      </w:r>
-      <w:r>
-        <w:t xml:space="preserve"> — chỉ đúng dòng SQL injection, đã xác nhận); một cảnh báo NoSQLi tại </w:t>
-      </w:r>
-      <w:r>
-        <w:rPr>
-          <w:rFonts w:ascii="Consolas" w:hAnsi="Consolas"/>
-          <w:sz w:val="20"/>
-        </w:rPr>
-        <w:t>basket.ts</w:t>
-      </w:r>
-      <w:r>
-        <w:t xml:space="preserve"> (rule </w:t>
-      </w:r>
-      <w:r>
-        <w:rPr>
-          <w:rFonts w:ascii="Consolas" w:hAnsi="Consolas"/>
-          <w:sz w:val="20"/>
-        </w:rPr>
-        <w:t>node_nosqli_injection</w:t>
-      </w:r>
-      <w:r>
-        <w:t xml:space="preserve">, CWE-943) được dùng làm </w:t>
-      </w:r>
-      <w:r>
-        <w:rPr>
-          <w:i/>
-        </w:rPr>
-        <w:t>gợi ý</w:t>
-      </w:r>
-      <w:r>
-        <w:t xml:space="preserve"> để rà F02 — </w:t>
-      </w:r>
-      <w:r>
-        <w:rPr>
-          <w:b/>
-        </w:rPr>
-        <w:t>bản thân rule này không phát hiện IDOR</w:t>
-      </w:r>
-      <w:r>
-        <w:t xml:space="preserve">, F02 được xác nhận độc lập bằng kiểm thử A/B (mục 5.2); và băm mật khẩu bằng MD5 không salt tại </w:t>
-      </w:r>
-      <w:r>
-        <w:rPr>
-          <w:rFonts w:ascii="Consolas" w:hAnsi="Consolas"/>
-          <w:sz w:val="20"/>
-        </w:rPr>
-        <w:t>lib/insecurity.ts</w:t>
-      </w:r>
-      <w:r>
-        <w:t xml:space="preserve"> (rủi ro lưu trữ còn lại, ngoài phạm vi F01).</w:t>
-      </w:r>
-    </w:p>
-    <w:p>
-      <w:pPr>
-        <w:jc w:val="center"/>
-      </w:pPr>
-      <w:r>
         <w:drawing>
           <wp:inline xmlns:a="http://schemas.openxmlformats.org/drawingml/2006/main" xmlns:pic="http://schemas.openxmlformats.org/drawingml/2006/picture">
-            <wp:extent cx="5760000" cy="2946162"/>
+            <wp:extent cx="5760000" cy="3035676"/>
             <wp:docPr id="6" name="Picture 6"/>
             <wp:cNvGraphicFramePr>
               <a:graphicFrameLocks noChangeAspect="1"/>
@@ -4912,7 +4597,7 @@
                   <pic:spPr>
                     <a:xfrm>
                       <a:off x="0" y="0"/>
-                      <a:ext cx="5760000" cy="2946162"/>
+                      <a:ext cx="5760000" cy="3035676"/>
                     </a:xfrm>
                     <a:prstGeom prst="rect"/>
                   </pic:spPr>
@@ -4939,7 +4624,37 @@
           <w:i/>
           <w:sz w:val="22"/>
         </w:rPr>
-        <w:t xml:space="preserve">Semgrep quét toàn bộ mã nguồn chưa vá: 38 cảnh báo trên 25 tệp (cảnh báo công cụ, chưa phải lỗ hổng đã xác nhận); tô vàng ba điểm thuộc phạm vi; </w:t>
+        <w:t>Semgrep quét toàn bộ mã nguồn chưa vá: 38 cảnh báo trên 25 tệp (cảnh báo công cụ, chưa phải lỗ hổng đã xác nhận); tô vàng F01 (</w:t>
+      </w:r>
+      <w:r>
+        <w:rPr>
+          <w:rFonts w:ascii="Consolas" w:hAnsi="Consolas"/>
+          <w:i/>
+          <w:sz w:val="22"/>
+        </w:rPr>
+        <w:t>login.ts</w:t>
+      </w:r>
+      <w:r>
+        <w:rPr>
+          <w:i/>
+          <w:sz w:val="22"/>
+        </w:rPr>
+        <w:t>) và băm MD5 (</w:t>
+      </w:r>
+      <w:r>
+        <w:rPr>
+          <w:rFonts w:ascii="Consolas" w:hAnsi="Consolas"/>
+          <w:i/>
+          <w:sz w:val="22"/>
+        </w:rPr>
+        <w:t>insecurity.ts</w:t>
+      </w:r>
+      <w:r>
+        <w:rPr>
+          <w:i/>
+          <w:sz w:val="22"/>
+        </w:rPr>
+        <w:t xml:space="preserve">) thuộc phạm vi; lệnh </w:t>
       </w:r>
       <w:r>
         <w:rPr>
@@ -4969,7 +4684,7 @@
           <w:i/>
           <w:sz w:val="22"/>
         </w:rPr>
-        <w:t xml:space="preserve"> nên là bước phát hiện, không tự chặn</w:t>
+        <w:t xml:space="preserve"> nên chỉ là bước phát hiện, không tự chặn</w:t>
       </w:r>
     </w:p>
     <w:p>
@@ -4979,7 +4694,7 @@
       <w:r>
         <w:drawing>
           <wp:inline xmlns:a="http://schemas.openxmlformats.org/drawingml/2006/main" xmlns:pic="http://schemas.openxmlformats.org/drawingml/2006/picture">
-            <wp:extent cx="5760000" cy="1334919"/>
+            <wp:extent cx="5760000" cy="1155892"/>
             <wp:docPr id="7" name="Picture 7"/>
             <wp:cNvGraphicFramePr>
               <a:graphicFrameLocks noChangeAspect="1"/>
@@ -5000,7 +4715,7 @@
                   <pic:spPr>
                     <a:xfrm>
                       <a:off x="0" y="0"/>
-                      <a:ext cx="5760000" cy="1334919"/>
+                      <a:ext cx="5760000" cy="1155892"/>
                     </a:xfrm>
                     <a:prstGeom prst="rect"/>
                   </pic:spPr>
@@ -5027,7 +4742,37 @@
           <w:i/>
           <w:sz w:val="22"/>
         </w:rPr>
-        <w:t>Ba điểm trong phạm vi — tách rõ phần cảnh báo nguyên văn của Semgrep và phần phân loại của nhóm: F01 (xác nhận), cảnh báo NoSQLi tại basket.ts (gợi ý rà F02, IDOR xác nhận bằng test A/B), và MD5 không salt (rủi ro còn lại)</w:t>
+        <w:t xml:space="preserve">Chi tiết hai điểm Semgrep xác định trong phạm vi: F01 SQL injection tại </w:t>
+      </w:r>
+      <w:r>
+        <w:rPr>
+          <w:rFonts w:ascii="Consolas" w:hAnsi="Consolas"/>
+          <w:i/>
+          <w:sz w:val="22"/>
+        </w:rPr>
+        <w:t>login.ts</w:t>
+      </w:r>
+      <w:r>
+        <w:rPr>
+          <w:i/>
+          <w:sz w:val="22"/>
+        </w:rPr>
+        <w:t xml:space="preserve"> và băm MD5 không salt tại </w:t>
+      </w:r>
+      <w:r>
+        <w:rPr>
+          <w:rFonts w:ascii="Consolas" w:hAnsi="Consolas"/>
+          <w:i/>
+          <w:sz w:val="22"/>
+        </w:rPr>
+        <w:t>lib/insecurity.ts</w:t>
+      </w:r>
+      <w:r>
+        <w:rPr>
+          <w:i/>
+          <w:sz w:val="22"/>
+        </w:rPr>
+        <w:t>; kèm ghi chú vì sao F02 không nằm trong nhóm này</w:t>
       </w:r>
     </w:p>
     <w:p>
@@ -5215,7 +4960,7 @@
           <w:i/>
           <w:sz w:val="22"/>
         </w:rPr>
-        <w:t>Bảng 11. Kết quả hợp nhất bốn tình huống (điều kiện → kỳ vọng → trước/sau vá → bằng chứng → rủi ro còn lại)</w:t>
+        <w:t>Bảng 10. Kết quả hợp nhất bốn tình huống (điều kiện → kỳ vọng → trước/sau vá → bằng chứng → rủi ro còn lại)</w:t>
       </w:r>
     </w:p>
     <w:tbl>
@@ -6276,44 +6021,45 @@
         <w:t>Phát hiện.</w:t>
       </w:r>
       <w:r>
-        <w:t xml:space="preserve"> Semgrep có phát một cảnh báo </w:t>
+        <w:t xml:space="preserve"> Lỗi được tìm ra bằng </w:t>
+      </w:r>
+      <w:r>
+        <w:rPr>
+          <w:b/>
+        </w:rPr>
+        <w:t>rà soát mã nguồn</w:t>
+      </w:r>
+      <w:r>
+        <w:t xml:space="preserve"> tuyến xử lý giỏ hàng: truy vấn </w:t>
       </w:r>
       <w:r>
         <w:rPr>
           <w:rFonts w:ascii="Consolas" w:hAnsi="Consolas"/>
           <w:sz w:val="20"/>
         </w:rPr>
-        <w:t>node_nosqli_injection</w:t>
-      </w:r>
-      <w:r>
-        <w:t xml:space="preserve"> (CWE-943) tại truy vấn này, nhưng đó là cảnh báo </w:t>
-      </w:r>
-      <w:r>
-        <w:rPr>
-          <w:i/>
-        </w:rPr>
-        <w:t>NoSQL injection</w:t>
-      </w:r>
-      <w:r>
-        <w:t xml:space="preserve"> — không phải IDOR; báo cáo chỉ dùng nó làm </w:t>
+        <w:t>findOne({ where: { id } })</w:t>
+      </w:r>
+      <w:r>
+        <w:t xml:space="preserve"> chỉ lọc theo mã giỏ lấy từ URL mà bỏ qua chủ sở hữu, trong khi middleware phía trước chỉ kiểm tra token có hợp lệ. Từ quan sát đó, giả thuyết IDOR được </w:t>
       </w:r>
       <w:r>
         <w:rPr>
           <w:b/>
         </w:rPr>
-        <w:t>gợi ý vị trí cần rà</w:t>
-      </w:r>
-      <w:r>
-        <w:t xml:space="preserve">. Việc thiếu kiểm tra quyền sở hữu được xác nhận </w:t>
+        <w:t>kiểm chứng bằng kiểm thử động chéo A/B</w:t>
+      </w:r>
+      <w:r>
+        <w:t xml:space="preserve">: dựng hai tài khoản A và B, rồi dùng token của A gọi </w:t>
       </w:r>
       <w:r>
         <w:rPr>
-          <w:b/>
+          <w:rFonts w:ascii="Consolas" w:hAnsi="Consolas"/>
+          <w:sz w:val="20"/>
         </w:rPr>
-        <w:t>độc lập</w:t>
-      </w:r>
-      <w:r>
-        <w:t xml:space="preserve"> bằng kiểm thử chéo A/B: kịch bản dựng hai tài khoản A và B, rồi dùng token của A để đọc giỏ của B. Trên mã chưa sửa, máy chủ trả về đúng giỏ của B (Hình 11) và các ca tương ứng trong </w:t>
+        <w:t>GET /rest/basket/{id_của_B}</w:t>
+      </w:r>
+      <w:r>
+        <w:t xml:space="preserve">. Trên mã chưa sửa, máy chủ trả về đúng giỏ của B (Hình 11); kịch bản này được tự động hóa thành ca kiểm thử trong </w:t>
       </w:r>
       <w:r>
         <w:rPr>
@@ -6323,7 +6069,7 @@
         <w:t>f01-f02.test.ts</w:t>
       </w:r>
       <w:r>
-        <w:t xml:space="preserve"> báo đỏ.</w:t>
+        <w:t xml:space="preserve"> (báo đỏ trước khi sửa). Đây là lỗi kiểm soát truy cập nên không công cụ phân tích tĩnh nào khẳng định được — bằng chứng đến từ việc đọc mã kết hợp phép thử truy cập chéo.</w:t>
       </w:r>
     </w:p>
     <w:p>
@@ -7930,7 +7676,7 @@
           <w:i/>
           <w:sz w:val="22"/>
         </w:rPr>
-        <w:t>Bảng 12. Luật kiểm tra cấu hình container — luật yêu cầu gì và dựa trên chuẩn nào</w:t>
+        <w:t>Bảng 11. Luật kiểm tra cấu hình container — luật yêu cầu gì và dựa trên chuẩn nào</w:t>
       </w:r>
     </w:p>
     <w:tbl>
@@ -8560,13 +8306,13 @@
         <w:pStyle w:val="ListBullet"/>
       </w:pPr>
       <w:r>
-        <w:t xml:space="preserve">Tài liệu môn học: </w:t>
+        <w:t xml:space="preserve">Phương pháp luận tham khảo: </w:t>
       </w:r>
       <w:r>
         <w:rPr>
           <w:i/>
         </w:rPr>
-        <w:t>Hands-On Lab Guide — Security as Code with OWASP Juice Shop &amp; Docker</w:t>
+        <w:t>Security as Code with OWASP Juice Shop &amp; Docker</w:t>
       </w:r>
       <w:r>
         <w:t xml:space="preserve">; </w:t>
@@ -8605,17 +8351,7 @@
         <w:t>Nguồn:</w:t>
       </w:r>
       <w:r>
-        <w:t xml:space="preserve"> kế thừa cấu trúc và các luật cốt lõi từ Appendix A.1 của tài liệu lab (</w:t>
-      </w:r>
-      <w:r>
-        <w:rPr>
-          <w:rFonts w:ascii="Consolas" w:hAnsi="Consolas"/>
-          <w:sz w:val="20"/>
-        </w:rPr>
-        <w:t>Policy_as_code_Lab ConfTest.docx</w:t>
-      </w:r>
-      <w:r>
-        <w:t xml:space="preserve">); phần nhóm điều chỉnh/bổ sung: bỏ luật HEALTHCHECK, gộp provenance vào SUPPLY-CHAIN, và </w:t>
+        <w:t xml:space="preserve"> kế thừa cấu trúc và các luật nền tảng từ một mẫu Policy-as-Code tham khảo; phần nhóm điều chỉnh/bổ sung: bỏ luật HEALTHCHECK, gộp provenance vào SUPPLY-CHAIN, và </w:t>
       </w:r>
       <w:r>
         <w:rPr>
@@ -8691,7 +8427,7 @@
                 <w:rFonts w:ascii="Consolas" w:hAnsi="Consolas"/>
                 <w:sz w:val="17"/>
               </w:rPr>
-              <w:t># Policy as Code cho Dockerfile của Juice Shop — bám theo lab môn học "Policy as Code with Conftest".</w:t>
+              <w:t># Policy as Code cho Dockerfile của Juice Shop — theo mô hình "Policy as Code with Conftest".</w:t>
             </w:r>
             <w:r>
               <w:br/>
@@ -9914,7 +9650,7 @@
         <w:t>nhóm tự viết</w:t>
       </w:r>
       <w:r>
-        <w:t xml:space="preserve"> cho docker-compose — lab chỉ enforce trên manifest Kubernetes, nhóm chuyển các ý tưởng least-privilege/firewall/secret sang định dạng triển khai thật. Namespace </w:t>
+        <w:t xml:space="preserve"> cho docker-compose — mẫu tham khảo chỉ áp dụng trên manifest Kubernetes, nhóm chuyển các ý tưởng least-privilege/firewall/secret sang định dạng triển khai thật. Namespace </w:t>
       </w:r>
       <w:r>
         <w:rPr>
@@ -10877,7 +10613,7 @@
           <w:i/>
           <w:sz w:val="22"/>
         </w:rPr>
-        <w:t>Bảng 13. Tra cứu — mỗi tiêu chuẩn/điều khoản tham chiếu yêu cầu gì</w:t>
+        <w:t>Bảng 12. Tra cứu — mỗi tiêu chuẩn/điều khoản tham chiếu yêu cầu gì</w:t>
       </w:r>
     </w:p>
     <w:tbl>

</xml_diff>

<commit_message>
docs(report): bia PTIT - them ten hoc vien/khoa, logo, nhan BÁO CÁO HỌC PHẦN (PDF + DOCX)
</commit_message>
<xml_diff>
--- a/report/BaoCao_DevSecOps_JuiceShop_gon.docx
+++ b/report/BaoCao_DevSecOps_JuiceShop_gon.docx
@@ -3,9 +3,6 @@
 <w:document xmlns:wpc="http://schemas.microsoft.com/office/word/2010/wordprocessingCanvas" xmlns:mo="http://schemas.microsoft.com/office/mac/office/2008/main" xmlns:mc="http://schemas.openxmlformats.org/markup-compatibility/2006" xmlns:mv="urn:schemas-microsoft-com:mac:vml" xmlns:o="urn:schemas-microsoft-com:office:office" xmlns:r="http://schemas.openxmlformats.org/officeDocument/2006/relationships" xmlns:m="http://schemas.openxmlformats.org/officeDocument/2006/math" xmlns:v="urn:schemas-microsoft-com:vml" xmlns:wp14="http://schemas.microsoft.com/office/word/2010/wordprocessingDrawing" xmlns:wp="http://schemas.openxmlformats.org/drawingml/2006/wordprocessingDrawing" xmlns:w10="urn:schemas-microsoft-com:office:word" xmlns:w="http://schemas.openxmlformats.org/wordprocessingml/2006/main" xmlns:w14="http://schemas.microsoft.com/office/word/2010/wordml" xmlns:wpg="http://schemas.microsoft.com/office/word/2010/wordprocessingGroup" xmlns:wpi="http://schemas.microsoft.com/office/word/2010/wordprocessingInk" xmlns:wne="http://schemas.microsoft.com/office/word/2006/wordml" xmlns:wps="http://schemas.microsoft.com/office/word/2010/wordprocessingShape" mc:Ignorable="w14 wp14">
   <w:body>
     <w:p/>
-    <w:p/>
-    <w:p/>
-    <w:p/>
     <w:p>
       <w:pPr>
         <w:jc w:val="center"/>
@@ -13,9 +10,74 @@
       <w:r>
         <w:rPr>
           <w:b/>
+          <w:color w:val="0B2A4A"/>
+          <w:sz w:val="30"/>
+        </w:rPr>
+        <w:t>HỌC VIỆN CÔNG NGHỆ BƯU CHÍNH VIỄN THÔNG</w:t>
+      </w:r>
+    </w:p>
+    <w:p>
+      <w:pPr>
+        <w:jc w:val="center"/>
+      </w:pPr>
+      <w:r>
+        <w:rPr>
+          <w:b/>
           <w:sz w:val="26"/>
         </w:rPr>
-        <w:t>Học viện Công nghệ Bưu chính Viễn thông — Khoa An toàn thông tin</w:t>
+        <w:t>KHOA AN TOÀN THÔNG TIN</w:t>
+      </w:r>
+    </w:p>
+    <w:p>
+      <w:pPr>
+        <w:spacing w:before="360" w:after="200"/>
+        <w:jc w:val="center"/>
+      </w:pPr>
+      <w:r>
+        <w:drawing>
+          <wp:inline xmlns:a="http://schemas.openxmlformats.org/drawingml/2006/main" xmlns:pic="http://schemas.openxmlformats.org/drawingml/2006/picture">
+            <wp:extent cx="1188000" cy="1188000"/>
+            <wp:docPr id="1" name="Picture 1"/>
+            <wp:cNvGraphicFramePr>
+              <a:graphicFrameLocks noChangeAspect="1"/>
+            </wp:cNvGraphicFramePr>
+            <a:graphic>
+              <a:graphicData uri="http://schemas.openxmlformats.org/drawingml/2006/picture">
+                <pic:pic>
+                  <pic:nvPicPr>
+                    <pic:cNvPr id="0" name="ptit-logo.jpeg"/>
+                    <pic:cNvPicPr/>
+                  </pic:nvPicPr>
+                  <pic:blipFill>
+                    <a:blip r:embed="rId10"/>
+                    <a:stretch>
+                      <a:fillRect/>
+                    </a:stretch>
+                  </pic:blipFill>
+                  <pic:spPr>
+                    <a:xfrm>
+                      <a:off x="0" y="0"/>
+                      <a:ext cx="1188000" cy="1188000"/>
+                    </a:xfrm>
+                    <a:prstGeom prst="rect"/>
+                  </pic:spPr>
+                </pic:pic>
+              </a:graphicData>
+            </a:graphic>
+          </wp:inline>
+        </w:drawing>
+      </w:r>
+    </w:p>
+    <w:p>
+      <w:pPr>
+        <w:jc w:val="center"/>
+      </w:pPr>
+      <w:r>
+        <w:rPr>
+          <w:b/>
+          <w:sz w:val="30"/>
+        </w:rPr>
+        <w:t>BÁO CÁO HỌC PHẦN</w:t>
       </w:r>
     </w:p>
     <w:p/>
@@ -27,7 +89,7 @@
         <w:rPr>
           <w:b/>
           <w:color w:val="0B2A4A"/>
-          <w:sz w:val="40"/>
+          <w:sz w:val="38"/>
         </w:rPr>
         <w:t>Đánh giá an toàn và bảo vệ dữ liệu người dùng</w:t>
       </w:r>
@@ -40,7 +102,7 @@
         <w:rPr>
           <w:b/>
           <w:color w:val="0B2A4A"/>
-          <w:sz w:val="40"/>
+          <w:sz w:val="38"/>
         </w:rPr>
         <w:t>ứng dụng OWASP Juice Shop v20.2.0</w:t>
       </w:r>
@@ -2315,7 +2377,7 @@
         <w:drawing>
           <wp:inline xmlns:a="http://schemas.openxmlformats.org/drawingml/2006/main" xmlns:pic="http://schemas.openxmlformats.org/drawingml/2006/picture">
             <wp:extent cx="5760000" cy="1054703"/>
-            <wp:docPr id="1" name="Picture 1"/>
+            <wp:docPr id="2" name="Picture 2"/>
             <wp:cNvGraphicFramePr>
               <a:graphicFrameLocks noChangeAspect="1"/>
             </wp:cNvGraphicFramePr>
@@ -2327,7 +2389,7 @@
                     <pic:cNvPicPr/>
                   </pic:nvPicPr>
                   <pic:blipFill>
-                    <a:blip r:embed="rId10"/>
+                    <a:blip r:embed="rId11"/>
                     <a:stretch>
                       <a:fillRect/>
                     </a:stretch>
@@ -3190,7 +3252,7 @@
         <w:drawing>
           <wp:inline xmlns:a="http://schemas.openxmlformats.org/drawingml/2006/main" xmlns:pic="http://schemas.openxmlformats.org/drawingml/2006/picture">
             <wp:extent cx="5760000" cy="2618182"/>
-            <wp:docPr id="2" name="Picture 2"/>
+            <wp:docPr id="3" name="Picture 3"/>
             <wp:cNvGraphicFramePr>
               <a:graphicFrameLocks noChangeAspect="1"/>
             </wp:cNvGraphicFramePr>
@@ -3202,7 +3264,7 @@
                     <pic:cNvPicPr/>
                   </pic:nvPicPr>
                   <pic:blipFill>
-                    <a:blip r:embed="rId11"/>
+                    <a:blip r:embed="rId12"/>
                     <a:stretch>
                       <a:fillRect/>
                     </a:stretch>
@@ -3430,7 +3492,7 @@
         <w:drawing>
           <wp:inline xmlns:a="http://schemas.openxmlformats.org/drawingml/2006/main" xmlns:pic="http://schemas.openxmlformats.org/drawingml/2006/picture">
             <wp:extent cx="5760000" cy="976865"/>
-            <wp:docPr id="3" name="Picture 3"/>
+            <wp:docPr id="4" name="Picture 4"/>
             <wp:cNvGraphicFramePr>
               <a:graphicFrameLocks noChangeAspect="1"/>
             </wp:cNvGraphicFramePr>
@@ -3442,7 +3504,7 @@
                     <pic:cNvPicPr/>
                   </pic:nvPicPr>
                   <pic:blipFill>
-                    <a:blip r:embed="rId12"/>
+                    <a:blip r:embed="rId13"/>
                     <a:stretch>
                       <a:fillRect/>
                     </a:stretch>
@@ -4330,7 +4392,7 @@
         <w:drawing>
           <wp:inline xmlns:a="http://schemas.openxmlformats.org/drawingml/2006/main" xmlns:pic="http://schemas.openxmlformats.org/drawingml/2006/picture">
             <wp:extent cx="5760000" cy="887351"/>
-            <wp:docPr id="4" name="Picture 4"/>
+            <wp:docPr id="5" name="Picture 5"/>
             <wp:cNvGraphicFramePr>
               <a:graphicFrameLocks noChangeAspect="1"/>
             </wp:cNvGraphicFramePr>
@@ -4342,7 +4404,7 @@
                     <pic:cNvPicPr/>
                   </pic:nvPicPr>
                   <pic:blipFill>
-                    <a:blip r:embed="rId13"/>
+                    <a:blip r:embed="rId14"/>
                     <a:stretch>
                       <a:fillRect/>
                     </a:stretch>
@@ -4418,7 +4480,7 @@
         <w:drawing>
           <wp:inline xmlns:a="http://schemas.openxmlformats.org/drawingml/2006/main" xmlns:pic="http://schemas.openxmlformats.org/drawingml/2006/picture">
             <wp:extent cx="5760000" cy="708324"/>
-            <wp:docPr id="5" name="Picture 5"/>
+            <wp:docPr id="6" name="Picture 6"/>
             <wp:cNvGraphicFramePr>
               <a:graphicFrameLocks noChangeAspect="1"/>
             </wp:cNvGraphicFramePr>
@@ -4430,7 +4492,7 @@
                     <pic:cNvPicPr/>
                   </pic:nvPicPr>
                   <pic:blipFill>
-                    <a:blip r:embed="rId14"/>
+                    <a:blip r:embed="rId15"/>
                     <a:stretch>
                       <a:fillRect/>
                     </a:stretch>
@@ -4692,7 +4754,7 @@
         <w:drawing>
           <wp:inline xmlns:a="http://schemas.openxmlformats.org/drawingml/2006/main" xmlns:pic="http://schemas.openxmlformats.org/drawingml/2006/picture">
             <wp:extent cx="5760000" cy="3035676"/>
-            <wp:docPr id="6" name="Picture 6"/>
+            <wp:docPr id="7" name="Picture 7"/>
             <wp:cNvGraphicFramePr>
               <a:graphicFrameLocks noChangeAspect="1"/>
             </wp:cNvGraphicFramePr>
@@ -4704,7 +4766,7 @@
                     <pic:cNvPicPr/>
                   </pic:nvPicPr>
                   <pic:blipFill>
-                    <a:blip r:embed="rId15"/>
+                    <a:blip r:embed="rId16"/>
                     <a:stretch>
                       <a:fillRect/>
                     </a:stretch>
@@ -4825,7 +4887,7 @@
         <w:drawing>
           <wp:inline xmlns:a="http://schemas.openxmlformats.org/drawingml/2006/main" xmlns:pic="http://schemas.openxmlformats.org/drawingml/2006/picture">
             <wp:extent cx="5760000" cy="1334919"/>
-            <wp:docPr id="7" name="Picture 7"/>
+            <wp:docPr id="8" name="Picture 8"/>
             <wp:cNvGraphicFramePr>
               <a:graphicFrameLocks noChangeAspect="1"/>
             </wp:cNvGraphicFramePr>
@@ -4837,7 +4899,7 @@
                     <pic:cNvPicPr/>
                   </pic:nvPicPr>
                   <pic:blipFill>
-                    <a:blip r:embed="rId16"/>
+                    <a:blip r:embed="rId17"/>
                     <a:stretch>
                       <a:fillRect/>
                     </a:stretch>
@@ -4981,7 +5043,7 @@
         <w:drawing>
           <wp:inline xmlns:a="http://schemas.openxmlformats.org/drawingml/2006/main" xmlns:pic="http://schemas.openxmlformats.org/drawingml/2006/picture">
             <wp:extent cx="5760000" cy="1245405"/>
-            <wp:docPr id="8" name="Picture 8"/>
+            <wp:docPr id="9" name="Picture 9"/>
             <wp:cNvGraphicFramePr>
               <a:graphicFrameLocks noChangeAspect="1"/>
             </wp:cNvGraphicFramePr>
@@ -4993,7 +5055,7 @@
                     <pic:cNvPicPr/>
                   </pic:nvPicPr>
                   <pic:blipFill>
-                    <a:blip r:embed="rId17"/>
+                    <a:blip r:embed="rId18"/>
                     <a:stretch>
                       <a:fillRect/>
                     </a:stretch>
@@ -5851,7 +5913,7 @@
         <w:drawing>
           <wp:inline xmlns:a="http://schemas.openxmlformats.org/drawingml/2006/main" xmlns:pic="http://schemas.openxmlformats.org/drawingml/2006/picture">
             <wp:extent cx="5400000" cy="1744054"/>
-            <wp:docPr id="9" name="Picture 9"/>
+            <wp:docPr id="10" name="Picture 10"/>
             <wp:cNvGraphicFramePr>
               <a:graphicFrameLocks noChangeAspect="1"/>
             </wp:cNvGraphicFramePr>
@@ -5863,7 +5925,7 @@
                     <pic:cNvPicPr/>
                   </pic:nvPicPr>
                   <pic:blipFill>
-                    <a:blip r:embed="rId18"/>
+                    <a:blip r:embed="rId19"/>
                     <a:stretch>
                       <a:fillRect/>
                     </a:stretch>
@@ -6031,7 +6093,7 @@
         <w:drawing>
           <wp:inline xmlns:a="http://schemas.openxmlformats.org/drawingml/2006/main" xmlns:pic="http://schemas.openxmlformats.org/drawingml/2006/picture">
             <wp:extent cx="5400000" cy="1996579"/>
-            <wp:docPr id="10" name="Picture 10"/>
+            <wp:docPr id="11" name="Picture 11"/>
             <wp:cNvGraphicFramePr>
               <a:graphicFrameLocks noChangeAspect="1"/>
             </wp:cNvGraphicFramePr>
@@ -6043,7 +6105,7 @@
                     <pic:cNvPicPr/>
                   </pic:nvPicPr>
                   <pic:blipFill>
-                    <a:blip r:embed="rId19"/>
+                    <a:blip r:embed="rId20"/>
                     <a:stretch>
                       <a:fillRect/>
                     </a:stretch>
@@ -6673,7 +6735,7 @@
         <w:drawing>
           <wp:inline xmlns:a="http://schemas.openxmlformats.org/drawingml/2006/main" xmlns:pic="http://schemas.openxmlformats.org/drawingml/2006/picture">
             <wp:extent cx="5400000" cy="988784"/>
-            <wp:docPr id="11" name="Picture 11"/>
+            <wp:docPr id="12" name="Picture 12"/>
             <wp:cNvGraphicFramePr>
               <a:graphicFrameLocks noChangeAspect="1"/>
             </wp:cNvGraphicFramePr>
@@ -6685,7 +6747,7 @@
                     <pic:cNvPicPr/>
                   </pic:nvPicPr>
                   <pic:blipFill>
-                    <a:blip r:embed="rId20"/>
+                    <a:blip r:embed="rId21"/>
                     <a:stretch>
                       <a:fillRect/>
                     </a:stretch>
@@ -6776,7 +6838,7 @@
         <w:drawing>
           <wp:inline xmlns:a="http://schemas.openxmlformats.org/drawingml/2006/main" xmlns:pic="http://schemas.openxmlformats.org/drawingml/2006/picture">
             <wp:extent cx="5400000" cy="1744054"/>
-            <wp:docPr id="12" name="Picture 12"/>
+            <wp:docPr id="13" name="Picture 13"/>
             <wp:cNvGraphicFramePr>
               <a:graphicFrameLocks noChangeAspect="1"/>
             </wp:cNvGraphicFramePr>
@@ -6788,7 +6850,7 @@
                     <pic:cNvPicPr/>
                   </pic:nvPicPr>
                   <pic:blipFill>
-                    <a:blip r:embed="rId21"/>
+                    <a:blip r:embed="rId22"/>
                     <a:stretch>
                       <a:fillRect/>
                     </a:stretch>
@@ -7153,7 +7215,7 @@
         <w:drawing>
           <wp:inline xmlns:a="http://schemas.openxmlformats.org/drawingml/2006/main" xmlns:pic="http://schemas.openxmlformats.org/drawingml/2006/picture">
             <wp:extent cx="5400000" cy="3006346"/>
-            <wp:docPr id="13" name="Picture 13"/>
+            <wp:docPr id="14" name="Picture 14"/>
             <wp:cNvGraphicFramePr>
               <a:graphicFrameLocks noChangeAspect="1"/>
             </wp:cNvGraphicFramePr>
@@ -7165,7 +7227,7 @@
                     <pic:cNvPicPr/>
                   </pic:nvPicPr>
                   <pic:blipFill>
-                    <a:blip r:embed="rId22"/>
+                    <a:blip r:embed="rId23"/>
                     <a:stretch>
                       <a:fillRect/>
                     </a:stretch>
@@ -8546,7 +8608,7 @@
         <w:drawing>
           <wp:inline xmlns:a="http://schemas.openxmlformats.org/drawingml/2006/main" xmlns:pic="http://schemas.openxmlformats.org/drawingml/2006/picture">
             <wp:extent cx="5400000" cy="2128846"/>
-            <wp:docPr id="14" name="Picture 14"/>
+            <wp:docPr id="15" name="Picture 15"/>
             <wp:cNvGraphicFramePr>
               <a:graphicFrameLocks noChangeAspect="1"/>
             </wp:cNvGraphicFramePr>
@@ -8558,7 +8620,7 @@
                     <pic:cNvPicPr/>
                   </pic:nvPicPr>
                   <pic:blipFill>
-                    <a:blip r:embed="rId23"/>
+                    <a:blip r:embed="rId24"/>
                     <a:stretch>
                       <a:fillRect/>
                     </a:stretch>
@@ -8729,7 +8791,7 @@
       <w:r>
         <w:t xml:space="preserve">OWASP Juice Shop v20.2.0 — </w:t>
       </w:r>
-      <w:hyperlink r:id="rId24">
+      <w:hyperlink r:id="rId25">
         <w:r>
           <w:rPr>
             <w:color w:val="0B4EA2"/>

</xml_diff>

<commit_message>
docs(report): bo doi chieu commit/digest (bang phuong phap, chan anh, header log, caption gitleaks)
</commit_message>
<xml_diff>
--- a/report/BaoCao_DevSecOps_JuiceShop_gon.docx
+++ b/report/BaoCao_DevSecOps_JuiceShop_gon.docx
@@ -1829,17 +1829,7 @@
           </w:tcPr>
           <w:p>
             <w:r>
-              <w:t xml:space="preserve">Bản mã Juice Shop gốc tại commit </w:t>
-            </w:r>
-            <w:r>
-              <w:rPr>
-                <w:rFonts w:ascii="Consolas" w:hAnsi="Consolas"/>
-                <w:sz w:val="20"/>
-              </w:rPr>
-              <w:t>21219d66d</w:t>
-            </w:r>
-            <w:r>
-              <w:t xml:space="preserve"> (thư mục </w:t>
+              <w:t xml:space="preserve">Bản mã Juice Shop gốc (thư mục </w:t>
             </w:r>
             <w:r>
               <w:rPr>
@@ -1881,34 +1871,7 @@
           </w:tcPr>
           <w:p>
             <w:r>
-              <w:t xml:space="preserve">Nhánh </w:t>
-            </w:r>
-            <w:r>
-              <w:rPr>
-                <w:rFonts w:ascii="Consolas" w:hAnsi="Consolas"/>
-                <w:sz w:val="20"/>
-              </w:rPr>
-              <w:t>fix/f01-f04</w:t>
-            </w:r>
-            <w:r>
-              <w:t xml:space="preserve">; image triển khai </w:t>
-            </w:r>
-            <w:r>
-              <w:rPr>
-                <w:rFonts w:ascii="Consolas" w:hAnsi="Consolas"/>
-                <w:sz w:val="20"/>
-              </w:rPr>
-              <w:t>juice-shop:hotfix-f01-f02</w:t>
-            </w:r>
-            <w:r>
-              <w:t xml:space="preserve"> trên base ghim digest </w:t>
-            </w:r>
-            <w:r>
-              <w:rPr>
-                <w:rFonts w:ascii="Consolas" w:hAnsi="Consolas"/>
-                <w:sz w:val="20"/>
-              </w:rPr>
-              <w:t>sha256:8739101a…</w:t>
+              <w:t>Bản vá của nhóm, đóng gói trong image hotfix triển khai ở cổng 3102</w:t>
             </w:r>
           </w:p>
         </w:tc>
@@ -4381,7 +4344,7 @@
         <w:t>mã thoát</w:t>
       </w:r>
       <w:r>
-        <w:t xml:space="preserve"> của lệnh, và mỗi hình ghi kèm thời điểm, commit, exit code ở chân hình.</w:t>
+        <w:t xml:space="preserve"> của lệnh, và mỗi hình ghi kèm thời điểm và exit code ở chân hình.</w:t>
       </w:r>
     </w:p>
     <w:p>
@@ -4439,22 +4402,7 @@
           <w:i/>
           <w:sz w:val="22"/>
         </w:rPr>
-        <w:t xml:space="preserve">Gitleaks quét các commit vá (phạm vi </w:t>
-      </w:r>
-      <w:r>
-        <w:rPr>
-          <w:rFonts w:ascii="Consolas" w:hAnsi="Consolas"/>
-          <w:i/>
-          <w:sz w:val="22"/>
-        </w:rPr>
-        <w:t>baf9dcea4..HEAD</w:t>
-      </w:r>
-      <w:r>
-        <w:rPr>
-          <w:i/>
-          <w:sz w:val="22"/>
-        </w:rPr>
-        <w:t xml:space="preserve">): 30 commit, </w:t>
+        <w:t xml:space="preserve">Gitleaks quét các commit vá của nhóm: </w:t>
       </w:r>
       <w:r>
         <w:rPr>

</xml_diff>

<commit_message>
docs(report): muc luc tinh (so trang co dinh) thay truong tu cap nhat; dung lai PDF/DOCX
</commit_message>
<xml_diff>
--- a/report/BaoCao_DevSecOps_JuiceShop_gon.docx
+++ b/report/BaoCao_DevSecOps_JuiceShop_gon.docx
@@ -335,13 +335,509 @@
         <w:t>Mục lục</w:t>
       </w:r>
     </w:p>
+    <w:p/>
     <w:p>
-      <w:r>
-        <w:fldChar w:fldCharType="begin"/>
-        <w:instrText xml:space="preserve">TOC \o "1-2" \h \z \u</w:instrText>
-        <w:fldChar w:fldCharType="separate"/>
-        <w:t>Mục lục tự cập nhật khi mở tài liệu.</w:t>
-        <w:fldChar w:fldCharType="end"/>
+      <w:pPr>
+        <w:tabs>
+          <w:tab w:pos="9071" w:val="right" w:leader="dot"/>
+        </w:tabs>
+        <w:spacing w:after="60"/>
+        <w:ind w:left="0"/>
+      </w:pPr>
+      <w:r>
+        <w:rPr>
+          <w:b/>
+          <w:sz w:val="24"/>
+        </w:rPr>
+        <w:t>Danh mục từ viết tắt</w:t>
+      </w:r>
+      <w:r>
+        <w:rPr>
+          <w:b/>
+          <w:sz w:val="24"/>
+        </w:rPr>
+        <w:tab/>
+        <w:t>3</w:t>
+      </w:r>
+    </w:p>
+    <w:p>
+      <w:pPr>
+        <w:tabs>
+          <w:tab w:pos="9071" w:val="right" w:leader="dot"/>
+        </w:tabs>
+        <w:spacing w:after="60"/>
+        <w:ind w:left="0"/>
+      </w:pPr>
+      <w:r>
+        <w:rPr>
+          <w:b/>
+          <w:sz w:val="24"/>
+        </w:rPr>
+        <w:t>1. Giới thiệu và phạm vi</w:t>
+      </w:r>
+      <w:r>
+        <w:rPr>
+          <w:b/>
+          <w:sz w:val="24"/>
+        </w:rPr>
+        <w:tab/>
+        <w:t>3</w:t>
+      </w:r>
+    </w:p>
+    <w:p>
+      <w:pPr>
+        <w:tabs>
+          <w:tab w:pos="9071" w:val="right" w:leader="dot"/>
+        </w:tabs>
+        <w:spacing w:after="60"/>
+        <w:ind w:left="0"/>
+      </w:pPr>
+      <w:r>
+        <w:rPr>
+          <w:b/>
+          <w:sz w:val="24"/>
+        </w:rPr>
+        <w:t>2. Ứng dụng Juice Shop và dữ liệu cần bảo vệ</w:t>
+      </w:r>
+      <w:r>
+        <w:rPr>
+          <w:b/>
+          <w:sz w:val="24"/>
+        </w:rPr>
+        <w:tab/>
+        <w:t>4</w:t>
+      </w:r>
+    </w:p>
+    <w:p>
+      <w:pPr>
+        <w:tabs>
+          <w:tab w:pos="9071" w:val="right" w:leader="dot"/>
+        </w:tabs>
+        <w:spacing w:after="60"/>
+        <w:ind w:left="283"/>
+      </w:pPr>
+      <w:r>
+        <w:rPr>
+          <w:b w:val="0"/>
+          <w:sz w:val="24"/>
+        </w:rPr>
+        <w:t>2.1. Nghiệp vụ đăng ký và đăng nhập</w:t>
+      </w:r>
+      <w:r>
+        <w:rPr>
+          <w:b w:val="0"/>
+          <w:sz w:val="24"/>
+        </w:rPr>
+        <w:tab/>
+        <w:t>5</w:t>
+      </w:r>
+    </w:p>
+    <w:p>
+      <w:pPr>
+        <w:tabs>
+          <w:tab w:pos="9071" w:val="right" w:leader="dot"/>
+        </w:tabs>
+        <w:spacing w:after="60"/>
+        <w:ind w:left="283"/>
+      </w:pPr>
+      <w:r>
+        <w:rPr>
+          <w:b w:val="0"/>
+          <w:sz w:val="24"/>
+        </w:rPr>
+        <w:t>2.2. Nghiệp vụ tải tệp tài liệu</w:t>
+      </w:r>
+      <w:r>
+        <w:rPr>
+          <w:b w:val="0"/>
+          <w:sz w:val="24"/>
+        </w:rPr>
+        <w:tab/>
+        <w:t>5</w:t>
+      </w:r>
+    </w:p>
+    <w:p>
+      <w:pPr>
+        <w:tabs>
+          <w:tab w:pos="9071" w:val="right" w:leader="dot"/>
+        </w:tabs>
+        <w:spacing w:after="60"/>
+        <w:ind w:left="0"/>
+      </w:pPr>
+      <w:r>
+        <w:rPr>
+          <w:b/>
+          <w:sz w:val="24"/>
+        </w:rPr>
+        <w:t>3. Môi trường triển khai và yêu cầu an toàn tối thiểu</w:t>
+      </w:r>
+      <w:r>
+        <w:rPr>
+          <w:b/>
+          <w:sz w:val="24"/>
+        </w:rPr>
+        <w:tab/>
+        <w:t>5</w:t>
+      </w:r>
+    </w:p>
+    <w:p>
+      <w:pPr>
+        <w:tabs>
+          <w:tab w:pos="9071" w:val="right" w:leader="dot"/>
+        </w:tabs>
+        <w:spacing w:after="60"/>
+        <w:ind w:left="283"/>
+      </w:pPr>
+      <w:r>
+        <w:rPr>
+          <w:b w:val="0"/>
+          <w:sz w:val="24"/>
+        </w:rPr>
+        <w:t>3.1. Công cụ sử dụng</w:t>
+      </w:r>
+      <w:r>
+        <w:rPr>
+          <w:b w:val="0"/>
+          <w:sz w:val="24"/>
+        </w:rPr>
+        <w:tab/>
+        <w:t>7</w:t>
+      </w:r>
+    </w:p>
+    <w:p>
+      <w:pPr>
+        <w:tabs>
+          <w:tab w:pos="9071" w:val="right" w:leader="dot"/>
+        </w:tabs>
+        <w:spacing w:after="60"/>
+        <w:ind w:left="283"/>
+      </w:pPr>
+      <w:r>
+        <w:rPr>
+          <w:b w:val="0"/>
+          <w:sz w:val="24"/>
+        </w:rPr>
+        <w:t>3.2. Chính sách và tiêu chuẩn đối chiếu</w:t>
+      </w:r>
+      <w:r>
+        <w:rPr>
+          <w:b w:val="0"/>
+          <w:sz w:val="24"/>
+        </w:rPr>
+        <w:tab/>
+        <w:t>8</w:t>
+      </w:r>
+    </w:p>
+    <w:p>
+      <w:pPr>
+        <w:tabs>
+          <w:tab w:pos="9071" w:val="right" w:leader="dot"/>
+        </w:tabs>
+        <w:spacing w:after="60"/>
+        <w:ind w:left="0"/>
+      </w:pPr>
+      <w:r>
+        <w:rPr>
+          <w:b/>
+          <w:sz w:val="24"/>
+        </w:rPr>
+        <w:t>4. Quy trình DevSecOps và các cổng kiểm soát</w:t>
+      </w:r>
+      <w:r>
+        <w:rPr>
+          <w:b/>
+          <w:sz w:val="24"/>
+        </w:rPr>
+        <w:tab/>
+        <w:t>9</w:t>
+      </w:r>
+    </w:p>
+    <w:p>
+      <w:pPr>
+        <w:tabs>
+          <w:tab w:pos="9071" w:val="right" w:leader="dot"/>
+        </w:tabs>
+        <w:spacing w:after="60"/>
+        <w:ind w:left="283"/>
+      </w:pPr>
+      <w:r>
+        <w:rPr>
+          <w:b w:val="0"/>
+          <w:sz w:val="24"/>
+        </w:rPr>
+        <w:t>4.1. Quét và phát hiện lỗi — kết quả thực tế</w:t>
+      </w:r>
+      <w:r>
+        <w:rPr>
+          <w:b w:val="0"/>
+          <w:sz w:val="24"/>
+        </w:rPr>
+        <w:tab/>
+        <w:t>12</w:t>
+      </w:r>
+    </w:p>
+    <w:p>
+      <w:pPr>
+        <w:tabs>
+          <w:tab w:pos="9071" w:val="right" w:leader="dot"/>
+        </w:tabs>
+        <w:spacing w:after="60"/>
+        <w:ind w:left="283"/>
+      </w:pPr>
+      <w:r>
+        <w:rPr>
+          <w:b w:val="0"/>
+          <w:sz w:val="24"/>
+        </w:rPr>
+        <w:t>4.2. Bảng kết quả hợp nhất</w:t>
+      </w:r>
+      <w:r>
+        <w:rPr>
+          <w:b w:val="0"/>
+          <w:sz w:val="24"/>
+        </w:rPr>
+        <w:tab/>
+        <w:t>14</w:t>
+      </w:r>
+    </w:p>
+    <w:p>
+      <w:pPr>
+        <w:tabs>
+          <w:tab w:pos="9071" w:val="right" w:leader="dot"/>
+        </w:tabs>
+        <w:spacing w:after="60"/>
+        <w:ind w:left="0"/>
+      </w:pPr>
+      <w:r>
+        <w:rPr>
+          <w:b/>
+          <w:sz w:val="24"/>
+        </w:rPr>
+        <w:t>5. Bốn lỗi an toàn: phát hiện và xử lý</w:t>
+      </w:r>
+      <w:r>
+        <w:rPr>
+          <w:b/>
+          <w:sz w:val="24"/>
+        </w:rPr>
+        <w:tab/>
+        <w:t>16</w:t>
+      </w:r>
+    </w:p>
+    <w:p>
+      <w:pPr>
+        <w:tabs>
+          <w:tab w:pos="9071" w:val="right" w:leader="dot"/>
+        </w:tabs>
+        <w:spacing w:after="60"/>
+        <w:ind w:left="283"/>
+      </w:pPr>
+      <w:r>
+        <w:rPr>
+          <w:b w:val="0"/>
+          <w:sz w:val="24"/>
+        </w:rPr>
+        <w:t>5.1. F01 — SQL injection tại đăng nhập</w:t>
+      </w:r>
+      <w:r>
+        <w:rPr>
+          <w:b w:val="0"/>
+          <w:sz w:val="24"/>
+        </w:rPr>
+        <w:tab/>
+        <w:t>16</w:t>
+      </w:r>
+    </w:p>
+    <w:p>
+      <w:pPr>
+        <w:tabs>
+          <w:tab w:pos="9071" w:val="right" w:leader="dot"/>
+        </w:tabs>
+        <w:spacing w:after="60"/>
+        <w:ind w:left="283"/>
+      </w:pPr>
+      <w:r>
+        <w:rPr>
+          <w:b w:val="0"/>
+          <w:sz w:val="24"/>
+        </w:rPr>
+        <w:t>5.2. F02 — Poison Null Byte làm lộ tệp sao lưu</w:t>
+      </w:r>
+      <w:r>
+        <w:rPr>
+          <w:b w:val="0"/>
+          <w:sz w:val="24"/>
+        </w:rPr>
+        <w:tab/>
+        <w:t>18</w:t>
+      </w:r>
+    </w:p>
+    <w:p>
+      <w:pPr>
+        <w:tabs>
+          <w:tab w:pos="9071" w:val="right" w:leader="dot"/>
+        </w:tabs>
+        <w:spacing w:after="60"/>
+        <w:ind w:left="283"/>
+      </w:pPr>
+      <w:r>
+        <w:rPr>
+          <w:b w:val="0"/>
+          <w:sz w:val="24"/>
+        </w:rPr>
+        <w:t>5.3. F03 — Lộ endpoint /metrics không xác thực</w:t>
+      </w:r>
+      <w:r>
+        <w:rPr>
+          <w:b w:val="0"/>
+          <w:sz w:val="24"/>
+        </w:rPr>
+        <w:tab/>
+        <w:t>19</w:t>
+      </w:r>
+    </w:p>
+    <w:p>
+      <w:pPr>
+        <w:tabs>
+          <w:tab w:pos="9071" w:val="right" w:leader="dot"/>
+        </w:tabs>
+        <w:spacing w:after="60"/>
+        <w:ind w:left="283"/>
+      </w:pPr>
+      <w:r>
+        <w:rPr>
+          <w:b w:val="0"/>
+          <w:sz w:val="24"/>
+        </w:rPr>
+        <w:t>5.4. F04 — Sai cấu hình an toàn của container</w:t>
+      </w:r>
+      <w:r>
+        <w:rPr>
+          <w:b w:val="0"/>
+          <w:sz w:val="24"/>
+        </w:rPr>
+        <w:tab/>
+        <w:t>20</w:t>
+      </w:r>
+    </w:p>
+    <w:p>
+      <w:pPr>
+        <w:tabs>
+          <w:tab w:pos="9071" w:val="right" w:leader="dot"/>
+        </w:tabs>
+        <w:spacing w:after="60"/>
+        <w:ind w:left="0"/>
+      </w:pPr>
+      <w:r>
+        <w:rPr>
+          <w:b/>
+          <w:sz w:val="24"/>
+        </w:rPr>
+        <w:t>6. Kết luận</w:t>
+      </w:r>
+      <w:r>
+        <w:rPr>
+          <w:b/>
+          <w:sz w:val="24"/>
+        </w:rPr>
+        <w:tab/>
+        <w:t>24</w:t>
+      </w:r>
+    </w:p>
+    <w:p>
+      <w:pPr>
+        <w:tabs>
+          <w:tab w:pos="9071" w:val="right" w:leader="dot"/>
+        </w:tabs>
+        <w:spacing w:after="60"/>
+        <w:ind w:left="0"/>
+      </w:pPr>
+      <w:r>
+        <w:rPr>
+          <w:b/>
+          <w:sz w:val="24"/>
+        </w:rPr>
+        <w:t>7. Tài liệu tham khảo</w:t>
+      </w:r>
+      <w:r>
+        <w:rPr>
+          <w:b/>
+          <w:sz w:val="24"/>
+        </w:rPr>
+        <w:tab/>
+        <w:t>24</w:t>
+      </w:r>
+    </w:p>
+    <w:p>
+      <w:pPr>
+        <w:tabs>
+          <w:tab w:pos="9071" w:val="right" w:leader="dot"/>
+        </w:tabs>
+        <w:spacing w:after="60"/>
+        <w:ind w:left="0"/>
+      </w:pPr>
+      <w:r>
+        <w:rPr>
+          <w:b/>
+          <w:sz w:val="24"/>
+        </w:rPr>
+        <w:t>Phụ lục A — Mã nguồn chính sách Dockerfile (docker_security.rego)</w:t>
+      </w:r>
+      <w:r>
+        <w:rPr>
+          <w:b/>
+          <w:sz w:val="24"/>
+        </w:rPr>
+        <w:tab/>
+        <w:t>26</w:t>
+      </w:r>
+    </w:p>
+    <w:p>
+      <w:pPr>
+        <w:tabs>
+          <w:tab w:pos="9071" w:val="right" w:leader="dot"/>
+        </w:tabs>
+        <w:spacing w:after="60"/>
+        <w:ind w:left="0"/>
+      </w:pPr>
+      <w:r>
+        <w:rPr>
+          <w:b/>
+          <w:sz w:val="24"/>
+        </w:rPr>
+        <w:t>Phụ lục B — Mã nguồn chính sách docker-compose (compose.rego)</w:t>
+      </w:r>
+      <w:r>
+        <w:rPr>
+          <w:b/>
+          <w:sz w:val="24"/>
+        </w:rPr>
+        <w:tab/>
+        <w:t>29</w:t>
+      </w:r>
+    </w:p>
+    <w:p>
+      <w:pPr>
+        <w:tabs>
+          <w:tab w:pos="9071" w:val="right" w:leader="dot"/>
+        </w:tabs>
+        <w:spacing w:after="60"/>
+        <w:ind w:left="0"/>
+      </w:pPr>
+      <w:r>
+        <w:rPr>
+          <w:b/>
+          <w:sz w:val="24"/>
+        </w:rPr>
+        <w:t>Phụ lục C — Giải thích tiêu chuẩn và điều khoản tham chiếu</w:t>
+      </w:r>
+      <w:r>
+        <w:rPr>
+          <w:b/>
+          <w:sz w:val="24"/>
+        </w:rPr>
+        <w:tab/>
+        <w:t>31</w:t>
       </w:r>
     </w:p>
     <w:p>

</xml_diff>

<commit_message>
feat(report): them quet image (Trivy/Dockle, Release) + giam sat van hanh (Prometheus/Grafana, Operate)
- Trivy: SCA/CVE image (189 CVE); Dockle: CIS image (bat secret bake vao layer) - pha Release
- Prometheus scrape /metrics noi bo + Grafana dashboard + alert HighClientErrorRate fire that - pha Operate
- Tach muc 4.4 Lenh quet khoi demo tv1-tv4; moi buoc quet co anh that
- Gon muc 3.2: don giai thich tieu chuan xuong Phu luc C, than bai chi con ma dieu khoan
- Them docker-compose.monitoring.yml + deploy/monitoring/*, capture_scans.py; dung lai PDF/DOCX
</commit_message>
<xml_diff>
--- a/report/BaoCao_DevSecOps_JuiceShop_gon.docx
+++ b/report/BaoCao_DevSecOps_JuiceShop_gon.docx
@@ -549,7 +549,7 @@
           <w:sz w:val="24"/>
         </w:rPr>
         <w:tab/>
-        <w:t>9</w:t>
+        <w:t>8</w:t>
       </w:r>
     </w:p>
     <w:p>
@@ -573,7 +573,7 @@
           <w:sz w:val="24"/>
         </w:rPr>
         <w:tab/>
-        <w:t>12</w:t>
+        <w:t>13</w:t>
       </w:r>
     </w:p>
     <w:p>
@@ -597,7 +597,55 @@
           <w:sz w:val="24"/>
         </w:rPr>
         <w:tab/>
-        <w:t>14</w:t>
+        <w:t>15</w:t>
+      </w:r>
+    </w:p>
+    <w:p>
+      <w:pPr>
+        <w:tabs>
+          <w:tab w:pos="9071" w:val="right" w:leader="dot"/>
+        </w:tabs>
+        <w:spacing w:after="60"/>
+        <w:ind w:left="283"/>
+      </w:pPr>
+      <w:r>
+        <w:rPr>
+          <w:b w:val="0"/>
+          <w:sz w:val="24"/>
+        </w:rPr>
+        <w:t>4.3. Giám sát khi vận hành (pha Operate)</w:t>
+      </w:r>
+      <w:r>
+        <w:rPr>
+          <w:b w:val="0"/>
+          <w:sz w:val="24"/>
+        </w:rPr>
+        <w:tab/>
+        <w:t>17</w:t>
+      </w:r>
+    </w:p>
+    <w:p>
+      <w:pPr>
+        <w:tabs>
+          <w:tab w:pos="9071" w:val="right" w:leader="dot"/>
+        </w:tabs>
+        <w:spacing w:after="60"/>
+        <w:ind w:left="283"/>
+      </w:pPr>
+      <w:r>
+        <w:rPr>
+          <w:b w:val="0"/>
+          <w:sz w:val="24"/>
+        </w:rPr>
+        <w:t>4.4. Lệnh quét (tái lập)</w:t>
+      </w:r>
+      <w:r>
+        <w:rPr>
+          <w:b w:val="0"/>
+          <w:sz w:val="24"/>
+        </w:rPr>
+        <w:tab/>
+        <w:t>18</w:t>
       </w:r>
     </w:p>
     <w:p>
@@ -621,7 +669,7 @@
           <w:sz w:val="24"/>
         </w:rPr>
         <w:tab/>
-        <w:t>16</w:t>
+        <w:t>19</w:t>
       </w:r>
     </w:p>
     <w:p>
@@ -645,7 +693,7 @@
           <w:sz w:val="24"/>
         </w:rPr>
         <w:tab/>
-        <w:t>16</w:t>
+        <w:t>19</w:t>
       </w:r>
     </w:p>
     <w:p>
@@ -669,7 +717,7 @@
           <w:sz w:val="24"/>
         </w:rPr>
         <w:tab/>
-        <w:t>18</w:t>
+        <w:t>20</w:t>
       </w:r>
     </w:p>
     <w:p>
@@ -693,7 +741,7 @@
           <w:sz w:val="24"/>
         </w:rPr>
         <w:tab/>
-        <w:t>19</w:t>
+        <w:t>22</w:t>
       </w:r>
     </w:p>
     <w:p>
@@ -717,7 +765,7 @@
           <w:sz w:val="24"/>
         </w:rPr>
         <w:tab/>
-        <w:t>20</w:t>
+        <w:t>23</w:t>
       </w:r>
     </w:p>
     <w:p>
@@ -741,7 +789,7 @@
           <w:sz w:val="24"/>
         </w:rPr>
         <w:tab/>
-        <w:t>24</w:t>
+        <w:t>27</w:t>
       </w:r>
     </w:p>
     <w:p>
@@ -765,7 +813,7 @@
           <w:sz w:val="24"/>
         </w:rPr>
         <w:tab/>
-        <w:t>24</w:t>
+        <w:t>27</w:t>
       </w:r>
     </w:p>
     <w:p>
@@ -789,7 +837,7 @@
           <w:sz w:val="24"/>
         </w:rPr>
         <w:tab/>
-        <w:t>26</w:t>
+        <w:t>29</w:t>
       </w:r>
     </w:p>
     <w:p>
@@ -813,7 +861,7 @@
           <w:sz w:val="24"/>
         </w:rPr>
         <w:tab/>
-        <w:t>29</w:t>
+        <w:t>32</w:t>
       </w:r>
     </w:p>
     <w:p>
@@ -837,7 +885,7 @@
           <w:sz w:val="24"/>
         </w:rPr>
         <w:tab/>
-        <w:t>31</w:t>
+        <w:t>34</w:t>
       </w:r>
     </w:p>
     <w:p>
@@ -2453,7 +2501,7 @@
           </w:tcPr>
           <w:p>
             <w:r>
-              <w:t>Semgrep 1.180.0; Gitleaks v8.30.1; Conftest/OPA v0.71.1; node:test + Supertest</w:t>
+              <w:t>Semgrep 1.180.0; Gitleaks v8.30.1; Conftest/OPA v0.71.1; node:test + Supertest; Trivy 0.76.1; Dockle 0.4.15; Prometheus 3.15.1; Grafana 13.3.0</w:t>
             </w:r>
           </w:p>
         </w:tc>
@@ -3223,7 +3271,140 @@
           </w:tcPr>
           <w:p>
             <w:r>
-              <w:t>Kiểm tra Dockerfile và cấu hình triển khai (F03/F04)</w:t>
+              <w:t xml:space="preserve">Kiểm tra </w:t>
+            </w:r>
+            <w:r>
+              <w:rPr>
+                <w:i/>
+              </w:rPr>
+              <w:t>văn bản</w:t>
+            </w:r>
+            <w:r>
+              <w:t xml:space="preserve"> Dockerfile và cấu hình triển khai (pha Build/Deploy, F03/F04)</w:t>
+            </w:r>
+          </w:p>
+        </w:tc>
+      </w:tr>
+      <w:tr>
+        <w:tc>
+          <w:tcPr>
+            <w:tcW w:type="dxa" w:w="3213"/>
+          </w:tcPr>
+          <w:p>
+            <w:r>
+              <w:t>Trivy</w:t>
+            </w:r>
+          </w:p>
+        </w:tc>
+        <w:tc>
+          <w:tcPr>
+            <w:tcW w:type="dxa" w:w="3213"/>
+          </w:tcPr>
+          <w:p>
+            <w:r>
+              <w:t>Quét image (SCA)</w:t>
+            </w:r>
+          </w:p>
+        </w:tc>
+        <w:tc>
+          <w:tcPr>
+            <w:tcW w:type="dxa" w:w="3213"/>
+          </w:tcPr>
+          <w:p>
+            <w:r>
+              <w:t xml:space="preserve">Quét CVE dependency + secret + misconfig trên </w:t>
+            </w:r>
+            <w:r>
+              <w:rPr>
+                <w:b/>
+              </w:rPr>
+              <w:t>image đã build</w:t>
+            </w:r>
+            <w:r>
+              <w:t xml:space="preserve"> (pha Release); bổ sung mảng SCA mà các công cụ trên không có</w:t>
+            </w:r>
+          </w:p>
+        </w:tc>
+      </w:tr>
+      <w:tr>
+        <w:tc>
+          <w:tcPr>
+            <w:tcW w:type="dxa" w:w="3213"/>
+          </w:tcPr>
+          <w:p>
+            <w:r>
+              <w:t>Dockle</w:t>
+            </w:r>
+          </w:p>
+        </w:tc>
+        <w:tc>
+          <w:tcPr>
+            <w:tcW w:type="dxa" w:w="3213"/>
+          </w:tcPr>
+          <w:p>
+            <w:r>
+              <w:t>Lint image (CIS)</w:t>
+            </w:r>
+          </w:p>
+        </w:tc>
+        <w:tc>
+          <w:tcPr>
+            <w:tcW w:type="dxa" w:w="3213"/>
+          </w:tcPr>
+          <w:p>
+            <w:r>
+              <w:t xml:space="preserve">Kiểm cấu hình </w:t>
+            </w:r>
+            <w:r>
+              <w:rPr>
+                <w:b/>
+              </w:rPr>
+              <w:t>image sau build</w:t>
+            </w:r>
+            <w:r>
+              <w:t xml:space="preserve"> theo CIS Docker — bắt secret bị bake vào layer, thiếu HEALTHCHECK, user hiệu lực (pha Release)</w:t>
+            </w:r>
+          </w:p>
+        </w:tc>
+      </w:tr>
+      <w:tr>
+        <w:tc>
+          <w:tcPr>
+            <w:tcW w:type="dxa" w:w="3213"/>
+          </w:tcPr>
+          <w:p>
+            <w:r>
+              <w:t>Prometheus + Grafana</w:t>
+            </w:r>
+          </w:p>
+        </w:tc>
+        <w:tc>
+          <w:tcPr>
+            <w:tcW w:type="dxa" w:w="3213"/>
+          </w:tcPr>
+          <w:p>
+            <w:r>
+              <w:t>Giám sát (Operate)</w:t>
+            </w:r>
+          </w:p>
+        </w:tc>
+        <w:tc>
+          <w:tcPr>
+            <w:tcW w:type="dxa" w:w="3213"/>
+          </w:tcPr>
+          <w:p>
+            <w:r>
+              <w:t xml:space="preserve">Thu thập </w:t>
+            </w:r>
+            <w:r>
+              <w:rPr>
+                <w:rFonts w:ascii="Consolas" w:hAnsi="Consolas"/>
+                <w:sz w:val="20"/>
+              </w:rPr>
+              <w:t>/metrics</w:t>
+            </w:r>
+            <w:r>
+              <w:t xml:space="preserve"> nội bộ, cảnh báo bất thường, dashboard vận hành</w:t>
             </w:r>
           </w:p>
         </w:tc>
@@ -3287,7 +3468,43 @@
         <w:t>rà soát của con người</w:t>
       </w:r>
       <w:r>
-        <w:t xml:space="preserve"> khẳng định. Chính vì thế, báo cáo kết hợp bốn lớp gồm SAST, kiểm thử động, Policy as Code (build-time) và Compliance as Code (runtime), thay vì trông cậy vào một công cụ duy nhất.</w:t>
+        <w:t xml:space="preserve"> khẳng định. Chính vì thế, báo cáo kết hợp nhiều lớp theo vòng đời thay vì trông cậy vào một công cụ duy nhất: SAST + kiểm thử động trên </w:t>
+      </w:r>
+      <w:r>
+        <w:rPr>
+          <w:b/>
+        </w:rPr>
+        <w:t>mã nguồn</w:t>
+      </w:r>
+      <w:r>
+        <w:t xml:space="preserve"> (pha Code/Test), quét </w:t>
+      </w:r>
+      <w:r>
+        <w:rPr>
+          <w:b/>
+        </w:rPr>
+        <w:t>image</w:t>
+      </w:r>
+      <w:r>
+        <w:t xml:space="preserve"> bằng Trivy/Dockle (pha Release), Policy as Code trên văn bản cấu hình (pha Build/Deploy), Compliance as Code trên </w:t>
+      </w:r>
+      <w:r>
+        <w:rPr>
+          <w:b/>
+        </w:rPr>
+        <w:t>container đang chạy</w:t>
+      </w:r>
+      <w:r>
+        <w:t xml:space="preserve"> (pha Operate) và </w:t>
+      </w:r>
+      <w:r>
+        <w:rPr>
+          <w:b/>
+        </w:rPr>
+        <w:t>giám sát vận hành</w:t>
+      </w:r>
+      <w:r>
+        <w:t xml:space="preserve"> bằng Prometheus/Grafana (pha Operate). Mỗi lớp bắt loại lỗi mà lớp khác không thấy — minh họa ở mục 4.</w:t>
       </w:r>
     </w:p>
     <w:p>
@@ -3303,7 +3520,7 @@
         <w:jc w:val="both"/>
       </w:pPr>
       <w:r>
-        <w:t xml:space="preserve">Các phát hiện được đối chiếu với các tiêu chuẩn và nguyên tắc tham chiếu; ngưỡng và luật cụ thể do nhóm thiết kế cho môi trường lab. Báo cáo dùng </w:t>
+        <w:t xml:space="preserve">Báo cáo đối chiếu </w:t>
       </w:r>
       <w:r>
         <w:rPr>
@@ -3312,7 +3529,62 @@
         <w:t>song song</w:t>
       </w:r>
       <w:r>
-        <w:t xml:space="preserve"> khung quốc tế và pháp luật Việt Nam về bảo vệ dữ liệu cá nhân.</w:t>
+        <w:t xml:space="preserve"> khung quốc tế và pháp luật Việt Nam về bảo vệ dữ liệu cá nhân; ngưỡng và luật Rego cụ thể do nhóm thiết kế cho môi trường lab. Phần thân chỉ ghi </w:t>
+      </w:r>
+      <w:r>
+        <w:rPr>
+          <w:b/>
+        </w:rPr>
+        <w:t>mã điều khoản</w:t>
+      </w:r>
+      <w:r>
+        <w:t xml:space="preserve"> — </w:t>
+      </w:r>
+      <w:r>
+        <w:rPr>
+          <w:b/>
+        </w:rPr>
+        <w:t>ý nghĩa (yêu cầu gì) của mọi điều khoản tra tại Phụ lục C</w:t>
+      </w:r>
+      <w:r>
+        <w:t>.</w:t>
+      </w:r>
+    </w:p>
+    <w:p>
+      <w:pPr>
+        <w:pStyle w:val="ListBullet"/>
+      </w:pPr>
+      <w:r>
+        <w:rPr>
+          <w:b/>
+        </w:rPr>
+        <w:t>Quốc tế:</w:t>
+      </w:r>
+      <w:r>
+        <w:t xml:space="preserve"> GDPR (EU) 2016/679 — Điều 5, 25, 32; PCI-DSS — Yêu cầu 2.2, 3.4, 8.2.1; OWASP Top 10 2021 &amp; CWE — A03/CWE-89 (F01), A01/CWE-158 + CWE-180 (F02), A02/CWE-327 (băm MD5); CIS Docker Benchmark — 4.1, 4.9, 4.10, 5.3, 5.4, 5.8, 5.12 (F04); OCI image-spec, NIST SP 800-190, NIST SSDF (SP 800-218), SLSA (chuỗi cung ứng — chỉ </w:t>
+      </w:r>
+      <w:r>
+        <w:rPr>
+          <w:i/>
+        </w:rPr>
+        <w:t>tham chiếu</w:t>
+      </w:r>
+      <w:r>
+        <w:t>, không tuyên bố đạt mức).</w:t>
+      </w:r>
+    </w:p>
+    <w:p>
+      <w:pPr>
+        <w:pStyle w:val="ListBullet"/>
+      </w:pPr>
+      <w:r>
+        <w:rPr>
+          <w:b/>
+        </w:rPr>
+        <w:t>Việt Nam:</w:t>
+      </w:r>
+      <w:r>
+        <w:t xml:space="preserve"> Luật Bảo vệ dữ liệu cá nhân 91/2025/QH15 — Điều 3 (hiệu lực 01/01/2026); Nghị định 356/2025/NĐ-CP — Điều 9, 12 (thay NĐ 13/2023/NĐ-CP từ 01/01/2026); Luật An toàn thông tin mạng 2015 (86/2015/QH13) — Điều 16, 17, 19; TCVN 11930:2017.</w:t>
       </w:r>
     </w:p>
     <w:p>
@@ -3320,371 +3592,34 @@
         <w:jc w:val="both"/>
       </w:pPr>
       <w:r>
+        <w:t xml:space="preserve">Hai lưu ý về hiệu lực: PCI-DSS v3.2.1 đã </w:t>
+      </w:r>
+      <w:r>
         <w:rPr>
           <w:b/>
         </w:rPr>
-        <w:t>Quốc tế:</w:t>
-      </w:r>
-    </w:p>
-    <w:p>
-      <w:pPr>
-        <w:pStyle w:val="ListBullet"/>
-      </w:pPr>
+        <w:t>nghỉ từ 31/3/2024</w:t>
+      </w:r>
+      <w:r>
+        <w:t xml:space="preserve"> (bản hiện hành v4.0.1, số điều đổi, vd 3.4 → 3.5.1) nên chỉ trích như </w:t>
+      </w:r>
       <w:r>
         <w:rPr>
           <w:b/>
         </w:rPr>
-        <w:t>GDPR</w:t>
-      </w:r>
-      <w:r>
-        <w:t xml:space="preserve"> (Regulation (EU) 2016/679): khung bảo vệ dữ liệu cá nhân; dùng các Điều 5 (nguyên tắc), 25 (bảo vệ ngay từ thiết kế) và 32 (an toàn khi xử lý) làm cơ sở đánh giá dữ liệu cần bảo vệ.</w:t>
-      </w:r>
-    </w:p>
-    <w:p>
-      <w:pPr>
-        <w:pStyle w:val="ListBullet"/>
-      </w:pPr>
-      <w:r>
-        <w:rPr>
-          <w:b/>
-        </w:rPr>
-        <w:t>PCI-DSS v3.2.1</w:t>
-      </w:r>
-      <w:r>
-        <w:t xml:space="preserve">: chuẩn an toàn dữ liệu thẻ thanh toán; Yêu cầu 3.4 (PAN nếu lưu phải ở dạng không đọc được), 8.2.1 (không lưu credential ở dạng đọc được), 2.2 (cấu hình an toàn, đặc quyền tối thiểu). PCI SSC đã cho v3.2.1 </w:t>
+        <w:t>đối chiếu lịch sử</w:t>
+      </w:r>
+      <w:r>
+        <w:t xml:space="preserve">; Nghị định 13/2023/NĐ-CP đã hết hiệu lực nên không dùng làm khung hiện hành. Với dữ liệu giả lập của ứng dụng huấn luyện, báo cáo dùng cách diễn đạt </w:t>
       </w:r>
       <w:r>
         <w:rPr>
           <w:i/>
         </w:rPr>
-        <w:t>nghỉ từ 31/3/2024</w:t>
-      </w:r>
-      <w:r>
-        <w:t xml:space="preserve">; báo cáo trích v3.2.1 như </w:t>
-      </w:r>
-      <w:r>
-        <w:rPr>
-          <w:b/>
-        </w:rPr>
-        <w:t>đối chiếu lịch sử</w:t>
-      </w:r>
-      <w:r>
-        <w:t xml:space="preserve"> (bản hiện hành là v4.0.1, các số điều có thay đổi, ví dụ 3.4 → 3.5.1).</w:t>
-      </w:r>
-    </w:p>
-    <w:p>
-      <w:pPr>
-        <w:pStyle w:val="ListBullet"/>
-      </w:pPr>
-      <w:r>
-        <w:rPr>
-          <w:b/>
-        </w:rPr>
-        <w:t>OWASP Top 10 2021 &amp; CWE</w:t>
-      </w:r>
-      <w:r>
-        <w:t>: phân loại loại lỗi — A03 Injection/CWE-89 (F01 SQL injection ở đăng nhập); A01 Broken Access Control/CWE-158 Poison Null Byte (F02 ở route tải tệp).</w:t>
-      </w:r>
-    </w:p>
-    <w:p>
-      <w:pPr>
-        <w:pStyle w:val="ListBullet"/>
-      </w:pPr>
-      <w:r>
-        <w:rPr>
-          <w:b/>
-        </w:rPr>
-        <w:t>CIS Docker Benchmark</w:t>
-      </w:r>
-      <w:r>
-        <w:t xml:space="preserve">: chuẩn cấu hình container an toàn — mục 4.1 (non-root), 4.9 (COPY thay ADD), 4.10 (không nhúng secret), 5.8 (hạn chế cổng) dùng cho F04. </w:t>
-      </w:r>
-      <w:r>
-        <w:rPr>
-          <w:i/>
-        </w:rPr>
-        <w:t>Lưu ý:</w:t>
-      </w:r>
-      <w:r>
-        <w:t xml:space="preserve"> mục 4.5 là </w:t>
-      </w:r>
-      <w:r>
-        <w:rPr>
-          <w:b/>
-        </w:rPr>
-        <w:t>Content Trust</w:t>
-      </w:r>
-      <w:r>
-        <w:t xml:space="preserve"> (bật chữ ký số ảnh) — khác với </w:t>
-      </w:r>
-      <w:r>
-        <w:rPr>
-          <w:i/>
-        </w:rPr>
-        <w:t>ghim digest</w:t>
-      </w:r>
-      <w:r>
-        <w:t xml:space="preserve">; việc ghim digest/tránh </w:t>
-      </w:r>
-      <w:r>
-        <w:rPr>
-          <w:rFonts w:ascii="Consolas" w:hAnsi="Consolas"/>
-          <w:sz w:val="20"/>
-        </w:rPr>
-        <w:t>:latest</w:t>
-      </w:r>
-      <w:r>
-        <w:t xml:space="preserve"> thuộc nhóm quản lý ảnh nền (§4), không phải 4.5.</w:t>
-      </w:r>
-    </w:p>
-    <w:p>
-      <w:pPr>
-        <w:pStyle w:val="ListBullet"/>
-      </w:pPr>
-      <w:r>
-        <w:rPr>
-          <w:b/>
-        </w:rPr>
-        <w:t>OCI image-spec / NIST SP 800-190 / NIST SSDF (SP 800-218) / SLSA</w:t>
-      </w:r>
-      <w:r>
-        <w:t xml:space="preserve">: định dạng và metadata nguồn gốc image, an toàn container và chuỗi cung ứng phần mềm (F04). Báo cáo dùng các khung này để </w:t>
-      </w:r>
-      <w:r>
-        <w:rPr>
-          <w:i/>
-        </w:rPr>
-        <w:t>tham chiếu</w:t>
-      </w:r>
-      <w:r>
-        <w:t>, không tuyên bố đạt mức cụ thể (ví dụ SLSA).</w:t>
-      </w:r>
-    </w:p>
-    <w:p>
-      <w:pPr>
-        <w:jc w:val="both"/>
-      </w:pPr>
-      <w:r>
-        <w:rPr>
-          <w:b/>
-        </w:rPr>
-        <w:t>Việt Nam:</w:t>
-      </w:r>
-    </w:p>
-    <w:p>
-      <w:pPr>
-        <w:pStyle w:val="ListBullet"/>
-      </w:pPr>
-      <w:r>
-        <w:rPr>
-          <w:b/>
-        </w:rPr>
-        <w:t>Luật Bảo vệ dữ liệu cá nhân 91/2025/QH15</w:t>
-      </w:r>
-      <w:r>
-        <w:t xml:space="preserve"> (Quốc hội thông qua 26/6/2025, </w:t>
-      </w:r>
-      <w:r>
-        <w:rPr>
-          <w:b/>
-        </w:rPr>
-        <w:t>hiệu lực 01/01/2026</w:t>
-      </w:r>
-      <w:r>
-        <w:t xml:space="preserve">): </w:t>
-      </w:r>
-      <w:r>
-        <w:rPr>
-          <w:b/>
-        </w:rPr>
-        <w:t>Điều 3</w:t>
-      </w:r>
-      <w:r>
-        <w:t xml:space="preserve"> — nguyên tắc bảo vệ dữ liệu cá nhân (hợp pháp, đúng mục đích, chính xác, </w:t>
-      </w:r>
-      <w:r>
-        <w:rPr>
-          <w:i/>
-        </w:rPr>
-        <w:t>bảo mật – an toàn</w:t>
-      </w:r>
-      <w:r>
-        <w:t>). Đây là văn bản luật hiện hành, nâng khung bảo vệ dữ liệu cá nhân từ cấp nghị định lên cấp luật. Tương ứng GDPR Điều 5.</w:t>
-      </w:r>
-    </w:p>
-    <w:p>
-      <w:pPr>
-        <w:pStyle w:val="ListBullet"/>
-      </w:pPr>
-      <w:r>
-        <w:rPr>
-          <w:b/>
-        </w:rPr>
-        <w:t>Nghị định 356/2025/NĐ-CP</w:t>
-      </w:r>
-      <w:r>
-        <w:t xml:space="preserve"> (hiệu lực 01/01/2026, </w:t>
-      </w:r>
-      <w:r>
-        <w:rPr>
-          <w:b/>
-        </w:rPr>
-        <w:t>thay thế Nghị định 13/2023/NĐ-CP</w:t>
-      </w:r>
-      <w:r>
-        <w:t xml:space="preserve">): quy định chi tiết biện pháp bảo vệ dữ liệu cá nhân gồm biện pháp </w:t>
-      </w:r>
-      <w:r>
-        <w:rPr>
-          <w:i/>
-        </w:rPr>
-        <w:t>quản lý</w:t>
-      </w:r>
-      <w:r>
-        <w:t xml:space="preserve"> và </w:t>
-      </w:r>
-      <w:r>
-        <w:rPr>
-          <w:i/>
-        </w:rPr>
-        <w:t>kỹ thuật</w:t>
-      </w:r>
-      <w:r>
-        <w:t xml:space="preserve"> (mã hóa, xác thực nhiều yếu tố, kiểm soát truy cập, giám sát liên tục, đánh giá an toàn định kỳ), trong đó </w:t>
-      </w:r>
-      <w:r>
-        <w:rPr>
-          <w:b/>
-        </w:rPr>
-        <w:t>Điều 12</w:t>
-      </w:r>
-      <w:r>
-        <w:t xml:space="preserve"> nêu bảo vệ dữ liệu cá nhân trong </w:t>
-      </w:r>
-      <w:r>
-        <w:rPr>
-          <w:i/>
-        </w:rPr>
-        <w:t>điện toán đám mây</w:t>
-      </w:r>
-      <w:r>
-        <w:t xml:space="preserve"> — liên quan trực tiếp khâu triển khai container (F03/F04). Tương ứng GDPR Điều 25/32.</w:t>
-      </w:r>
-    </w:p>
-    <w:p>
-      <w:pPr>
-        <w:pStyle w:val="ListBullet"/>
-      </w:pPr>
-      <w:r>
-        <w:rPr>
-          <w:b/>
-        </w:rPr>
-        <w:t>Luật An toàn thông tin mạng 2015 (86/2015/QH13)</w:t>
-      </w:r>
-      <w:r>
-        <w:t xml:space="preserve"> (còn hiệu lực): </w:t>
-      </w:r>
-      <w:r>
-        <w:rPr>
-          <w:b/>
-        </w:rPr>
-        <w:t>Điều 16</w:t>
-      </w:r>
-      <w:r>
-        <w:t xml:space="preserve"> — nguyên tắc bảo vệ thông tin cá nhân; </w:t>
-      </w:r>
-      <w:r>
-        <w:rPr>
-          <w:b/>
-        </w:rPr>
-        <w:t>Điều 17</w:t>
-      </w:r>
-      <w:r>
-        <w:t xml:space="preserve"> — không chia sẻ thông tin cá nhân cho bên thứ ba khi chưa được đồng ý (liên quan F02/F03); </w:t>
-      </w:r>
-      <w:r>
-        <w:rPr>
-          <w:b/>
-        </w:rPr>
-        <w:t>Điều 19</w:t>
-      </w:r>
-      <w:r>
-        <w:t xml:space="preserve"> — bảo đảm an toàn thông tin cá nhân bằng biện pháp quản lý, kỹ thuật và </w:t>
-      </w:r>
-      <w:r>
-        <w:rPr>
-          <w:i/>
-        </w:rPr>
-        <w:t>tuân thủ tiêu chuẩn, quy chuẩn kỹ thuật</w:t>
-      </w:r>
-      <w:r>
-        <w:t>.</w:t>
-      </w:r>
-    </w:p>
-    <w:p>
-      <w:pPr>
-        <w:pStyle w:val="ListBullet"/>
-      </w:pPr>
-      <w:r>
-        <w:rPr>
-          <w:b/>
-        </w:rPr>
-        <w:t>TCVN 11930:2017</w:t>
-      </w:r>
-      <w:r>
-        <w:t xml:space="preserve"> — tiêu chuẩn kỹ thuật quốc gia </w:t>
-      </w:r>
-      <w:r>
-        <w:rPr>
-          <w:i/>
-        </w:rPr>
-        <w:t>Yêu cầu cơ bản về an toàn hệ thống thông tin theo cấp độ</w:t>
-      </w:r>
-      <w:r>
-        <w:t>, làm cơ sở kỹ thuật cho cấu hình triển khai tối thiểu (F03/F04).</w:t>
-      </w:r>
-    </w:p>
-    <w:p>
-      <w:pPr>
-        <w:jc w:val="both"/>
-      </w:pPr>
-      <w:r>
-        <w:t xml:space="preserve">Nghị định 13/2023/NĐ-CP (tiền nhiệm) hết hiệu lực từ 01/01/2026 nên không dùng làm khung hiện hành. Với dữ liệu giả lập của ứng dụng huấn luyện, báo cáo dùng cách diễn đạt </w:t>
-      </w:r>
-      <w:r>
-        <w:rPr>
-          <w:i/>
-        </w:rPr>
         <w:t>"đối chiếu nguyên tắc bảo vệ"</w:t>
       </w:r>
       <w:r>
         <w:t xml:space="preserve"> thay cho kết luận vi phạm pháp luật hay chứng nhận tuân thủ.</w:t>
-      </w:r>
-    </w:p>
-    <w:p>
-      <w:pPr>
-        <w:jc w:val="both"/>
-      </w:pPr>
-      <w:r>
-        <w:t>Ý nghĩa cụ thể (</w:t>
-      </w:r>
-      <w:r>
-        <w:rPr>
-          <w:b/>
-        </w:rPr>
-        <w:t>yêu cầu gì</w:t>
-      </w:r>
-      <w:r>
-        <w:t xml:space="preserve">) của mỗi điều khoản tham chiếu được tóm gọn trong </w:t>
-      </w:r>
-      <w:r>
-        <w:rPr>
-          <w:b/>
-        </w:rPr>
-        <w:t>Phụ lục C</w:t>
-      </w:r>
-      <w:r>
-        <w:t xml:space="preserve"> (bảng tra). Phần thân chỉ ghi mã điều khoản trong các bảng và các mục, còn ý nghĩa thì tra ở Phụ lục C.</w:t>
       </w:r>
     </w:p>
     <w:p>
@@ -3766,7 +3701,16 @@
         <w:jc w:val="both"/>
       </w:pPr>
       <w:r>
-        <w:t>Ba lớp kiểm soát trong hình:</w:t>
+        <w:t xml:space="preserve">Các lớp kiểm soát, xếp theo </w:t>
+      </w:r>
+      <w:r>
+        <w:rPr>
+          <w:b/>
+        </w:rPr>
+        <w:t>pha vòng đời</w:t>
+      </w:r>
+      <w:r>
+        <w:t xml:space="preserve"> (mỗi lớp bắt loại lỗi lớp khác không thấy):</w:t>
       </w:r>
     </w:p>
     <w:p>
@@ -3777,7 +3721,7 @@
         <w:rPr>
           <w:b/>
         </w:rPr>
-        <w:t>Security as Code:</w:t>
+        <w:t>Security as Code (Code/Test):</w:t>
       </w:r>
       <w:r>
         <w:t xml:space="preserve"> quét secret (Gitleaks), SAST (Semgrep) cho F01/F02, và kiểm thử bảo mật </w:t>
@@ -3801,10 +3745,10 @@
         <w:rPr>
           <w:b/>
         </w:rPr>
-        <w:t>Policy as Code (build-time):</w:t>
-      </w:r>
-      <w:r>
-        <w:t xml:space="preserve"> luật Rego cho Dockerfile (F04) và cho </w:t>
+        <w:t>Policy as Code (Build/Deploy):</w:t>
+      </w:r>
+      <w:r>
+        <w:t xml:space="preserve"> luật Rego cho Dockerfile (F04) và </w:t>
       </w:r>
       <w:r>
         <w:rPr>
@@ -3814,7 +3758,7 @@
         <w:t>docker-compose</w:t>
       </w:r>
       <w:r>
-        <w:t xml:space="preserve"> (F03), chặn ngay những cấu hình mở cổng backend hoặc chạy root </w:t>
+        <w:t xml:space="preserve"> (F03), chặn ngay cấu hình mở cổng backend hoặc chạy root </w:t>
       </w:r>
       <w:r>
         <w:rPr>
@@ -3823,7 +3767,16 @@
         <w:t>trước khi triển khai</w:t>
       </w:r>
       <w:r>
-        <w:t>.</w:t>
+        <w:t xml:space="preserve"> — đọc </w:t>
+      </w:r>
+      <w:r>
+        <w:rPr>
+          <w:i/>
+        </w:rPr>
+        <w:t>văn bản</w:t>
+      </w:r>
+      <w:r>
+        <w:t xml:space="preserve"> cấu hình.</w:t>
       </w:r>
     </w:p>
     <w:p>
@@ -3834,10 +3787,51 @@
         <w:rPr>
           <w:b/>
         </w:rPr>
-        <w:t>Compliance as Code (runtime):</w:t>
-      </w:r>
-      <w:r>
-        <w:t xml:space="preserve"> kiểm tra </w:t>
+        <w:t>Quét image (Release):</w:t>
+      </w:r>
+      <w:r>
+        <w:t xml:space="preserve"> </w:t>
+      </w:r>
+      <w:r>
+        <w:rPr>
+          <w:b/>
+        </w:rPr>
+        <w:t>Trivy</w:t>
+      </w:r>
+      <w:r>
+        <w:t xml:space="preserve"> quét CVE dependency (SCA) và </w:t>
+      </w:r>
+      <w:r>
+        <w:rPr>
+          <w:b/>
+        </w:rPr>
+        <w:t>Dockle</w:t>
+      </w:r>
+      <w:r>
+        <w:t xml:space="preserve"> lint cấu hình image theo CIS trên </w:t>
+      </w:r>
+      <w:r>
+        <w:rPr>
+          <w:b/>
+        </w:rPr>
+        <w:t>image đã build</w:t>
+      </w:r>
+      <w:r>
+        <w:t xml:space="preserve"> — bắt lỗ hổng thư viện và secret bị bake vào layer mà quét văn bản không thấy (mục 4.1).</w:t>
+      </w:r>
+    </w:p>
+    <w:p>
+      <w:pPr>
+        <w:pStyle w:val="ListBullet"/>
+      </w:pPr>
+      <w:r>
+        <w:rPr>
+          <w:b/>
+        </w:rPr>
+        <w:t>Compliance as Code (Operate):</w:t>
+      </w:r>
+      <w:r>
+        <w:t xml:space="preserve"> kiểm </w:t>
       </w:r>
       <w:r>
         <w:rPr>
@@ -3856,36 +3850,67 @@
         <w:t>docker inspect</w:t>
       </w:r>
       <w:r>
-        <w:t xml:space="preserve"> cùng luật Rego runtime (</w:t>
+        <w:t xml:space="preserve"> + luật Rego runtime, xác nhận non-root, drop capability, chỉ proxy mở cổng loopback. Đặt container đối chứng (trước vá) cạnh bản triển khai (sau vá) tạo đúng cặp ca </w:t>
+      </w:r>
+      <w:r>
+        <w:rPr>
+          <w:i/>
+        </w:rPr>
+        <w:t>lỗi cố ý / đạt</w:t>
+      </w:r>
+      <w:r>
+        <w:t>.</w:t>
+      </w:r>
+    </w:p>
+    <w:p>
+      <w:pPr>
+        <w:pStyle w:val="ListBullet"/>
+      </w:pPr>
+      <w:r>
+        <w:rPr>
+          <w:b/>
+        </w:rPr>
+        <w:t>Giám sát vận hành (Operate):</w:t>
+      </w:r>
+      <w:r>
+        <w:t xml:space="preserve"> </w:t>
+      </w:r>
+      <w:r>
+        <w:rPr>
+          <w:b/>
+        </w:rPr>
+        <w:t>Prometheus</w:t>
+      </w:r>
+      <w:r>
+        <w:t xml:space="preserve"> scrape </w:t>
       </w:r>
       <w:r>
         <w:rPr>
           <w:rFonts w:ascii="Consolas" w:hAnsi="Consolas"/>
           <w:sz w:val="20"/>
         </w:rPr>
-        <w:t>report/policy/runtime.rego</w:t>
-      </w:r>
-      <w:r>
-        <w:t xml:space="preserve">, </w:t>
-      </w:r>
-      <w:r>
-        <w:rPr>
-          <w:rFonts w:ascii="Consolas" w:hAnsi="Consolas"/>
-          <w:sz w:val="20"/>
-        </w:rPr>
-        <w:t>checks/hardening.py</w:t>
-      </w:r>
-      <w:r>
-        <w:t xml:space="preserve">), xác nhận non-root, drop capability và chỉ proxy mở cổng loopback. Việc đặt container đối chứng (trước vá) cạnh bản triển khai (sau vá) tạo thành đúng cặp ca </w:t>
-      </w:r>
-      <w:r>
-        <w:rPr>
-          <w:i/>
-        </w:rPr>
-        <w:t>lỗi cố ý / đạt</w:t>
-      </w:r>
-      <w:r>
-        <w:t xml:space="preserve"> của một bài kiểm tra tuân thủ.</w:t>
+        <w:t>/metrics</w:t>
+      </w:r>
+      <w:r>
+        <w:t xml:space="preserve"> nội bộ, </w:t>
+      </w:r>
+      <w:r>
+        <w:rPr>
+          <w:b/>
+        </w:rPr>
+        <w:t>Grafana</w:t>
+      </w:r>
+      <w:r>
+        <w:t xml:space="preserve"> dashboard, và </w:t>
+      </w:r>
+      <w:r>
+        <w:rPr>
+          <w:b/>
+        </w:rPr>
+        <w:t>cảnh báo</w:t>
+      </w:r>
+      <w:r>
+        <w:t xml:space="preserve"> khi có bất thường (vd đột biến 4XX do dò đăng nhập) — mục 4.3.</w:t>
       </w:r>
     </w:p>
     <w:p>
@@ -4450,7 +4475,7 @@
           </w:tcPr>
           <w:p>
             <w:r>
-              <w:t>Compliance as Code — runtime</w:t>
+              <w:t>Quét image — CVE (SCA)</w:t>
             </w:r>
           </w:p>
         </w:tc>
@@ -4460,14 +4485,7 @@
           </w:tcPr>
           <w:p>
             <w:r>
-              <w:t xml:space="preserve">Conftest + </w:t>
-            </w:r>
-            <w:r>
-              <w:rPr>
-                <w:rFonts w:ascii="Consolas" w:hAnsi="Consolas"/>
-                <w:sz w:val="20"/>
-              </w:rPr>
-              <w:t>docker inspect</w:t>
+              <w:t>Trivy</w:t>
             </w:r>
           </w:p>
         </w:tc>
@@ -4477,7 +4495,7 @@
           </w:tcPr>
           <w:p>
             <w:r>
-              <w:t>F03, F04 (container đang chạy)</w:t>
+              <w:t>lỗ hổng dependency + secret trong image</w:t>
             </w:r>
           </w:p>
         </w:tc>
@@ -4487,7 +4505,165 @@
           </w:tcPr>
           <w:p>
             <w:r>
+              <w:rPr>
+                <w:i/>
+              </w:rPr>
+              <w:t>phát hiện</w:t>
+            </w:r>
+            <w:r>
+              <w:t xml:space="preserve"> — 189 CVE (12 CRITICAL, 56 HIGH); </w:t>
+            </w:r>
+            <w:r>
+              <w:rPr>
+                <w:rFonts w:ascii="Consolas" w:hAnsi="Consolas"/>
+                <w:sz w:val="20"/>
+              </w:rPr>
+              <w:t>--exit-code 1</w:t>
+            </w:r>
+            <w:r>
+              <w:t xml:space="preserve"> đủ làm cổng</w:t>
+            </w:r>
+          </w:p>
+        </w:tc>
+      </w:tr>
+      <w:tr>
+        <w:tc>
+          <w:tcPr>
+            <w:tcW w:type="dxa" w:w="2409"/>
+          </w:tcPr>
+          <w:p>
+            <w:r>
+              <w:t>Quét image — CIS</w:t>
+            </w:r>
+          </w:p>
+        </w:tc>
+        <w:tc>
+          <w:tcPr>
+            <w:tcW w:type="dxa" w:w="2409"/>
+          </w:tcPr>
+          <w:p>
+            <w:r>
+              <w:t>Dockle</w:t>
+            </w:r>
+          </w:p>
+        </w:tc>
+        <w:tc>
+          <w:tcPr>
+            <w:tcW w:type="dxa" w:w="2409"/>
+          </w:tcPr>
+          <w:p>
+            <w:r>
+              <w:t>cấu hình image sau build (secret, HEALTHCHECK, user)</w:t>
+            </w:r>
+          </w:p>
+        </w:tc>
+        <w:tc>
+          <w:tcPr>
+            <w:tcW w:type="dxa" w:w="2409"/>
+          </w:tcPr>
+          <w:p>
+            <w:r>
+              <w:t>exit≠0 khi có FATAL; bắt secret bake vào layer mà Conftest không thấy</w:t>
+            </w:r>
+          </w:p>
+        </w:tc>
+      </w:tr>
+      <w:tr>
+        <w:tc>
+          <w:tcPr>
+            <w:tcW w:type="dxa" w:w="2409"/>
+          </w:tcPr>
+          <w:p>
+            <w:r>
+              <w:t>Compliance as Code — runtime</w:t>
+            </w:r>
+          </w:p>
+        </w:tc>
+        <w:tc>
+          <w:tcPr>
+            <w:tcW w:type="dxa" w:w="2409"/>
+          </w:tcPr>
+          <w:p>
+            <w:r>
+              <w:t xml:space="preserve">Conftest + </w:t>
+            </w:r>
+            <w:r>
+              <w:rPr>
+                <w:rFonts w:ascii="Consolas" w:hAnsi="Consolas"/>
+                <w:sz w:val="20"/>
+              </w:rPr>
+              <w:t>docker inspect</w:t>
+            </w:r>
+          </w:p>
+        </w:tc>
+        <w:tc>
+          <w:tcPr>
+            <w:tcW w:type="dxa" w:w="2409"/>
+          </w:tcPr>
+          <w:p>
+            <w:r>
+              <w:t>F03, F04 (container đang chạy)</w:t>
+            </w:r>
+          </w:p>
+        </w:tc>
+        <w:tc>
+          <w:tcPr>
+            <w:tcW w:type="dxa" w:w="2409"/>
+          </w:tcPr>
+          <w:p>
+            <w:r>
               <w:t>đối chứng runtime, không dùng để chặn phát hành</w:t>
+            </w:r>
+          </w:p>
+        </w:tc>
+      </w:tr>
+      <w:tr>
+        <w:tc>
+          <w:tcPr>
+            <w:tcW w:type="dxa" w:w="2409"/>
+          </w:tcPr>
+          <w:p>
+            <w:r>
+              <w:t>Giám sát vận hành</w:t>
+            </w:r>
+          </w:p>
+        </w:tc>
+        <w:tc>
+          <w:tcPr>
+            <w:tcW w:type="dxa" w:w="2409"/>
+          </w:tcPr>
+          <w:p>
+            <w:r>
+              <w:t>Prometheus + Grafana</w:t>
+            </w:r>
+          </w:p>
+        </w:tc>
+        <w:tc>
+          <w:tcPr>
+            <w:tcW w:type="dxa" w:w="2409"/>
+          </w:tcPr>
+          <w:p>
+            <w:r>
+              <w:t>bất thường runtime (đột biến 4XX)</w:t>
+            </w:r>
+          </w:p>
+        </w:tc>
+        <w:tc>
+          <w:tcPr>
+            <w:tcW w:type="dxa" w:w="2409"/>
+          </w:tcPr>
+          <w:p>
+            <w:r>
+              <w:t xml:space="preserve">thu thập + </w:t>
+            </w:r>
+            <w:r>
+              <w:rPr>
+                <w:b/>
+              </w:rPr>
+              <w:t>cảnh báo fire thật</w:t>
+            </w:r>
+            <w:r>
+              <w:t xml:space="preserve"> khi mô phỏng dò đăng nhập; không dùng để chặn phát hành</w:t>
             </w:r>
           </w:p>
         </w:tc>
@@ -4499,7 +4675,7 @@
         <w:jc w:val="both"/>
       </w:pPr>
       <w:r>
-        <w:t>Quy trình được tổ chức thành bảy bước nối tiếp theo vòng đời DevSecOps, mỗi bước gắn với một nhóm công cụ kiểm soát cụ thể:</w:t>
+        <w:t>Quy trình được tổ chức thành các bước nối tiếp theo vòng đời DevSecOps, mỗi bước gắn với một nhóm công cụ kiểm soát cụ thể và một pha:</w:t>
       </w:r>
     </w:p>
     <w:p>
@@ -4511,7 +4687,7 @@
           <w:i/>
           <w:sz w:val="22"/>
         </w:rPr>
-        <w:t>Bảng 9. Bảy bước của quy trình DevSecOps áp dụng</w:t>
+        <w:t>Bảng 9. Các bước của quy trình DevSecOps áp dụng (theo pha)</w:t>
       </w:r>
     </w:p>
     <w:tbl>
@@ -4522,14 +4698,15 @@
         <w:tblLook w:firstColumn="1" w:firstRow="1" w:lastColumn="0" w:lastRow="0" w:noHBand="0" w:noVBand="1" w:val="04A0"/>
       </w:tblPr>
       <w:tblGrid>
-        <w:gridCol w:w="3213"/>
-        <w:gridCol w:w="3213"/>
-        <w:gridCol w:w="3213"/>
+        <w:gridCol w:w="2409"/>
+        <w:gridCol w:w="2409"/>
+        <w:gridCol w:w="2409"/>
+        <w:gridCol w:w="2409"/>
       </w:tblGrid>
       <w:tr>
         <w:tc>
           <w:tcPr>
-            <w:tcW w:type="dxa" w:w="3213"/>
+            <w:tcW w:type="dxa" w:w="2409"/>
             <w:shd w:val="clear" w:color="auto" w:fill="0B2A4A"/>
           </w:tcPr>
           <w:p>
@@ -4544,7 +4721,22 @@
         </w:tc>
         <w:tc>
           <w:tcPr>
-            <w:tcW w:type="dxa" w:w="3213"/>
+            <w:tcW w:type="dxa" w:w="2409"/>
+            <w:shd w:val="clear" w:color="auto" w:fill="0B2A4A"/>
+          </w:tcPr>
+          <w:p>
+            <w:r>
+              <w:rPr>
+                <w:b/>
+                <w:color w:val="FFFFFF"/>
+              </w:rPr>
+              <w:t>Pha</w:t>
+            </w:r>
+          </w:p>
+        </w:tc>
+        <w:tc>
+          <w:tcPr>
+            <w:tcW w:type="dxa" w:w="2409"/>
             <w:shd w:val="clear" w:color="auto" w:fill="0B2A4A"/>
           </w:tcPr>
           <w:p>
@@ -4559,7 +4751,7 @@
         </w:tc>
         <w:tc>
           <w:tcPr>
-            <w:tcW w:type="dxa" w:w="3213"/>
+            <w:tcW w:type="dxa" w:w="2409"/>
             <w:shd w:val="clear" w:color="auto" w:fill="0B2A4A"/>
           </w:tcPr>
           <w:p>
@@ -4576,7 +4768,7 @@
       <w:tr>
         <w:tc>
           <w:tcPr>
-            <w:tcW w:type="dxa" w:w="3213"/>
+            <w:tcW w:type="dxa" w:w="2409"/>
           </w:tcPr>
           <w:p>
             <w:r>
@@ -4586,17 +4778,27 @@
         </w:tc>
         <w:tc>
           <w:tcPr>
-            <w:tcW w:type="dxa" w:w="3213"/>
+            <w:tcW w:type="dxa" w:w="2409"/>
           </w:tcPr>
           <w:p>
             <w:r>
-              <w:t>Dựng hai môi trường trước/sau vá bằng Docker</w:t>
+              <w:t>—</w:t>
             </w:r>
           </w:p>
         </w:tc>
         <w:tc>
           <w:tcPr>
-            <w:tcW w:type="dxa" w:w="3213"/>
+            <w:tcW w:type="dxa" w:w="2409"/>
+          </w:tcPr>
+          <w:p>
+            <w:r>
+              <w:t>Dựng hai môi trường trước/sau vá bằng Docker</w:t>
+            </w:r>
+          </w:p>
+        </w:tc>
+        <w:tc>
+          <w:tcPr>
+            <w:tcW w:type="dxa" w:w="2409"/>
           </w:tcPr>
           <w:p>
             <w:r>
@@ -4608,7 +4810,7 @@
       <w:tr>
         <w:tc>
           <w:tcPr>
-            <w:tcW w:type="dxa" w:w="3213"/>
+            <w:tcW w:type="dxa" w:w="2409"/>
           </w:tcPr>
           <w:p>
             <w:r>
@@ -4618,17 +4820,27 @@
         </w:tc>
         <w:tc>
           <w:tcPr>
-            <w:tcW w:type="dxa" w:w="3213"/>
+            <w:tcW w:type="dxa" w:w="2409"/>
           </w:tcPr>
           <w:p>
             <w:r>
-              <w:t>Kiểm chính sách Dockerfile và compose trước khi triển khai</w:t>
+              <w:t>Build/Deploy</w:t>
             </w:r>
           </w:p>
         </w:tc>
         <w:tc>
           <w:tcPr>
-            <w:tcW w:type="dxa" w:w="3213"/>
+            <w:tcW w:type="dxa" w:w="2409"/>
+          </w:tcPr>
+          <w:p>
+            <w:r>
+              <w:t>Kiểm chính sách Dockerfile và compose trước khi triển khai</w:t>
+            </w:r>
+          </w:p>
+        </w:tc>
+        <w:tc>
+          <w:tcPr>
+            <w:tcW w:type="dxa" w:w="2409"/>
           </w:tcPr>
           <w:p>
             <w:r>
@@ -4640,27 +4852,37 @@
       <w:tr>
         <w:tc>
           <w:tcPr>
-            <w:tcW w:type="dxa" w:w="3213"/>
+            <w:tcW w:type="dxa" w:w="2409"/>
           </w:tcPr>
           <w:p>
             <w:r>
-              <w:t>3. Phát hiện điểm yếu và đối chiếu quy định</w:t>
+              <w:t>3. Phát hiện điểm yếu mã nguồn</w:t>
             </w:r>
           </w:p>
         </w:tc>
         <w:tc>
           <w:tcPr>
-            <w:tcW w:type="dxa" w:w="3213"/>
+            <w:tcW w:type="dxa" w:w="2409"/>
           </w:tcPr>
           <w:p>
             <w:r>
-              <w:t>Quét tĩnh mã nguồn, ánh xạ sang điều khoản</w:t>
+              <w:t>Code</w:t>
             </w:r>
           </w:p>
         </w:tc>
         <w:tc>
           <w:tcPr>
-            <w:tcW w:type="dxa" w:w="3213"/>
+            <w:tcW w:type="dxa" w:w="2409"/>
+          </w:tcPr>
+          <w:p>
+            <w:r>
+              <w:t>Quét tĩnh mã nguồn, ánh xạ sang điều khoản</w:t>
+            </w:r>
+          </w:p>
+        </w:tc>
+        <w:tc>
+          <w:tcPr>
+            <w:tcW w:type="dxa" w:w="2409"/>
           </w:tcPr>
           <w:p>
             <w:r>
@@ -4672,7 +4894,7 @@
       <w:tr>
         <w:tc>
           <w:tcPr>
-            <w:tcW w:type="dxa" w:w="3213"/>
+            <w:tcW w:type="dxa" w:w="2409"/>
           </w:tcPr>
           <w:p>
             <w:r>
@@ -4682,17 +4904,27 @@
         </w:tc>
         <w:tc>
           <w:tcPr>
-            <w:tcW w:type="dxa" w:w="3213"/>
+            <w:tcW w:type="dxa" w:w="2409"/>
           </w:tcPr>
           <w:p>
             <w:r>
-              <w:t>Viết kiểm thử đỏ trước vá, xanh sau vá</w:t>
+              <w:t>Test</w:t>
             </w:r>
           </w:p>
         </w:tc>
         <w:tc>
           <w:tcPr>
-            <w:tcW w:type="dxa" w:w="3213"/>
+            <w:tcW w:type="dxa" w:w="2409"/>
+          </w:tcPr>
+          <w:p>
+            <w:r>
+              <w:t>Viết kiểm thử đỏ trước vá, xanh sau vá</w:t>
+            </w:r>
+          </w:p>
+        </w:tc>
+        <w:tc>
+          <w:tcPr>
+            <w:tcW w:type="dxa" w:w="2409"/>
           </w:tcPr>
           <w:p>
             <w:r>
@@ -4704,7 +4936,7 @@
       <w:tr>
         <w:tc>
           <w:tcPr>
-            <w:tcW w:type="dxa" w:w="3213"/>
+            <w:tcW w:type="dxa" w:w="2409"/>
           </w:tcPr>
           <w:p>
             <w:r>
@@ -4714,17 +4946,27 @@
         </w:tc>
         <w:tc>
           <w:tcPr>
-            <w:tcW w:type="dxa" w:w="3213"/>
+            <w:tcW w:type="dxa" w:w="2409"/>
           </w:tcPr>
           <w:p>
             <w:r>
-              <w:t>Sửa mã theo kết quả kiểm thử</w:t>
+              <w:t>Code</w:t>
             </w:r>
           </w:p>
         </w:tc>
         <w:tc>
           <w:tcPr>
-            <w:tcW w:type="dxa" w:w="3213"/>
+            <w:tcW w:type="dxa" w:w="2409"/>
+          </w:tcPr>
+          <w:p>
+            <w:r>
+              <w:t>Sửa mã theo kết quả kiểm thử</w:t>
+            </w:r>
+          </w:p>
+        </w:tc>
+        <w:tc>
+          <w:tcPr>
+            <w:tcW w:type="dxa" w:w="2409"/>
           </w:tcPr>
           <w:p>
             <w:r>
@@ -4736,38 +4978,41 @@
       <w:tr>
         <w:tc>
           <w:tcPr>
-            <w:tcW w:type="dxa" w:w="3213"/>
+            <w:tcW w:type="dxa" w:w="2409"/>
           </w:tcPr>
           <w:p>
             <w:r>
-              <w:t>6. Compliance as Code</w:t>
+              <w:t>6. Quét image</w:t>
             </w:r>
           </w:p>
         </w:tc>
         <w:tc>
           <w:tcPr>
-            <w:tcW w:type="dxa" w:w="3213"/>
+            <w:tcW w:type="dxa" w:w="2409"/>
           </w:tcPr>
           <w:p>
             <w:r>
-              <w:t>Kiểm tra cấu hình container tại thời điểm chạy</w:t>
+              <w:t>Release</w:t>
             </w:r>
           </w:p>
         </w:tc>
         <w:tc>
           <w:tcPr>
-            <w:tcW w:type="dxa" w:w="3213"/>
+            <w:tcW w:type="dxa" w:w="2409"/>
           </w:tcPr>
           <w:p>
             <w:r>
-              <w:t xml:space="preserve">Conftest + </w:t>
-            </w:r>
-            <w:r>
-              <w:rPr>
-                <w:rFonts w:ascii="Consolas" w:hAnsi="Consolas"/>
-                <w:sz w:val="20"/>
-              </w:rPr>
-              <w:t>docker inspect</w:t>
+              <w:t>Quét CVE/secret (SCA) và CIS trên image đã build</w:t>
+            </w:r>
+          </w:p>
+        </w:tc>
+        <w:tc>
+          <w:tcPr>
+            <w:tcW w:type="dxa" w:w="2409"/>
+          </w:tcPr>
+          <w:p>
+            <w:r>
+              <w:t>Trivy, Dockle</w:t>
             </w:r>
           </w:p>
         </w:tc>
@@ -4775,27 +5020,138 @@
       <w:tr>
         <w:tc>
           <w:tcPr>
-            <w:tcW w:type="dxa" w:w="3213"/>
+            <w:tcW w:type="dxa" w:w="2409"/>
           </w:tcPr>
           <w:p>
             <w:r>
-              <w:t>7. Kiểm chứng và bàn giao</w:t>
+              <w:t>7. Compliance as Code</w:t>
             </w:r>
           </w:p>
         </w:tc>
         <w:tc>
           <w:tcPr>
-            <w:tcW w:type="dxa" w:w="3213"/>
+            <w:tcW w:type="dxa" w:w="2409"/>
           </w:tcPr>
           <w:p>
             <w:r>
-              <w:t>Chạy lại toàn bộ cổng kiểm soát; quét secret</w:t>
+              <w:t>Operate</w:t>
             </w:r>
           </w:p>
         </w:tc>
         <w:tc>
           <w:tcPr>
-            <w:tcW w:type="dxa" w:w="3213"/>
+            <w:tcW w:type="dxa" w:w="2409"/>
+          </w:tcPr>
+          <w:p>
+            <w:r>
+              <w:t>Kiểm cấu hình container tại thời điểm chạy</w:t>
+            </w:r>
+          </w:p>
+        </w:tc>
+        <w:tc>
+          <w:tcPr>
+            <w:tcW w:type="dxa" w:w="2409"/>
+          </w:tcPr>
+          <w:p>
+            <w:r>
+              <w:t xml:space="preserve">Conftest + </w:t>
+            </w:r>
+            <w:r>
+              <w:rPr>
+                <w:rFonts w:ascii="Consolas" w:hAnsi="Consolas"/>
+                <w:sz w:val="20"/>
+              </w:rPr>
+              <w:t>docker inspect</w:t>
+            </w:r>
+          </w:p>
+        </w:tc>
+      </w:tr>
+      <w:tr>
+        <w:tc>
+          <w:tcPr>
+            <w:tcW w:type="dxa" w:w="2409"/>
+          </w:tcPr>
+          <w:p>
+            <w:r>
+              <w:t>8. Giám sát vận hành</w:t>
+            </w:r>
+          </w:p>
+        </w:tc>
+        <w:tc>
+          <w:tcPr>
+            <w:tcW w:type="dxa" w:w="2409"/>
+          </w:tcPr>
+          <w:p>
+            <w:r>
+              <w:t>Operate</w:t>
+            </w:r>
+          </w:p>
+        </w:tc>
+        <w:tc>
+          <w:tcPr>
+            <w:tcW w:type="dxa" w:w="2409"/>
+          </w:tcPr>
+          <w:p>
+            <w:r>
+              <w:t xml:space="preserve">Thu thập </w:t>
+            </w:r>
+            <w:r>
+              <w:rPr>
+                <w:rFonts w:ascii="Consolas" w:hAnsi="Consolas"/>
+                <w:sz w:val="20"/>
+              </w:rPr>
+              <w:t>/metrics</w:t>
+            </w:r>
+            <w:r>
+              <w:t xml:space="preserve"> nội bộ, cảnh báo bất thường, dashboard</w:t>
+            </w:r>
+          </w:p>
+        </w:tc>
+        <w:tc>
+          <w:tcPr>
+            <w:tcW w:type="dxa" w:w="2409"/>
+          </w:tcPr>
+          <w:p>
+            <w:r>
+              <w:t>Prometheus, Grafana</w:t>
+            </w:r>
+          </w:p>
+        </w:tc>
+      </w:tr>
+      <w:tr>
+        <w:tc>
+          <w:tcPr>
+            <w:tcW w:type="dxa" w:w="2409"/>
+          </w:tcPr>
+          <w:p>
+            <w:r>
+              <w:t>9. Kiểm chứng và bàn giao</w:t>
+            </w:r>
+          </w:p>
+        </w:tc>
+        <w:tc>
+          <w:tcPr>
+            <w:tcW w:type="dxa" w:w="2409"/>
+          </w:tcPr>
+          <w:p>
+            <w:r>
+              <w:t>—</w:t>
+            </w:r>
+          </w:p>
+        </w:tc>
+        <w:tc>
+          <w:tcPr>
+            <w:tcW w:type="dxa" w:w="2409"/>
+          </w:tcPr>
+          <w:p>
+            <w:r>
+              <w:t>Chạy lại toàn bộ cổng kiểm soát; quét secret</w:t>
+            </w:r>
+          </w:p>
+        </w:tc>
+        <w:tc>
+          <w:tcPr>
+            <w:tcW w:type="dxa" w:w="2409"/>
           </w:tcPr>
           <w:p>
             <w:r>
@@ -5569,6 +5925,310 @@
     </w:p>
     <w:p>
       <w:pPr>
+        <w:jc w:val="both"/>
+      </w:pPr>
+      <w:r>
+        <w:rPr>
+          <w:b/>
+        </w:rPr>
+        <w:t>Quét image — CVE/SCA (Trivy, pha Release).</w:t>
+      </w:r>
+      <w:r>
+        <w:t xml:space="preserve"> Trên image triển khai </w:t>
+      </w:r>
+      <w:r>
+        <w:rPr>
+          <w:rFonts w:ascii="Consolas" w:hAnsi="Consolas"/>
+          <w:sz w:val="20"/>
+        </w:rPr>
+        <w:t>juice-shop:hotfix-f01-f02</w:t>
+      </w:r>
+      <w:r>
+        <w:t xml:space="preserve">, Trivy quét lỗ hổng </w:t>
+      </w:r>
+      <w:r>
+        <w:rPr>
+          <w:i/>
+        </w:rPr>
+        <w:t>dependency</w:t>
+      </w:r>
+      <w:r>
+        <w:t xml:space="preserve">: </w:t>
+      </w:r>
+      <w:r>
+        <w:rPr>
+          <w:b/>
+        </w:rPr>
+        <w:t>189 CVE</w:t>
+      </w:r>
+      <w:r>
+        <w:t xml:space="preserve"> (12 CRITICAL, 56 HIGH, 97 MEDIUM, 24 LOW) — gồm các thư viện cũ như </w:t>
+      </w:r>
+      <w:r>
+        <w:rPr>
+          <w:rFonts w:ascii="Consolas" w:hAnsi="Consolas"/>
+          <w:sz w:val="20"/>
+        </w:rPr>
+        <w:t>crypto-js</w:t>
+      </w:r>
+      <w:r>
+        <w:t xml:space="preserve"> (CVE-2023-46233, CRITICAL), </w:t>
+      </w:r>
+      <w:r>
+        <w:rPr>
+          <w:rFonts w:ascii="Consolas" w:hAnsi="Consolas"/>
+          <w:sz w:val="20"/>
+        </w:rPr>
+        <w:t>jws</w:t>
+      </w:r>
+      <w:r>
+        <w:t xml:space="preserve">, </w:t>
+      </w:r>
+      <w:r>
+        <w:rPr>
+          <w:rFonts w:ascii="Consolas" w:hAnsi="Consolas"/>
+          <w:sz w:val="20"/>
+        </w:rPr>
+        <w:t>body-parser</w:t>
+      </w:r>
+      <w:r>
+        <w:t xml:space="preserve">, </w:t>
+      </w:r>
+      <w:r>
+        <w:rPr>
+          <w:rFonts w:ascii="Consolas" w:hAnsi="Consolas"/>
+          <w:sz w:val="20"/>
+        </w:rPr>
+        <w:t>brace-expansion</w:t>
+      </w:r>
+      <w:r>
+        <w:t xml:space="preserve">. Đây là </w:t>
+      </w:r>
+      <w:r>
+        <w:rPr>
+          <w:b/>
+        </w:rPr>
+        <w:t>mảng SCA</w:t>
+      </w:r>
+      <w:r>
+        <w:t xml:space="preserve"> mà Semgrep (quét mã nhóm tự viết) và Conftest (quét cấu hình) </w:t>
+      </w:r>
+      <w:r>
+        <w:rPr>
+          <w:b/>
+        </w:rPr>
+        <w:t>không phủ</w:t>
+      </w:r>
+      <w:r>
+        <w:t>; lỗ hổng thư viện là rủi ro chuỗi cung ứng cần quét ở pha Release (Hình 9).</w:t>
+      </w:r>
+    </w:p>
+    <w:p>
+      <w:pPr>
+        <w:jc w:val="center"/>
+      </w:pPr>
+      <w:r>
+        <w:drawing>
+          <wp:inline xmlns:a="http://schemas.openxmlformats.org/drawingml/2006/main" xmlns:pic="http://schemas.openxmlformats.org/drawingml/2006/picture">
+            <wp:extent cx="5760000" cy="1603459"/>
+            <wp:docPr id="10" name="Picture 10"/>
+            <wp:cNvGraphicFramePr>
+              <a:graphicFrameLocks noChangeAspect="1"/>
+            </wp:cNvGraphicFramePr>
+            <a:graphic>
+              <a:graphicData uri="http://schemas.openxmlformats.org/drawingml/2006/picture">
+                <pic:pic>
+                  <pic:nvPicPr>
+                    <pic:cNvPr id="0" name="trivy.png"/>
+                    <pic:cNvPicPr/>
+                  </pic:nvPicPr>
+                  <pic:blipFill>
+                    <a:blip r:embed="rId19"/>
+                    <a:stretch>
+                      <a:fillRect/>
+                    </a:stretch>
+                  </pic:blipFill>
+                  <pic:spPr>
+                    <a:xfrm>
+                      <a:off x="0" y="0"/>
+                      <a:ext cx="5760000" cy="1603459"/>
+                    </a:xfrm>
+                    <a:prstGeom prst="rect"/>
+                  </pic:spPr>
+                </pic:pic>
+              </a:graphicData>
+            </a:graphic>
+          </wp:inline>
+        </w:drawing>
+      </w:r>
+    </w:p>
+    <w:p>
+      <w:pPr>
+        <w:jc w:val="center"/>
+      </w:pPr>
+      <w:r>
+        <w:rPr>
+          <w:i/>
+          <w:sz w:val="22"/>
+        </w:rPr>
+        <w:t xml:space="preserve">Hình 9. </w:t>
+      </w:r>
+      <w:r>
+        <w:rPr>
+          <w:i/>
+          <w:sz w:val="22"/>
+        </w:rPr>
+        <w:t>Trivy quét CVE dependency của image hotfix: 189 CVE — 12 CRITICAL, 56 HIGH; SCA là lớp mà SAST/Policy-as-Code không phủ</w:t>
+      </w:r>
+    </w:p>
+    <w:p>
+      <w:pPr>
+        <w:jc w:val="both"/>
+      </w:pPr>
+      <w:r>
+        <w:rPr>
+          <w:b/>
+        </w:rPr>
+        <w:t>Quét image — CIS (Dockle, pha Release).</w:t>
+      </w:r>
+      <w:r>
+        <w:t xml:space="preserve"> Dockle đọc </w:t>
+      </w:r>
+      <w:r>
+        <w:rPr>
+          <w:i/>
+        </w:rPr>
+        <w:t>image đã build</w:t>
+      </w:r>
+      <w:r>
+        <w:t xml:space="preserve"> (không phải văn bản Dockerfile) nên bắt được lỗi chỉ hiện ở thành phẩm. Trên một image đóng gói sai, Dockle báo </w:t>
+      </w:r>
+      <w:r>
+        <w:rPr>
+          <w:b/>
+        </w:rPr>
+        <w:t>FATAL</w:t>
+      </w:r>
+      <w:r>
+        <w:t xml:space="preserve"> vì </w:t>
+      </w:r>
+      <w:r>
+        <w:rPr>
+          <w:b/>
+        </w:rPr>
+        <w:t>secret bị bake vào layer</w:t>
+      </w:r>
+      <w:r>
+        <w:t xml:space="preserve"> (</w:t>
+      </w:r>
+      <w:r>
+        <w:rPr>
+          <w:rFonts w:ascii="Consolas" w:hAnsi="Consolas"/>
+          <w:sz w:val="20"/>
+        </w:rPr>
+        <w:t>id_rsa</w:t>
+      </w:r>
+      <w:r>
+        <w:t xml:space="preserve">) và secret trong </w:t>
+      </w:r>
+      <w:r>
+        <w:rPr>
+          <w:rFonts w:ascii="Consolas" w:hAnsi="Consolas"/>
+          <w:sz w:val="20"/>
+        </w:rPr>
+        <w:t>ENV</w:t>
+      </w:r>
+      <w:r>
+        <w:t xml:space="preserve"> — thứ Conftest đọc văn bản Dockerfile </w:t>
+      </w:r>
+      <w:r>
+        <w:rPr>
+          <w:b/>
+        </w:rPr>
+        <w:t>không thấy</w:t>
+      </w:r>
+      <w:r>
+        <w:t xml:space="preserve"> — cùng cảnh báo chạy root và thiếu HEALTHCHECK; image triển khai của nhóm thì sạch (chỉ còn INFO). Dockle vì vậy bổ sung cho Conftest chứ không trùng: Conftest kiểm </w:t>
+      </w:r>
+      <w:r>
+        <w:rPr>
+          <w:i/>
+        </w:rPr>
+        <w:t>công thức</w:t>
+      </w:r>
+      <w:r>
+        <w:t xml:space="preserve"> trước build, Dockle kiểm </w:t>
+      </w:r>
+      <w:r>
+        <w:rPr>
+          <w:i/>
+        </w:rPr>
+        <w:t>thành phẩm</w:t>
+      </w:r>
+      <w:r>
+        <w:t xml:space="preserve"> sau build (Hình 10).</w:t>
+      </w:r>
+    </w:p>
+    <w:p>
+      <w:pPr>
+        <w:jc w:val="center"/>
+      </w:pPr>
+      <w:r>
+        <w:drawing>
+          <wp:inline xmlns:a="http://schemas.openxmlformats.org/drawingml/2006/main" xmlns:pic="http://schemas.openxmlformats.org/drawingml/2006/picture">
+            <wp:extent cx="5760000" cy="2498594"/>
+            <wp:docPr id="11" name="Picture 11"/>
+            <wp:cNvGraphicFramePr>
+              <a:graphicFrameLocks noChangeAspect="1"/>
+            </wp:cNvGraphicFramePr>
+            <a:graphic>
+              <a:graphicData uri="http://schemas.openxmlformats.org/drawingml/2006/picture">
+                <pic:pic>
+                  <pic:nvPicPr>
+                    <pic:cNvPr id="0" name="dockle.png"/>
+                    <pic:cNvPicPr/>
+                  </pic:nvPicPr>
+                  <pic:blipFill>
+                    <a:blip r:embed="rId20"/>
+                    <a:stretch>
+                      <a:fillRect/>
+                    </a:stretch>
+                  </pic:blipFill>
+                  <pic:spPr>
+                    <a:xfrm>
+                      <a:off x="0" y="0"/>
+                      <a:ext cx="5760000" cy="2498594"/>
+                    </a:xfrm>
+                    <a:prstGeom prst="rect"/>
+                  </pic:spPr>
+                </pic:pic>
+              </a:graphicData>
+            </a:graphic>
+          </wp:inline>
+        </w:drawing>
+      </w:r>
+    </w:p>
+    <w:p>
+      <w:pPr>
+        <w:jc w:val="center"/>
+      </w:pPr>
+      <w:r>
+        <w:rPr>
+          <w:i/>
+          <w:sz w:val="22"/>
+        </w:rPr>
+        <w:t xml:space="preserve">Hình 10. </w:t>
+      </w:r>
+      <w:r>
+        <w:rPr>
+          <w:i/>
+          <w:sz w:val="22"/>
+        </w:rPr>
+        <w:t>Dockle quét cấu hình image theo CIS: image sai bị FATAL vì secret bake vào layer (id_rsa) + ENV; image triển khai của nhóm sạch</w:t>
+      </w:r>
+    </w:p>
+    <w:p>
+      <w:pPr>
         <w:pStyle w:val="Heading2"/>
       </w:pPr>
       <w:r>
@@ -6206,10 +6866,288 @@
     </w:p>
     <w:p>
       <w:pPr>
-        <w:pStyle w:val="Heading1"/>
+        <w:pStyle w:val="Heading2"/>
       </w:pPr>
       <w:r>
-        <w:t>5. Bốn lỗi an toàn: phát hiện và xử lý</w:t>
+        <w:t>4.3. Giám sát khi vận hành (pha Operate)</w:t>
+      </w:r>
+    </w:p>
+    <w:p>
+      <w:pPr>
+        <w:jc w:val="both"/>
+      </w:pPr>
+      <w:r>
+        <w:t xml:space="preserve">Các lớp trên dừng ở "trước khi chạy" và "cấu hình lúc chạy". Khi ứng dụng </w:t>
+      </w:r>
+      <w:r>
+        <w:rPr>
+          <w:b/>
+        </w:rPr>
+        <w:t>đang chạy</w:t>
+      </w:r>
+      <w:r>
+        <w:t xml:space="preserve">, nhóm bổ sung một lớp </w:t>
+      </w:r>
+      <w:r>
+        <w:rPr>
+          <w:b/>
+        </w:rPr>
+        <w:t>quan sát + phát hiện</w:t>
+      </w:r>
+      <w:r>
+        <w:t xml:space="preserve"> nhẹ: </w:t>
+      </w:r>
+      <w:r>
+        <w:rPr>
+          <w:b/>
+        </w:rPr>
+        <w:t>Prometheus</w:t>
+      </w:r>
+      <w:r>
+        <w:t xml:space="preserve"> scrape endpoint </w:t>
+      </w:r>
+      <w:r>
+        <w:rPr>
+          <w:rFonts w:ascii="Consolas" w:hAnsi="Consolas"/>
+          <w:sz w:val="20"/>
+        </w:rPr>
+        <w:t>/metrics</w:t>
+      </w:r>
+      <w:r>
+        <w:t xml:space="preserve"> của ứng dụng qua </w:t>
+      </w:r>
+      <w:r>
+        <w:rPr>
+          <w:b/>
+        </w:rPr>
+        <w:t>mạng nội bộ</w:t>
+      </w:r>
+      <w:r>
+        <w:t xml:space="preserve"> (app vẫn không mở cổng host — đúng nguyên tắc F03), </w:t>
+      </w:r>
+      <w:r>
+        <w:rPr>
+          <w:b/>
+        </w:rPr>
+        <w:t>Grafana</w:t>
+      </w:r>
+      <w:r>
+        <w:t xml:space="preserve"> làm portal hiển thị, và một </w:t>
+      </w:r>
+      <w:r>
+        <w:rPr>
+          <w:b/>
+        </w:rPr>
+        <w:t>luật cảnh báo</w:t>
+      </w:r>
+      <w:r>
+        <w:t xml:space="preserve"> để phát hiện bất thường.</w:t>
+      </w:r>
+    </w:p>
+    <w:p>
+      <w:pPr>
+        <w:jc w:val="both"/>
+      </w:pPr>
+      <w:r>
+        <w:t xml:space="preserve">Chính </w:t>
+      </w:r>
+      <w:r>
+        <w:rPr>
+          <w:rFonts w:ascii="Consolas" w:hAnsi="Consolas"/>
+          <w:sz w:val="20"/>
+        </w:rPr>
+        <w:t>/metrics</w:t>
+      </w:r>
+      <w:r>
+        <w:t xml:space="preserve"> mà F03 chặn ra ngoài lại là </w:t>
+      </w:r>
+      <w:r>
+        <w:rPr>
+          <w:i/>
+        </w:rPr>
+        <w:t>nguồn cấp dữ liệu giám sát nội bộ</w:t>
+      </w:r>
+      <w:r>
+        <w:t xml:space="preserve">: nó xuất số người dùng, số đơn hàng, thời gian xử lý HTTP và số phản hồi theo mã trạng thái. Prometheus scrape endpoint này (target </w:t>
+      </w:r>
+      <w:r>
+        <w:rPr>
+          <w:b/>
+        </w:rPr>
+        <w:t>UP</w:t>
+      </w:r>
+      <w:r>
+        <w:t>), Grafana vẽ thành dashboard vận hành (Hình 11).</w:t>
+      </w:r>
+    </w:p>
+    <w:p>
+      <w:pPr>
+        <w:jc w:val="center"/>
+      </w:pPr>
+      <w:r>
+        <w:drawing>
+          <wp:inline xmlns:a="http://schemas.openxmlformats.org/drawingml/2006/main" xmlns:pic="http://schemas.openxmlformats.org/drawingml/2006/picture">
+            <wp:extent cx="5760000" cy="3302400"/>
+            <wp:docPr id="12" name="Picture 12"/>
+            <wp:cNvGraphicFramePr>
+              <a:graphicFrameLocks noChangeAspect="1"/>
+            </wp:cNvGraphicFramePr>
+            <a:graphic>
+              <a:graphicData uri="http://schemas.openxmlformats.org/drawingml/2006/picture">
+                <pic:pic>
+                  <pic:nvPicPr>
+                    <pic:cNvPr id="0" name="grafana-dashboard.png"/>
+                    <pic:cNvPicPr/>
+                  </pic:nvPicPr>
+                  <pic:blipFill>
+                    <a:blip r:embed="rId21"/>
+                    <a:stretch>
+                      <a:fillRect/>
+                    </a:stretch>
+                  </pic:blipFill>
+                  <pic:spPr>
+                    <a:xfrm>
+                      <a:off x="0" y="0"/>
+                      <a:ext cx="5760000" cy="3302400"/>
+                    </a:xfrm>
+                    <a:prstGeom prst="rect"/>
+                  </pic:spPr>
+                </pic:pic>
+              </a:graphicData>
+            </a:graphic>
+          </wp:inline>
+        </w:drawing>
+      </w:r>
+    </w:p>
+    <w:p>
+      <w:pPr>
+        <w:jc w:val="center"/>
+      </w:pPr>
+      <w:r>
+        <w:rPr>
+          <w:i/>
+          <w:sz w:val="22"/>
+        </w:rPr>
+        <w:t xml:space="preserve">Hình 11. </w:t>
+      </w:r>
+      <w:r>
+        <w:rPr>
+          <w:i/>
+          <w:sz w:val="22"/>
+        </w:rPr>
+        <w:t>Dashboard Grafana (portal giám sát) với số liệu thật từ ứng dụng đang chạy: người dùng đã đăng ký, đơn hàng, HTTP theo status_code, RAM tiến trình</w:t>
+      </w:r>
+    </w:p>
+    <w:p>
+      <w:pPr>
+        <w:jc w:val="both"/>
+      </w:pPr>
+      <w:r>
+        <w:t xml:space="preserve">Phần </w:t>
+      </w:r>
+      <w:r>
+        <w:rPr>
+          <w:b/>
+        </w:rPr>
+        <w:t>phát hiện</w:t>
+      </w:r>
+      <w:r>
+        <w:t xml:space="preserve">: luật cảnh báo </w:t>
+      </w:r>
+      <w:r>
+        <w:rPr>
+          <w:rFonts w:ascii="Consolas" w:hAnsi="Consolas"/>
+          <w:sz w:val="20"/>
+        </w:rPr>
+        <w:t>HighClientErrorRate</w:t>
+      </w:r>
+      <w:r>
+        <w:t xml:space="preserve"> theo dõi đột biến phản hồi </w:t>
+      </w:r>
+      <w:r>
+        <w:rPr>
+          <w:b/>
+        </w:rPr>
+        <w:t>4XX</w:t>
+      </w:r>
+      <w:r>
+        <w:t xml:space="preserve"> — dấu hiệu dò mật khẩu (F01), null-byte (F02) hoặc bị rate-limit (F03). Khi nhóm mô phỏng tấn công (60 lần đăng nhập sai liên tiếp), số 4XX vọt lên và cảnh báo </w:t>
+      </w:r>
+      <w:r>
+        <w:rPr>
+          <w:b/>
+        </w:rPr>
+        <w:t>chuyển trạng thái FIRING</w:t>
+      </w:r>
+      <w:r>
+        <w:t xml:space="preserve">, minh họa việc phát hiện tấn công mà bản thân mã nguồn không tự biết (Hình 12). Đây là biện pháp </w:t>
+      </w:r>
+      <w:r>
+        <w:rPr>
+          <w:i/>
+        </w:rPr>
+        <w:t>giám sát liên tục</w:t>
+      </w:r>
+      <w:r>
+        <w:t xml:space="preserve"> mà NĐ 356/2025/NĐ-CP nêu ở khâu vận hành.</w:t>
+      </w:r>
+    </w:p>
+    <w:p>
+      <w:pPr>
+        <w:jc w:val="center"/>
+      </w:pPr>
+      <w:r>
+        <w:drawing>
+          <wp:inline xmlns:a="http://schemas.openxmlformats.org/drawingml/2006/main" xmlns:pic="http://schemas.openxmlformats.org/drawingml/2006/picture">
+            <wp:extent cx="5760000" cy="976865"/>
+            <wp:docPr id="13" name="Picture 13"/>
+            <wp:cNvGraphicFramePr>
+              <a:graphicFrameLocks noChangeAspect="1"/>
+            </wp:cNvGraphicFramePr>
+            <a:graphic>
+              <a:graphicData uri="http://schemas.openxmlformats.org/drawingml/2006/picture">
+                <pic:pic>
+                  <pic:nvPicPr>
+                    <pic:cNvPr id="0" name="monitoring.png"/>
+                    <pic:cNvPicPr/>
+                  </pic:nvPicPr>
+                  <pic:blipFill>
+                    <a:blip r:embed="rId22"/>
+                    <a:stretch>
+                      <a:fillRect/>
+                    </a:stretch>
+                  </pic:blipFill>
+                  <pic:spPr>
+                    <a:xfrm>
+                      <a:off x="0" y="0"/>
+                      <a:ext cx="5760000" cy="976865"/>
+                    </a:xfrm>
+                    <a:prstGeom prst="rect"/>
+                  </pic:spPr>
+                </pic:pic>
+              </a:graphicData>
+            </a:graphic>
+          </wp:inline>
+        </w:drawing>
+      </w:r>
+    </w:p>
+    <w:p>
+      <w:pPr>
+        <w:jc w:val="center"/>
+      </w:pPr>
+      <w:r>
+        <w:rPr>
+          <w:i/>
+          <w:sz w:val="22"/>
+        </w:rPr>
+        <w:t xml:space="preserve">Hình 12. </w:t>
+      </w:r>
+      <w:r>
+        <w:rPr>
+          <w:i/>
+          <w:sz w:val="22"/>
+        </w:rPr>
+        <w:t>Giám sát vận hành: Prometheus scrape /metrics (target UP), truy vấn số liệu thật, và cảnh báo HighClientErrorRate chuyển FIRING khi mô phỏng dò đăng nhập</w:t>
       </w:r>
     </w:p>
     <w:p>
@@ -6217,15 +7155,7 @@
         <w:pStyle w:val="Heading2"/>
       </w:pPr>
       <w:r>
-        <w:t>5.1. F01 — SQL injection tại đăng nhập</w:t>
-      </w:r>
-    </w:p>
-    <w:p>
-      <w:pPr>
-        <w:pStyle w:val="Heading3"/>
-      </w:pPr>
-      <w:r>
-        <w:t>Trước khi sửa</w:t>
+        <w:t>4.4. Lệnh quét (tái lập)</w:t>
       </w:r>
     </w:p>
     <w:p>
@@ -6233,17 +7163,55 @@
         <w:jc w:val="both"/>
       </w:pPr>
       <w:r>
-        <w:t xml:space="preserve">Route </w:t>
+        <w:t xml:space="preserve">Các lệnh </w:t>
+      </w:r>
+      <w:r>
+        <w:rPr>
+          <w:b/>
+        </w:rPr>
+        <w:t>quét</w:t>
+      </w:r>
+      <w:r>
+        <w:t xml:space="preserve"> của từng cổng kiểm soát được gom ở đây để tái lập, </w:t>
+      </w:r>
+      <w:r>
+        <w:rPr>
+          <w:b/>
+        </w:rPr>
+        <w:t>tách riêng</w:t>
+      </w:r>
+      <w:r>
+        <w:t xml:space="preserve"> với các script demo tấn công/khắc phục (</w:t>
       </w:r>
       <w:r>
         <w:rPr>
           <w:rFonts w:ascii="Consolas" w:hAnsi="Consolas"/>
           <w:sz w:val="20"/>
         </w:rPr>
-        <w:t>routes/login.ts</w:t>
-      </w:r>
-      <w:r>
-        <w:t xml:space="preserve"> ghép thẳng email vào câu SQL:</w:t>
+        <w:t>tv1</w:t>
+      </w:r>
+      <w:r>
+        <w:t>–</w:t>
+      </w:r>
+      <w:r>
+        <w:rPr>
+          <w:rFonts w:ascii="Consolas" w:hAnsi="Consolas"/>
+          <w:sz w:val="20"/>
+        </w:rPr>
+        <w:t>tv4</w:t>
+      </w:r>
+      <w:r>
+        <w:t xml:space="preserve"> ở phần 5). Mỗi lệnh chạy ra log gốc kèm mã thoát trong </w:t>
+      </w:r>
+      <w:r>
+        <w:rPr>
+          <w:rFonts w:ascii="Consolas" w:hAnsi="Consolas"/>
+          <w:sz w:val="20"/>
+        </w:rPr>
+        <w:t>report/evidence/</w:t>
+      </w:r>
+      <w:r>
+        <w:t>.</w:t>
       </w:r>
     </w:p>
     <w:tbl>
@@ -6270,7 +7238,7 @@
                 <w:rFonts w:ascii="Consolas" w:hAnsi="Consolas"/>
                 <w:sz w:val="17"/>
               </w:rPr>
-              <w:t>models.sequelize.query(`SELECT * FROM Users WHERE email = '${req.body.email || ''}'</w:t>
+              <w:t># (Code)         SAST — quét mã nguồn</w:t>
             </w:r>
             <w:r>
               <w:br/>
@@ -6280,7 +7248,137 @@
                 <w:rFonts w:ascii="Consolas" w:hAnsi="Consolas"/>
                 <w:sz w:val="17"/>
               </w:rPr>
-              <w:t xml:space="preserve">  AND password = '${security.hash(req.body.password || '')}' AND deletedAt IS NULL`, { model: UserModel, plain: true })</w:t>
+              <w:t>semgrep scan --config auto routes/ lib/</w:t>
+            </w:r>
+            <w:r>
+              <w:br/>
+            </w:r>
+            <w:r>
+              <w:rPr>
+                <w:rFonts w:ascii="Consolas" w:hAnsi="Consolas"/>
+                <w:sz w:val="17"/>
+              </w:rPr>
+              <w:t># (Code)         quét secret trong lịch sử commit</w:t>
+            </w:r>
+            <w:r>
+              <w:br/>
+            </w:r>
+            <w:r>
+              <w:rPr>
+                <w:rFonts w:ascii="Consolas" w:hAnsi="Consolas"/>
+                <w:sz w:val="17"/>
+              </w:rPr>
+              <w:t>gitleaks git /repo --log-opts=&lt;range&gt; --no-banner</w:t>
+            </w:r>
+            <w:r>
+              <w:br/>
+            </w:r>
+            <w:r>
+              <w:rPr>
+                <w:rFonts w:ascii="Consolas" w:hAnsi="Consolas"/>
+                <w:sz w:val="17"/>
+              </w:rPr>
+              <w:t># (Build/Deploy) Policy as Code — quét VĂN BẢN Dockerfile + compose</w:t>
+            </w:r>
+            <w:r>
+              <w:br/>
+            </w:r>
+            <w:r>
+              <w:rPr>
+                <w:rFonts w:ascii="Consolas" w:hAnsi="Consolas"/>
+                <w:sz w:val="17"/>
+              </w:rPr>
+              <w:t>conftest test Dockerfile.vulnerable -p policy --namespace dockerfile</w:t>
+            </w:r>
+            <w:r>
+              <w:br/>
+            </w:r>
+            <w:r>
+              <w:rPr>
+                <w:rFonts w:ascii="Consolas" w:hAnsi="Consolas"/>
+                <w:sz w:val="17"/>
+              </w:rPr>
+              <w:t>conftest test docker-compose.yml    -p policy --namespace compose</w:t>
+            </w:r>
+            <w:r>
+              <w:br/>
+            </w:r>
+            <w:r>
+              <w:rPr>
+                <w:rFonts w:ascii="Consolas" w:hAnsi="Consolas"/>
+                <w:sz w:val="17"/>
+              </w:rPr>
+              <w:t>conftest verify -p policy                                 # unit test bộ luật Rego</w:t>
+            </w:r>
+            <w:r>
+              <w:br/>
+            </w:r>
+            <w:r>
+              <w:rPr>
+                <w:rFonts w:ascii="Consolas" w:hAnsi="Consolas"/>
+                <w:sz w:val="17"/>
+              </w:rPr>
+              <w:t># (Release)      quét IMAGE đã build</w:t>
+            </w:r>
+            <w:r>
+              <w:br/>
+            </w:r>
+            <w:r>
+              <w:rPr>
+                <w:rFonts w:ascii="Consolas" w:hAnsi="Consolas"/>
+                <w:sz w:val="17"/>
+              </w:rPr>
+              <w:t>trivy  image --scanners vuln juice-shop:hotfix-f01-f02    # CVE / SCA</w:t>
+            </w:r>
+            <w:r>
+              <w:br/>
+            </w:r>
+            <w:r>
+              <w:rPr>
+                <w:rFonts w:ascii="Consolas" w:hAnsi="Consolas"/>
+                <w:sz w:val="17"/>
+              </w:rPr>
+              <w:t>dockle juice-shop:hotfix-f01-f02                          # CIS image (secret, HEALTHCHECK, user)</w:t>
+            </w:r>
+            <w:r>
+              <w:br/>
+            </w:r>
+            <w:r>
+              <w:rPr>
+                <w:rFonts w:ascii="Consolas" w:hAnsi="Consolas"/>
+                <w:sz w:val="17"/>
+              </w:rPr>
+              <w:t># (Operate)      Compliance as Code + giám sát</w:t>
+            </w:r>
+            <w:r>
+              <w:br/>
+            </w:r>
+            <w:r>
+              <w:rPr>
+                <w:rFonts w:ascii="Consolas" w:hAnsi="Consolas"/>
+                <w:sz w:val="17"/>
+              </w:rPr>
+              <w:t>docker inspect &lt;container&gt;                                # -&gt; đưa JSON vào Conftest runtime</w:t>
+            </w:r>
+            <w:r>
+              <w:br/>
+            </w:r>
+            <w:r>
+              <w:rPr>
+                <w:rFonts w:ascii="Consolas" w:hAnsi="Consolas"/>
+                <w:sz w:val="17"/>
+              </w:rPr>
+              <w:t>curl http://127.0.0.1:9090/api/v1/targets                # Prometheus scrape /metrics</w:t>
+            </w:r>
+            <w:r>
+              <w:br/>
+            </w:r>
+            <w:r>
+              <w:rPr>
+                <w:rFonts w:ascii="Consolas" w:hAnsi="Consolas"/>
+                <w:sz w:val="17"/>
+              </w:rPr>
+              <w:t>curl http://127.0.0.1:9090/api/v1/alerts                 # trạng thái cảnh báo</w:t>
             </w:r>
           </w:p>
         </w:tc>
@@ -6292,17 +7390,51 @@
         <w:jc w:val="both"/>
       </w:pPr>
       <w:r>
-        <w:t xml:space="preserve">Với email </w:t>
+        <w:t xml:space="preserve">Ảnh được dựng lại từ chính các lệnh này: </w:t>
       </w:r>
       <w:r>
         <w:rPr>
           <w:rFonts w:ascii="Consolas" w:hAnsi="Consolas"/>
           <w:sz w:val="20"/>
         </w:rPr>
-        <w:t>' OR 1=1--</w:t>
-      </w:r>
-      <w:r>
-        <w:t>, mệnh đề WHERE luôn đúng còn phần kiểm tra mật khẩu bị đẩy thành chú thích, nên máy chủ cấp token của tài khoản đầu tiên (tài khoản quản trị) mà không cần mật khẩu. Đây chính là CWE-89, OWASP A03:2021.</w:t>
+        <w:t>report/figures/capture_runs.py</w:t>
+      </w:r>
+      <w:r>
+        <w:t xml:space="preserve"> (Semgrep/Gitleaks/Conftest/docker inspect) và </w:t>
+      </w:r>
+      <w:r>
+        <w:rPr>
+          <w:rFonts w:ascii="Consolas" w:hAnsi="Consolas"/>
+          <w:sz w:val="20"/>
+        </w:rPr>
+        <w:t>report/figures/capture_scans.py</w:t>
+      </w:r>
+      <w:r>
+        <w:t xml:space="preserve"> (Trivy/Dockle/Prometheus).</w:t>
+      </w:r>
+    </w:p>
+    <w:p>
+      <w:pPr>
+        <w:pStyle w:val="Heading1"/>
+      </w:pPr>
+      <w:r>
+        <w:t>5. Bốn lỗi an toàn: phát hiện và xử lý</w:t>
+      </w:r>
+    </w:p>
+    <w:p>
+      <w:pPr>
+        <w:pStyle w:val="Heading2"/>
+      </w:pPr>
+      <w:r>
+        <w:t>5.1. F01 — SQL injection tại đăng nhập</w:t>
+      </w:r>
+    </w:p>
+    <w:p>
+      <w:pPr>
+        <w:pStyle w:val="Heading3"/>
+      </w:pPr>
+      <w:r>
+        <w:t>Trước khi sửa</w:t>
       </w:r>
     </w:p>
     <w:p>
@@ -6310,117 +7442,17 @@
         <w:jc w:val="both"/>
       </w:pPr>
       <w:r>
-        <w:rPr>
-          <w:b/>
-        </w:rPr>
-        <w:t>Phát hiện.</w:t>
-      </w:r>
-      <w:r>
-        <w:t xml:space="preserve"> Semgrep (luật </w:t>
+        <w:t xml:space="preserve">Route </w:t>
       </w:r>
       <w:r>
         <w:rPr>
           <w:rFonts w:ascii="Consolas" w:hAnsi="Consolas"/>
           <w:sz w:val="20"/>
         </w:rPr>
-        <w:t>express-sequelize-injection</w:t>
-      </w:r>
-      <w:r>
-        <w:t xml:space="preserve">) chỉ đúng dòng lỗi (xem hình quét tổng ở mục 4.1). Kiểm thử </w:t>
-      </w:r>
-      <w:r>
-        <w:rPr>
-          <w:rFonts w:ascii="Consolas" w:hAnsi="Consolas"/>
-          <w:sz w:val="20"/>
-        </w:rPr>
-        <w:t>test/api/security/f01-f02.test.ts</w:t>
-      </w:r>
-      <w:r>
-        <w:t xml:space="preserve"> gửi payload kèm mật khẩu sai và yêu cầu phản hồi 401; trên mã chưa sửa, test báo đỏ (Hình 9). Demo </w:t>
-      </w:r>
-      <w:r>
-        <w:rPr>
-          <w:rFonts w:ascii="Consolas" w:hAnsi="Consolas"/>
-          <w:sz w:val="20"/>
-        </w:rPr>
-        <w:t>demos/tv1_f01_sqli.py</w:t>
-      </w:r>
-      <w:r>
-        <w:t xml:space="preserve"> xác nhận token vẫn được cấp (Hình 10).</w:t>
-      </w:r>
-    </w:p>
-    <w:p>
-      <w:pPr>
-        <w:jc w:val="center"/>
-      </w:pPr>
-      <w:r>
-        <w:drawing>
-          <wp:inline xmlns:a="http://schemas.openxmlformats.org/drawingml/2006/main" xmlns:pic="http://schemas.openxmlformats.org/drawingml/2006/picture">
-            <wp:extent cx="5400000" cy="1744054"/>
-            <wp:docPr id="10" name="Picture 10"/>
-            <wp:cNvGraphicFramePr>
-              <a:graphicFrameLocks noChangeAspect="1"/>
-            </wp:cNvGraphicFramePr>
-            <a:graphic>
-              <a:graphicData uri="http://schemas.openxmlformats.org/drawingml/2006/picture">
-                <pic:pic>
-                  <pic:nvPicPr>
-                    <pic:cNvPr id="0" name="f0102-red.png"/>
-                    <pic:cNvPicPr/>
-                  </pic:nvPicPr>
-                  <pic:blipFill>
-                    <a:blip r:embed="rId19"/>
-                    <a:stretch>
-                      <a:fillRect/>
-                    </a:stretch>
-                  </pic:blipFill>
-                  <pic:spPr>
-                    <a:xfrm>
-                      <a:off x="0" y="0"/>
-                      <a:ext cx="5400000" cy="1744054"/>
-                    </a:xfrm>
-                    <a:prstGeom prst="rect"/>
-                  </pic:spPr>
-                </pic:pic>
-              </a:graphicData>
-            </a:graphic>
-          </wp:inline>
-        </w:drawing>
-      </w:r>
-    </w:p>
-    <w:p>
-      <w:pPr>
-        <w:jc w:val="center"/>
-      </w:pPr>
-      <w:r>
-        <w:rPr>
-          <w:i/>
-          <w:sz w:val="22"/>
-        </w:rPr>
-        <w:t xml:space="preserve">Hình 9. </w:t>
-      </w:r>
-      <w:r>
-        <w:rPr>
-          <w:i/>
-          <w:sz w:val="22"/>
-        </w:rPr>
-        <w:t>Kiểm thử bảo mật F01/F02 trên mã chưa sửa: các ca kiểm thử đỏ ứng với lỗ hổng còn tồn tại</w:t>
-      </w:r>
-    </w:p>
-    <w:p>
-      <w:pPr>
-        <w:pStyle w:val="Heading3"/>
-      </w:pPr>
-      <w:r>
-        <w:t>Sau khi sửa</w:t>
-      </w:r>
-    </w:p>
-    <w:p>
-      <w:pPr>
-        <w:jc w:val="both"/>
-      </w:pPr>
-      <w:r>
-        <w:t>Dùng truy vấn tham số (bind parameter):</w:t>
+        <w:t>routes/login.ts</w:t>
+      </w:r>
+      <w:r>
+        <w:t xml:space="preserve"> ghép thẳng email vào câu SQL:</w:t>
       </w:r>
     </w:p>
     <w:tbl>
@@ -6447,7 +7479,7 @@
                 <w:rFonts w:ascii="Consolas" w:hAnsi="Consolas"/>
                 <w:sz w:val="17"/>
               </w:rPr>
-              <w:t>const email = typeof req.body.email === 'string' ? req.body.email : ''</w:t>
+              <w:t>models.sequelize.query(`SELECT * FROM Users WHERE email = '${req.body.email || ''}'</w:t>
             </w:r>
             <w:r>
               <w:br/>
@@ -6457,27 +7489,7 @@
                 <w:rFonts w:ascii="Consolas" w:hAnsi="Consolas"/>
                 <w:sz w:val="17"/>
               </w:rPr>
-              <w:t>const password = typeof req.body.password === 'string' ? req.body.password : ''</w:t>
-            </w:r>
-            <w:r>
-              <w:br/>
-            </w:r>
-            <w:r>
-              <w:rPr>
-                <w:rFonts w:ascii="Consolas" w:hAnsi="Consolas"/>
-                <w:sz w:val="17"/>
-              </w:rPr>
-              <w:t>models.sequelize.query('SELECT * FROM Users WHERE email = $email AND password = $password AND deletedAt IS NULL',</w:t>
-            </w:r>
-            <w:r>
-              <w:br/>
-            </w:r>
-            <w:r>
-              <w:rPr>
-                <w:rFonts w:ascii="Consolas" w:hAnsi="Consolas"/>
-                <w:sz w:val="17"/>
-              </w:rPr>
-              <w:t xml:space="preserve">  { bind: { email, password: security.hash(password) }, model: UserModel, plain: true })</w:t>
+              <w:t xml:space="preserve">  AND password = '${security.hash(req.body.password || '')}' AND deletedAt IS NULL`, { model: UserModel, plain: true })</w:t>
             </w:r>
           </w:p>
         </w:tc>
@@ -6489,7 +7501,17 @@
         <w:jc w:val="both"/>
       </w:pPr>
       <w:r>
-        <w:t>Câu lệnh được biên dịch trước và giá trị truyền riêng, nên mọi ký tự SQL trong email giờ chỉ còn được hiểu là dữ liệu. Sau khi sửa, kiểm thử bảo mật xanh toàn bộ (Hình 12); demo cũng cho thấy mọi payload đều bị từ chối 401 trong khi đăng nhập hợp lệ vẫn hoạt động bình thường (Hình 10).</w:t>
+        <w:t xml:space="preserve">Với email </w:t>
+      </w:r>
+      <w:r>
+        <w:rPr>
+          <w:rFonts w:ascii="Consolas" w:hAnsi="Consolas"/>
+          <w:sz w:val="20"/>
+        </w:rPr>
+        <w:t>' OR 1=1--</w:t>
+      </w:r>
+      <w:r>
+        <w:t>, mệnh đề WHERE luôn đúng còn phần kiểm tra mật khẩu bị đẩy thành chú thích, nên máy chủ cấp token của tài khoản đầu tiên (tài khoản quản trị) mà không cần mật khẩu. Đây chính là CWE-89, OWASP A03:2021.</w:t>
       </w:r>
     </w:p>
     <w:p>
@@ -6497,36 +7519,43 @@
         <w:jc w:val="both"/>
       </w:pPr>
       <w:r>
-        <w:t xml:space="preserve">Bản vá vẫn còn một giới hạn: nó chỉ xử lý injection, trong khi cùng dòng code đó vẫn gọi </w:t>
+        <w:rPr>
+          <w:b/>
+        </w:rPr>
+        <w:t>Phát hiện.</w:t>
+      </w:r>
+      <w:r>
+        <w:t xml:space="preserve"> Semgrep (luật </w:t>
       </w:r>
       <w:r>
         <w:rPr>
           <w:rFonts w:ascii="Consolas" w:hAnsi="Consolas"/>
           <w:sz w:val="20"/>
         </w:rPr>
-        <w:t>security.hash</w:t>
-      </w:r>
-      <w:r>
-        <w:t xml:space="preserve"> của Juice Shop, vốn băm mật khẩu bằng </w:t>
-      </w:r>
-      <w:r>
-        <w:rPr>
-          <w:b/>
-        </w:rPr>
-        <w:t>MD5 không salt</w:t>
-      </w:r>
-      <w:r>
-        <w:t xml:space="preserve"> (</w:t>
+        <w:t>express-sequelize-injection</w:t>
+      </w:r>
+      <w:r>
+        <w:t xml:space="preserve">) chỉ đúng dòng lỗi (xem hình quét tổng ở mục 4.1). Kiểm thử </w:t>
       </w:r>
       <w:r>
         <w:rPr>
           <w:rFonts w:ascii="Consolas" w:hAnsi="Consolas"/>
           <w:sz w:val="20"/>
         </w:rPr>
-        <w:t>lib/insecurity.ts</w:t>
-      </w:r>
-      <w:r>
-        <w:t>, CWE-327 / OWASP A02:2021). Đây là lỗ hổng lưu trữ mật khẩu nằm ngoài phạm vi F01, vì F01 chỉ chặn việc vượt xác thực; khi triển khai thật, cần thay nó bằng bcrypt hoặc argon2 có salt.</w:t>
+        <w:t>test/api/security/f01-f02.test.ts</w:t>
+      </w:r>
+      <w:r>
+        <w:t xml:space="preserve"> gửi payload kèm mật khẩu sai và yêu cầu phản hồi 401; trên mã chưa sửa, test báo đỏ (Hình 13). Demo </w:t>
+      </w:r>
+      <w:r>
+        <w:rPr>
+          <w:rFonts w:ascii="Consolas" w:hAnsi="Consolas"/>
+          <w:sz w:val="20"/>
+        </w:rPr>
+        <w:t>demos/tv1_f01_sqli.py</w:t>
+      </w:r>
+      <w:r>
+        <w:t xml:space="preserve"> xác nhận token vẫn được cấp (Hình 14).</w:t>
       </w:r>
     </w:p>
     <w:p>
@@ -6536,8 +7565,8 @@
       <w:r>
         <w:drawing>
           <wp:inline xmlns:a="http://schemas.openxmlformats.org/drawingml/2006/main" xmlns:pic="http://schemas.openxmlformats.org/drawingml/2006/picture">
-            <wp:extent cx="5400000" cy="1996579"/>
-            <wp:docPr id="11" name="Picture 11"/>
+            <wp:extent cx="5400000" cy="1744054"/>
+            <wp:docPr id="14" name="Picture 14"/>
             <wp:cNvGraphicFramePr>
               <a:graphicFrameLocks noChangeAspect="1"/>
             </wp:cNvGraphicFramePr>
@@ -6545,11 +7574,11 @@
               <a:graphicData uri="http://schemas.openxmlformats.org/drawingml/2006/picture">
                 <pic:pic>
                   <pic:nvPicPr>
-                    <pic:cNvPr id="0" name="tv1.png"/>
+                    <pic:cNvPr id="0" name="f0102-red.png"/>
                     <pic:cNvPicPr/>
                   </pic:nvPicPr>
                   <pic:blipFill>
-                    <a:blip r:embed="rId20"/>
+                    <a:blip r:embed="rId23"/>
                     <a:stretch>
                       <a:fillRect/>
                     </a:stretch>
@@ -6557,7 +7586,7 @@
                   <pic:spPr>
                     <a:xfrm>
                       <a:off x="0" y="0"/>
-                      <a:ext cx="5400000" cy="1996579"/>
+                      <a:ext cx="5400000" cy="1744054"/>
                     </a:xfrm>
                     <a:prstGeom prst="rect"/>
                   </pic:spPr>
@@ -6577,14 +7606,22 @@
           <w:i/>
           <w:sz w:val="22"/>
         </w:rPr>
-        <w:t xml:space="preserve">Hình 10. </w:t>
+        <w:t xml:space="preserve">Hình 13. </w:t>
       </w:r>
       <w:r>
         <w:rPr>
           <w:i/>
           <w:sz w:val="22"/>
         </w:rPr>
-        <w:t>Demo F01: cùng payload, trước khi sửa được cấp token, sau khi sửa bị từ chối</w:t>
+        <w:t>Kiểm thử bảo mật F01/F02 trên mã chưa sửa: các ca kiểm thử đỏ ứng với lỗ hổng còn tồn tại</w:t>
+      </w:r>
+    </w:p>
+    <w:p>
+      <w:pPr>
+        <w:pStyle w:val="Heading3"/>
+      </w:pPr>
+      <w:r>
+        <w:t>Sau khi sửa</w:t>
       </w:r>
     </w:p>
     <w:p>
@@ -6592,115 +7629,7 @@
         <w:jc w:val="both"/>
       </w:pPr>
       <w:r>
-        <w:rPr>
-          <w:b/>
-        </w:rPr>
-        <w:t>Nguyên tắc/tiêu chuẩn đối chiếu:</w:t>
-      </w:r>
-      <w:r>
-        <w:t xml:space="preserve"> GDPR Điều 32(1)(b) (bảo mật khi xử lý dữ liệu); Luật 91/2025/QH15 Điều 3 và NĐ 356/2025/NĐ-CP (biện pháp kỹ thuật bảo vệ dữ liệu cá nhân); Luật ATTTM 2015 Điều 19. </w:t>
-      </w:r>
-      <w:r>
-        <w:rPr>
-          <w:b/>
-        </w:rPr>
-        <w:t>Pha DevSecOps:</w:t>
-      </w:r>
-      <w:r>
-        <w:t xml:space="preserve"> Code → Test. </w:t>
-      </w:r>
-      <w:r>
-        <w:rPr>
-          <w:b/>
-        </w:rPr>
-        <w:t>Kiểm soát (Security as Code):</w:t>
-      </w:r>
-      <w:r>
-        <w:t xml:space="preserve"> phát hiện bằng SAST ở pha Code, chặn tái diễn bằng kiểm thử bảo mật tự động ở pha Test.</w:t>
-      </w:r>
-    </w:p>
-    <w:p>
-      <w:pPr>
-        <w:pStyle w:val="Heading2"/>
-      </w:pPr>
-      <w:r>
-        <w:t>5.2. F02 — Poison Null Byte làm lộ tệp sao lưu</w:t>
-      </w:r>
-    </w:p>
-    <w:p>
-      <w:pPr>
-        <w:pStyle w:val="Heading3"/>
-      </w:pPr>
-      <w:r>
-        <w:t>Trước khi sửa</w:t>
-      </w:r>
-    </w:p>
-    <w:p>
-      <w:pPr>
-        <w:jc w:val="both"/>
-      </w:pPr>
-      <w:r>
-        <w:t xml:space="preserve">Route </w:t>
-      </w:r>
-      <w:r>
-        <w:rPr>
-          <w:rFonts w:ascii="Consolas" w:hAnsi="Consolas"/>
-          <w:sz w:val="20"/>
-        </w:rPr>
-        <w:t>routes/fileServer.ts</w:t>
-      </w:r>
-      <w:r>
-        <w:t xml:space="preserve"> phục vụ tệp trong thư mục </w:t>
-      </w:r>
-      <w:r>
-        <w:rPr>
-          <w:rFonts w:ascii="Consolas" w:hAnsi="Consolas"/>
-          <w:sz w:val="20"/>
-        </w:rPr>
-        <w:t>ftp/</w:t>
-      </w:r>
-      <w:r>
-        <w:t xml:space="preserve"> qua </w:t>
-      </w:r>
-      <w:r>
-        <w:rPr>
-          <w:rFonts w:ascii="Consolas" w:hAnsi="Consolas"/>
-          <w:sz w:val="20"/>
-        </w:rPr>
-        <w:t>GET /ftp/:file</w:t>
-      </w:r>
-      <w:r>
-        <w:t xml:space="preserve">. Ứng dụng kiểm tra hậu tố </w:t>
-      </w:r>
-      <w:r>
-        <w:rPr>
-          <w:rFonts w:ascii="Consolas" w:hAnsi="Consolas"/>
-          <w:sz w:val="20"/>
-        </w:rPr>
-        <w:t>.md</w:t>
-      </w:r>
-      <w:r>
-        <w:t>/</w:t>
-      </w:r>
-      <w:r>
-        <w:rPr>
-          <w:rFonts w:ascii="Consolas" w:hAnsi="Consolas"/>
-          <w:sz w:val="20"/>
-        </w:rPr>
-        <w:t>.pdf</w:t>
-      </w:r>
-      <w:r>
-        <w:t xml:space="preserve"> (ngoài ra có ngoại lệ cho </w:t>
-      </w:r>
-      <w:r>
-        <w:rPr>
-          <w:rFonts w:ascii="Consolas" w:hAnsi="Consolas"/>
-          <w:sz w:val="20"/>
-        </w:rPr>
-        <w:t>incident-support.kdbx</w:t>
-      </w:r>
-      <w:r>
-        <w:t>), sau đó mới phục vụ:</w:t>
+        <w:t>Dùng truy vấn tham số (bind parameter):</w:t>
       </w:r>
     </w:p>
     <w:tbl>
@@ -6727,7 +7656,7 @@
                 <w:rFonts w:ascii="Consolas" w:hAnsi="Consolas"/>
                 <w:sz w:val="17"/>
               </w:rPr>
-              <w:t>if (file &amp;&amp; (endsWithAllowlistedFileType(file) || (file === 'incident-support.kdbx'))) {</w:t>
+              <w:t>const email = typeof req.body.email === 'string' ? req.body.email : ''</w:t>
             </w:r>
             <w:r>
               <w:br/>
@@ -6737,7 +7666,7 @@
                 <w:rFonts w:ascii="Consolas" w:hAnsi="Consolas"/>
                 <w:sz w:val="17"/>
               </w:rPr>
-              <w:t xml:space="preserve">  file = security.cutOffPoisonNullByte(file)   // cắt tên tại chuỗi literal "%00" rồi mới phục vụ</w:t>
+              <w:t>const password = typeof req.body.password === 'string' ? req.body.password : ''</w:t>
             </w:r>
             <w:r>
               <w:br/>
@@ -6747,7 +7676,7 @@
                 <w:rFonts w:ascii="Consolas" w:hAnsi="Consolas"/>
                 <w:sz w:val="17"/>
               </w:rPr>
-              <w:t xml:space="preserve">  res.sendFile(path.resolve('ftp/', file))</w:t>
+              <w:t>models.sequelize.query('SELECT * FROM Users WHERE email = $email AND password = $password AND deletedAt IS NULL',</w:t>
             </w:r>
             <w:r>
               <w:br/>
@@ -6757,7 +7686,7 @@
                 <w:rFonts w:ascii="Consolas" w:hAnsi="Consolas"/>
                 <w:sz w:val="17"/>
               </w:rPr>
-              <w:t>}</w:t>
+              <w:t xml:space="preserve">  { bind: { email, password: security.hash(password) }, model: UserModel, plain: true })</w:t>
             </w:r>
           </w:p>
         </w:tc>
@@ -6769,171 +7698,7 @@
         <w:jc w:val="both"/>
       </w:pPr>
       <w:r>
-        <w:t xml:space="preserve">Điểm yếu nằm ở </w:t>
-      </w:r>
-      <w:r>
-        <w:rPr>
-          <w:b/>
-        </w:rPr>
-        <w:t>thứ tự xử lý</w:t>
-      </w:r>
-      <w:r>
-        <w:t xml:space="preserve">: tên tệp được </w:t>
-      </w:r>
-      <w:r>
-        <w:rPr>
-          <w:i/>
-        </w:rPr>
-        <w:t>kiểm tra</w:t>
-      </w:r>
-      <w:r>
-        <w:t xml:space="preserve"> khác với tên </w:t>
-      </w:r>
-      <w:r>
-        <w:rPr>
-          <w:i/>
-        </w:rPr>
-        <w:t>thực sự dùng để đọc</w:t>
-      </w:r>
-      <w:r>
-        <w:t xml:space="preserve">. Với yêu cầu </w:t>
-      </w:r>
-      <w:r>
-        <w:rPr>
-          <w:rFonts w:ascii="Consolas" w:hAnsi="Consolas"/>
-          <w:sz w:val="20"/>
-        </w:rPr>
-        <w:t>/ftp/package.json.bak%2500.md</w:t>
-      </w:r>
-      <w:r>
-        <w:t xml:space="preserve">, quá trình giải mã URL tạo tham số </w:t>
-      </w:r>
-      <w:r>
-        <w:rPr>
-          <w:rFonts w:ascii="Consolas" w:hAnsi="Consolas"/>
-          <w:sz w:val="20"/>
-        </w:rPr>
-        <w:t>package.json.bak%00.md</w:t>
-      </w:r>
-      <w:r>
-        <w:t xml:space="preserve">; tham số này vượt qua kiểm tra hậu tố </w:t>
-      </w:r>
-      <w:r>
-        <w:rPr>
-          <w:rFonts w:ascii="Consolas" w:hAnsi="Consolas"/>
-          <w:sz w:val="20"/>
-        </w:rPr>
-        <w:t>.md</w:t>
-      </w:r>
-      <w:r>
-        <w:t xml:space="preserve">, rồi hàm </w:t>
-      </w:r>
-      <w:r>
-        <w:rPr>
-          <w:rFonts w:ascii="Consolas" w:hAnsi="Consolas"/>
-          <w:sz w:val="20"/>
-        </w:rPr>
-        <w:t>cutOffPoisonNullByte</w:t>
-      </w:r>
-      <w:r>
-        <w:t xml:space="preserve"> cắt tại chuỗi </w:t>
-      </w:r>
-      <w:r>
-        <w:rPr>
-          <w:rFonts w:ascii="Consolas" w:hAnsi="Consolas"/>
-          <w:sz w:val="20"/>
-        </w:rPr>
-        <w:t>%00</w:t>
-      </w:r>
-      <w:r>
-        <w:t xml:space="preserve"> thành </w:t>
-      </w:r>
-      <w:r>
-        <w:rPr>
-          <w:rFonts w:ascii="Consolas" w:hAnsi="Consolas"/>
-          <w:sz w:val="20"/>
-        </w:rPr>
-        <w:t>package.json.bak</w:t>
-      </w:r>
-      <w:r>
-        <w:t xml:space="preserve"> và chuyển cho </w:t>
-      </w:r>
-      <w:r>
-        <w:rPr>
-          <w:rFonts w:ascii="Consolas" w:hAnsi="Consolas"/>
-          <w:sz w:val="20"/>
-        </w:rPr>
-        <w:t>res.sendFile</w:t>
-      </w:r>
-      <w:r>
-        <w:t xml:space="preserve">. Nhờ đó người dùng </w:t>
-      </w:r>
-      <w:r>
-        <w:rPr>
-          <w:b/>
-        </w:rPr>
-        <w:t>đọc được các tệp sao lưu phía máy chủ</w:t>
-      </w:r>
-      <w:r>
-        <w:t xml:space="preserve"> mà bộ lọc đuôi lẽ ra chặn — ví dụ </w:t>
-      </w:r>
-      <w:r>
-        <w:rPr>
-          <w:rFonts w:ascii="Consolas" w:hAnsi="Consolas"/>
-          <w:sz w:val="20"/>
-        </w:rPr>
-        <w:t>package.json.bak</w:t>
-      </w:r>
-      <w:r>
-        <w:t xml:space="preserve"> (thông tin cấu hình, phiên bản dependency) hay </w:t>
-      </w:r>
-      <w:r>
-        <w:rPr>
-          <w:rFonts w:ascii="Consolas" w:hAnsi="Consolas"/>
-          <w:sz w:val="20"/>
-        </w:rPr>
-        <w:t>coupons_2013.md.bak</w:t>
-      </w:r>
-      <w:r>
-        <w:t xml:space="preserve"> (mã giảm giá). Đây là lỗi </w:t>
-      </w:r>
-      <w:r>
-        <w:rPr>
-          <w:b/>
-        </w:rPr>
-        <w:t>Poison Null Byte</w:t>
-      </w:r>
-      <w:r>
-        <w:t xml:space="preserve"> (CWE-158; CWE-180 kiểm tra trước khi chuẩn hóa; OWASP A01:2021 Broken Access Control). Tình huống thực nghiệm chỉ chứng minh đọc được tệp </w:t>
-      </w:r>
-      <w:r>
-        <w:rPr>
-          <w:i/>
-        </w:rPr>
-        <w:t>bên trong</w:t>
-      </w:r>
-      <w:r>
-        <w:t xml:space="preserve"> thư mục </w:t>
-      </w:r>
-      <w:r>
-        <w:rPr>
-          <w:rFonts w:ascii="Consolas" w:hAnsi="Consolas"/>
-          <w:sz w:val="20"/>
-        </w:rPr>
-        <w:t>ftp/</w:t>
-      </w:r>
-      <w:r>
-        <w:t>; chưa chứng minh truy cập ra ngoài thư mục này (</w:t>
-      </w:r>
-      <w:r>
-        <w:rPr>
-          <w:rFonts w:ascii="Consolas" w:hAnsi="Consolas"/>
-          <w:sz w:val="20"/>
-        </w:rPr>
-        <w:t>/</w:t>
-      </w:r>
-      <w:r>
-        <w:t xml:space="preserve"> bị chặn riêng).</w:t>
+        <w:t>Câu lệnh được biên dịch trước và giá trị truyền riêng, nên mọi ký tự SQL trong email giờ chỉ còn được hiểu là dữ liệu. Sau khi sửa, kiểm thử bảo mật xanh toàn bộ (Hình 16); demo cũng cho thấy mọi payload đều bị từ chối 401 trong khi đăng nhập hợp lệ vẫn hoạt động bình thường (Hình 14).</w:t>
       </w:r>
     </w:p>
     <w:p>
@@ -6941,72 +7706,134 @@
         <w:jc w:val="both"/>
       </w:pPr>
       <w:r>
-        <w:rPr>
-          <w:b/>
-        </w:rPr>
-        <w:t>Phát hiện.</w:t>
-      </w:r>
-      <w:r>
-        <w:t xml:space="preserve"> Semgrep (luật </w:t>
+        <w:t xml:space="preserve">Bản vá vẫn còn một giới hạn: nó chỉ xử lý injection, trong khi cùng dòng code đó vẫn gọi </w:t>
       </w:r>
       <w:r>
         <w:rPr>
           <w:rFonts w:ascii="Consolas" w:hAnsi="Consolas"/>
           <w:sz w:val="20"/>
         </w:rPr>
-        <w:t>express-res-sendfile</w:t>
-      </w:r>
-      <w:r>
-        <w:t xml:space="preserve">) chỉ ra lời gọi </w:t>
+        <w:t>security.hash</w:t>
+      </w:r>
+      <w:r>
+        <w:t xml:space="preserve"> của Juice Shop, vốn băm mật khẩu bằng </w:t>
+      </w:r>
+      <w:r>
+        <w:rPr>
+          <w:b/>
+        </w:rPr>
+        <w:t>MD5 không salt</w:t>
+      </w:r>
+      <w:r>
+        <w:t xml:space="preserve"> (</w:t>
       </w:r>
       <w:r>
         <w:rPr>
           <w:rFonts w:ascii="Consolas" w:hAnsi="Consolas"/>
           <w:sz w:val="20"/>
         </w:rPr>
-        <w:t>res.sendFile</w:t>
-      </w:r>
-      <w:r>
-        <w:t xml:space="preserve"> nhận tên tệp từ đầu vào người dùng — F02 là một trong các cảnh báo SAST được xác nhận (xem hình quét ở mục 4.1). Vì cảnh báo chỉ nêu vị trí, nhóm phân tích luồng xử lý và dùng </w:t>
-      </w:r>
+        <w:t>lib/insecurity.ts</w:t>
+      </w:r>
+      <w:r>
+        <w:t>, CWE-327 / OWASP A02:2021). Đây là lỗ hổng lưu trữ mật khẩu nằm ngoài phạm vi F01, vì F01 chỉ chặn việc vượt xác thực; khi triển khai thật, cần thay nó bằng bcrypt hoặc argon2 có salt.</w:t>
+      </w:r>
+    </w:p>
+    <w:p>
+      <w:pPr>
+        <w:jc w:val="center"/>
+      </w:pPr>
+      <w:r>
+        <w:drawing>
+          <wp:inline xmlns:a="http://schemas.openxmlformats.org/drawingml/2006/main" xmlns:pic="http://schemas.openxmlformats.org/drawingml/2006/picture">
+            <wp:extent cx="5400000" cy="1996579"/>
+            <wp:docPr id="15" name="Picture 15"/>
+            <wp:cNvGraphicFramePr>
+              <a:graphicFrameLocks noChangeAspect="1"/>
+            </wp:cNvGraphicFramePr>
+            <a:graphic>
+              <a:graphicData uri="http://schemas.openxmlformats.org/drawingml/2006/picture">
+                <pic:pic>
+                  <pic:nvPicPr>
+                    <pic:cNvPr id="0" name="tv1.png"/>
+                    <pic:cNvPicPr/>
+                  </pic:nvPicPr>
+                  <pic:blipFill>
+                    <a:blip r:embed="rId24"/>
+                    <a:stretch>
+                      <a:fillRect/>
+                    </a:stretch>
+                  </pic:blipFill>
+                  <pic:spPr>
+                    <a:xfrm>
+                      <a:off x="0" y="0"/>
+                      <a:ext cx="5400000" cy="1996579"/>
+                    </a:xfrm>
+                    <a:prstGeom prst="rect"/>
+                  </pic:spPr>
+                </pic:pic>
+              </a:graphicData>
+            </a:graphic>
+          </wp:inline>
+        </w:drawing>
+      </w:r>
+    </w:p>
+    <w:p>
+      <w:pPr>
+        <w:jc w:val="center"/>
+      </w:pPr>
+      <w:r>
+        <w:rPr>
+          <w:i/>
+          <w:sz w:val="22"/>
+        </w:rPr>
+        <w:t xml:space="preserve">Hình 14. </w:t>
+      </w:r>
+      <w:r>
+        <w:rPr>
+          <w:i/>
+          <w:sz w:val="22"/>
+        </w:rPr>
+        <w:t>Demo F01: cùng payload, trước khi sửa được cấp token, sau khi sửa bị từ chối</w:t>
+      </w:r>
+    </w:p>
+    <w:p>
+      <w:pPr>
+        <w:jc w:val="both"/>
+      </w:pPr>
       <w:r>
         <w:rPr>
           <w:b/>
         </w:rPr>
-        <w:t>kiểm thử HTTP</w:t>
-      </w:r>
-      <w:r>
-        <w:t xml:space="preserve"> để xác nhận việc vượt bộ lọc: kiểm thử </w:t>
-      </w:r>
-      <w:r>
-        <w:rPr>
-          <w:rFonts w:ascii="Consolas" w:hAnsi="Consolas"/>
-          <w:sz w:val="20"/>
-        </w:rPr>
-        <w:t>test/api/security/f01-f02.test.ts</w:t>
-      </w:r>
-      <w:r>
-        <w:t xml:space="preserve"> gửi </w:t>
-      </w:r>
-      <w:r>
-        <w:rPr>
-          <w:rFonts w:ascii="Consolas" w:hAnsi="Consolas"/>
-          <w:sz w:val="20"/>
-        </w:rPr>
-        <w:t>GET /ftp/package.json.bak%2500.md</w:t>
-      </w:r>
-      <w:r>
-        <w:t xml:space="preserve"> và yêu cầu phản hồi 403; trên mã chưa sửa, ca này báo đỏ (Hình 9). Demo </w:t>
-      </w:r>
-      <w:r>
-        <w:rPr>
-          <w:rFonts w:ascii="Consolas" w:hAnsi="Consolas"/>
-          <w:sz w:val="20"/>
-        </w:rPr>
-        <w:t>demos/tv2_f02_pathtraversal.py</w:t>
-      </w:r>
-      <w:r>
-        <w:t xml:space="preserve"> cho thấy cùng payload đọc được nội dung tệp ở bản chưa vá (Hình 11).</w:t>
+        <w:t>Nguyên tắc/tiêu chuẩn đối chiếu:</w:t>
+      </w:r>
+      <w:r>
+        <w:t xml:space="preserve"> GDPR Điều 32(1)(b) (bảo mật khi xử lý dữ liệu); Luật 91/2025/QH15 Điều 3 và NĐ 356/2025/NĐ-CP (biện pháp kỹ thuật bảo vệ dữ liệu cá nhân); Luật ATTTM 2015 Điều 19. </w:t>
+      </w:r>
+      <w:r>
+        <w:rPr>
+          <w:b/>
+        </w:rPr>
+        <w:t>Pha DevSecOps:</w:t>
+      </w:r>
+      <w:r>
+        <w:t xml:space="preserve"> Code → Test. </w:t>
+      </w:r>
+      <w:r>
+        <w:rPr>
+          <w:b/>
+        </w:rPr>
+        <w:t>Kiểm soát (Security as Code):</w:t>
+      </w:r>
+      <w:r>
+        <w:t xml:space="preserve"> phát hiện bằng SAST ở pha Code, chặn tái diễn bằng kiểm thử bảo mật tự động ở pha Test.</w:t>
+      </w:r>
+    </w:p>
+    <w:p>
+      <w:pPr>
+        <w:pStyle w:val="Heading2"/>
+      </w:pPr>
+      <w:r>
+        <w:t>5.2. F02 — Poison Null Byte làm lộ tệp sao lưu</w:t>
       </w:r>
     </w:p>
     <w:p>
@@ -7014,7 +7841,7 @@
         <w:pStyle w:val="Heading3"/>
       </w:pPr>
       <w:r>
-        <w:t>Sau khi sửa</w:t>
+        <w:t>Trước khi sửa</w:t>
       </w:r>
     </w:p>
     <w:p>
@@ -7022,36 +7849,67 @@
         <w:jc w:val="both"/>
       </w:pPr>
       <w:r>
-        <w:t>Từ chối hẳn tên tệp chứa null byte (</w:t>
+        <w:t xml:space="preserve">Route </w:t>
       </w:r>
       <w:r>
         <w:rPr>
           <w:rFonts w:ascii="Consolas" w:hAnsi="Consolas"/>
           <w:sz w:val="20"/>
         </w:rPr>
-        <w:t>%00</w:t>
-      </w:r>
-      <w:r>
-        <w:t xml:space="preserve"> dạng chuỗi hoặc ký tự NUL thực </w:t>
+        <w:t>routes/fileServer.ts</w:t>
+      </w:r>
+      <w:r>
+        <w:t xml:space="preserve"> phục vụ tệp trong thư mục </w:t>
       </w:r>
       <w:r>
         <w:rPr>
           <w:rFonts w:ascii="Consolas" w:hAnsi="Consolas"/>
           <w:sz w:val="20"/>
         </w:rPr>
-        <w:t>\u0000</w:t>
-      </w:r>
-      <w:r>
-        <w:t xml:space="preserve">) </w:t>
-      </w:r>
-      <w:r>
-        <w:rPr>
-          <w:b/>
-        </w:rPr>
-        <w:t>trước</w:t>
-      </w:r>
-      <w:r>
-        <w:t xml:space="preserve"> bước kiểm tra loại và phục vụ, thay vì cắt bỏ rồi gửi:</w:t>
+        <w:t>ftp/</w:t>
+      </w:r>
+      <w:r>
+        <w:t xml:space="preserve"> qua </w:t>
+      </w:r>
+      <w:r>
+        <w:rPr>
+          <w:rFonts w:ascii="Consolas" w:hAnsi="Consolas"/>
+          <w:sz w:val="20"/>
+        </w:rPr>
+        <w:t>GET /ftp/:file</w:t>
+      </w:r>
+      <w:r>
+        <w:t xml:space="preserve">. Ứng dụng kiểm tra hậu tố </w:t>
+      </w:r>
+      <w:r>
+        <w:rPr>
+          <w:rFonts w:ascii="Consolas" w:hAnsi="Consolas"/>
+          <w:sz w:val="20"/>
+        </w:rPr>
+        <w:t>.md</w:t>
+      </w:r>
+      <w:r>
+        <w:t>/</w:t>
+      </w:r>
+      <w:r>
+        <w:rPr>
+          <w:rFonts w:ascii="Consolas" w:hAnsi="Consolas"/>
+          <w:sz w:val="20"/>
+        </w:rPr>
+        <w:t>.pdf</w:t>
+      </w:r>
+      <w:r>
+        <w:t xml:space="preserve"> (ngoài ra có ngoại lệ cho </w:t>
+      </w:r>
+      <w:r>
+        <w:rPr>
+          <w:rFonts w:ascii="Consolas" w:hAnsi="Consolas"/>
+          <w:sz w:val="20"/>
+        </w:rPr>
+        <w:t>incident-support.kdbx</w:t>
+      </w:r>
+      <w:r>
+        <w:t>), sau đó mới phục vụ:</w:t>
       </w:r>
     </w:p>
     <w:tbl>
@@ -7078,7 +7936,7 @@
                 <w:rFonts w:ascii="Consolas" w:hAnsi="Consolas"/>
                 <w:sz w:val="17"/>
               </w:rPr>
-              <w:t>if (file &amp;&amp; (file.includes('%00') || file.includes('\u0000'))) {</w:t>
+              <w:t>if (file &amp;&amp; (endsWithAllowlistedFileType(file) || (file === 'incident-support.kdbx'))) {</w:t>
             </w:r>
             <w:r>
               <w:br/>
@@ -7088,7 +7946,7 @@
                 <w:rFonts w:ascii="Consolas" w:hAnsi="Consolas"/>
                 <w:sz w:val="17"/>
               </w:rPr>
-              <w:t xml:space="preserve">  res.status(403)</w:t>
+              <w:t xml:space="preserve">  file = security.cutOffPoisonNullByte(file)   // cắt tên tại chuỗi literal "%00" rồi mới phục vụ</w:t>
             </w:r>
             <w:r>
               <w:br/>
@@ -7098,17 +7956,7 @@
                 <w:rFonts w:ascii="Consolas" w:hAnsi="Consolas"/>
                 <w:sz w:val="17"/>
               </w:rPr>
-              <w:t xml:space="preserve">  next(new Error('File names cannot contain null bytes!'))</w:t>
-            </w:r>
-            <w:r>
-              <w:br/>
-            </w:r>
-            <w:r>
-              <w:rPr>
-                <w:rFonts w:ascii="Consolas" w:hAnsi="Consolas"/>
-                <w:sz w:val="17"/>
-              </w:rPr>
-              <w:t xml:space="preserve">  return</w:t>
+              <w:t xml:space="preserve">  res.sendFile(path.resolve('ftp/', file))</w:t>
             </w:r>
             <w:r>
               <w:br/>
@@ -7130,36 +7978,397 @@
         <w:jc w:val="both"/>
       </w:pPr>
       <w:r>
-        <w:t xml:space="preserve">Sau khi sửa, hai payload </w:t>
+        <w:t xml:space="preserve">Điểm yếu nằm ở </w:t>
+      </w:r>
+      <w:r>
+        <w:rPr>
+          <w:b/>
+        </w:rPr>
+        <w:t>thứ tự xử lý</w:t>
+      </w:r>
+      <w:r>
+        <w:t xml:space="preserve">: tên tệp được </w:t>
+      </w:r>
+      <w:r>
+        <w:rPr>
+          <w:i/>
+        </w:rPr>
+        <w:t>kiểm tra</w:t>
+      </w:r>
+      <w:r>
+        <w:t xml:space="preserve"> khác với tên </w:t>
+      </w:r>
+      <w:r>
+        <w:rPr>
+          <w:i/>
+        </w:rPr>
+        <w:t>thực sự dùng để đọc</w:t>
+      </w:r>
+      <w:r>
+        <w:t xml:space="preserve">. Với yêu cầu </w:t>
       </w:r>
       <w:r>
         <w:rPr>
           <w:rFonts w:ascii="Consolas" w:hAnsi="Consolas"/>
           <w:sz w:val="20"/>
         </w:rPr>
-        <w:t>...%2500.md</w:t>
-      </w:r>
-      <w:r>
-        <w:t xml:space="preserve"> bị từ chối </w:t>
-      </w:r>
-      <w:r>
-        <w:rPr>
-          <w:b/>
-        </w:rPr>
-        <w:t>403</w:t>
-      </w:r>
-      <w:r>
-        <w:t>, trong khi tải tệp hợp lệ (</w:t>
+        <w:t>/ftp/package.json.bak%2500.md</w:t>
+      </w:r>
+      <w:r>
+        <w:t xml:space="preserve">, quá trình giải mã URL tạo tham số </w:t>
       </w:r>
       <w:r>
         <w:rPr>
           <w:rFonts w:ascii="Consolas" w:hAnsi="Consolas"/>
           <w:sz w:val="20"/>
         </w:rPr>
+        <w:t>package.json.bak%00.md</w:t>
+      </w:r>
+      <w:r>
+        <w:t xml:space="preserve">; tham số này vượt qua kiểm tra hậu tố </w:t>
+      </w:r>
+      <w:r>
+        <w:rPr>
+          <w:rFonts w:ascii="Consolas" w:hAnsi="Consolas"/>
+          <w:sz w:val="20"/>
+        </w:rPr>
+        <w:t>.md</w:t>
+      </w:r>
+      <w:r>
+        <w:t xml:space="preserve">, rồi hàm </w:t>
+      </w:r>
+      <w:r>
+        <w:rPr>
+          <w:rFonts w:ascii="Consolas" w:hAnsi="Consolas"/>
+          <w:sz w:val="20"/>
+        </w:rPr>
+        <w:t>cutOffPoisonNullByte</w:t>
+      </w:r>
+      <w:r>
+        <w:t xml:space="preserve"> cắt tại chuỗi </w:t>
+      </w:r>
+      <w:r>
+        <w:rPr>
+          <w:rFonts w:ascii="Consolas" w:hAnsi="Consolas"/>
+          <w:sz w:val="20"/>
+        </w:rPr>
+        <w:t>%00</w:t>
+      </w:r>
+      <w:r>
+        <w:t xml:space="preserve"> thành </w:t>
+      </w:r>
+      <w:r>
+        <w:rPr>
+          <w:rFonts w:ascii="Consolas" w:hAnsi="Consolas"/>
+          <w:sz w:val="20"/>
+        </w:rPr>
+        <w:t>package.json.bak</w:t>
+      </w:r>
+      <w:r>
+        <w:t xml:space="preserve"> và chuyển cho </w:t>
+      </w:r>
+      <w:r>
+        <w:rPr>
+          <w:rFonts w:ascii="Consolas" w:hAnsi="Consolas"/>
+          <w:sz w:val="20"/>
+        </w:rPr>
+        <w:t>res.sendFile</w:t>
+      </w:r>
+      <w:r>
+        <w:t xml:space="preserve">. Nhờ đó người dùng </w:t>
+      </w:r>
+      <w:r>
+        <w:rPr>
+          <w:b/>
+        </w:rPr>
+        <w:t>đọc được các tệp sao lưu phía máy chủ</w:t>
+      </w:r>
+      <w:r>
+        <w:t xml:space="preserve"> mà bộ lọc đuôi lẽ ra chặn — ví dụ </w:t>
+      </w:r>
+      <w:r>
+        <w:rPr>
+          <w:rFonts w:ascii="Consolas" w:hAnsi="Consolas"/>
+          <w:sz w:val="20"/>
+        </w:rPr>
+        <w:t>package.json.bak</w:t>
+      </w:r>
+      <w:r>
+        <w:t xml:space="preserve"> (thông tin cấu hình, phiên bản dependency) hay </w:t>
+      </w:r>
+      <w:r>
+        <w:rPr>
+          <w:rFonts w:ascii="Consolas" w:hAnsi="Consolas"/>
+          <w:sz w:val="20"/>
+        </w:rPr>
+        <w:t>coupons_2013.md.bak</w:t>
+      </w:r>
+      <w:r>
+        <w:t xml:space="preserve"> (mã giảm giá). Đây là lỗi </w:t>
+      </w:r>
+      <w:r>
+        <w:rPr>
+          <w:b/>
+        </w:rPr>
+        <w:t>Poison Null Byte</w:t>
+      </w:r>
+      <w:r>
+        <w:t xml:space="preserve"> (CWE-158; CWE-180 kiểm tra trước khi chuẩn hóa; OWASP A01:2021 Broken Access Control). Tình huống thực nghiệm chỉ chứng minh đọc được tệp </w:t>
+      </w:r>
+      <w:r>
+        <w:rPr>
+          <w:i/>
+        </w:rPr>
+        <w:t>bên trong</w:t>
+      </w:r>
+      <w:r>
+        <w:t xml:space="preserve"> thư mục </w:t>
+      </w:r>
+      <w:r>
+        <w:rPr>
+          <w:rFonts w:ascii="Consolas" w:hAnsi="Consolas"/>
+          <w:sz w:val="20"/>
+        </w:rPr>
+        <w:t>ftp/</w:t>
+      </w:r>
+      <w:r>
+        <w:t>; chưa chứng minh truy cập ra ngoài thư mục này (</w:t>
+      </w:r>
+      <w:r>
+        <w:rPr>
+          <w:rFonts w:ascii="Consolas" w:hAnsi="Consolas"/>
+          <w:sz w:val="20"/>
+        </w:rPr>
+        <w:t>/</w:t>
+      </w:r>
+      <w:r>
+        <w:t xml:space="preserve"> bị chặn riêng).</w:t>
+      </w:r>
+    </w:p>
+    <w:p>
+      <w:pPr>
+        <w:jc w:val="both"/>
+      </w:pPr>
+      <w:r>
+        <w:rPr>
+          <w:b/>
+        </w:rPr>
+        <w:t>Phát hiện.</w:t>
+      </w:r>
+      <w:r>
+        <w:t xml:space="preserve"> Semgrep (luật </w:t>
+      </w:r>
+      <w:r>
+        <w:rPr>
+          <w:rFonts w:ascii="Consolas" w:hAnsi="Consolas"/>
+          <w:sz w:val="20"/>
+        </w:rPr>
+        <w:t>express-res-sendfile</w:t>
+      </w:r>
+      <w:r>
+        <w:t xml:space="preserve">) chỉ ra lời gọi </w:t>
+      </w:r>
+      <w:r>
+        <w:rPr>
+          <w:rFonts w:ascii="Consolas" w:hAnsi="Consolas"/>
+          <w:sz w:val="20"/>
+        </w:rPr>
+        <w:t>res.sendFile</w:t>
+      </w:r>
+      <w:r>
+        <w:t xml:space="preserve"> nhận tên tệp từ đầu vào người dùng — F02 là một trong các cảnh báo SAST được xác nhận (xem hình quét ở mục 4.1). Vì cảnh báo chỉ nêu vị trí, nhóm phân tích luồng xử lý và dùng </w:t>
+      </w:r>
+      <w:r>
+        <w:rPr>
+          <w:b/>
+        </w:rPr>
+        <w:t>kiểm thử HTTP</w:t>
+      </w:r>
+      <w:r>
+        <w:t xml:space="preserve"> để xác nhận việc vượt bộ lọc: kiểm thử </w:t>
+      </w:r>
+      <w:r>
+        <w:rPr>
+          <w:rFonts w:ascii="Consolas" w:hAnsi="Consolas"/>
+          <w:sz w:val="20"/>
+        </w:rPr>
+        <w:t>test/api/security/f01-f02.test.ts</w:t>
+      </w:r>
+      <w:r>
+        <w:t xml:space="preserve"> gửi </w:t>
+      </w:r>
+      <w:r>
+        <w:rPr>
+          <w:rFonts w:ascii="Consolas" w:hAnsi="Consolas"/>
+          <w:sz w:val="20"/>
+        </w:rPr>
+        <w:t>GET /ftp/package.json.bak%2500.md</w:t>
+      </w:r>
+      <w:r>
+        <w:t xml:space="preserve"> và yêu cầu phản hồi 403; trên mã chưa sửa, ca này báo đỏ (Hình 13). Demo </w:t>
+      </w:r>
+      <w:r>
+        <w:rPr>
+          <w:rFonts w:ascii="Consolas" w:hAnsi="Consolas"/>
+          <w:sz w:val="20"/>
+        </w:rPr>
+        <w:t>demos/tv2_f02_pathtraversal.py</w:t>
+      </w:r>
+      <w:r>
+        <w:t xml:space="preserve"> cho thấy cùng payload đọc được nội dung tệp ở bản chưa vá (Hình 15).</w:t>
+      </w:r>
+    </w:p>
+    <w:p>
+      <w:pPr>
+        <w:pStyle w:val="Heading3"/>
+      </w:pPr>
+      <w:r>
+        <w:t>Sau khi sửa</w:t>
+      </w:r>
+    </w:p>
+    <w:p>
+      <w:pPr>
+        <w:jc w:val="both"/>
+      </w:pPr>
+      <w:r>
+        <w:t>Từ chối hẳn tên tệp chứa null byte (</w:t>
+      </w:r>
+      <w:r>
+        <w:rPr>
+          <w:rFonts w:ascii="Consolas" w:hAnsi="Consolas"/>
+          <w:sz w:val="20"/>
+        </w:rPr>
+        <w:t>%00</w:t>
+      </w:r>
+      <w:r>
+        <w:t xml:space="preserve"> dạng chuỗi hoặc ký tự NUL thực </w:t>
+      </w:r>
+      <w:r>
+        <w:rPr>
+          <w:rFonts w:ascii="Consolas" w:hAnsi="Consolas"/>
+          <w:sz w:val="20"/>
+        </w:rPr>
+        <w:t>\u0000</w:t>
+      </w:r>
+      <w:r>
+        <w:t xml:space="preserve">) </w:t>
+      </w:r>
+      <w:r>
+        <w:rPr>
+          <w:b/>
+        </w:rPr>
+        <w:t>trước</w:t>
+      </w:r>
+      <w:r>
+        <w:t xml:space="preserve"> bước kiểm tra loại và phục vụ, thay vì cắt bỏ rồi gửi:</w:t>
+      </w:r>
+    </w:p>
+    <w:tbl>
+      <w:tblPr>
+        <w:tblStyle w:val="TableGrid"/>
+        <w:tblW w:type="auto" w:w="0"/>
+        <w:tblLook w:firstColumn="1" w:firstRow="1" w:lastColumn="0" w:lastRow="0" w:noHBand="0" w:noVBand="1" w:val="04A0"/>
+      </w:tblPr>
+      <w:tblGrid>
+        <w:gridCol w:w="9638"/>
+      </w:tblGrid>
+      <w:tr>
+        <w:tc>
+          <w:tcPr>
+            <w:tcW w:type="dxa" w:w="9638"/>
+            <w:shd w:val="clear" w:color="auto" w:fill="F6F8FA"/>
+          </w:tcPr>
+          <w:p>
+            <w:pPr>
+              <w:spacing w:after="0"/>
+            </w:pPr>
+            <w:r>
+              <w:rPr>
+                <w:rFonts w:ascii="Consolas" w:hAnsi="Consolas"/>
+                <w:sz w:val="17"/>
+              </w:rPr>
+              <w:t>if (file &amp;&amp; (file.includes('%00') || file.includes('\u0000'))) {</w:t>
+            </w:r>
+            <w:r>
+              <w:br/>
+            </w:r>
+            <w:r>
+              <w:rPr>
+                <w:rFonts w:ascii="Consolas" w:hAnsi="Consolas"/>
+                <w:sz w:val="17"/>
+              </w:rPr>
+              <w:t xml:space="preserve">  res.status(403)</w:t>
+            </w:r>
+            <w:r>
+              <w:br/>
+            </w:r>
+            <w:r>
+              <w:rPr>
+                <w:rFonts w:ascii="Consolas" w:hAnsi="Consolas"/>
+                <w:sz w:val="17"/>
+              </w:rPr>
+              <w:t xml:space="preserve">  next(new Error('File names cannot contain null bytes!'))</w:t>
+            </w:r>
+            <w:r>
+              <w:br/>
+            </w:r>
+            <w:r>
+              <w:rPr>
+                <w:rFonts w:ascii="Consolas" w:hAnsi="Consolas"/>
+                <w:sz w:val="17"/>
+              </w:rPr>
+              <w:t xml:space="preserve">  return</w:t>
+            </w:r>
+            <w:r>
+              <w:br/>
+            </w:r>
+            <w:r>
+              <w:rPr>
+                <w:rFonts w:ascii="Consolas" w:hAnsi="Consolas"/>
+                <w:sz w:val="17"/>
+              </w:rPr>
+              <w:t>}</w:t>
+            </w:r>
+          </w:p>
+        </w:tc>
+      </w:tr>
+    </w:tbl>
+    <w:p/>
+    <w:p>
+      <w:pPr>
+        <w:jc w:val="both"/>
+      </w:pPr>
+      <w:r>
+        <w:t xml:space="preserve">Sau khi sửa, hai payload </w:t>
+      </w:r>
+      <w:r>
+        <w:rPr>
+          <w:rFonts w:ascii="Consolas" w:hAnsi="Consolas"/>
+          <w:sz w:val="20"/>
+        </w:rPr>
+        <w:t>...%2500.md</w:t>
+      </w:r>
+      <w:r>
+        <w:t xml:space="preserve"> bị từ chối </w:t>
+      </w:r>
+      <w:r>
+        <w:rPr>
+          <w:b/>
+        </w:rPr>
+        <w:t>403</w:t>
+      </w:r>
+      <w:r>
+        <w:t>, trong khi tải tệp hợp lệ (</w:t>
+      </w:r>
+      <w:r>
+        <w:rPr>
+          <w:rFonts w:ascii="Consolas" w:hAnsi="Consolas"/>
+          <w:sz w:val="20"/>
+        </w:rPr>
         <w:t>legal.md</w:t>
       </w:r>
       <w:r>
-        <w:t xml:space="preserve">) vẫn trả về bình thường (Hình 11); kiểm thử bảo mật khi đó xanh toàn bộ (Hình 12). Kết quả xác nhận hiệu quả của bản vá </w:t>
+        <w:t xml:space="preserve">) vẫn trả về bình thường (Hình 15); kiểm thử bảo mật khi đó xanh toàn bộ (Hình 16). Kết quả xác nhận hiệu quả của bản vá </w:t>
       </w:r>
       <w:r>
         <w:rPr>
@@ -7179,7 +8388,7 @@
         <w:drawing>
           <wp:inline xmlns:a="http://schemas.openxmlformats.org/drawingml/2006/main" xmlns:pic="http://schemas.openxmlformats.org/drawingml/2006/picture">
             <wp:extent cx="5400000" cy="988784"/>
-            <wp:docPr id="12" name="Picture 12"/>
+            <wp:docPr id="16" name="Picture 16"/>
             <wp:cNvGraphicFramePr>
               <a:graphicFrameLocks noChangeAspect="1"/>
             </wp:cNvGraphicFramePr>
@@ -7191,7 +8400,7 @@
                     <pic:cNvPicPr/>
                   </pic:nvPicPr>
                   <pic:blipFill>
-                    <a:blip r:embed="rId21"/>
+                    <a:blip r:embed="rId25"/>
                     <a:stretch>
                       <a:fillRect/>
                     </a:stretch>
@@ -7219,7 +8428,7 @@
           <w:i/>
           <w:sz w:val="22"/>
         </w:rPr>
-        <w:t xml:space="preserve">Hình 11. </w:t>
+        <w:t xml:space="preserve">Hình 15. </w:t>
       </w:r>
       <w:r>
         <w:rPr>
@@ -7282,7 +8491,7 @@
         <w:drawing>
           <wp:inline xmlns:a="http://schemas.openxmlformats.org/drawingml/2006/main" xmlns:pic="http://schemas.openxmlformats.org/drawingml/2006/picture">
             <wp:extent cx="5400000" cy="1744054"/>
-            <wp:docPr id="13" name="Picture 13"/>
+            <wp:docPr id="17" name="Picture 17"/>
             <wp:cNvGraphicFramePr>
               <a:graphicFrameLocks noChangeAspect="1"/>
             </wp:cNvGraphicFramePr>
@@ -7294,7 +8503,7 @@
                     <pic:cNvPicPr/>
                   </pic:nvPicPr>
                   <pic:blipFill>
-                    <a:blip r:embed="rId22"/>
+                    <a:blip r:embed="rId26"/>
                     <a:stretch>
                       <a:fillRect/>
                     </a:stretch>
@@ -7322,7 +8531,7 @@
           <w:i/>
           <w:sz w:val="22"/>
         </w:rPr>
-        <w:t xml:space="preserve">Hình 12. </w:t>
+        <w:t xml:space="preserve">Hình 16. </w:t>
       </w:r>
       <w:r>
         <w:rPr>
@@ -7493,7 +8702,7 @@
         <w:t>/metrics</w:t>
       </w:r>
       <w:r>
-        <w:t xml:space="preserve"> từ host; trước khi sửa, endpoint trả về 200 kèm hàng trăm dòng số liệu (Hình 13).</w:t>
+        <w:t xml:space="preserve"> từ host; trước khi sửa, endpoint trả về 200 kèm hàng trăm dòng số liệu (Hình 17).</w:t>
       </w:r>
     </w:p>
     <w:p>
@@ -7648,7 +8857,7 @@
         <w:t>từ host</w:t>
       </w:r>
       <w:r>
-        <w:t>. Đây là chặn ở lối vào từ bên ngoài chứ không phải khóa tuyệt đối: trong mạng internal, hệ thống giám sát vẫn đọc được metrics đúng mục đích (Hình 13).</w:t>
+        <w:t>. Đây là chặn ở lối vào từ bên ngoài chứ không phải khóa tuyệt đối: trong mạng internal, hệ thống giám sát vẫn đọc được metrics đúng mục đích (Hình 17).</w:t>
       </w:r>
     </w:p>
     <w:p>
@@ -7659,7 +8868,7 @@
         <w:drawing>
           <wp:inline xmlns:a="http://schemas.openxmlformats.org/drawingml/2006/main" xmlns:pic="http://schemas.openxmlformats.org/drawingml/2006/picture">
             <wp:extent cx="5400000" cy="3006346"/>
-            <wp:docPr id="14" name="Picture 14"/>
+            <wp:docPr id="18" name="Picture 18"/>
             <wp:cNvGraphicFramePr>
               <a:graphicFrameLocks noChangeAspect="1"/>
             </wp:cNvGraphicFramePr>
@@ -7671,7 +8880,7 @@
                     <pic:cNvPicPr/>
                   </pic:nvPicPr>
                   <pic:blipFill>
-                    <a:blip r:embed="rId23"/>
+                    <a:blip r:embed="rId27"/>
                     <a:stretch>
                       <a:fillRect/>
                     </a:stretch>
@@ -7699,7 +8908,7 @@
           <w:i/>
           <w:sz w:val="22"/>
         </w:rPr>
-        <w:t xml:space="preserve">Hình 13. </w:t>
+        <w:t xml:space="preserve">Hình 17. </w:t>
       </w:r>
       <w:r>
         <w:rPr>
@@ -9041,7 +10250,7 @@
         <w:t>không</w:t>
       </w:r>
       <w:r>
-        <w:t xml:space="preserve"> đồng nghĩa đạt toàn bộ CIS Docker Benchmark, mà chỉ là đạt các luật đã định nghĩa (Hình 14).</w:t>
+        <w:t xml:space="preserve"> đồng nghĩa đạt toàn bộ CIS Docker Benchmark, mà chỉ là đạt các luật đã định nghĩa (Hình 18).</w:t>
       </w:r>
     </w:p>
     <w:p>
@@ -9052,7 +10261,7 @@
         <w:drawing>
           <wp:inline xmlns:a="http://schemas.openxmlformats.org/drawingml/2006/main" xmlns:pic="http://schemas.openxmlformats.org/drawingml/2006/picture">
             <wp:extent cx="5400000" cy="2128846"/>
-            <wp:docPr id="15" name="Picture 15"/>
+            <wp:docPr id="19" name="Picture 19"/>
             <wp:cNvGraphicFramePr>
               <a:graphicFrameLocks noChangeAspect="1"/>
             </wp:cNvGraphicFramePr>
@@ -9064,7 +10273,7 @@
                     <pic:cNvPicPr/>
                   </pic:nvPicPr>
                   <pic:blipFill>
-                    <a:blip r:embed="rId24"/>
+                    <a:blip r:embed="rId28"/>
                     <a:stretch>
                       <a:fillRect/>
                     </a:stretch>
@@ -9092,7 +10301,7 @@
           <w:i/>
           <w:sz w:val="22"/>
         </w:rPr>
-        <w:t xml:space="preserve">Hình 14. </w:t>
+        <w:t xml:space="preserve">Hình 18. </w:t>
       </w:r>
       <w:r>
         <w:rPr>
@@ -9173,7 +10382,34 @@
         <w:jc w:val="both"/>
       </w:pPr>
       <w:r>
-        <w:t xml:space="preserve">Phần đóng góp của nhóm — trong phạm vi bốn tình huống — gồm: bản vá F01/F02 kèm kiểm thử hồi quy, reverse proxy và giới hạn tốc độ cho F03, và bộ luật Rego (Dockerfile + compose, 19 unit test) cho F04. Kho mã Juice Shop gốc </w:t>
+        <w:t xml:space="preserve">Chuỗi kiểm soát trải khắp vòng đời — Code/Test (SAST + kiểm thử động), Build/Deploy (Policy as Code), Release (quét image Trivy/Dockle) đến Operate (Compliance as Code + giám sát Prometheus/Grafana). Phần đóng góp của nhóm — trong phạm vi bốn tình huống — gồm: bản vá F01/F02 kèm kiểm thử hồi quy; reverse proxy và giới hạn tốc độ cho F03; bộ luật Rego (Dockerfile + compose, 19 unit test) cho F04; quét image bằng </w:t>
+      </w:r>
+      <w:r>
+        <w:rPr>
+          <w:b/>
+        </w:rPr>
+        <w:t>Trivy (CVE/SCA)</w:t>
+      </w:r>
+      <w:r>
+        <w:t xml:space="preserve"> và </w:t>
+      </w:r>
+      <w:r>
+        <w:rPr>
+          <w:b/>
+        </w:rPr>
+        <w:t>Dockle (CIS)</w:t>
+      </w:r>
+      <w:r>
+        <w:t xml:space="preserve"> ở pha Release; và </w:t>
+      </w:r>
+      <w:r>
+        <w:rPr>
+          <w:b/>
+        </w:rPr>
+        <w:t>giám sát vận hành bằng Prometheus/Grafana kèm cảnh báo</w:t>
+      </w:r>
+      <w:r>
+        <w:t xml:space="preserve"> fire thật ở pha Operate. Kho mã Juice Shop gốc </w:t>
       </w:r>
       <w:r>
         <w:rPr>
@@ -9217,7 +10453,25 @@
         <w:t>các luật đã định nghĩa</w:t>
       </w:r>
       <w:r>
-        <w:t>, không phải đạt toàn bộ CIS Docker Benchmark; MD5 không salt, TLS nội bộ và digest chưa ghim vẫn là rủi ro còn lại; báo cáo chưa đánh giá SCA/DAST và chưa kết luận production-ready. Đây là những hướng mở rộng tiếp theo, không thuộc phạm vi bốn tình huống của đồ án.</w:t>
+        <w:t xml:space="preserve">, không phải đạt toàn bộ CIS Docker Benchmark; MD5 không salt, TLS nội bộ và digest chưa ghim vẫn là rủi ro còn lại; báo cáo đã bổ sung quét </w:t>
+      </w:r>
+      <w:r>
+        <w:rPr>
+          <w:b/>
+        </w:rPr>
+        <w:t>SCA (Trivy)</w:t>
+      </w:r>
+      <w:r>
+        <w:t xml:space="preserve"> nhưng </w:t>
+      </w:r>
+      <w:r>
+        <w:rPr>
+          <w:b/>
+        </w:rPr>
+        <w:t>chưa đánh giá DAST</w:t>
+      </w:r>
+      <w:r>
+        <w:t xml:space="preserve"> và chưa kết luận production-ready. Đây là những hướng mở rộng tiếp theo, không thuộc phạm vi bốn tình huống của đồ án.</w:t>
       </w:r>
     </w:p>
     <w:p>
@@ -9235,7 +10489,7 @@
       <w:r>
         <w:t xml:space="preserve">OWASP Juice Shop v20.2.0 — </w:t>
       </w:r>
-      <w:hyperlink r:id="rId25">
+      <w:hyperlink r:id="rId29">
         <w:r>
           <w:rPr>
             <w:color w:val="0B4EA2"/>
@@ -9301,7 +10555,7 @@
         <w:pStyle w:val="ListBullet"/>
       </w:pPr>
       <w:r>
-        <w:t>Công cụ (phiên bản dùng trong thực nghiệm): Semgrep 1.180.0, Gitleaks v8.30.1, Conftest/OPA v0.71.1, node:test + Supertest.</w:t>
+        <w:t>Công cụ (phiên bản dùng trong thực nghiệm): Semgrep 1.180.0, Gitleaks v8.30.1, Conftest/OPA v0.71.1, node:test + Supertest, Trivy 0.76.1, Dockle 0.4.15, Prometheus 3.15.1, Grafana 13.3.0.</w:t>
       </w:r>
     </w:p>
     <w:p>

</xml_diff>